<commit_message>
Updates to document section 1, 2, 3
Updated below section in the project proposal document:
- 1. Project Title
- 2. Introduction
- 3. Problem Definition
</commit_message>
<xml_diff>
--- a/docs/sba26094_CA1_Strategic_Thinking_v1.docx
+++ b/docs/sba26094_CA1_Strategic_Thinking_v1.docx
@@ -41,7 +41,7 @@
                     </pic:cNvPicPr>
                   </pic:nvPicPr>
                   <pic:blipFill>
-                    <a:blip r:embed="rId5">
+                    <a:blip r:embed="rId6">
                       <a:extLst>
                         <a:ext uri="{28A0092B-C50C-407E-A947-70E740481C1C}">
                           <a14:useLocalDpi xmlns:a14="http://schemas.microsoft.com/office/drawing/2010/main" val="0"/>
@@ -828,7 +828,7 @@
                 <w:szCs w:val="32"/>
               </w:rPr>
             </w:pPr>
-            <w:hyperlink r:id="rId6" w:history="1">
+            <w:hyperlink r:id="rId7" w:history="1">
               <w:r>
                 <w:rPr>
                   <w:rStyle w:val="Hyperlink"/>
@@ -1115,6 +1115,51 @@
     <w:p>
       <w:pPr>
         <w:rPr>
+          <w:b/>
+          <w:bCs/>
+          <w:rPrChange w:id="0" w:author="Rohit Singh" w:date="2026-10-12T21:32:00Z" w16du:dateUtc="2026-10-12T20:32:00Z">
+            <w:rPr/>
+          </w:rPrChange>
+        </w:rPr>
+      </w:pPr>
+      <w:ins w:id="1" w:author="Rohit Singh" w:date="2026-10-12T21:30:00Z" w16du:dateUtc="2026-10-12T20:30:00Z">
+        <w:r>
+          <w:rPr>
+            <w:b/>
+            <w:bCs/>
+            <w:rPrChange w:id="2" w:author="Rohit Singh" w:date="2026-10-12T21:32:00Z" w16du:dateUtc="2026-10-12T20:32:00Z">
+              <w:rPr/>
+            </w:rPrChange>
+          </w:rPr>
+          <w:t>Predictive Analytics for Electric Vehicle Charging Infrastructur</w:t>
+        </w:r>
+      </w:ins>
+      <w:ins w:id="3" w:author="Rohit Singh" w:date="2026-10-12T21:31:00Z" w16du:dateUtc="2026-10-12T20:31:00Z">
+        <w:r>
+          <w:rPr>
+            <w:b/>
+            <w:bCs/>
+            <w:rPrChange w:id="4" w:author="Rohit Singh" w:date="2026-10-12T21:32:00Z" w16du:dateUtc="2026-10-12T20:32:00Z">
+              <w:rPr/>
+            </w:rPrChange>
+          </w:rPr>
+          <w:t>e</w:t>
+        </w:r>
+        <w:r>
+          <w:rPr>
+            <w:b/>
+            <w:bCs/>
+            <w:rPrChange w:id="5" w:author="Rohit Singh" w:date="2026-10-12T21:32:00Z" w16du:dateUtc="2026-10-12T20:32:00Z">
+              <w:rPr/>
+            </w:rPrChange>
+          </w:rPr>
+          <w:t>: Supporting Strategic Public-Private Planning in Ireland</w:t>
+        </w:r>
+      </w:ins>
+    </w:p>
+    <w:p>
+      <w:pPr>
+        <w:rPr>
           <w:sz w:val="24"/>
           <w:szCs w:val="24"/>
         </w:rPr>
@@ -1128,7 +1173,59 @@
         <w:t>Introduction</w:t>
       </w:r>
     </w:p>
-    <w:p/>
+    <w:p>
+      <w:pPr>
+        <w:rPr>
+          <w:ins w:id="6" w:author="Rohit Singh" w:date="2026-10-12T21:32:00Z" w16du:dateUtc="2026-10-12T20:32:00Z"/>
+        </w:rPr>
+      </w:pPr>
+      <w:ins w:id="7" w:author="Rohit Singh" w:date="2026-10-12T21:32:00Z" w16du:dateUtc="2026-10-12T20:32:00Z">
+        <w:r>
+          <w:t>Ireland’s Climate Action Plan sets an ambitious target of transitioning to sustainable transportation, targeting over 950,000 electric vehicles (EVs) on Irish roads by 2030. Achieving this target requires a proportional expansion of robust, accessible, and reliably placed public charging infrastructure across all local electoral areas and municipal regions.</w:t>
+        </w:r>
+      </w:ins>
+    </w:p>
+    <w:p>
+      <w:pPr>
+        <w:rPr>
+          <w:ins w:id="8" w:author="Rohit Singh" w:date="2026-10-12T21:32:00Z" w16du:dateUtc="2026-10-12T20:32:00Z"/>
+        </w:rPr>
+      </w:pPr>
+      <w:ins w:id="9" w:author="Rohit Singh" w:date="2026-10-12T21:32:00Z" w16du:dateUtc="2026-10-12T20:32:00Z">
+        <w:r>
+          <w:t>Currently, local authorities, energy providers, and private operators face significant challenges in determining optimal geographic and capacity allocation for new EV charging stations. Misalignments between rapid vehicle adoption and infrastructure deployment result in severe localized congestion in high-adoption zones and underutilized capital investments in lower-demand corridors.</w:t>
+        </w:r>
+      </w:ins>
+    </w:p>
+    <w:p>
+      <w:pPr>
+        <w:rPr>
+          <w:ins w:id="10" w:author="Rohit Singh" w:date="2026-10-12T21:32:00Z" w16du:dateUtc="2026-10-12T20:32:00Z"/>
+        </w:rPr>
+      </w:pPr>
+      <w:ins w:id="11" w:author="Rohit Singh" w:date="2026-10-12T21:32:00Z" w16du:dateUtc="2026-10-12T20:32:00Z">
+        <w:r>
+          <w:t>This project addresses this critical infrastructure gap through data analytics and predictive modelling. By synthesizing public vehicle registration statistics, demographic metrics, and spatial charging station locations published on the Irish open data portal (</w:t>
+        </w:r>
+        <w:r>
+          <w:rPr>
+            <w:i/>
+            <w:iCs/>
+          </w:rPr>
+          <w:t>data.gov.ie</w:t>
+        </w:r>
+        <w:r>
+          <w:t>), this initiative delivers a predictive framework to forecast charging demand scores and infrastructure deficits across Irish counties.</w:t>
+        </w:r>
+      </w:ins>
+    </w:p>
+    <w:p>
+      <w:pPr>
+        <w:rPr>
+          <w:del w:id="12" w:author="Rohit Singh" w:date="2026-10-12T21:32:00Z" w16du:dateUtc="2026-10-12T20:32:00Z"/>
+        </w:rPr>
+      </w:pPr>
+    </w:p>
     <w:p>
       <w:pPr>
         <w:pStyle w:val="Heading1"/>
@@ -1137,7 +1234,158 @@
         <w:t>Problem Definition</w:t>
       </w:r>
     </w:p>
-    <w:p/>
+    <w:p>
+      <w:pPr>
+        <w:rPr>
+          <w:ins w:id="13" w:author="Rohit Singh" w:date="2026-10-12T21:32:00Z" w16du:dateUtc="2026-10-12T20:32:00Z"/>
+        </w:rPr>
+      </w:pPr>
+      <w:ins w:id="14" w:author="Rohit Singh" w:date="2026-10-12T21:32:00Z" w16du:dateUtc="2026-10-12T20:32:00Z">
+        <w:r>
+          <w:t>The primary business problem investigated in this project is the lack of empirical, data-driven forecasting tools to guide public and private capital expenditure in EV charging infrastructure across Ireland.</w:t>
+        </w:r>
+      </w:ins>
+    </w:p>
+    <w:p>
+      <w:pPr>
+        <w:rPr>
+          <w:ins w:id="15" w:author="Rohit Singh" w:date="2026-10-12T21:32:00Z" w16du:dateUtc="2026-10-12T20:32:00Z"/>
+          <w:b/>
+          <w:bCs/>
+        </w:rPr>
+      </w:pPr>
+      <w:ins w:id="16" w:author="Rohit Singh" w:date="2026-10-12T21:32:00Z" w16du:dateUtc="2026-10-12T20:32:00Z">
+        <w:r>
+          <w:rPr>
+            <w:b/>
+            <w:bCs/>
+          </w:rPr>
+          <w:t>Business Impact</w:t>
+        </w:r>
+      </w:ins>
+    </w:p>
+    <w:p>
+      <w:pPr>
+        <w:numPr>
+          <w:ilvl w:val="0"/>
+          <w:numId w:val="1"/>
+        </w:numPr>
+        <w:rPr>
+          <w:ins w:id="17" w:author="Rohit Singh" w:date="2026-10-12T21:32:00Z" w16du:dateUtc="2026-10-12T20:32:00Z"/>
+        </w:rPr>
+      </w:pPr>
+      <w:ins w:id="18" w:author="Rohit Singh" w:date="2026-10-12T21:32:00Z" w16du:dateUtc="2026-10-12T20:32:00Z">
+        <w:r>
+          <w:rPr>
+            <w:b/>
+            <w:bCs/>
+          </w:rPr>
+          <w:t>Capital Inefficiency:</w:t>
+        </w:r>
+        <w:r>
+          <w:t xml:space="preserve"> Local councils and charge point operators (CPOs) risk misallocating finite infrastructure grants into low-utilization regions while high-volume corridors remain underserved.</w:t>
+        </w:r>
+      </w:ins>
+    </w:p>
+    <w:p>
+      <w:pPr>
+        <w:numPr>
+          <w:ilvl w:val="0"/>
+          <w:numId w:val="1"/>
+        </w:numPr>
+        <w:rPr>
+          <w:ins w:id="19" w:author="Rohit Singh" w:date="2026-10-12T21:32:00Z" w16du:dateUtc="2026-10-12T20:32:00Z"/>
+        </w:rPr>
+      </w:pPr>
+      <w:ins w:id="20" w:author="Rohit Singh" w:date="2026-10-12T21:32:00Z" w16du:dateUtc="2026-10-12T20:32:00Z">
+        <w:r>
+          <w:rPr>
+            <w:b/>
+            <w:bCs/>
+          </w:rPr>
+          <w:t>Adoption Friction (Range &amp; Queue Anxiety):</w:t>
+        </w:r>
+        <w:r>
+          <w:t xml:space="preserve"> Grid bottlenecks and long queuing times at public charging points create negative consumer sentiment, directly hindering Ireland’s national EV adoption targets.</w:t>
+        </w:r>
+      </w:ins>
+    </w:p>
+    <w:p>
+      <w:pPr>
+        <w:numPr>
+          <w:ilvl w:val="0"/>
+          <w:numId w:val="1"/>
+        </w:numPr>
+        <w:rPr>
+          <w:ins w:id="21" w:author="Rohit Singh" w:date="2026-10-12T21:32:00Z" w16du:dateUtc="2026-10-12T20:32:00Z"/>
+        </w:rPr>
+      </w:pPr>
+      <w:ins w:id="22" w:author="Rohit Singh" w:date="2026-10-12T21:32:00Z" w16du:dateUtc="2026-10-12T20:32:00Z">
+        <w:r>
+          <w:rPr>
+            <w:b/>
+            <w:bCs/>
+          </w:rPr>
+          <w:t>Operational Grid Strain:</w:t>
+        </w:r>
+        <w:r>
+          <w:t xml:space="preserve"> Unplanned charger installations create localized electric grid imbalances, requiring costly reactive infrastructure upgrades from utility providers.</w:t>
+        </w:r>
+      </w:ins>
+    </w:p>
+    <w:p>
+      <w:pPr>
+        <w:rPr>
+          <w:ins w:id="23" w:author="Rohit Singh" w:date="2026-10-12T21:32:00Z" w16du:dateUtc="2026-10-12T20:32:00Z"/>
+          <w:b/>
+          <w:bCs/>
+        </w:rPr>
+      </w:pPr>
+      <w:ins w:id="24" w:author="Rohit Singh" w:date="2026-10-12T21:32:00Z" w16du:dateUtc="2026-10-12T20:32:00Z">
+        <w:r>
+          <w:rPr>
+            <w:b/>
+            <w:bCs/>
+          </w:rPr>
+          <w:t>Role of Data Analytics and Predictive Mode</w:t>
+        </w:r>
+        <w:r>
+          <w:rPr>
+            <w:b/>
+            <w:bCs/>
+          </w:rPr>
+          <w:t>l</w:t>
+        </w:r>
+        <w:r>
+          <w:rPr>
+            <w:b/>
+            <w:bCs/>
+          </w:rPr>
+          <w:t>ling</w:t>
+        </w:r>
+      </w:ins>
+    </w:p>
+    <w:p>
+      <w:ins w:id="25" w:author="Rohit Singh" w:date="2026-10-12T21:32:00Z" w16du:dateUtc="2026-10-12T20:32:00Z">
+        <w:r>
+          <w:t xml:space="preserve">Data analytics allows stakeholders to transition from reactive installation policies to proactive, predictive deployment strategies. By analysing historical vehicle registration trends, county-level EV adoption rates, and existing spatial charger distributions, machine learning algorithms (e.g., Regression and Decision Tree models) can model complex non-linear relationships. These </w:t>
+        </w:r>
+        <w:r>
+          <w:lastRenderedPageBreak/>
+          <w:t xml:space="preserve">models produce a localized </w:t>
+        </w:r>
+        <w:r>
+          <w:rPr>
+            <w:b/>
+            <w:bCs/>
+          </w:rPr>
+          <w:t>Infrastructure Demand Score</w:t>
+        </w:r>
+        <w:r>
+          <w:t>, enabling decision-makers to prioritize investments where future demand will be highest.</w:t>
+        </w:r>
+      </w:ins>
+    </w:p>
     <w:p>
       <w:pPr>
         <w:pStyle w:val="Heading1"/>
@@ -2826,6 +3074,14 @@
     <w:abstractNumId w:val="0"/>
   </w:num>
 </w:numbering>
+</file>
+
+<file path=word/people.xml><?xml version="1.0" encoding="utf-8"?>
+<w15:people xmlns:wpc="http://schemas.microsoft.com/office/word/2010/wordprocessingCanvas" xmlns:cx="http://schemas.microsoft.com/office/drawing/2014/chartex" xmlns:cx1="http://schemas.microsoft.com/office/drawing/2015/9/8/chartex" xmlns:cx2="http://schemas.microsoft.com/office/drawing/2015/10/21/chartex" xmlns:cx3="http://schemas.microsoft.com/office/drawing/2016/5/9/chartex" xmlns:cx4="http://schemas.microsoft.com/office/drawing/2016/5/10/chartex" xmlns:cx5="http://schemas.microsoft.com/office/drawing/2016/5/11/chartex" xmlns:cx6="http://schemas.microsoft.com/office/drawing/2016/5/12/chartex" xmlns:cx7="http://schemas.microsoft.com/office/drawing/2016/5/13/chartex" xmlns:cx8="http://schemas.microsoft.com/office/drawing/2016/5/14/chartex" xmlns:mc="http://schemas.openxmlformats.org/markup-compatibility/2006" xmlns:aink="http://schemas.microsoft.com/office/drawing/2016/ink" xmlns:am3d="http://schemas.microsoft.com/office/drawing/2017/model3d" xmlns:o="urn:schemas-microsoft-com:office:office" xmlns:oel="http://schemas.microsoft.com/office/2019/extlst" xmlns:r="http://schemas.openxmlformats.org/officeDocument/2006/relationships" xmlns:m="http://schemas.openxmlformats.org/officeDocument/2006/math" xmlns:v="urn:schemas-microsoft-com:vml" xmlns:wp14="http://schemas.microsoft.com/office/word/2010/wordprocessingDrawing" xmlns:wp="http://schemas.openxmlformats.org/drawingml/2006/wordprocessingDrawing" xmlns:w10="urn:schemas-microsoft-com:office:word" xmlns:w="http://schemas.openxmlformats.org/wordprocessingml/2006/main" xmlns:w14="http://schemas.microsoft.com/office/word/2010/wordml" xmlns:w15="http://schemas.microsoft.com/office/word/2012/wordml" xmlns:w16cex="http://schemas.microsoft.com/office/word/2018/wordml/cex" xmlns:w16cid="http://schemas.microsoft.com/office/word/2016/wordml/cid" xmlns:w16="http://schemas.microsoft.com/office/word/2018/wordml" xmlns:w16du="http://schemas.microsoft.com/office/word/2023/wordml/word16du" xmlns:w16sdtdh="http://schemas.microsoft.com/office/word/2020/wordml/sdtdatahash" xmlns:w16sdtfl="http://schemas.microsoft.com/office/word/2024/wordml/sdtformatlock" xmlns:w16se="http://schemas.microsoft.com/office/word/2015/wordml/symex" xmlns:wpg="http://schemas.microsoft.com/office/word/2010/wordprocessingGroup" xmlns:wpi="http://schemas.microsoft.com/office/word/2010/wordprocessingInk" xmlns:wne="http://schemas.microsoft.com/office/word/2006/wordml" xmlns:wps="http://schemas.microsoft.com/office/word/2010/wordprocessingShape" mc:Ignorable="w14 w15 w16se w16cid w16 w16cex w16sdtdh w16sdtfl w16du wp14">
+  <w15:person w15:author="Rohit Singh">
+    <w15:presenceInfo w15:providerId="Windows Live" w15:userId="a7fbf1ac01b5c51a"/>
+  </w15:person>
+</w15:people>
 </file>
 
 <file path=word/styles.xml><?xml version="1.0" encoding="utf-8"?>
@@ -3779,6 +4035,51 @@
       <w:shd w:val="clear" w:color="auto" w:fill="E1DFDD"/>
     </w:rPr>
   </w:style>
+  <w:style w:type="paragraph" w:styleId="Revision">
+    <w:name w:val="Revision"/>
+    <w:hidden/>
+    <w:uiPriority w:val="99"/>
+    <w:semiHidden/>
+    <w:rsid w:val="00A509D1"/>
+    <w:pPr>
+      <w:spacing w:after="0" w:line="240" w:lineRule="auto"/>
+    </w:pPr>
+  </w:style>
+  <w:style w:type="paragraph" w:styleId="TOCHeading">
+    <w:name w:val="TOC Heading"/>
+    <w:basedOn w:val="Heading1"/>
+    <w:next w:val="Normal"/>
+    <w:uiPriority w:val="39"/>
+    <w:unhideWhenUsed/>
+    <w:qFormat/>
+    <w:rsid w:val="004F2A4A"/>
+    <w:pPr>
+      <w:numPr>
+        <w:numId w:val="0"/>
+      </w:numPr>
+      <w:spacing w:before="240" w:after="0"/>
+      <w:outlineLvl w:val="9"/>
+    </w:pPr>
+    <w:rPr>
+      <w:kern w:val="0"/>
+      <w:sz w:val="32"/>
+      <w:szCs w:val="32"/>
+      <w:lang w:val="en-US"/>
+      <w14:ligatures w14:val="none"/>
+    </w:rPr>
+  </w:style>
+  <w:style w:type="paragraph" w:styleId="TOC1">
+    <w:name w:val="toc 1"/>
+    <w:basedOn w:val="Normal"/>
+    <w:next w:val="Normal"/>
+    <w:autoRedefine/>
+    <w:uiPriority w:val="39"/>
+    <w:unhideWhenUsed/>
+    <w:rsid w:val="004F2A4A"/>
+    <w:pPr>
+      <w:spacing w:after="100"/>
+    </w:pPr>
+  </w:style>
 </w:styles>
 </file>
 
@@ -4075,4 +4376,16 @@
     </a:ext>
   </a:extLst>
 </a:theme>
+</file>
+
+<file path=customXml/item1.xml><?xml version="1.0" encoding="utf-8"?>
+<b:Sources xmlns:b="http://schemas.openxmlformats.org/officeDocument/2006/bibliography" xmlns="http://schemas.openxmlformats.org/officeDocument/2006/bibliography" SelectedStyle="\APASixthEditionOfficeOnline.xsl" StyleName="APA" Version="6"/>
+</file>
+
+<file path=customXml/itemProps1.xml><?xml version="1.0" encoding="utf-8"?>
+<ds:datastoreItem xmlns:ds="http://schemas.openxmlformats.org/officeDocument/2006/customXml" ds:itemID="{89343DAB-DA29-433D-925A-F9B8468622FB}">
+  <ds:schemaRefs>
+    <ds:schemaRef ds:uri="http://schemas.openxmlformats.org/officeDocument/2006/bibliography"/>
+  </ds:schemaRefs>
+</ds:datastoreItem>
 </file>
</xml_diff>

<commit_message>
Updated section 4 Aims and Objectives in the word document
Updated section 4 Aims and Objectives in the word document
</commit_message>
<xml_diff>
--- a/docs/sba26094_CA1_Strategic_Thinking_v1.docx
+++ b/docs/sba26094_CA1_Strategic_Thinking_v1.docx
@@ -650,7 +650,6 @@
                 <w:szCs w:val="32"/>
               </w:rPr>
             </w:pPr>
-            <w:proofErr w:type="spellStart"/>
             <w:r>
               <w:rPr>
                 <w:i/>
@@ -658,17 +657,7 @@
                 <w:sz w:val="32"/>
                 <w:szCs w:val="32"/>
               </w:rPr>
-              <w:t>Taufique</w:t>
-            </w:r>
-            <w:proofErr w:type="spellEnd"/>
-            <w:r>
-              <w:rPr>
-                <w:i/>
-                <w:color w:val="156082"/>
-                <w:sz w:val="32"/>
-                <w:szCs w:val="32"/>
-              </w:rPr>
-              <w:t xml:space="preserve"> Ahmed</w:t>
+              <w:t>Taufique Ahmed</w:t>
             </w:r>
           </w:p>
         </w:tc>
@@ -1389,10 +1378,272 @@
     <w:p>
       <w:pPr>
         <w:pStyle w:val="Heading1"/>
+        <w:rPr>
+          <w:ins w:id="26" w:author="Rohit Singh" w:date="2026-10-15T10:35:00Z" w16du:dateUtc="2026-10-15T09:35:00Z"/>
+        </w:rPr>
       </w:pPr>
       <w:r>
         <w:t>Aim and Objectives</w:t>
       </w:r>
+    </w:p>
+    <w:p>
+      <w:pPr>
+        <w:rPr>
+          <w:ins w:id="27" w:author="Rohit Singh" w:date="2026-10-15T10:35:00Z" w16du:dateUtc="2026-10-15T09:35:00Z"/>
+          <w:b/>
+          <w:bCs/>
+        </w:rPr>
+      </w:pPr>
+      <w:ins w:id="28" w:author="Rohit Singh" w:date="2026-10-15T10:35:00Z" w16du:dateUtc="2026-10-15T09:35:00Z">
+        <w:r>
+          <w:rPr>
+            <w:b/>
+            <w:bCs/>
+          </w:rPr>
+          <w:t>Overall Project Aim</w:t>
+        </w:r>
+      </w:ins>
+    </w:p>
+    <w:p>
+      <w:pPr>
+        <w:rPr>
+          <w:ins w:id="29" w:author="Rohit Singh" w:date="2026-10-15T10:35:00Z" w16du:dateUtc="2026-10-15T09:35:00Z"/>
+        </w:rPr>
+      </w:pPr>
+      <w:ins w:id="30" w:author="Rohit Singh" w:date="2026-10-15T10:35:00Z" w16du:dateUtc="2026-10-15T09:35:00Z">
+        <w:r>
+          <w:t>The overall aim of this project is to develop a predictive analytics model and interactive business intelligence solution that forecasts regional EV charging demand in Ireland, empowering public planners and commercial operators to optimize future infrastructure allocation.</w:t>
+        </w:r>
+      </w:ins>
+    </w:p>
+    <w:p>
+      <w:pPr>
+        <w:rPr>
+          <w:ins w:id="31" w:author="Rohit Singh" w:date="2026-10-15T10:35:00Z" w16du:dateUtc="2026-10-15T09:35:00Z"/>
+          <w:b/>
+          <w:bCs/>
+        </w:rPr>
+      </w:pPr>
+      <w:ins w:id="32" w:author="Rohit Singh" w:date="2026-10-15T10:35:00Z" w16du:dateUtc="2026-10-15T09:35:00Z">
+        <w:r>
+          <w:rPr>
+            <w:b/>
+            <w:bCs/>
+          </w:rPr>
+          <w:t>Key Objectives</w:t>
+        </w:r>
+      </w:ins>
+    </w:p>
+    <w:p>
+      <w:pPr>
+        <w:numPr>
+          <w:ilvl w:val="0"/>
+          <w:numId w:val="2"/>
+        </w:numPr>
+        <w:rPr>
+          <w:ins w:id="33" w:author="Rohit Singh" w:date="2026-10-15T10:35:00Z" w16du:dateUtc="2026-10-15T09:35:00Z"/>
+        </w:rPr>
+      </w:pPr>
+      <w:ins w:id="34" w:author="Rohit Singh" w:date="2026-10-15T10:35:00Z" w16du:dateUtc="2026-10-15T09:35:00Z">
+        <w:r>
+          <w:rPr>
+            <w:b/>
+            <w:bCs/>
+          </w:rPr>
+          <w:t>Data Acquisition &amp; Integration:</w:t>
+        </w:r>
+        <w:r>
+          <w:t xml:space="preserve"> Extract, clean, and consolidate multi-source datasets from </w:t>
+        </w:r>
+        <w:r>
+          <w:rPr>
+            <w:i/>
+            <w:iCs/>
+          </w:rPr>
+          <w:t>data.gov.ie</w:t>
+        </w:r>
+        <w:r>
+          <w:t>, including Central Statistics Office (CSO) vehicle registration tables and local authority GIS charging location records.</w:t>
+        </w:r>
+      </w:ins>
+    </w:p>
+    <w:p>
+      <w:pPr>
+        <w:numPr>
+          <w:ilvl w:val="0"/>
+          <w:numId w:val="2"/>
+        </w:numPr>
+        <w:rPr>
+          <w:ins w:id="35" w:author="Rohit Singh" w:date="2026-10-15T10:35:00Z" w16du:dateUtc="2026-10-15T09:35:00Z"/>
+        </w:rPr>
+      </w:pPr>
+      <w:ins w:id="36" w:author="Rohit Singh" w:date="2026-10-15T10:35:00Z" w16du:dateUtc="2026-10-15T09:35:00Z">
+        <w:r>
+          <w:rPr>
+            <w:b/>
+            <w:bCs/>
+          </w:rPr>
+          <w:t>Exploratory &amp; Spatial Analysis:</w:t>
+        </w:r>
+        <w:r>
+          <w:t xml:space="preserve"> Conduct exploratory data analysis (EDA) to evaluate regional disparities in EV adoption, charger density ratios, and temporal growth patterns across Irish counties.</w:t>
+        </w:r>
+      </w:ins>
+    </w:p>
+    <w:p>
+      <w:pPr>
+        <w:numPr>
+          <w:ilvl w:val="0"/>
+          <w:numId w:val="2"/>
+        </w:numPr>
+        <w:rPr>
+          <w:ins w:id="37" w:author="Rohit Singh" w:date="2026-10-15T10:35:00Z" w16du:dateUtc="2026-10-15T09:35:00Z"/>
+        </w:rPr>
+      </w:pPr>
+      <w:ins w:id="38" w:author="Rohit Singh" w:date="2026-10-15T10:35:00Z" w16du:dateUtc="2026-10-15T09:35:00Z">
+        <w:r>
+          <w:rPr>
+            <w:b/>
+            <w:bCs/>
+          </w:rPr>
+          <w:t>Feature Engineering:</w:t>
+        </w:r>
+        <w:r>
+          <w:t xml:space="preserve"> Derive composite indicators, such as the </w:t>
+        </w:r>
+        <w:r>
+          <w:rPr>
+            <w:i/>
+            <w:iCs/>
+          </w:rPr>
+          <w:t>Vehicle-to-Charger Ratio</w:t>
+        </w:r>
+        <w:r>
+          <w:t xml:space="preserve">, </w:t>
+        </w:r>
+        <w:r>
+          <w:rPr>
+            <w:i/>
+            <w:iCs/>
+          </w:rPr>
+          <w:t>Regional EV Growth Rate</w:t>
+        </w:r>
+        <w:r>
+          <w:t xml:space="preserve">, and </w:t>
+        </w:r>
+        <w:r>
+          <w:rPr>
+            <w:i/>
+            <w:iCs/>
+          </w:rPr>
+          <w:t>Spatial Accessibility Indices</w:t>
+        </w:r>
+        <w:r>
+          <w:t>.</w:t>
+        </w:r>
+      </w:ins>
+    </w:p>
+    <w:p>
+      <w:pPr>
+        <w:numPr>
+          <w:ilvl w:val="0"/>
+          <w:numId w:val="2"/>
+        </w:numPr>
+        <w:rPr>
+          <w:ins w:id="39" w:author="Rohit Singh" w:date="2026-10-15T10:35:00Z" w16du:dateUtc="2026-10-15T09:35:00Z"/>
+        </w:rPr>
+      </w:pPr>
+      <w:ins w:id="40" w:author="Rohit Singh" w:date="2026-10-15T10:35:00Z" w16du:dateUtc="2026-10-15T09:35:00Z">
+        <w:r>
+          <w:rPr>
+            <w:b/>
+            <w:bCs/>
+          </w:rPr>
+          <w:t>Predictive Model Development:</w:t>
+        </w:r>
+        <w:r>
+          <w:t xml:space="preserve"> Train, evaluate, and compare machine learning regression models (e.g., Multiple Linear Regression, Random Forest Regressor, XGBoost) to forecast county-level charging demand scores.</w:t>
+        </w:r>
+      </w:ins>
+    </w:p>
+    <w:p>
+      <w:pPr>
+        <w:numPr>
+          <w:ilvl w:val="0"/>
+          <w:numId w:val="2"/>
+        </w:numPr>
+        <w:rPr>
+          <w:ins w:id="41" w:author="Rohit Singh" w:date="2026-10-15T10:35:00Z" w16du:dateUtc="2026-10-15T09:35:00Z"/>
+        </w:rPr>
+      </w:pPr>
+      <w:ins w:id="42" w:author="Rohit Singh" w:date="2026-10-15T10:35:00Z" w16du:dateUtc="2026-10-15T09:35:00Z">
+        <w:r>
+          <w:rPr>
+            <w:b/>
+            <w:bCs/>
+          </w:rPr>
+          <w:t>Interactive Dashboard &amp; Delivery:</w:t>
+        </w:r>
+        <w:r>
+          <w:t xml:space="preserve"> Build an interactive business intelligence dashboard (Power BI/Streamlit) that visualizes predicted demand, identifies underserved regions, and provides scenario-based planning tools for stakeholders.</w:t>
+        </w:r>
+      </w:ins>
+    </w:p>
+    <w:p>
+      <w:pPr>
+        <w:rPr>
+          <w:ins w:id="43" w:author="Rohit Singh" w:date="2026-10-15T10:35:00Z" w16du:dateUtc="2026-10-15T09:35:00Z"/>
+          <w:b/>
+          <w:bCs/>
+        </w:rPr>
+      </w:pPr>
+      <w:ins w:id="44" w:author="Rohit Singh" w:date="2026-10-15T10:35:00Z" w16du:dateUtc="2026-10-15T09:35:00Z">
+        <w:r>
+          <w:rPr>
+            <w:b/>
+            <w:bCs/>
+          </w:rPr>
+          <w:t>Primary Business Hypothesis</w:t>
+        </w:r>
+      </w:ins>
+    </w:p>
+    <w:p>
+      <w:pPr>
+        <w:rPr>
+          <w:ins w:id="45" w:author="Rohit Singh" w:date="2026-10-15T10:35:00Z" w16du:dateUtc="2026-10-15T09:35:00Z"/>
+        </w:rPr>
+      </w:pPr>
+      <w:ins w:id="46" w:author="Rohit Singh" w:date="2026-10-15T10:35:00Z" w16du:dateUtc="2026-10-15T09:35:00Z">
+        <w:r>
+          <w:rPr>
+            <w:i/>
+            <w:iCs/>
+          </w:rPr>
+          <w:t>Hypothesis (</w:t>
+        </w:r>
+        <w:r>
+          <w:t>$H_1$</w:t>
+        </w:r>
+        <w:r>
+          <w:rPr>
+            <w:i/>
+            <w:iCs/>
+          </w:rPr>
+          <w:t>):</w:t>
+        </w:r>
+        <w:r>
+          <w:t xml:space="preserve"> A predictive model incorporating regional EV registration growth rates, historical vehicle density, and spatial charging point distributions can forecast local charging demand with significantly higher accuracy ($R^2 &gt; 0.80$) than simple historical linear projections.</w:t>
+        </w:r>
+      </w:ins>
+    </w:p>
+    <w:p>
+      <w:pPr>
+        <w:pPrChange w:id="47" w:author="Rohit Singh" w:date="2026-10-15T10:35:00Z" w16du:dateUtc="2026-10-15T09:35:00Z">
+          <w:pPr>
+            <w:pStyle w:val="Heading1"/>
+          </w:pPr>
+        </w:pPrChange>
+      </w:pPr>
     </w:p>
     <w:sectPr>
       <w:pgSz w:w="11906" w:h="16838"/>

</xml_diff>

<commit_message>
Added table of contents in the word document
Added table of contents in the word document
</commit_message>
<xml_diff>
--- a/docs/sba26094_CA1_Strategic_Thinking_v1.docx
+++ b/docs/sba26094_CA1_Strategic_Thinking_v1.docx
@@ -650,6 +650,7 @@
                 <w:szCs w:val="32"/>
               </w:rPr>
             </w:pPr>
+            <w:proofErr w:type="spellStart"/>
             <w:r>
               <w:rPr>
                 <w:i/>
@@ -657,7 +658,17 @@
                 <w:sz w:val="32"/>
                 <w:szCs w:val="32"/>
               </w:rPr>
-              <w:t>Taufique Ahmed</w:t>
+              <w:t>Taufique</w:t>
+            </w:r>
+            <w:proofErr w:type="spellEnd"/>
+            <w:r>
+              <w:rPr>
+                <w:i/>
+                <w:color w:val="156082"/>
+                <w:sz w:val="32"/>
+                <w:szCs w:val="32"/>
+              </w:rPr>
+              <w:t xml:space="preserve"> Ahmed</w:t>
             </w:r>
           </w:p>
         </w:tc>
@@ -1088,9 +1099,567 @@
       </w:r>
     </w:p>
     <w:p>
-      <w:r>
-        <w:br w:type="page"/>
-      </w:r>
+      <w:pPr>
+        <w:rPr>
+          <w:del w:id="0" w:author="Rohit Singh" w:date="2026-10-15T10:54:00Z" w16du:dateUtc="2026-10-15T09:54:00Z"/>
+        </w:rPr>
+      </w:pPr>
+      <w:del w:id="1" w:author="Rohit Singh" w:date="2026-10-15T10:54:00Z" w16du:dateUtc="2026-10-15T09:54:00Z">
+        <w:r>
+          <w:br w:type="page"/>
+        </w:r>
+      </w:del>
+    </w:p>
+    <w:p>
+      <w:pPr>
+        <w:rPr>
+          <w:del w:id="2" w:author="Rohit Singh" w:date="2026-10-15T10:54:00Z" w16du:dateUtc="2026-10-15T09:54:00Z"/>
+        </w:rPr>
+        <w:pPrChange w:id="3" w:author="Rohit Singh" w:date="2026-10-15T10:54:00Z" w16du:dateUtc="2026-10-15T09:54:00Z">
+          <w:pPr>
+            <w:pStyle w:val="TOCHeading"/>
+          </w:pPr>
+        </w:pPrChange>
+      </w:pPr>
+      <w:ins w:id="4" w:author="Rohit Singh" w:date="2026-10-15T10:53:00Z" w16du:dateUtc="2026-10-15T09:53:00Z">
+        <w:r>
+          <w:br w:type="page"/>
+        </w:r>
+      </w:ins>
+    </w:p>
+    <w:customXmlInsRangeStart w:id="5" w:author="Rohit Singh" w:date="2026-10-15T10:54:00Z"/>
+    <w:sdt>
+      <w:sdtPr>
+        <w:id w:val="1905797357"/>
+        <w:docPartObj>
+          <w:docPartGallery w:val="Table of Contents"/>
+          <w:docPartUnique/>
+        </w:docPartObj>
+      </w:sdtPr>
+      <w:sdtEndPr>
+        <w:rPr>
+          <w:b/>
+          <w:bCs/>
+          <w:noProof/>
+        </w:rPr>
+      </w:sdtEndPr>
+      <w:sdtContent>
+        <w:customXmlInsRangeEnd w:id="5"/>
+        <w:p>
+          <w:pPr>
+            <w:rPr>
+              <w:ins w:id="6" w:author="Rohit Singh" w:date="2026-10-15T10:54:00Z" w16du:dateUtc="2026-10-15T09:54:00Z"/>
+            </w:rPr>
+            <w:pPrChange w:id="7" w:author="Rohit Singh" w:date="2026-10-15T10:54:00Z" w16du:dateUtc="2026-10-15T09:54:00Z">
+              <w:pPr>
+                <w:pStyle w:val="TOCHeading"/>
+              </w:pPr>
+            </w:pPrChange>
+          </w:pPr>
+          <w:ins w:id="8" w:author="Rohit Singh" w:date="2026-10-15T10:54:00Z" w16du:dateUtc="2026-10-15T09:54:00Z">
+            <w:r>
+              <w:t>Contents</w:t>
+            </w:r>
+          </w:ins>
+        </w:p>
+        <w:p>
+          <w:pPr>
+            <w:pStyle w:val="TOC1"/>
+            <w:tabs>
+              <w:tab w:val="left" w:pos="480"/>
+              <w:tab w:val="right" w:leader="dot" w:pos="9016"/>
+            </w:tabs>
+            <w:rPr>
+              <w:rFonts w:eastAsiaTheme="minorEastAsia"/>
+              <w:noProof/>
+              <w:sz w:val="24"/>
+              <w:szCs w:val="24"/>
+              <w:lang w:eastAsia="en-IE"/>
+            </w:rPr>
+          </w:pPr>
+          <w:ins w:id="9" w:author="Rohit Singh" w:date="2026-10-15T10:54:00Z" w16du:dateUtc="2026-10-15T09:54:00Z">
+            <w:r>
+              <w:fldChar w:fldCharType="begin"/>
+            </w:r>
+            <w:r>
+              <w:instrText xml:space="preserve"> TOC \o "1-3" \h \z \u </w:instrText>
+            </w:r>
+            <w:r>
+              <w:fldChar w:fldCharType="separate"/>
+            </w:r>
+          </w:ins>
+          <w:hyperlink w:anchor="_Toc242954056" w:history="1">
+            <w:r>
+              <w:rPr>
+                <w:rStyle w:val="Hyperlink"/>
+                <w:noProof/>
+              </w:rPr>
+              <w:t>1</w:t>
+            </w:r>
+            <w:r>
+              <w:rPr>
+                <w:rFonts w:eastAsiaTheme="minorEastAsia"/>
+                <w:noProof/>
+                <w:sz w:val="24"/>
+                <w:szCs w:val="24"/>
+                <w:lang w:eastAsia="en-IE"/>
+              </w:rPr>
+              <w:tab/>
+            </w:r>
+            <w:r>
+              <w:rPr>
+                <w:rStyle w:val="Hyperlink"/>
+                <w:noProof/>
+              </w:rPr>
+              <w:t>Project Title</w:t>
+            </w:r>
+            <w:r>
+              <w:rPr>
+                <w:noProof/>
+                <w:webHidden/>
+              </w:rPr>
+              <w:tab/>
+            </w:r>
+            <w:r>
+              <w:rPr>
+                <w:noProof/>
+                <w:webHidden/>
+              </w:rPr>
+              <w:fldChar w:fldCharType="begin"/>
+            </w:r>
+            <w:r>
+              <w:rPr>
+                <w:noProof/>
+                <w:webHidden/>
+              </w:rPr>
+              <w:instrText xml:space="preserve"> PAGEREF _Toc242954056 \h </w:instrText>
+            </w:r>
+            <w:r>
+              <w:rPr>
+                <w:noProof/>
+                <w:webHidden/>
+              </w:rPr>
+            </w:r>
+            <w:r>
+              <w:rPr>
+                <w:noProof/>
+                <w:webHidden/>
+              </w:rPr>
+              <w:fldChar w:fldCharType="separate"/>
+            </w:r>
+            <w:r>
+              <w:rPr>
+                <w:noProof/>
+                <w:webHidden/>
+              </w:rPr>
+              <w:t>4</w:t>
+            </w:r>
+            <w:r>
+              <w:rPr>
+                <w:noProof/>
+                <w:webHidden/>
+              </w:rPr>
+              <w:fldChar w:fldCharType="end"/>
+            </w:r>
+          </w:hyperlink>
+        </w:p>
+        <w:p>
+          <w:pPr>
+            <w:pStyle w:val="TOC1"/>
+            <w:tabs>
+              <w:tab w:val="left" w:pos="480"/>
+              <w:tab w:val="right" w:leader="dot" w:pos="9016"/>
+            </w:tabs>
+            <w:rPr>
+              <w:rFonts w:eastAsiaTheme="minorEastAsia"/>
+              <w:noProof/>
+              <w:sz w:val="24"/>
+              <w:szCs w:val="24"/>
+              <w:lang w:eastAsia="en-IE"/>
+            </w:rPr>
+          </w:pPr>
+          <w:hyperlink w:anchor="_Toc242954057" w:history="1">
+            <w:r>
+              <w:rPr>
+                <w:rStyle w:val="Hyperlink"/>
+                <w:noProof/>
+              </w:rPr>
+              <w:t>2</w:t>
+            </w:r>
+            <w:r>
+              <w:rPr>
+                <w:rFonts w:eastAsiaTheme="minorEastAsia"/>
+                <w:noProof/>
+                <w:sz w:val="24"/>
+                <w:szCs w:val="24"/>
+                <w:lang w:eastAsia="en-IE"/>
+              </w:rPr>
+              <w:tab/>
+            </w:r>
+            <w:r>
+              <w:rPr>
+                <w:rStyle w:val="Hyperlink"/>
+                <w:noProof/>
+              </w:rPr>
+              <w:t>Introduction</w:t>
+            </w:r>
+            <w:r>
+              <w:rPr>
+                <w:noProof/>
+                <w:webHidden/>
+              </w:rPr>
+              <w:tab/>
+            </w:r>
+            <w:r>
+              <w:rPr>
+                <w:noProof/>
+                <w:webHidden/>
+              </w:rPr>
+              <w:fldChar w:fldCharType="begin"/>
+            </w:r>
+            <w:r>
+              <w:rPr>
+                <w:noProof/>
+                <w:webHidden/>
+              </w:rPr>
+              <w:instrText xml:space="preserve"> PAGEREF _Toc242954057 \h </w:instrText>
+            </w:r>
+            <w:r>
+              <w:rPr>
+                <w:noProof/>
+                <w:webHidden/>
+              </w:rPr>
+            </w:r>
+            <w:r>
+              <w:rPr>
+                <w:noProof/>
+                <w:webHidden/>
+              </w:rPr>
+              <w:fldChar w:fldCharType="separate"/>
+            </w:r>
+            <w:r>
+              <w:rPr>
+                <w:noProof/>
+                <w:webHidden/>
+              </w:rPr>
+              <w:t>4</w:t>
+            </w:r>
+            <w:r>
+              <w:rPr>
+                <w:noProof/>
+                <w:webHidden/>
+              </w:rPr>
+              <w:fldChar w:fldCharType="end"/>
+            </w:r>
+          </w:hyperlink>
+        </w:p>
+        <w:p>
+          <w:pPr>
+            <w:pStyle w:val="TOC1"/>
+            <w:tabs>
+              <w:tab w:val="left" w:pos="480"/>
+              <w:tab w:val="right" w:leader="dot" w:pos="9016"/>
+            </w:tabs>
+            <w:rPr>
+              <w:rFonts w:eastAsiaTheme="minorEastAsia"/>
+              <w:noProof/>
+              <w:sz w:val="24"/>
+              <w:szCs w:val="24"/>
+              <w:lang w:eastAsia="en-IE"/>
+            </w:rPr>
+          </w:pPr>
+          <w:hyperlink w:anchor="_Toc242954059" w:history="1">
+            <w:r>
+              <w:rPr>
+                <w:rStyle w:val="Hyperlink"/>
+                <w:noProof/>
+              </w:rPr>
+              <w:t>3</w:t>
+            </w:r>
+            <w:r>
+              <w:rPr>
+                <w:rFonts w:eastAsiaTheme="minorEastAsia"/>
+                <w:noProof/>
+                <w:sz w:val="24"/>
+                <w:szCs w:val="24"/>
+                <w:lang w:eastAsia="en-IE"/>
+              </w:rPr>
+              <w:tab/>
+            </w:r>
+            <w:r>
+              <w:rPr>
+                <w:rStyle w:val="Hyperlink"/>
+                <w:noProof/>
+              </w:rPr>
+              <w:t>Problem Definition</w:t>
+            </w:r>
+            <w:r>
+              <w:rPr>
+                <w:noProof/>
+                <w:webHidden/>
+              </w:rPr>
+              <w:tab/>
+            </w:r>
+            <w:r>
+              <w:rPr>
+                <w:noProof/>
+                <w:webHidden/>
+              </w:rPr>
+              <w:fldChar w:fldCharType="begin"/>
+            </w:r>
+            <w:r>
+              <w:rPr>
+                <w:noProof/>
+                <w:webHidden/>
+              </w:rPr>
+              <w:instrText xml:space="preserve"> PAGEREF _Toc242954059 \h </w:instrText>
+            </w:r>
+            <w:r>
+              <w:rPr>
+                <w:noProof/>
+                <w:webHidden/>
+              </w:rPr>
+            </w:r>
+            <w:r>
+              <w:rPr>
+                <w:noProof/>
+                <w:webHidden/>
+              </w:rPr>
+              <w:fldChar w:fldCharType="separate"/>
+            </w:r>
+            <w:r>
+              <w:rPr>
+                <w:noProof/>
+                <w:webHidden/>
+              </w:rPr>
+              <w:t>4</w:t>
+            </w:r>
+            <w:r>
+              <w:rPr>
+                <w:noProof/>
+                <w:webHidden/>
+              </w:rPr>
+              <w:fldChar w:fldCharType="end"/>
+            </w:r>
+          </w:hyperlink>
+        </w:p>
+        <w:p>
+          <w:pPr>
+            <w:pStyle w:val="TOC1"/>
+            <w:tabs>
+              <w:tab w:val="left" w:pos="480"/>
+              <w:tab w:val="right" w:leader="dot" w:pos="9016"/>
+            </w:tabs>
+            <w:rPr>
+              <w:rFonts w:eastAsiaTheme="minorEastAsia"/>
+              <w:noProof/>
+              <w:sz w:val="24"/>
+              <w:szCs w:val="24"/>
+              <w:lang w:eastAsia="en-IE"/>
+            </w:rPr>
+          </w:pPr>
+          <w:hyperlink w:anchor="_Toc242954060" w:history="1">
+            <w:r>
+              <w:rPr>
+                <w:rStyle w:val="Hyperlink"/>
+                <w:noProof/>
+              </w:rPr>
+              <w:t>4</w:t>
+            </w:r>
+            <w:r>
+              <w:rPr>
+                <w:rFonts w:eastAsiaTheme="minorEastAsia"/>
+                <w:noProof/>
+                <w:sz w:val="24"/>
+                <w:szCs w:val="24"/>
+                <w:lang w:eastAsia="en-IE"/>
+              </w:rPr>
+              <w:tab/>
+            </w:r>
+            <w:r>
+              <w:rPr>
+                <w:rStyle w:val="Hyperlink"/>
+                <w:noProof/>
+              </w:rPr>
+              <w:t>Aim and Objectives</w:t>
+            </w:r>
+            <w:r>
+              <w:rPr>
+                <w:noProof/>
+                <w:webHidden/>
+              </w:rPr>
+              <w:tab/>
+            </w:r>
+            <w:r>
+              <w:rPr>
+                <w:noProof/>
+                <w:webHidden/>
+              </w:rPr>
+              <w:fldChar w:fldCharType="begin"/>
+            </w:r>
+            <w:r>
+              <w:rPr>
+                <w:noProof/>
+                <w:webHidden/>
+              </w:rPr>
+              <w:instrText xml:space="preserve"> PAGEREF _Toc242954060 \h </w:instrText>
+            </w:r>
+            <w:r>
+              <w:rPr>
+                <w:noProof/>
+                <w:webHidden/>
+              </w:rPr>
+            </w:r>
+            <w:r>
+              <w:rPr>
+                <w:noProof/>
+                <w:webHidden/>
+              </w:rPr>
+              <w:fldChar w:fldCharType="separate"/>
+            </w:r>
+            <w:r>
+              <w:rPr>
+                <w:noProof/>
+                <w:webHidden/>
+              </w:rPr>
+              <w:t>5</w:t>
+            </w:r>
+            <w:r>
+              <w:rPr>
+                <w:noProof/>
+                <w:webHidden/>
+              </w:rPr>
+              <w:fldChar w:fldCharType="end"/>
+            </w:r>
+          </w:hyperlink>
+        </w:p>
+        <w:p>
+          <w:pPr>
+            <w:pStyle w:val="TOC1"/>
+            <w:tabs>
+              <w:tab w:val="left" w:pos="480"/>
+              <w:tab w:val="right" w:leader="dot" w:pos="9016"/>
+            </w:tabs>
+            <w:rPr>
+              <w:rFonts w:eastAsiaTheme="minorEastAsia"/>
+              <w:noProof/>
+              <w:sz w:val="24"/>
+              <w:szCs w:val="24"/>
+              <w:lang w:eastAsia="en-IE"/>
+            </w:rPr>
+          </w:pPr>
+          <w:hyperlink w:anchor="_Toc242954061" w:history="1">
+            <w:r>
+              <w:rPr>
+                <w:rStyle w:val="Hyperlink"/>
+                <w:noProof/>
+              </w:rPr>
+              <w:t>5</w:t>
+            </w:r>
+            <w:r>
+              <w:rPr>
+                <w:rFonts w:eastAsiaTheme="minorEastAsia"/>
+                <w:noProof/>
+                <w:sz w:val="24"/>
+                <w:szCs w:val="24"/>
+                <w:lang w:eastAsia="en-IE"/>
+              </w:rPr>
+              <w:tab/>
+            </w:r>
+            <w:r>
+              <w:rPr>
+                <w:rStyle w:val="Hyperlink"/>
+                <w:noProof/>
+              </w:rPr>
+              <w:t>Scope</w:t>
+            </w:r>
+            <w:r>
+              <w:rPr>
+                <w:noProof/>
+                <w:webHidden/>
+              </w:rPr>
+              <w:tab/>
+            </w:r>
+            <w:r>
+              <w:rPr>
+                <w:noProof/>
+                <w:webHidden/>
+              </w:rPr>
+              <w:fldChar w:fldCharType="begin"/>
+            </w:r>
+            <w:r>
+              <w:rPr>
+                <w:noProof/>
+                <w:webHidden/>
+              </w:rPr>
+              <w:instrText xml:space="preserve"> PAGEREF _Toc242954061 \h </w:instrText>
+            </w:r>
+            <w:r>
+              <w:rPr>
+                <w:noProof/>
+                <w:webHidden/>
+              </w:rPr>
+            </w:r>
+            <w:r>
+              <w:rPr>
+                <w:noProof/>
+                <w:webHidden/>
+              </w:rPr>
+              <w:fldChar w:fldCharType="separate"/>
+            </w:r>
+            <w:r>
+              <w:rPr>
+                <w:noProof/>
+                <w:webHidden/>
+              </w:rPr>
+              <w:t>5</w:t>
+            </w:r>
+            <w:r>
+              <w:rPr>
+                <w:noProof/>
+                <w:webHidden/>
+              </w:rPr>
+              <w:fldChar w:fldCharType="end"/>
+            </w:r>
+          </w:hyperlink>
+        </w:p>
+        <w:p>
+          <w:pPr>
+            <w:rPr>
+              <w:ins w:id="10" w:author="Rohit Singh" w:date="2026-10-15T10:54:00Z" w16du:dateUtc="2026-10-15T09:54:00Z"/>
+            </w:rPr>
+          </w:pPr>
+          <w:ins w:id="11" w:author="Rohit Singh" w:date="2026-10-15T10:54:00Z" w16du:dateUtc="2026-10-15T09:54:00Z">
+            <w:r>
+              <w:rPr>
+                <w:b/>
+                <w:bCs/>
+                <w:noProof/>
+              </w:rPr>
+              <w:fldChar w:fldCharType="end"/>
+            </w:r>
+          </w:ins>
+        </w:p>
+        <w:customXmlInsRangeStart w:id="12" w:author="Rohit Singh" w:date="2026-10-15T10:54:00Z"/>
+      </w:sdtContent>
+    </w:sdt>
+    <w:customXmlInsRangeEnd w:id="12"/>
+    <w:p>
+      <w:pPr>
+        <w:rPr>
+          <w:ins w:id="13" w:author="Rohit Singh" w:date="2026-10-15T10:54:00Z" w16du:dateUtc="2026-10-15T09:54:00Z"/>
+          <w:rFonts w:asciiTheme="majorHAnsi" w:eastAsiaTheme="majorEastAsia" w:hAnsiTheme="majorHAnsi" w:cstheme="majorBidi"/>
+          <w:color w:val="0F4761" w:themeColor="accent1" w:themeShade="BF"/>
+          <w:sz w:val="40"/>
+          <w:szCs w:val="40"/>
+        </w:rPr>
+      </w:pPr>
+      <w:bookmarkStart w:id="14" w:name="_Toc242954056"/>
+      <w:ins w:id="15" w:author="Rohit Singh" w:date="2026-10-15T10:54:00Z" w16du:dateUtc="2026-10-15T09:54:00Z">
+        <w:r>
+          <w:br w:type="page"/>
+        </w:r>
+      </w:ins>
     </w:p>
     <w:p>
       <w:pPr>
@@ -1100,35 +1669,36 @@
         <w:lastRenderedPageBreak/>
         <w:t>Project Title</w:t>
       </w:r>
+      <w:bookmarkEnd w:id="14"/>
     </w:p>
     <w:p>
       <w:pPr>
         <w:rPr>
           <w:b/>
           <w:bCs/>
-          <w:rPrChange w:id="0" w:author="Rohit Singh" w:date="2026-10-12T21:32:00Z" w16du:dateUtc="2026-10-12T20:32:00Z">
+          <w:rPrChange w:id="16" w:author="Rohit Singh" w:date="2026-10-12T21:32:00Z" w16du:dateUtc="2026-10-12T20:32:00Z">
             <w:rPr/>
           </w:rPrChange>
         </w:rPr>
       </w:pPr>
-      <w:ins w:id="1" w:author="Rohit Singh" w:date="2026-10-12T21:30:00Z" w16du:dateUtc="2026-10-12T20:30:00Z">
+      <w:ins w:id="17" w:author="Rohit Singh" w:date="2026-10-12T21:30:00Z" w16du:dateUtc="2026-10-12T20:30:00Z">
         <w:r>
           <w:rPr>
             <w:b/>
             <w:bCs/>
-            <w:rPrChange w:id="2" w:author="Rohit Singh" w:date="2026-10-12T21:32:00Z" w16du:dateUtc="2026-10-12T20:32:00Z">
+            <w:rPrChange w:id="18" w:author="Rohit Singh" w:date="2026-10-12T21:32:00Z" w16du:dateUtc="2026-10-12T20:32:00Z">
               <w:rPr/>
             </w:rPrChange>
           </w:rPr>
           <w:t>Predictive Analytics for Electric Vehicle Charging Infrastructur</w:t>
         </w:r>
       </w:ins>
-      <w:ins w:id="3" w:author="Rohit Singh" w:date="2026-10-12T21:31:00Z" w16du:dateUtc="2026-10-12T20:31:00Z">
+      <w:ins w:id="19" w:author="Rohit Singh" w:date="2026-10-12T21:31:00Z" w16du:dateUtc="2026-10-12T20:31:00Z">
         <w:r>
           <w:rPr>
             <w:b/>
             <w:bCs/>
-            <w:rPrChange w:id="4" w:author="Rohit Singh" w:date="2026-10-12T21:32:00Z" w16du:dateUtc="2026-10-12T20:32:00Z">
+            <w:rPrChange w:id="20" w:author="Rohit Singh" w:date="2026-10-12T21:32:00Z" w16du:dateUtc="2026-10-12T20:32:00Z">
               <w:rPr/>
             </w:rPrChange>
           </w:rPr>
@@ -1138,7 +1708,7 @@
           <w:rPr>
             <w:b/>
             <w:bCs/>
-            <w:rPrChange w:id="5" w:author="Rohit Singh" w:date="2026-10-12T21:32:00Z" w16du:dateUtc="2026-10-12T20:32:00Z">
+            <w:rPrChange w:id="21" w:author="Rohit Singh" w:date="2026-10-12T21:32:00Z" w16du:dateUtc="2026-10-12T20:32:00Z">
               <w:rPr/>
             </w:rPrChange>
           </w:rPr>
@@ -1158,17 +1728,19 @@
       <w:pPr>
         <w:pStyle w:val="Heading1"/>
       </w:pPr>
+      <w:bookmarkStart w:id="22" w:name="_Toc242954057"/>
       <w:r>
         <w:t>Introduction</w:t>
       </w:r>
+      <w:bookmarkEnd w:id="22"/>
     </w:p>
     <w:p>
       <w:pPr>
         <w:rPr>
-          <w:ins w:id="6" w:author="Rohit Singh" w:date="2026-10-12T21:32:00Z" w16du:dateUtc="2026-10-12T20:32:00Z"/>
+          <w:ins w:id="23" w:author="Rohit Singh" w:date="2026-10-12T21:32:00Z" w16du:dateUtc="2026-10-12T20:32:00Z"/>
         </w:rPr>
       </w:pPr>
-      <w:ins w:id="7" w:author="Rohit Singh" w:date="2026-10-12T21:32:00Z" w16du:dateUtc="2026-10-12T20:32:00Z">
+      <w:ins w:id="24" w:author="Rohit Singh" w:date="2026-10-12T21:32:00Z" w16du:dateUtc="2026-10-12T20:32:00Z">
         <w:r>
           <w:t>Ireland’s Climate Action Plan sets an ambitious target of transitioning to sustainable transportation, targeting over 950,000 electric vehicles (EVs) on Irish roads by 2030. Achieving this target requires a proportional expansion of robust, accessible, and reliably placed public charging infrastructure across all local electoral areas and municipal regions.</w:t>
         </w:r>
@@ -1177,10 +1749,10 @@
     <w:p>
       <w:pPr>
         <w:rPr>
-          <w:ins w:id="8" w:author="Rohit Singh" w:date="2026-10-12T21:32:00Z" w16du:dateUtc="2026-10-12T20:32:00Z"/>
+          <w:ins w:id="25" w:author="Rohit Singh" w:date="2026-10-12T21:32:00Z" w16du:dateUtc="2026-10-12T20:32:00Z"/>
         </w:rPr>
       </w:pPr>
-      <w:ins w:id="9" w:author="Rohit Singh" w:date="2026-10-12T21:32:00Z" w16du:dateUtc="2026-10-12T20:32:00Z">
+      <w:ins w:id="26" w:author="Rohit Singh" w:date="2026-10-12T21:32:00Z" w16du:dateUtc="2026-10-12T20:32:00Z">
         <w:r>
           <w:t>Currently, local authorities, energy providers, and private operators face significant challenges in determining optimal geographic and capacity allocation for new EV charging stations. Misalignments between rapid vehicle adoption and infrastructure deployment result in severe localized congestion in high-adoption zones and underutilized capital investments in lower-demand corridors.</w:t>
         </w:r>
@@ -1189,10 +1761,10 @@
     <w:p>
       <w:pPr>
         <w:rPr>
-          <w:ins w:id="10" w:author="Rohit Singh" w:date="2026-10-12T21:32:00Z" w16du:dateUtc="2026-10-12T20:32:00Z"/>
+          <w:ins w:id="27" w:author="Rohit Singh" w:date="2026-10-12T21:32:00Z" w16du:dateUtc="2026-10-12T20:32:00Z"/>
         </w:rPr>
       </w:pPr>
-      <w:ins w:id="11" w:author="Rohit Singh" w:date="2026-10-12T21:32:00Z" w16du:dateUtc="2026-10-12T20:32:00Z">
+      <w:ins w:id="28" w:author="Rohit Singh" w:date="2026-10-12T21:32:00Z" w16du:dateUtc="2026-10-12T20:32:00Z">
         <w:r>
           <w:t>This project addresses this critical infrastructure gap through data analytics and predictive modelling. By synthesizing public vehicle registration statistics, demographic metrics, and spatial charging station locations published on the Irish open data portal (</w:t>
         </w:r>
@@ -1211,25 +1783,29 @@
     <w:p>
       <w:pPr>
         <w:rPr>
-          <w:del w:id="12" w:author="Rohit Singh" w:date="2026-10-12T21:32:00Z" w16du:dateUtc="2026-10-12T20:32:00Z"/>
+          <w:del w:id="29" w:author="Rohit Singh" w:date="2026-10-12T21:32:00Z" w16du:dateUtc="2026-10-12T20:32:00Z"/>
         </w:rPr>
       </w:pPr>
+      <w:bookmarkStart w:id="30" w:name="_Toc242954058"/>
+      <w:bookmarkEnd w:id="30"/>
     </w:p>
     <w:p>
       <w:pPr>
         <w:pStyle w:val="Heading1"/>
       </w:pPr>
+      <w:bookmarkStart w:id="31" w:name="_Toc242954059"/>
       <w:r>
         <w:t>Problem Definition</w:t>
       </w:r>
+      <w:bookmarkEnd w:id="31"/>
     </w:p>
     <w:p>
       <w:pPr>
         <w:rPr>
-          <w:ins w:id="13" w:author="Rohit Singh" w:date="2026-10-12T21:32:00Z" w16du:dateUtc="2026-10-12T20:32:00Z"/>
+          <w:ins w:id="32" w:author="Rohit Singh" w:date="2026-10-12T21:32:00Z" w16du:dateUtc="2026-10-12T20:32:00Z"/>
         </w:rPr>
       </w:pPr>
-      <w:ins w:id="14" w:author="Rohit Singh" w:date="2026-10-12T21:32:00Z" w16du:dateUtc="2026-10-12T20:32:00Z">
+      <w:ins w:id="33" w:author="Rohit Singh" w:date="2026-10-12T21:32:00Z" w16du:dateUtc="2026-10-12T20:32:00Z">
         <w:r>
           <w:t>The primary business problem investigated in this project is the lack of empirical, data-driven forecasting tools to guide public and private capital expenditure in EV charging infrastructure across Ireland.</w:t>
         </w:r>
@@ -1238,12 +1814,12 @@
     <w:p>
       <w:pPr>
         <w:rPr>
-          <w:ins w:id="15" w:author="Rohit Singh" w:date="2026-10-12T21:32:00Z" w16du:dateUtc="2026-10-12T20:32:00Z"/>
+          <w:ins w:id="34" w:author="Rohit Singh" w:date="2026-10-12T21:32:00Z" w16du:dateUtc="2026-10-12T20:32:00Z"/>
           <w:b/>
           <w:bCs/>
         </w:rPr>
       </w:pPr>
-      <w:ins w:id="16" w:author="Rohit Singh" w:date="2026-10-12T21:32:00Z" w16du:dateUtc="2026-10-12T20:32:00Z">
+      <w:ins w:id="35" w:author="Rohit Singh" w:date="2026-10-12T21:32:00Z" w16du:dateUtc="2026-10-12T20:32:00Z">
         <w:r>
           <w:rPr>
             <w:b/>
@@ -1260,10 +1836,10 @@
           <w:numId w:val="1"/>
         </w:numPr>
         <w:rPr>
-          <w:ins w:id="17" w:author="Rohit Singh" w:date="2026-10-12T21:32:00Z" w16du:dateUtc="2026-10-12T20:32:00Z"/>
+          <w:ins w:id="36" w:author="Rohit Singh" w:date="2026-10-12T21:32:00Z" w16du:dateUtc="2026-10-12T20:32:00Z"/>
         </w:rPr>
       </w:pPr>
-      <w:ins w:id="18" w:author="Rohit Singh" w:date="2026-10-12T21:32:00Z" w16du:dateUtc="2026-10-12T20:32:00Z">
+      <w:ins w:id="37" w:author="Rohit Singh" w:date="2026-10-12T21:32:00Z" w16du:dateUtc="2026-10-12T20:32:00Z">
         <w:r>
           <w:rPr>
             <w:b/>
@@ -1283,10 +1859,10 @@
           <w:numId w:val="1"/>
         </w:numPr>
         <w:rPr>
-          <w:ins w:id="19" w:author="Rohit Singh" w:date="2026-10-12T21:32:00Z" w16du:dateUtc="2026-10-12T20:32:00Z"/>
+          <w:ins w:id="38" w:author="Rohit Singh" w:date="2026-10-12T21:32:00Z" w16du:dateUtc="2026-10-12T20:32:00Z"/>
         </w:rPr>
       </w:pPr>
-      <w:ins w:id="20" w:author="Rohit Singh" w:date="2026-10-12T21:32:00Z" w16du:dateUtc="2026-10-12T20:32:00Z">
+      <w:ins w:id="39" w:author="Rohit Singh" w:date="2026-10-12T21:32:00Z" w16du:dateUtc="2026-10-12T20:32:00Z">
         <w:r>
           <w:rPr>
             <w:b/>
@@ -1306,10 +1882,10 @@
           <w:numId w:val="1"/>
         </w:numPr>
         <w:rPr>
-          <w:ins w:id="21" w:author="Rohit Singh" w:date="2026-10-12T21:32:00Z" w16du:dateUtc="2026-10-12T20:32:00Z"/>
+          <w:ins w:id="40" w:author="Rohit Singh" w:date="2026-10-12T21:32:00Z" w16du:dateUtc="2026-10-12T20:32:00Z"/>
         </w:rPr>
       </w:pPr>
-      <w:ins w:id="22" w:author="Rohit Singh" w:date="2026-10-12T21:32:00Z" w16du:dateUtc="2026-10-12T20:32:00Z">
+      <w:ins w:id="41" w:author="Rohit Singh" w:date="2026-10-12T21:32:00Z" w16du:dateUtc="2026-10-12T20:32:00Z">
         <w:r>
           <w:rPr>
             <w:b/>
@@ -1325,12 +1901,12 @@
     <w:p>
       <w:pPr>
         <w:rPr>
-          <w:ins w:id="23" w:author="Rohit Singh" w:date="2026-10-12T21:32:00Z" w16du:dateUtc="2026-10-12T20:32:00Z"/>
+          <w:ins w:id="42" w:author="Rohit Singh" w:date="2026-10-12T21:32:00Z" w16du:dateUtc="2026-10-12T20:32:00Z"/>
           <w:b/>
           <w:bCs/>
         </w:rPr>
       </w:pPr>
-      <w:ins w:id="24" w:author="Rohit Singh" w:date="2026-10-12T21:32:00Z" w16du:dateUtc="2026-10-12T20:32:00Z">
+      <w:ins w:id="43" w:author="Rohit Singh" w:date="2026-10-12T21:32:00Z" w16du:dateUtc="2026-10-12T20:32:00Z">
         <w:r>
           <w:rPr>
             <w:b/>
@@ -1355,7 +1931,7 @@
       </w:ins>
     </w:p>
     <w:p>
-      <w:ins w:id="25" w:author="Rohit Singh" w:date="2026-10-12T21:32:00Z" w16du:dateUtc="2026-10-12T20:32:00Z">
+      <w:ins w:id="44" w:author="Rohit Singh" w:date="2026-10-12T21:32:00Z" w16du:dateUtc="2026-10-12T20:32:00Z">
         <w:r>
           <w:t xml:space="preserve">Data analytics allows stakeholders to transition from reactive installation policies to proactive, predictive deployment strategies. By analysing historical vehicle registration trends, county-level EV adoption rates, and existing spatial charger distributions, machine learning algorithms (e.g., Regression and Decision Tree models) can model complex non-linear relationships. These </w:t>
         </w:r>
@@ -1379,22 +1955,24 @@
       <w:pPr>
         <w:pStyle w:val="Heading1"/>
         <w:rPr>
-          <w:ins w:id="26" w:author="Rohit Singh" w:date="2026-10-15T10:35:00Z" w16du:dateUtc="2026-10-15T09:35:00Z"/>
+          <w:ins w:id="45" w:author="Rohit Singh" w:date="2026-10-15T10:35:00Z" w16du:dateUtc="2026-10-15T09:35:00Z"/>
         </w:rPr>
       </w:pPr>
+      <w:bookmarkStart w:id="46" w:name="_Toc242954060"/>
       <w:r>
         <w:t>Aim and Objectives</w:t>
       </w:r>
+      <w:bookmarkEnd w:id="46"/>
     </w:p>
     <w:p>
       <w:pPr>
         <w:rPr>
-          <w:ins w:id="27" w:author="Rohit Singh" w:date="2026-10-15T10:35:00Z" w16du:dateUtc="2026-10-15T09:35:00Z"/>
+          <w:ins w:id="47" w:author="Rohit Singh" w:date="2026-10-15T10:35:00Z" w16du:dateUtc="2026-10-15T09:35:00Z"/>
           <w:b/>
           <w:bCs/>
         </w:rPr>
       </w:pPr>
-      <w:ins w:id="28" w:author="Rohit Singh" w:date="2026-10-15T10:35:00Z" w16du:dateUtc="2026-10-15T09:35:00Z">
+      <w:ins w:id="48" w:author="Rohit Singh" w:date="2026-10-15T10:35:00Z" w16du:dateUtc="2026-10-15T09:35:00Z">
         <w:r>
           <w:rPr>
             <w:b/>
@@ -1407,10 +1985,10 @@
     <w:p>
       <w:pPr>
         <w:rPr>
-          <w:ins w:id="29" w:author="Rohit Singh" w:date="2026-10-15T10:35:00Z" w16du:dateUtc="2026-10-15T09:35:00Z"/>
+          <w:ins w:id="49" w:author="Rohit Singh" w:date="2026-10-15T10:35:00Z" w16du:dateUtc="2026-10-15T09:35:00Z"/>
         </w:rPr>
       </w:pPr>
-      <w:ins w:id="30" w:author="Rohit Singh" w:date="2026-10-15T10:35:00Z" w16du:dateUtc="2026-10-15T09:35:00Z">
+      <w:ins w:id="50" w:author="Rohit Singh" w:date="2026-10-15T10:35:00Z" w16du:dateUtc="2026-10-15T09:35:00Z">
         <w:r>
           <w:t>The overall aim of this project is to develop a predictive analytics model and interactive business intelligence solution that forecasts regional EV charging demand in Ireland, empowering public planners and commercial operators to optimize future infrastructure allocation.</w:t>
         </w:r>
@@ -1419,12 +1997,12 @@
     <w:p>
       <w:pPr>
         <w:rPr>
-          <w:ins w:id="31" w:author="Rohit Singh" w:date="2026-10-15T10:35:00Z" w16du:dateUtc="2026-10-15T09:35:00Z"/>
+          <w:ins w:id="51" w:author="Rohit Singh" w:date="2026-10-15T10:35:00Z" w16du:dateUtc="2026-10-15T09:35:00Z"/>
           <w:b/>
           <w:bCs/>
         </w:rPr>
       </w:pPr>
-      <w:ins w:id="32" w:author="Rohit Singh" w:date="2026-10-15T10:35:00Z" w16du:dateUtc="2026-10-15T09:35:00Z">
+      <w:ins w:id="52" w:author="Rohit Singh" w:date="2026-10-15T10:35:00Z" w16du:dateUtc="2026-10-15T09:35:00Z">
         <w:r>
           <w:rPr>
             <w:b/>
@@ -1441,10 +2019,10 @@
           <w:numId w:val="2"/>
         </w:numPr>
         <w:rPr>
-          <w:ins w:id="33" w:author="Rohit Singh" w:date="2026-10-15T10:35:00Z" w16du:dateUtc="2026-10-15T09:35:00Z"/>
+          <w:ins w:id="53" w:author="Rohit Singh" w:date="2026-10-15T10:35:00Z" w16du:dateUtc="2026-10-15T09:35:00Z"/>
         </w:rPr>
       </w:pPr>
-      <w:ins w:id="34" w:author="Rohit Singh" w:date="2026-10-15T10:35:00Z" w16du:dateUtc="2026-10-15T09:35:00Z">
+      <w:ins w:id="54" w:author="Rohit Singh" w:date="2026-10-15T10:35:00Z" w16du:dateUtc="2026-10-15T09:35:00Z">
         <w:r>
           <w:rPr>
             <w:b/>
@@ -1474,10 +2052,10 @@
           <w:numId w:val="2"/>
         </w:numPr>
         <w:rPr>
-          <w:ins w:id="35" w:author="Rohit Singh" w:date="2026-10-15T10:35:00Z" w16du:dateUtc="2026-10-15T09:35:00Z"/>
+          <w:ins w:id="55" w:author="Rohit Singh" w:date="2026-10-15T10:35:00Z" w16du:dateUtc="2026-10-15T09:35:00Z"/>
         </w:rPr>
       </w:pPr>
-      <w:ins w:id="36" w:author="Rohit Singh" w:date="2026-10-15T10:35:00Z" w16du:dateUtc="2026-10-15T09:35:00Z">
+      <w:ins w:id="56" w:author="Rohit Singh" w:date="2026-10-15T10:35:00Z" w16du:dateUtc="2026-10-15T09:35:00Z">
         <w:r>
           <w:rPr>
             <w:b/>
@@ -1497,10 +2075,10 @@
           <w:numId w:val="2"/>
         </w:numPr>
         <w:rPr>
-          <w:ins w:id="37" w:author="Rohit Singh" w:date="2026-10-15T10:35:00Z" w16du:dateUtc="2026-10-15T09:35:00Z"/>
+          <w:ins w:id="57" w:author="Rohit Singh" w:date="2026-10-15T10:35:00Z" w16du:dateUtc="2026-10-15T09:35:00Z"/>
         </w:rPr>
       </w:pPr>
-      <w:ins w:id="38" w:author="Rohit Singh" w:date="2026-10-15T10:35:00Z" w16du:dateUtc="2026-10-15T09:35:00Z">
+      <w:ins w:id="58" w:author="Rohit Singh" w:date="2026-10-15T10:35:00Z" w16du:dateUtc="2026-10-15T09:35:00Z">
         <w:r>
           <w:rPr>
             <w:b/>
@@ -1550,10 +2128,10 @@
           <w:numId w:val="2"/>
         </w:numPr>
         <w:rPr>
-          <w:ins w:id="39" w:author="Rohit Singh" w:date="2026-10-15T10:35:00Z" w16du:dateUtc="2026-10-15T09:35:00Z"/>
+          <w:ins w:id="59" w:author="Rohit Singh" w:date="2026-10-15T10:35:00Z" w16du:dateUtc="2026-10-15T09:35:00Z"/>
         </w:rPr>
       </w:pPr>
-      <w:ins w:id="40" w:author="Rohit Singh" w:date="2026-10-15T10:35:00Z" w16du:dateUtc="2026-10-15T09:35:00Z">
+      <w:ins w:id="60" w:author="Rohit Singh" w:date="2026-10-15T10:35:00Z" w16du:dateUtc="2026-10-15T09:35:00Z">
         <w:r>
           <w:rPr>
             <w:b/>
@@ -1562,7 +2140,15 @@
           <w:t>Predictive Model Development:</w:t>
         </w:r>
         <w:r>
-          <w:t xml:space="preserve"> Train, evaluate, and compare machine learning regression models (e.g., Multiple Linear Regression, Random Forest Regressor, XGBoost) to forecast county-level charging demand scores.</w:t>
+          <w:t xml:space="preserve"> Train, evaluate, and compare machine learning regression models (e.g., Multiple Linear Regression, Random Forest Regressor, </w:t>
+        </w:r>
+        <w:proofErr w:type="spellStart"/>
+        <w:r>
+          <w:t>XGBoost</w:t>
+        </w:r>
+        <w:proofErr w:type="spellEnd"/>
+        <w:r>
+          <w:t>) to forecast county-level charging demand scores.</w:t>
         </w:r>
       </w:ins>
     </w:p>
@@ -1573,10 +2159,10 @@
           <w:numId w:val="2"/>
         </w:numPr>
         <w:rPr>
-          <w:ins w:id="41" w:author="Rohit Singh" w:date="2026-10-15T10:35:00Z" w16du:dateUtc="2026-10-15T09:35:00Z"/>
+          <w:ins w:id="61" w:author="Rohit Singh" w:date="2026-10-15T10:35:00Z" w16du:dateUtc="2026-10-15T09:35:00Z"/>
         </w:rPr>
       </w:pPr>
-      <w:ins w:id="42" w:author="Rohit Singh" w:date="2026-10-15T10:35:00Z" w16du:dateUtc="2026-10-15T09:35:00Z">
+      <w:ins w:id="62" w:author="Rohit Singh" w:date="2026-10-15T10:35:00Z" w16du:dateUtc="2026-10-15T09:35:00Z">
         <w:r>
           <w:rPr>
             <w:b/>
@@ -1585,19 +2171,27 @@
           <w:t>Interactive Dashboard &amp; Delivery:</w:t>
         </w:r>
         <w:r>
-          <w:t xml:space="preserve"> Build an interactive business intelligence dashboard (Power BI/Streamlit) that visualizes predicted demand, identifies underserved regions, and provides scenario-based planning tools for stakeholders.</w:t>
+          <w:t xml:space="preserve"> Build an interactive business intelligence dashboard (Power BI/</w:t>
+        </w:r>
+        <w:proofErr w:type="spellStart"/>
+        <w:r>
+          <w:t>Streamlit</w:t>
+        </w:r>
+        <w:proofErr w:type="spellEnd"/>
+        <w:r>
+          <w:t>) that visualizes predicted demand, identifies underserved regions, and provides scenario-based planning tools for stakeholders.</w:t>
         </w:r>
       </w:ins>
     </w:p>
     <w:p>
       <w:pPr>
         <w:rPr>
-          <w:ins w:id="43" w:author="Rohit Singh" w:date="2026-10-15T10:35:00Z" w16du:dateUtc="2026-10-15T09:35:00Z"/>
+          <w:ins w:id="63" w:author="Rohit Singh" w:date="2026-10-15T10:35:00Z" w16du:dateUtc="2026-10-15T09:35:00Z"/>
           <w:b/>
           <w:bCs/>
         </w:rPr>
       </w:pPr>
-      <w:ins w:id="44" w:author="Rohit Singh" w:date="2026-10-15T10:35:00Z" w16du:dateUtc="2026-10-15T09:35:00Z">
+      <w:ins w:id="64" w:author="Rohit Singh" w:date="2026-10-15T10:35:00Z" w16du:dateUtc="2026-10-15T09:35:00Z">
         <w:r>
           <w:rPr>
             <w:b/>
@@ -1610,10 +2204,10 @@
     <w:p>
       <w:pPr>
         <w:rPr>
-          <w:ins w:id="45" w:author="Rohit Singh" w:date="2026-10-15T10:35:00Z" w16du:dateUtc="2026-10-15T09:35:00Z"/>
+          <w:ins w:id="65" w:author="Rohit Singh" w:date="2026-10-15T10:52:00Z" w16du:dateUtc="2026-10-15T09:52:00Z"/>
         </w:rPr>
       </w:pPr>
-      <w:ins w:id="46" w:author="Rohit Singh" w:date="2026-10-15T10:35:00Z" w16du:dateUtc="2026-10-15T09:35:00Z">
+      <w:ins w:id="66" w:author="Rohit Singh" w:date="2026-10-15T10:35:00Z" w16du:dateUtc="2026-10-15T09:35:00Z">
         <w:r>
           <w:rPr>
             <w:i/>
@@ -1638,12 +2232,22 @@
     </w:p>
     <w:p>
       <w:pPr>
-        <w:pPrChange w:id="47" w:author="Rohit Singh" w:date="2026-10-15T10:35:00Z" w16du:dateUtc="2026-10-15T09:35:00Z">
-          <w:pPr>
-            <w:pStyle w:val="Heading1"/>
-          </w:pPr>
-        </w:pPrChange>
-      </w:pPr>
+        <w:rPr>
+          <w:ins w:id="67" w:author="Rohit Singh" w:date="2026-10-15T10:52:00Z" w16du:dateUtc="2026-10-15T09:52:00Z"/>
+        </w:rPr>
+      </w:pPr>
+    </w:p>
+    <w:p>
+      <w:pPr>
+        <w:pStyle w:val="Heading1"/>
+      </w:pPr>
+      <w:bookmarkStart w:id="68" w:name="_Toc242954061"/>
+      <w:ins w:id="69" w:author="Rohit Singh" w:date="2026-10-15T10:52:00Z" w16du:dateUtc="2026-10-15T09:52:00Z">
+        <w:r>
+          <w:t>Scope</w:t>
+        </w:r>
+      </w:ins>
+      <w:bookmarkEnd w:id="68"/>
     </w:p>
     <w:sectPr>
       <w:pgSz w:w="11906" w:h="16838"/>

</xml_diff>

<commit_message>
Updated proposal document with content. Added section 5, 6, 7, 8 in the word document
Updated proposal document with content. Added section 5, 6, 7, 8 in the word document. Also included some diagrams in few of the sections.
</commit_message>
<xml_diff>
--- a/docs/sba26094_CA1_Strategic_Thinking_v1.docx
+++ b/docs/sba26094_CA1_Strategic_Thinking_v1.docx
@@ -650,7 +650,6 @@
                 <w:szCs w:val="32"/>
               </w:rPr>
             </w:pPr>
-            <w:proofErr w:type="spellStart"/>
             <w:r>
               <w:rPr>
                 <w:i/>
@@ -658,17 +657,7 @@
                 <w:sz w:val="32"/>
                 <w:szCs w:val="32"/>
               </w:rPr>
-              <w:t>Taufique</w:t>
-            </w:r>
-            <w:proofErr w:type="spellEnd"/>
-            <w:r>
-              <w:rPr>
-                <w:i/>
-                <w:color w:val="156082"/>
-                <w:sz w:val="32"/>
-                <w:szCs w:val="32"/>
-              </w:rPr>
-              <w:t xml:space="preserve"> Ahmed</w:t>
+              <w:t>Taufique Ahmed</w:t>
             </w:r>
           </w:p>
         </w:tc>
@@ -776,6 +765,28 @@
                 <w:szCs w:val="32"/>
               </w:rPr>
             </w:pPr>
+            <w:del w:id="0" w:author="Rohit Singh" w:date="2026-10-20T22:37:00Z" w16du:dateUtc="2026-10-20T21:37:00Z">
+              <w:r>
+                <w:rPr>
+                  <w:i/>
+                  <w:color w:val="156082"/>
+                  <w:sz w:val="32"/>
+                  <w:szCs w:val="32"/>
+                </w:rPr>
+                <w:delText>__</w:delText>
+              </w:r>
+            </w:del>
+            <w:ins w:id="1" w:author="Rohit Singh" w:date="2026-10-20T22:37:00Z" w16du:dateUtc="2026-10-20T21:37:00Z">
+              <w:r>
+                <w:rPr>
+                  <w:i/>
+                  <w:color w:val="156082"/>
+                  <w:sz w:val="32"/>
+                  <w:szCs w:val="32"/>
+                </w:rPr>
+                <w:t>23</w:t>
+              </w:r>
+            </w:ins>
             <w:r>
               <w:rPr>
                 <w:i/>
@@ -783,7 +794,7 @@
                 <w:sz w:val="32"/>
                 <w:szCs w:val="32"/>
               </w:rPr>
-              <w:t>__/10/2026</w:t>
+              <w:t>/10/2026</w:t>
             </w:r>
           </w:p>
         </w:tc>
@@ -1101,10 +1112,10 @@
     <w:p>
       <w:pPr>
         <w:rPr>
-          <w:del w:id="0" w:author="Rohit Singh" w:date="2026-10-15T10:54:00Z" w16du:dateUtc="2026-10-15T09:54:00Z"/>
-        </w:rPr>
-      </w:pPr>
-      <w:del w:id="1" w:author="Rohit Singh" w:date="2026-10-15T10:54:00Z" w16du:dateUtc="2026-10-15T09:54:00Z">
+          <w:del w:id="2" w:author="Rohit Singh" w:date="2026-10-15T10:54:00Z" w16du:dateUtc="2026-10-15T09:54:00Z"/>
+        </w:rPr>
+      </w:pPr>
+      <w:del w:id="3" w:author="Rohit Singh" w:date="2026-10-15T10:54:00Z" w16du:dateUtc="2026-10-15T09:54:00Z">
         <w:r>
           <w:br w:type="page"/>
         </w:r>
@@ -1113,21 +1124,21 @@
     <w:p>
       <w:pPr>
         <w:rPr>
-          <w:del w:id="2" w:author="Rohit Singh" w:date="2026-10-15T10:54:00Z" w16du:dateUtc="2026-10-15T09:54:00Z"/>
-        </w:rPr>
-        <w:pPrChange w:id="3" w:author="Rohit Singh" w:date="2026-10-15T10:54:00Z" w16du:dateUtc="2026-10-15T09:54:00Z">
+          <w:del w:id="4" w:author="Rohit Singh" w:date="2026-10-15T10:54:00Z" w16du:dateUtc="2026-10-15T09:54:00Z"/>
+        </w:rPr>
+        <w:pPrChange w:id="5" w:author="Rohit Singh" w:date="2026-10-15T10:54:00Z" w16du:dateUtc="2026-10-15T09:54:00Z">
           <w:pPr>
             <w:pStyle w:val="TOCHeading"/>
           </w:pPr>
         </w:pPrChange>
       </w:pPr>
-      <w:ins w:id="4" w:author="Rohit Singh" w:date="2026-10-15T10:53:00Z" w16du:dateUtc="2026-10-15T09:53:00Z">
+      <w:ins w:id="6" w:author="Rohit Singh" w:date="2026-10-15T10:53:00Z" w16du:dateUtc="2026-10-15T09:53:00Z">
         <w:r>
           <w:br w:type="page"/>
         </w:r>
       </w:ins>
     </w:p>
-    <w:customXmlInsRangeStart w:id="5" w:author="Rohit Singh" w:date="2026-10-15T10:54:00Z"/>
+    <w:customXmlInsRangeStart w:id="7" w:author="Rohit Singh" w:date="2026-10-15T10:54:00Z"/>
     <w:sdt>
       <w:sdtPr>
         <w:id w:val="1905797357"/>
@@ -1144,19 +1155,19 @@
         </w:rPr>
       </w:sdtEndPr>
       <w:sdtContent>
-        <w:customXmlInsRangeEnd w:id="5"/>
+        <w:customXmlInsRangeEnd w:id="7"/>
         <w:p>
           <w:pPr>
             <w:rPr>
-              <w:ins w:id="6" w:author="Rohit Singh" w:date="2026-10-15T10:54:00Z" w16du:dateUtc="2026-10-15T09:54:00Z"/>
+              <w:ins w:id="8" w:author="Rohit Singh" w:date="2026-10-15T10:54:00Z" w16du:dateUtc="2026-10-15T09:54:00Z"/>
             </w:rPr>
-            <w:pPrChange w:id="7" w:author="Rohit Singh" w:date="2026-10-15T10:54:00Z" w16du:dateUtc="2026-10-15T09:54:00Z">
+            <w:pPrChange w:id="9" w:author="Rohit Singh" w:date="2026-10-15T10:54:00Z" w16du:dateUtc="2026-10-15T09:54:00Z">
               <w:pPr>
                 <w:pStyle w:val="TOCHeading"/>
               </w:pPr>
             </w:pPrChange>
           </w:pPr>
-          <w:ins w:id="8" w:author="Rohit Singh" w:date="2026-10-15T10:54:00Z" w16du:dateUtc="2026-10-15T09:54:00Z">
+          <w:ins w:id="10" w:author="Rohit Singh" w:date="2026-10-15T10:54:00Z" w16du:dateUtc="2026-10-15T09:54:00Z">
             <w:r>
               <w:t>Contents</w:t>
             </w:r>
@@ -1177,7 +1188,7 @@
               <w:lang w:eastAsia="en-IE"/>
             </w:rPr>
           </w:pPr>
-          <w:ins w:id="9" w:author="Rohit Singh" w:date="2026-10-15T10:54:00Z" w16du:dateUtc="2026-10-15T09:54:00Z">
+          <w:ins w:id="11" w:author="Rohit Singh" w:date="2026-10-15T10:54:00Z" w16du:dateUtc="2026-10-15T09:54:00Z">
             <w:r>
               <w:fldChar w:fldCharType="begin"/>
             </w:r>
@@ -1626,10 +1637,10 @@
         <w:p>
           <w:pPr>
             <w:rPr>
-              <w:ins w:id="10" w:author="Rohit Singh" w:date="2026-10-15T10:54:00Z" w16du:dateUtc="2026-10-15T09:54:00Z"/>
+              <w:ins w:id="12" w:author="Rohit Singh" w:date="2026-10-15T10:54:00Z" w16du:dateUtc="2026-10-15T09:54:00Z"/>
             </w:rPr>
           </w:pPr>
-          <w:ins w:id="11" w:author="Rohit Singh" w:date="2026-10-15T10:54:00Z" w16du:dateUtc="2026-10-15T09:54:00Z">
+          <w:ins w:id="13" w:author="Rohit Singh" w:date="2026-10-15T10:54:00Z" w16du:dateUtc="2026-10-15T09:54:00Z">
             <w:r>
               <w:rPr>
                 <w:b/>
@@ -1640,22 +1651,22 @@
             </w:r>
           </w:ins>
         </w:p>
-        <w:customXmlInsRangeStart w:id="12" w:author="Rohit Singh" w:date="2026-10-15T10:54:00Z"/>
+        <w:customXmlInsRangeStart w:id="14" w:author="Rohit Singh" w:date="2026-10-15T10:54:00Z"/>
       </w:sdtContent>
     </w:sdt>
-    <w:customXmlInsRangeEnd w:id="12"/>
-    <w:p>
-      <w:pPr>
-        <w:rPr>
-          <w:ins w:id="13" w:author="Rohit Singh" w:date="2026-10-15T10:54:00Z" w16du:dateUtc="2026-10-15T09:54:00Z"/>
+    <w:customXmlInsRangeEnd w:id="14"/>
+    <w:p>
+      <w:pPr>
+        <w:rPr>
+          <w:ins w:id="15" w:author="Rohit Singh" w:date="2026-10-15T10:54:00Z" w16du:dateUtc="2026-10-15T09:54:00Z"/>
           <w:rFonts w:asciiTheme="majorHAnsi" w:eastAsiaTheme="majorEastAsia" w:hAnsiTheme="majorHAnsi" w:cstheme="majorBidi"/>
           <w:color w:val="0F4761" w:themeColor="accent1" w:themeShade="BF"/>
           <w:sz w:val="40"/>
           <w:szCs w:val="40"/>
         </w:rPr>
       </w:pPr>
-      <w:bookmarkStart w:id="14" w:name="_Toc242954056"/>
-      <w:ins w:id="15" w:author="Rohit Singh" w:date="2026-10-15T10:54:00Z" w16du:dateUtc="2026-10-15T09:54:00Z">
+      <w:bookmarkStart w:id="16" w:name="_Toc242954056"/>
+      <w:ins w:id="17" w:author="Rohit Singh" w:date="2026-10-15T10:54:00Z" w16du:dateUtc="2026-10-15T09:54:00Z">
         <w:r>
           <w:br w:type="page"/>
         </w:r>
@@ -1669,31 +1680,19 @@
         <w:lastRenderedPageBreak/>
         <w:t>Project Title</w:t>
       </w:r>
-      <w:bookmarkEnd w:id="14"/>
+      <w:bookmarkEnd w:id="16"/>
     </w:p>
     <w:p>
       <w:pPr>
         <w:rPr>
           <w:b/>
           <w:bCs/>
-          <w:rPrChange w:id="16" w:author="Rohit Singh" w:date="2026-10-12T21:32:00Z" w16du:dateUtc="2026-10-12T20:32:00Z">
+          <w:rPrChange w:id="18" w:author="Rohit Singh" w:date="2026-10-12T21:32:00Z" w16du:dateUtc="2026-10-12T20:32:00Z">
             <w:rPr/>
           </w:rPrChange>
         </w:rPr>
       </w:pPr>
-      <w:ins w:id="17" w:author="Rohit Singh" w:date="2026-10-12T21:30:00Z" w16du:dateUtc="2026-10-12T20:30:00Z">
-        <w:r>
-          <w:rPr>
-            <w:b/>
-            <w:bCs/>
-            <w:rPrChange w:id="18" w:author="Rohit Singh" w:date="2026-10-12T21:32:00Z" w16du:dateUtc="2026-10-12T20:32:00Z">
-              <w:rPr/>
-            </w:rPrChange>
-          </w:rPr>
-          <w:t>Predictive Analytics for Electric Vehicle Charging Infrastructur</w:t>
-        </w:r>
-      </w:ins>
-      <w:ins w:id="19" w:author="Rohit Singh" w:date="2026-10-12T21:31:00Z" w16du:dateUtc="2026-10-12T20:31:00Z">
+      <w:ins w:id="19" w:author="Rohit Singh" w:date="2026-10-12T21:30:00Z" w16du:dateUtc="2026-10-12T20:30:00Z">
         <w:r>
           <w:rPr>
             <w:b/>
@@ -1702,16 +1701,28 @@
               <w:rPr/>
             </w:rPrChange>
           </w:rPr>
-          <w:t>e</w:t>
-        </w:r>
+          <w:t>Predictive Analytics for Electric Vehicle Charging Infrastructur</w:t>
+        </w:r>
+      </w:ins>
+      <w:ins w:id="21" w:author="Rohit Singh" w:date="2026-10-12T21:31:00Z" w16du:dateUtc="2026-10-12T20:31:00Z">
         <w:r>
           <w:rPr>
             <w:b/>
             <w:bCs/>
-            <w:rPrChange w:id="21" w:author="Rohit Singh" w:date="2026-10-12T21:32:00Z" w16du:dateUtc="2026-10-12T20:32:00Z">
+            <w:rPrChange w:id="22" w:author="Rohit Singh" w:date="2026-10-12T21:32:00Z" w16du:dateUtc="2026-10-12T20:32:00Z">
               <w:rPr/>
             </w:rPrChange>
           </w:rPr>
+          <w:t>e</w:t>
+        </w:r>
+        <w:r>
+          <w:rPr>
+            <w:b/>
+            <w:bCs/>
+            <w:rPrChange w:id="23" w:author="Rohit Singh" w:date="2026-10-12T21:32:00Z" w16du:dateUtc="2026-10-12T20:32:00Z">
+              <w:rPr/>
+            </w:rPrChange>
+          </w:rPr>
           <w:t>: Supporting Strategic Public-Private Planning in Ireland</w:t>
         </w:r>
       </w:ins>
@@ -1728,19 +1739,19 @@
       <w:pPr>
         <w:pStyle w:val="Heading1"/>
       </w:pPr>
-      <w:bookmarkStart w:id="22" w:name="_Toc242954057"/>
+      <w:bookmarkStart w:id="24" w:name="_Toc242954057"/>
       <w:r>
         <w:t>Introduction</w:t>
       </w:r>
-      <w:bookmarkEnd w:id="22"/>
-    </w:p>
-    <w:p>
-      <w:pPr>
-        <w:rPr>
-          <w:ins w:id="23" w:author="Rohit Singh" w:date="2026-10-12T21:32:00Z" w16du:dateUtc="2026-10-12T20:32:00Z"/>
-        </w:rPr>
-      </w:pPr>
-      <w:ins w:id="24" w:author="Rohit Singh" w:date="2026-10-12T21:32:00Z" w16du:dateUtc="2026-10-12T20:32:00Z">
+      <w:bookmarkEnd w:id="24"/>
+    </w:p>
+    <w:p>
+      <w:pPr>
+        <w:rPr>
+          <w:ins w:id="25" w:author="Rohit Singh" w:date="2026-10-12T21:32:00Z" w16du:dateUtc="2026-10-12T20:32:00Z"/>
+        </w:rPr>
+      </w:pPr>
+      <w:ins w:id="26" w:author="Rohit Singh" w:date="2026-10-12T21:32:00Z" w16du:dateUtc="2026-10-12T20:32:00Z">
         <w:r>
           <w:t>Ireland’s Climate Action Plan sets an ambitious target of transitioning to sustainable transportation, targeting over 950,000 electric vehicles (EVs) on Irish roads by 2030. Achieving this target requires a proportional expansion of robust, accessible, and reliably placed public charging infrastructure across all local electoral areas and municipal regions.</w:t>
         </w:r>
@@ -1749,10 +1760,10 @@
     <w:p>
       <w:pPr>
         <w:rPr>
-          <w:ins w:id="25" w:author="Rohit Singh" w:date="2026-10-12T21:32:00Z" w16du:dateUtc="2026-10-12T20:32:00Z"/>
-        </w:rPr>
-      </w:pPr>
-      <w:ins w:id="26" w:author="Rohit Singh" w:date="2026-10-12T21:32:00Z" w16du:dateUtc="2026-10-12T20:32:00Z">
+          <w:ins w:id="27" w:author="Rohit Singh" w:date="2026-10-12T21:32:00Z" w16du:dateUtc="2026-10-12T20:32:00Z"/>
+        </w:rPr>
+      </w:pPr>
+      <w:ins w:id="28" w:author="Rohit Singh" w:date="2026-10-12T21:32:00Z" w16du:dateUtc="2026-10-12T20:32:00Z">
         <w:r>
           <w:t>Currently, local authorities, energy providers, and private operators face significant challenges in determining optimal geographic and capacity allocation for new EV charging stations. Misalignments between rapid vehicle adoption and infrastructure deployment result in severe localized congestion in high-adoption zones and underutilized capital investments in lower-demand corridors.</w:t>
         </w:r>
@@ -1761,10 +1772,10 @@
     <w:p>
       <w:pPr>
         <w:rPr>
-          <w:ins w:id="27" w:author="Rohit Singh" w:date="2026-10-12T21:32:00Z" w16du:dateUtc="2026-10-12T20:32:00Z"/>
-        </w:rPr>
-      </w:pPr>
-      <w:ins w:id="28" w:author="Rohit Singh" w:date="2026-10-12T21:32:00Z" w16du:dateUtc="2026-10-12T20:32:00Z">
+          <w:ins w:id="29" w:author="Rohit Singh" w:date="2026-10-12T21:32:00Z" w16du:dateUtc="2026-10-12T20:32:00Z"/>
+        </w:rPr>
+      </w:pPr>
+      <w:ins w:id="30" w:author="Rohit Singh" w:date="2026-10-12T21:32:00Z" w16du:dateUtc="2026-10-12T20:32:00Z">
         <w:r>
           <w:t>This project addresses this critical infrastructure gap through data analytics and predictive modelling. By synthesizing public vehicle registration statistics, demographic metrics, and spatial charging station locations published on the Irish open data portal (</w:t>
         </w:r>
@@ -1783,29 +1794,29 @@
     <w:p>
       <w:pPr>
         <w:rPr>
-          <w:del w:id="29" w:author="Rohit Singh" w:date="2026-10-12T21:32:00Z" w16du:dateUtc="2026-10-12T20:32:00Z"/>
-        </w:rPr>
-      </w:pPr>
-      <w:bookmarkStart w:id="30" w:name="_Toc242954058"/>
-      <w:bookmarkEnd w:id="30"/>
+          <w:del w:id="31" w:author="Rohit Singh" w:date="2026-10-12T21:32:00Z" w16du:dateUtc="2026-10-12T20:32:00Z"/>
+        </w:rPr>
+      </w:pPr>
+      <w:bookmarkStart w:id="32" w:name="_Toc242954058"/>
+      <w:bookmarkEnd w:id="32"/>
     </w:p>
     <w:p>
       <w:pPr>
         <w:pStyle w:val="Heading1"/>
       </w:pPr>
-      <w:bookmarkStart w:id="31" w:name="_Toc242954059"/>
+      <w:bookmarkStart w:id="33" w:name="_Toc242954059"/>
       <w:r>
         <w:t>Problem Definition</w:t>
       </w:r>
-      <w:bookmarkEnd w:id="31"/>
-    </w:p>
-    <w:p>
-      <w:pPr>
-        <w:rPr>
-          <w:ins w:id="32" w:author="Rohit Singh" w:date="2026-10-12T21:32:00Z" w16du:dateUtc="2026-10-12T20:32:00Z"/>
-        </w:rPr>
-      </w:pPr>
-      <w:ins w:id="33" w:author="Rohit Singh" w:date="2026-10-12T21:32:00Z" w16du:dateUtc="2026-10-12T20:32:00Z">
+      <w:bookmarkEnd w:id="33"/>
+    </w:p>
+    <w:p>
+      <w:pPr>
+        <w:rPr>
+          <w:ins w:id="34" w:author="Rohit Singh" w:date="2026-10-12T21:32:00Z" w16du:dateUtc="2026-10-12T20:32:00Z"/>
+        </w:rPr>
+      </w:pPr>
+      <w:ins w:id="35" w:author="Rohit Singh" w:date="2026-10-12T21:32:00Z" w16du:dateUtc="2026-10-12T20:32:00Z">
         <w:r>
           <w:t>The primary business problem investigated in this project is the lack of empirical, data-driven forecasting tools to guide public and private capital expenditure in EV charging infrastructure across Ireland.</w:t>
         </w:r>
@@ -1814,12 +1825,12 @@
     <w:p>
       <w:pPr>
         <w:rPr>
-          <w:ins w:id="34" w:author="Rohit Singh" w:date="2026-10-12T21:32:00Z" w16du:dateUtc="2026-10-12T20:32:00Z"/>
+          <w:ins w:id="36" w:author="Rohit Singh" w:date="2026-10-12T21:32:00Z" w16du:dateUtc="2026-10-12T20:32:00Z"/>
           <w:b/>
           <w:bCs/>
         </w:rPr>
       </w:pPr>
-      <w:ins w:id="35" w:author="Rohit Singh" w:date="2026-10-12T21:32:00Z" w16du:dateUtc="2026-10-12T20:32:00Z">
+      <w:ins w:id="37" w:author="Rohit Singh" w:date="2026-10-12T21:32:00Z" w16du:dateUtc="2026-10-12T20:32:00Z">
         <w:r>
           <w:rPr>
             <w:b/>
@@ -1836,10 +1847,10 @@
           <w:numId w:val="1"/>
         </w:numPr>
         <w:rPr>
-          <w:ins w:id="36" w:author="Rohit Singh" w:date="2026-10-12T21:32:00Z" w16du:dateUtc="2026-10-12T20:32:00Z"/>
-        </w:rPr>
-      </w:pPr>
-      <w:ins w:id="37" w:author="Rohit Singh" w:date="2026-10-12T21:32:00Z" w16du:dateUtc="2026-10-12T20:32:00Z">
+          <w:ins w:id="38" w:author="Rohit Singh" w:date="2026-10-12T21:32:00Z" w16du:dateUtc="2026-10-12T20:32:00Z"/>
+        </w:rPr>
+      </w:pPr>
+      <w:ins w:id="39" w:author="Rohit Singh" w:date="2026-10-12T21:32:00Z" w16du:dateUtc="2026-10-12T20:32:00Z">
         <w:r>
           <w:rPr>
             <w:b/>
@@ -1859,10 +1870,10 @@
           <w:numId w:val="1"/>
         </w:numPr>
         <w:rPr>
-          <w:ins w:id="38" w:author="Rohit Singh" w:date="2026-10-12T21:32:00Z" w16du:dateUtc="2026-10-12T20:32:00Z"/>
-        </w:rPr>
-      </w:pPr>
-      <w:ins w:id="39" w:author="Rohit Singh" w:date="2026-10-12T21:32:00Z" w16du:dateUtc="2026-10-12T20:32:00Z">
+          <w:ins w:id="40" w:author="Rohit Singh" w:date="2026-10-12T21:32:00Z" w16du:dateUtc="2026-10-12T20:32:00Z"/>
+        </w:rPr>
+      </w:pPr>
+      <w:ins w:id="41" w:author="Rohit Singh" w:date="2026-10-12T21:32:00Z" w16du:dateUtc="2026-10-12T20:32:00Z">
         <w:r>
           <w:rPr>
             <w:b/>
@@ -1882,10 +1893,10 @@
           <w:numId w:val="1"/>
         </w:numPr>
         <w:rPr>
-          <w:ins w:id="40" w:author="Rohit Singh" w:date="2026-10-12T21:32:00Z" w16du:dateUtc="2026-10-12T20:32:00Z"/>
-        </w:rPr>
-      </w:pPr>
-      <w:ins w:id="41" w:author="Rohit Singh" w:date="2026-10-12T21:32:00Z" w16du:dateUtc="2026-10-12T20:32:00Z">
+          <w:ins w:id="42" w:author="Rohit Singh" w:date="2026-10-12T21:32:00Z" w16du:dateUtc="2026-10-12T20:32:00Z"/>
+        </w:rPr>
+      </w:pPr>
+      <w:ins w:id="43" w:author="Rohit Singh" w:date="2026-10-12T21:32:00Z" w16du:dateUtc="2026-10-12T20:32:00Z">
         <w:r>
           <w:rPr>
             <w:b/>
@@ -1901,12 +1912,12 @@
     <w:p>
       <w:pPr>
         <w:rPr>
-          <w:ins w:id="42" w:author="Rohit Singh" w:date="2026-10-12T21:32:00Z" w16du:dateUtc="2026-10-12T20:32:00Z"/>
+          <w:ins w:id="44" w:author="Rohit Singh" w:date="2026-10-12T21:32:00Z" w16du:dateUtc="2026-10-12T20:32:00Z"/>
           <w:b/>
           <w:bCs/>
         </w:rPr>
       </w:pPr>
-      <w:ins w:id="43" w:author="Rohit Singh" w:date="2026-10-12T21:32:00Z" w16du:dateUtc="2026-10-12T20:32:00Z">
+      <w:ins w:id="45" w:author="Rohit Singh" w:date="2026-10-12T21:32:00Z" w16du:dateUtc="2026-10-12T20:32:00Z">
         <w:r>
           <w:rPr>
             <w:b/>
@@ -1931,7 +1942,7 @@
       </w:ins>
     </w:p>
     <w:p>
-      <w:ins w:id="44" w:author="Rohit Singh" w:date="2026-10-12T21:32:00Z" w16du:dateUtc="2026-10-12T20:32:00Z">
+      <w:ins w:id="46" w:author="Rohit Singh" w:date="2026-10-12T21:32:00Z" w16du:dateUtc="2026-10-12T20:32:00Z">
         <w:r>
           <w:t xml:space="preserve">Data analytics allows stakeholders to transition from reactive installation policies to proactive, predictive deployment strategies. By analysing historical vehicle registration trends, county-level EV adoption rates, and existing spatial charger distributions, machine learning algorithms (e.g., Regression and Decision Tree models) can model complex non-linear relationships. These </w:t>
         </w:r>
@@ -1955,24 +1966,24 @@
       <w:pPr>
         <w:pStyle w:val="Heading1"/>
         <w:rPr>
-          <w:ins w:id="45" w:author="Rohit Singh" w:date="2026-10-15T10:35:00Z" w16du:dateUtc="2026-10-15T09:35:00Z"/>
-        </w:rPr>
-      </w:pPr>
-      <w:bookmarkStart w:id="46" w:name="_Toc242954060"/>
+          <w:ins w:id="47" w:author="Rohit Singh" w:date="2026-10-15T10:35:00Z" w16du:dateUtc="2026-10-15T09:35:00Z"/>
+        </w:rPr>
+      </w:pPr>
+      <w:bookmarkStart w:id="48" w:name="_Toc242954060"/>
       <w:r>
         <w:t>Aim and Objectives</w:t>
       </w:r>
-      <w:bookmarkEnd w:id="46"/>
-    </w:p>
-    <w:p>
-      <w:pPr>
-        <w:rPr>
-          <w:ins w:id="47" w:author="Rohit Singh" w:date="2026-10-15T10:35:00Z" w16du:dateUtc="2026-10-15T09:35:00Z"/>
+      <w:bookmarkEnd w:id="48"/>
+    </w:p>
+    <w:p>
+      <w:pPr>
+        <w:rPr>
+          <w:ins w:id="49" w:author="Rohit Singh" w:date="2026-10-15T10:35:00Z" w16du:dateUtc="2026-10-15T09:35:00Z"/>
           <w:b/>
           <w:bCs/>
         </w:rPr>
       </w:pPr>
-      <w:ins w:id="48" w:author="Rohit Singh" w:date="2026-10-15T10:35:00Z" w16du:dateUtc="2026-10-15T09:35:00Z">
+      <w:ins w:id="50" w:author="Rohit Singh" w:date="2026-10-15T10:35:00Z" w16du:dateUtc="2026-10-15T09:35:00Z">
         <w:r>
           <w:rPr>
             <w:b/>
@@ -1985,10 +1996,10 @@
     <w:p>
       <w:pPr>
         <w:rPr>
-          <w:ins w:id="49" w:author="Rohit Singh" w:date="2026-10-15T10:35:00Z" w16du:dateUtc="2026-10-15T09:35:00Z"/>
-        </w:rPr>
-      </w:pPr>
-      <w:ins w:id="50" w:author="Rohit Singh" w:date="2026-10-15T10:35:00Z" w16du:dateUtc="2026-10-15T09:35:00Z">
+          <w:ins w:id="51" w:author="Rohit Singh" w:date="2026-10-15T10:35:00Z" w16du:dateUtc="2026-10-15T09:35:00Z"/>
+        </w:rPr>
+      </w:pPr>
+      <w:ins w:id="52" w:author="Rohit Singh" w:date="2026-10-15T10:35:00Z" w16du:dateUtc="2026-10-15T09:35:00Z">
         <w:r>
           <w:t>The overall aim of this project is to develop a predictive analytics model and interactive business intelligence solution that forecasts regional EV charging demand in Ireland, empowering public planners and commercial operators to optimize future infrastructure allocation.</w:t>
         </w:r>
@@ -1997,12 +2008,12 @@
     <w:p>
       <w:pPr>
         <w:rPr>
-          <w:ins w:id="51" w:author="Rohit Singh" w:date="2026-10-15T10:35:00Z" w16du:dateUtc="2026-10-15T09:35:00Z"/>
+          <w:ins w:id="53" w:author="Rohit Singh" w:date="2026-10-15T10:35:00Z" w16du:dateUtc="2026-10-15T09:35:00Z"/>
           <w:b/>
           <w:bCs/>
         </w:rPr>
       </w:pPr>
-      <w:ins w:id="52" w:author="Rohit Singh" w:date="2026-10-15T10:35:00Z" w16du:dateUtc="2026-10-15T09:35:00Z">
+      <w:ins w:id="54" w:author="Rohit Singh" w:date="2026-10-15T10:35:00Z" w16du:dateUtc="2026-10-15T09:35:00Z">
         <w:r>
           <w:rPr>
             <w:b/>
@@ -2019,10 +2030,10 @@
           <w:numId w:val="2"/>
         </w:numPr>
         <w:rPr>
-          <w:ins w:id="53" w:author="Rohit Singh" w:date="2026-10-15T10:35:00Z" w16du:dateUtc="2026-10-15T09:35:00Z"/>
-        </w:rPr>
-      </w:pPr>
-      <w:ins w:id="54" w:author="Rohit Singh" w:date="2026-10-15T10:35:00Z" w16du:dateUtc="2026-10-15T09:35:00Z">
+          <w:ins w:id="55" w:author="Rohit Singh" w:date="2026-10-15T10:35:00Z" w16du:dateUtc="2026-10-15T09:35:00Z"/>
+        </w:rPr>
+      </w:pPr>
+      <w:ins w:id="56" w:author="Rohit Singh" w:date="2026-10-15T10:35:00Z" w16du:dateUtc="2026-10-15T09:35:00Z">
         <w:r>
           <w:rPr>
             <w:b/>
@@ -2052,10 +2063,10 @@
           <w:numId w:val="2"/>
         </w:numPr>
         <w:rPr>
-          <w:ins w:id="55" w:author="Rohit Singh" w:date="2026-10-15T10:35:00Z" w16du:dateUtc="2026-10-15T09:35:00Z"/>
-        </w:rPr>
-      </w:pPr>
-      <w:ins w:id="56" w:author="Rohit Singh" w:date="2026-10-15T10:35:00Z" w16du:dateUtc="2026-10-15T09:35:00Z">
+          <w:ins w:id="57" w:author="Rohit Singh" w:date="2026-10-15T10:35:00Z" w16du:dateUtc="2026-10-15T09:35:00Z"/>
+        </w:rPr>
+      </w:pPr>
+      <w:ins w:id="58" w:author="Rohit Singh" w:date="2026-10-15T10:35:00Z" w16du:dateUtc="2026-10-15T09:35:00Z">
         <w:r>
           <w:rPr>
             <w:b/>
@@ -2075,10 +2086,10 @@
           <w:numId w:val="2"/>
         </w:numPr>
         <w:rPr>
-          <w:ins w:id="57" w:author="Rohit Singh" w:date="2026-10-15T10:35:00Z" w16du:dateUtc="2026-10-15T09:35:00Z"/>
-        </w:rPr>
-      </w:pPr>
-      <w:ins w:id="58" w:author="Rohit Singh" w:date="2026-10-15T10:35:00Z" w16du:dateUtc="2026-10-15T09:35:00Z">
+          <w:ins w:id="59" w:author="Rohit Singh" w:date="2026-10-15T10:35:00Z" w16du:dateUtc="2026-10-15T09:35:00Z"/>
+        </w:rPr>
+      </w:pPr>
+      <w:ins w:id="60" w:author="Rohit Singh" w:date="2026-10-15T10:35:00Z" w16du:dateUtc="2026-10-15T09:35:00Z">
         <w:r>
           <w:rPr>
             <w:b/>
@@ -2128,10 +2139,10 @@
           <w:numId w:val="2"/>
         </w:numPr>
         <w:rPr>
-          <w:ins w:id="59" w:author="Rohit Singh" w:date="2026-10-15T10:35:00Z" w16du:dateUtc="2026-10-15T09:35:00Z"/>
-        </w:rPr>
-      </w:pPr>
-      <w:ins w:id="60" w:author="Rohit Singh" w:date="2026-10-15T10:35:00Z" w16du:dateUtc="2026-10-15T09:35:00Z">
+          <w:ins w:id="61" w:author="Rohit Singh" w:date="2026-10-15T10:35:00Z" w16du:dateUtc="2026-10-15T09:35:00Z"/>
+        </w:rPr>
+      </w:pPr>
+      <w:ins w:id="62" w:author="Rohit Singh" w:date="2026-10-15T10:35:00Z" w16du:dateUtc="2026-10-15T09:35:00Z">
         <w:r>
           <w:rPr>
             <w:b/>
@@ -2140,15 +2151,7 @@
           <w:t>Predictive Model Development:</w:t>
         </w:r>
         <w:r>
-          <w:t xml:space="preserve"> Train, evaluate, and compare machine learning regression models (e.g., Multiple Linear Regression, Random Forest Regressor, </w:t>
-        </w:r>
-        <w:proofErr w:type="spellStart"/>
-        <w:r>
-          <w:t>XGBoost</w:t>
-        </w:r>
-        <w:proofErr w:type="spellEnd"/>
-        <w:r>
-          <w:t>) to forecast county-level charging demand scores.</w:t>
+          <w:t xml:space="preserve"> Train, evaluate, and compare machine learning regression models (e.g., Multiple Linear Regression, Random Forest Regressor, XGBoost) to forecast county-level charging demand scores.</w:t>
         </w:r>
       </w:ins>
     </w:p>
@@ -2159,10 +2162,10 @@
           <w:numId w:val="2"/>
         </w:numPr>
         <w:rPr>
-          <w:ins w:id="61" w:author="Rohit Singh" w:date="2026-10-15T10:35:00Z" w16du:dateUtc="2026-10-15T09:35:00Z"/>
-        </w:rPr>
-      </w:pPr>
-      <w:ins w:id="62" w:author="Rohit Singh" w:date="2026-10-15T10:35:00Z" w16du:dateUtc="2026-10-15T09:35:00Z">
+          <w:ins w:id="63" w:author="Rohit Singh" w:date="2026-10-15T10:35:00Z" w16du:dateUtc="2026-10-15T09:35:00Z"/>
+        </w:rPr>
+      </w:pPr>
+      <w:ins w:id="64" w:author="Rohit Singh" w:date="2026-10-15T10:35:00Z" w16du:dateUtc="2026-10-15T09:35:00Z">
         <w:r>
           <w:rPr>
             <w:b/>
@@ -2171,27 +2174,19 @@
           <w:t>Interactive Dashboard &amp; Delivery:</w:t>
         </w:r>
         <w:r>
-          <w:t xml:space="preserve"> Build an interactive business intelligence dashboard (Power BI/</w:t>
-        </w:r>
-        <w:proofErr w:type="spellStart"/>
-        <w:r>
-          <w:t>Streamlit</w:t>
-        </w:r>
-        <w:proofErr w:type="spellEnd"/>
-        <w:r>
-          <w:t>) that visualizes predicted demand, identifies underserved regions, and provides scenario-based planning tools for stakeholders.</w:t>
-        </w:r>
-      </w:ins>
-    </w:p>
-    <w:p>
-      <w:pPr>
-        <w:rPr>
-          <w:ins w:id="63" w:author="Rohit Singh" w:date="2026-10-15T10:35:00Z" w16du:dateUtc="2026-10-15T09:35:00Z"/>
+          <w:t xml:space="preserve"> Build an interactive business intelligence dashboard (Power BI/Streamlit) that visualizes predicted demand, identifies underserved regions, and provides scenario-based planning tools for stakeholders.</w:t>
+        </w:r>
+      </w:ins>
+    </w:p>
+    <w:p>
+      <w:pPr>
+        <w:rPr>
+          <w:ins w:id="65" w:author="Rohit Singh" w:date="2026-10-15T10:35:00Z" w16du:dateUtc="2026-10-15T09:35:00Z"/>
           <w:b/>
           <w:bCs/>
         </w:rPr>
       </w:pPr>
-      <w:ins w:id="64" w:author="Rohit Singh" w:date="2026-10-15T10:35:00Z" w16du:dateUtc="2026-10-15T09:35:00Z">
+      <w:ins w:id="66" w:author="Rohit Singh" w:date="2026-10-15T10:35:00Z" w16du:dateUtc="2026-10-15T09:35:00Z">
         <w:r>
           <w:rPr>
             <w:b/>
@@ -2204,10 +2199,10 @@
     <w:p>
       <w:pPr>
         <w:rPr>
-          <w:ins w:id="65" w:author="Rohit Singh" w:date="2026-10-15T10:52:00Z" w16du:dateUtc="2026-10-15T09:52:00Z"/>
-        </w:rPr>
-      </w:pPr>
-      <w:ins w:id="66" w:author="Rohit Singh" w:date="2026-10-15T10:35:00Z" w16du:dateUtc="2026-10-15T09:35:00Z">
+          <w:ins w:id="67" w:author="Rohit Singh" w:date="2026-10-15T10:52:00Z" w16du:dateUtc="2026-10-15T09:52:00Z"/>
+        </w:rPr>
+      </w:pPr>
+      <w:ins w:id="68" w:author="Rohit Singh" w:date="2026-10-15T10:35:00Z" w16du:dateUtc="2026-10-15T09:35:00Z">
         <w:r>
           <w:rPr>
             <w:i/>
@@ -2233,21 +2228,1250 @@
     <w:p>
       <w:pPr>
         <w:rPr>
-          <w:ins w:id="67" w:author="Rohit Singh" w:date="2026-10-15T10:52:00Z" w16du:dateUtc="2026-10-15T09:52:00Z"/>
+          <w:ins w:id="69" w:author="Rohit Singh" w:date="2026-10-15T10:52:00Z" w16du:dateUtc="2026-10-15T09:52:00Z"/>
         </w:rPr>
       </w:pPr>
     </w:p>
     <w:p>
       <w:pPr>
         <w:pStyle w:val="Heading1"/>
-      </w:pPr>
-      <w:bookmarkStart w:id="68" w:name="_Toc242954061"/>
-      <w:ins w:id="69" w:author="Rohit Singh" w:date="2026-10-15T10:52:00Z" w16du:dateUtc="2026-10-15T09:52:00Z">
+        <w:rPr>
+          <w:ins w:id="70" w:author="Rohit Singh" w:date="2026-10-20T22:38:00Z" w16du:dateUtc="2026-10-20T21:38:00Z"/>
+        </w:rPr>
+      </w:pPr>
+      <w:bookmarkStart w:id="71" w:name="_Toc242954061"/>
+      <w:ins w:id="72" w:author="Rohit Singh" w:date="2026-10-15T10:52:00Z" w16du:dateUtc="2026-10-15T09:52:00Z">
         <w:r>
           <w:t>Scope</w:t>
         </w:r>
       </w:ins>
-      <w:bookmarkEnd w:id="68"/>
+      <w:bookmarkEnd w:id="71"/>
+    </w:p>
+    <w:p>
+      <w:pPr>
+        <w:rPr>
+          <w:ins w:id="73" w:author="Rohit Singh" w:date="2026-10-20T22:38:00Z" w16du:dateUtc="2026-10-20T21:38:00Z"/>
+          <w:b/>
+          <w:bCs/>
+        </w:rPr>
+      </w:pPr>
+      <w:ins w:id="74" w:author="Rohit Singh" w:date="2026-10-20T22:38:00Z" w16du:dateUtc="2026-10-20T21:38:00Z">
+        <w:r>
+          <w:rPr>
+            <w:b/>
+            <w:bCs/>
+          </w:rPr>
+          <w:t>In Scope</w:t>
+        </w:r>
+      </w:ins>
+    </w:p>
+    <w:p>
+      <w:pPr>
+        <w:numPr>
+          <w:ilvl w:val="0"/>
+          <w:numId w:val="3"/>
+        </w:numPr>
+        <w:rPr>
+          <w:ins w:id="75" w:author="Rohit Singh" w:date="2026-10-20T22:38:00Z" w16du:dateUtc="2026-10-20T21:38:00Z"/>
+        </w:rPr>
+      </w:pPr>
+      <w:ins w:id="76" w:author="Rohit Singh" w:date="2026-10-20T22:38:00Z" w16du:dateUtc="2026-10-20T21:38:00Z">
+        <w:r>
+          <w:t xml:space="preserve">Analysis of open public datasets from </w:t>
+        </w:r>
+        <w:r>
+          <w:rPr>
+            <w:i/>
+            <w:iCs/>
+          </w:rPr>
+          <w:t>data.gov.ie</w:t>
+        </w:r>
+        <w:r>
+          <w:t xml:space="preserve"> covering Irish counties and local electoral areas.</w:t>
+        </w:r>
+      </w:ins>
+    </w:p>
+    <w:p>
+      <w:pPr>
+        <w:numPr>
+          <w:ilvl w:val="0"/>
+          <w:numId w:val="3"/>
+        </w:numPr>
+        <w:rPr>
+          <w:ins w:id="77" w:author="Rohit Singh" w:date="2026-10-20T22:38:00Z" w16du:dateUtc="2026-10-20T21:38:00Z"/>
+        </w:rPr>
+      </w:pPr>
+      <w:ins w:id="78" w:author="Rohit Singh" w:date="2026-10-20T22:38:00Z" w16du:dateUtc="2026-10-20T21:38:00Z">
+        <w:r>
+          <w:t>Historical vehicle registration trends and EV adoption metrics from 2019 to 2026.</w:t>
+        </w:r>
+      </w:ins>
+    </w:p>
+    <w:p>
+      <w:pPr>
+        <w:numPr>
+          <w:ilvl w:val="0"/>
+          <w:numId w:val="3"/>
+        </w:numPr>
+        <w:rPr>
+          <w:ins w:id="79" w:author="Rohit Singh" w:date="2026-10-20T22:38:00Z" w16du:dateUtc="2026-10-20T21:38:00Z"/>
+        </w:rPr>
+      </w:pPr>
+      <w:ins w:id="80" w:author="Rohit Singh" w:date="2026-10-20T22:38:00Z" w16du:dateUtc="2026-10-20T21:38:00Z">
+        <w:r>
+          <w:t>Spatial analysis of existing public charging points managed by local authorities and public bodies.</w:t>
+        </w:r>
+      </w:ins>
+    </w:p>
+    <w:p>
+      <w:pPr>
+        <w:numPr>
+          <w:ilvl w:val="0"/>
+          <w:numId w:val="3"/>
+        </w:numPr>
+        <w:rPr>
+          <w:ins w:id="81" w:author="Rohit Singh" w:date="2026-10-20T22:38:00Z" w16du:dateUtc="2026-10-20T21:38:00Z"/>
+        </w:rPr>
+      </w:pPr>
+      <w:ins w:id="82" w:author="Rohit Singh" w:date="2026-10-20T22:38:00Z" w16du:dateUtc="2026-10-20T21:38:00Z">
+        <w:r>
+          <w:lastRenderedPageBreak/>
+          <w:t>Machine learning modelling in Python using supervised regression algorithms.</w:t>
+        </w:r>
+      </w:ins>
+    </w:p>
+    <w:p>
+      <w:pPr>
+        <w:numPr>
+          <w:ilvl w:val="0"/>
+          <w:numId w:val="3"/>
+        </w:numPr>
+        <w:rPr>
+          <w:ins w:id="83" w:author="Rohit Singh" w:date="2026-10-20T22:38:00Z" w16du:dateUtc="2026-10-20T21:38:00Z"/>
+        </w:rPr>
+      </w:pPr>
+      <w:ins w:id="84" w:author="Rohit Singh" w:date="2026-10-20T22:38:00Z" w16du:dateUtc="2026-10-20T21:38:00Z">
+        <w:r>
+          <w:t>Development of an interactive executive dashboard for visual scenario planning.</w:t>
+        </w:r>
+      </w:ins>
+    </w:p>
+    <w:p>
+      <w:pPr>
+        <w:rPr>
+          <w:ins w:id="85" w:author="Rohit Singh" w:date="2026-10-20T22:38:00Z" w16du:dateUtc="2026-10-20T21:38:00Z"/>
+          <w:b/>
+          <w:bCs/>
+        </w:rPr>
+      </w:pPr>
+      <w:ins w:id="86" w:author="Rohit Singh" w:date="2026-10-20T22:38:00Z" w16du:dateUtc="2026-10-20T21:38:00Z">
+        <w:r>
+          <w:rPr>
+            <w:b/>
+            <w:bCs/>
+          </w:rPr>
+          <w:t>Out of Scope</w:t>
+        </w:r>
+      </w:ins>
+    </w:p>
+    <w:p>
+      <w:pPr>
+        <w:numPr>
+          <w:ilvl w:val="0"/>
+          <w:numId w:val="4"/>
+        </w:numPr>
+        <w:rPr>
+          <w:ins w:id="87" w:author="Rohit Singh" w:date="2026-10-20T22:38:00Z" w16du:dateUtc="2026-10-20T21:38:00Z"/>
+        </w:rPr>
+      </w:pPr>
+      <w:ins w:id="88" w:author="Rohit Singh" w:date="2026-10-20T22:38:00Z" w16du:dateUtc="2026-10-20T21:38:00Z">
+        <w:r>
+          <w:t>Real-time IoT sensor telemetry or live live-streamed charger occupancy tracking.</w:t>
+        </w:r>
+      </w:ins>
+    </w:p>
+    <w:p>
+      <w:pPr>
+        <w:numPr>
+          <w:ilvl w:val="0"/>
+          <w:numId w:val="4"/>
+        </w:numPr>
+        <w:rPr>
+          <w:ins w:id="89" w:author="Rohit Singh" w:date="2026-10-20T22:38:00Z" w16du:dateUtc="2026-10-20T21:38:00Z"/>
+        </w:rPr>
+      </w:pPr>
+      <w:ins w:id="90" w:author="Rohit Singh" w:date="2026-10-20T22:38:00Z" w16du:dateUtc="2026-10-20T21:38:00Z">
+        <w:r>
+          <w:t>Proprietary commercial pricing strategies, electricity tariff modelling, or financial ROI calculations for private operators.</w:t>
+        </w:r>
+      </w:ins>
+    </w:p>
+    <w:p>
+      <w:pPr>
+        <w:numPr>
+          <w:ilvl w:val="0"/>
+          <w:numId w:val="4"/>
+        </w:numPr>
+        <w:rPr>
+          <w:ins w:id="91" w:author="Rohit Singh" w:date="2026-10-20T22:38:00Z" w16du:dateUtc="2026-10-20T21:38:00Z"/>
+        </w:rPr>
+      </w:pPr>
+      <w:ins w:id="92" w:author="Rohit Singh" w:date="2026-10-20T22:38:00Z" w16du:dateUtc="2026-10-20T21:38:00Z">
+        <w:r>
+          <w:t>Electrical engineering smart-grid load balancing and circuit design.</w:t>
+        </w:r>
+      </w:ins>
+    </w:p>
+    <w:p>
+      <w:pPr>
+        <w:rPr>
+          <w:ins w:id="93" w:author="Rohit Singh" w:date="2026-10-20T22:38:00Z" w16du:dateUtc="2026-10-20T21:38:00Z"/>
+        </w:rPr>
+      </w:pPr>
+      <w:ins w:id="94" w:author="Rohit Singh" w:date="2026-10-20T22:38:00Z" w16du:dateUtc="2026-10-20T21:38:00Z">
+        <w:r>
+          <w:t>Individual driver behavioural tracking or private home charger installation analysis.</w:t>
+        </w:r>
+      </w:ins>
+    </w:p>
+    <w:p>
+      <w:pPr>
+        <w:rPr>
+          <w:ins w:id="95" w:author="Rohit Singh" w:date="2026-10-20T22:38:00Z" w16du:dateUtc="2026-10-20T21:38:00Z"/>
+        </w:rPr>
+      </w:pPr>
+    </w:p>
+    <w:p>
+      <w:pPr>
+        <w:pStyle w:val="Heading1"/>
+        <w:rPr>
+          <w:ins w:id="96" w:author="Rohit Singh" w:date="2026-10-20T22:38:00Z" w16du:dateUtc="2026-10-20T21:38:00Z"/>
+        </w:rPr>
+      </w:pPr>
+      <w:ins w:id="97" w:author="Rohit Singh" w:date="2026-10-20T22:38:00Z" w16du:dateUtc="2026-10-20T21:38:00Z">
+        <w:r>
+          <w:t>Methodology &amp; Architecture</w:t>
+        </w:r>
+      </w:ins>
+    </w:p>
+    <w:p>
+      <w:pPr>
+        <w:rPr>
+          <w:ins w:id="98" w:author="Rohit Singh" w:date="2026-10-20T22:38:00Z" w16du:dateUtc="2026-10-20T21:38:00Z"/>
+          <w:b/>
+          <w:bCs/>
+        </w:rPr>
+      </w:pPr>
+      <w:ins w:id="99" w:author="Rohit Singh" w:date="2026-10-20T22:38:00Z" w16du:dateUtc="2026-10-20T21:38:00Z">
+        <w:r>
+          <w:rPr>
+            <w:b/>
+            <w:bCs/>
+          </w:rPr>
+          <w:t>Analytics Methodology (CRISP-DM)</w:t>
+        </w:r>
+      </w:ins>
+    </w:p>
+    <w:p>
+      <w:pPr>
+        <w:rPr>
+          <w:ins w:id="100" w:author="Rohit Singh" w:date="2026-10-20T22:38:00Z" w16du:dateUtc="2026-10-20T21:38:00Z"/>
+        </w:rPr>
+      </w:pPr>
+      <w:ins w:id="101" w:author="Rohit Singh" w:date="2026-10-20T22:38:00Z" w16du:dateUtc="2026-10-20T21:38:00Z">
+        <w:r>
+          <w:t xml:space="preserve">This project follows the </w:t>
+        </w:r>
+        <w:r>
+          <w:rPr>
+            <w:b/>
+            <w:bCs/>
+          </w:rPr>
+          <w:t>CRISP-DM (Cross-Industry Standard Process for Data Mining)</w:t>
+        </w:r>
+        <w:r>
+          <w:t xml:space="preserve"> methodology, structured into six iterative phases: Business Understanding, Data Understanding, Data Preparation, Modelling, Evaluation, and Deployment.</w:t>
+        </w:r>
+      </w:ins>
+    </w:p>
+    <w:p>
+      <w:pPr>
+        <w:rPr>
+          <w:ins w:id="102" w:author="Rohit Singh" w:date="2026-10-20T22:38:00Z" w16du:dateUtc="2026-10-20T21:38:00Z"/>
+          <w:b/>
+          <w:bCs/>
+        </w:rPr>
+      </w:pPr>
+      <w:ins w:id="103" w:author="Rohit Singh" w:date="2026-10-20T22:55:00Z" w16du:dateUtc="2026-10-20T21:55:00Z">
+        <w:r>
+          <w:rPr>
+            <w:b/>
+            <w:bCs/>
+            <w:noProof/>
+          </w:rPr>
+          <w:drawing>
+            <wp:inline distT="0" distB="0" distL="0" distR="0" wp14:anchorId="6246AAFD" wp14:editId="4C1AA093">
+              <wp:extent cx="5210902" cy="3038899"/>
+              <wp:effectExtent l="0" t="0" r="8890" b="9525"/>
+              <wp:docPr id="567514605" name="Picture 1"/>
+              <wp:cNvGraphicFramePr>
+                <a:graphicFrameLocks xmlns:a="http://schemas.openxmlformats.org/drawingml/2006/main" noChangeAspect="1"/>
+              </wp:cNvGraphicFramePr>
+              <a:graphic xmlns:a="http://schemas.openxmlformats.org/drawingml/2006/main">
+                <a:graphicData uri="http://schemas.openxmlformats.org/drawingml/2006/picture">
+                  <pic:pic xmlns:pic="http://schemas.openxmlformats.org/drawingml/2006/picture">
+                    <pic:nvPicPr>
+                      <pic:cNvPr id="567514605" name=""/>
+                      <pic:cNvPicPr/>
+                    </pic:nvPicPr>
+                    <pic:blipFill>
+                      <a:blip r:embed="rId8"/>
+                      <a:stretch>
+                        <a:fillRect/>
+                      </a:stretch>
+                    </pic:blipFill>
+                    <pic:spPr>
+                      <a:xfrm>
+                        <a:off x="0" y="0"/>
+                        <a:ext cx="5210902" cy="3038899"/>
+                      </a:xfrm>
+                      <a:prstGeom prst="rect">
+                        <a:avLst/>
+                      </a:prstGeom>
+                    </pic:spPr>
+                  </pic:pic>
+                </a:graphicData>
+              </a:graphic>
+            </wp:inline>
+          </w:drawing>
+        </w:r>
+      </w:ins>
+    </w:p>
+    <w:p>
+      <w:pPr>
+        <w:rPr>
+          <w:ins w:id="104" w:author="Rohit Singh" w:date="2026-10-20T22:38:00Z" w16du:dateUtc="2026-10-20T21:38:00Z"/>
+          <w:b/>
+          <w:bCs/>
+        </w:rPr>
+      </w:pPr>
+      <w:ins w:id="105" w:author="Rohit Singh" w:date="2026-10-20T22:38:00Z" w16du:dateUtc="2026-10-20T21:38:00Z">
+        <w:r>
+          <w:rPr>
+            <w:b/>
+            <w:bCs/>
+          </w:rPr>
+          <w:t>Proposed Technologies and Tools</w:t>
+        </w:r>
+      </w:ins>
+    </w:p>
+    <w:p>
+      <w:pPr>
+        <w:numPr>
+          <w:ilvl w:val="0"/>
+          <w:numId w:val="5"/>
+        </w:numPr>
+        <w:rPr>
+          <w:ins w:id="106" w:author="Rohit Singh" w:date="2026-10-20T22:38:00Z" w16du:dateUtc="2026-10-20T21:38:00Z"/>
+        </w:rPr>
+      </w:pPr>
+      <w:ins w:id="107" w:author="Rohit Singh" w:date="2026-10-20T22:38:00Z" w16du:dateUtc="2026-10-20T21:38:00Z">
+        <w:r>
+          <w:rPr>
+            <w:b/>
+            <w:bCs/>
+          </w:rPr>
+          <w:t>Programming &amp; Pipeline:</w:t>
+        </w:r>
+        <w:r>
+          <w:t xml:space="preserve"> Python 3.x (Pandas, NumPy) for data wrangling and ETL processes.</w:t>
+        </w:r>
+      </w:ins>
+    </w:p>
+    <w:p>
+      <w:pPr>
+        <w:numPr>
+          <w:ilvl w:val="0"/>
+          <w:numId w:val="5"/>
+        </w:numPr>
+        <w:rPr>
+          <w:ins w:id="108" w:author="Rohit Singh" w:date="2026-10-20T22:38:00Z" w16du:dateUtc="2026-10-20T21:38:00Z"/>
+        </w:rPr>
+      </w:pPr>
+      <w:ins w:id="109" w:author="Rohit Singh" w:date="2026-10-20T22:38:00Z" w16du:dateUtc="2026-10-20T21:38:00Z">
+        <w:r>
+          <w:rPr>
+            <w:b/>
+            <w:bCs/>
+          </w:rPr>
+          <w:t>Machine Learning:</w:t>
+        </w:r>
+        <w:r>
+          <w:t xml:space="preserve"> Scikit-Learn, XGBoost for feature scaling, regression modelling, and cross-validation.</w:t>
+        </w:r>
+      </w:ins>
+    </w:p>
+    <w:p>
+      <w:pPr>
+        <w:numPr>
+          <w:ilvl w:val="0"/>
+          <w:numId w:val="5"/>
+        </w:numPr>
+        <w:rPr>
+          <w:ins w:id="110" w:author="Rohit Singh" w:date="2026-10-20T22:38:00Z" w16du:dateUtc="2026-10-20T21:38:00Z"/>
+        </w:rPr>
+      </w:pPr>
+      <w:ins w:id="111" w:author="Rohit Singh" w:date="2026-10-20T22:38:00Z" w16du:dateUtc="2026-10-20T21:38:00Z">
+        <w:r>
+          <w:rPr>
+            <w:b/>
+            <w:bCs/>
+          </w:rPr>
+          <w:t>Visualization &amp; Reporting:</w:t>
+        </w:r>
+        <w:r>
+          <w:t xml:space="preserve"> Power BI / Streamlit for dynamic user dashboarding; Matplotlib &amp; Seaborn for EDA.</w:t>
+        </w:r>
+      </w:ins>
+    </w:p>
+    <w:p>
+      <w:pPr>
+        <w:numPr>
+          <w:ilvl w:val="0"/>
+          <w:numId w:val="5"/>
+        </w:numPr>
+        <w:rPr>
+          <w:ins w:id="112" w:author="Rohit Singh" w:date="2026-10-20T22:38:00Z" w16du:dateUtc="2026-10-20T21:38:00Z"/>
+        </w:rPr>
+      </w:pPr>
+      <w:ins w:id="113" w:author="Rohit Singh" w:date="2026-10-20T22:38:00Z" w16du:dateUtc="2026-10-20T21:38:00Z">
+        <w:r>
+          <w:rPr>
+            <w:b/>
+            <w:bCs/>
+          </w:rPr>
+          <w:lastRenderedPageBreak/>
+          <w:t>Environment &amp; Version Control:</w:t>
+        </w:r>
+        <w:r>
+          <w:t xml:space="preserve"> Jupyter Notebooks, Git, GitHub repository (tahmed1986 access).</w:t>
+        </w:r>
+      </w:ins>
+    </w:p>
+    <w:p>
+      <w:pPr>
+        <w:rPr>
+          <w:ins w:id="114" w:author="Rohit Singh" w:date="2026-10-20T22:38:00Z" w16du:dateUtc="2026-10-20T21:38:00Z"/>
+          <w:b/>
+          <w:bCs/>
+        </w:rPr>
+      </w:pPr>
+      <w:ins w:id="115" w:author="Rohit Singh" w:date="2026-10-20T22:38:00Z" w16du:dateUtc="2026-10-20T21:38:00Z">
+        <w:r>
+          <w:rPr>
+            <w:b/>
+            <w:bCs/>
+          </w:rPr>
+          <w:t>System Architecture Diagram</w:t>
+        </w:r>
+      </w:ins>
+    </w:p>
+    <w:p>
+      <w:pPr>
+        <w:rPr>
+          <w:ins w:id="116" w:author="Rohit Singh" w:date="2026-10-20T22:53:00Z" w16du:dateUtc="2026-10-20T21:53:00Z"/>
+          <w:b/>
+          <w:bCs/>
+        </w:rPr>
+      </w:pPr>
+      <w:ins w:id="117" w:author="Rohit Singh" w:date="2026-10-20T22:55:00Z" w16du:dateUtc="2026-10-20T21:55:00Z">
+        <w:r>
+          <w:rPr>
+            <w:b/>
+            <w:bCs/>
+            <w:noProof/>
+          </w:rPr>
+          <w:drawing>
+            <wp:inline distT="0" distB="0" distL="0" distR="0" wp14:anchorId="3D02058B" wp14:editId="14097368">
+              <wp:extent cx="5731510" cy="4234815"/>
+              <wp:effectExtent l="0" t="0" r="2540" b="0"/>
+              <wp:docPr id="883228301" name="Picture 1"/>
+              <wp:cNvGraphicFramePr>
+                <a:graphicFrameLocks xmlns:a="http://schemas.openxmlformats.org/drawingml/2006/main" noChangeAspect="1"/>
+              </wp:cNvGraphicFramePr>
+              <a:graphic xmlns:a="http://schemas.openxmlformats.org/drawingml/2006/main">
+                <a:graphicData uri="http://schemas.openxmlformats.org/drawingml/2006/picture">
+                  <pic:pic xmlns:pic="http://schemas.openxmlformats.org/drawingml/2006/picture">
+                    <pic:nvPicPr>
+                      <pic:cNvPr id="883228301" name=""/>
+                      <pic:cNvPicPr/>
+                    </pic:nvPicPr>
+                    <pic:blipFill>
+                      <a:blip r:embed="rId9"/>
+                      <a:stretch>
+                        <a:fillRect/>
+                      </a:stretch>
+                    </pic:blipFill>
+                    <pic:spPr>
+                      <a:xfrm>
+                        <a:off x="0" y="0"/>
+                        <a:ext cx="5731510" cy="4234815"/>
+                      </a:xfrm>
+                      <a:prstGeom prst="rect">
+                        <a:avLst/>
+                      </a:prstGeom>
+                    </pic:spPr>
+                  </pic:pic>
+                </a:graphicData>
+              </a:graphic>
+            </wp:inline>
+          </w:drawing>
+        </w:r>
+      </w:ins>
+    </w:p>
+    <w:p>
+      <w:pPr>
+        <w:rPr>
+          <w:ins w:id="118" w:author="Rohit Singh" w:date="2026-10-20T22:53:00Z" w16du:dateUtc="2026-10-20T21:53:00Z"/>
+          <w:b/>
+          <w:bCs/>
+        </w:rPr>
+      </w:pPr>
+    </w:p>
+    <w:p>
+      <w:pPr>
+        <w:pStyle w:val="Heading1"/>
+        <w:rPr>
+          <w:ins w:id="119" w:author="Rohit Singh" w:date="2026-10-20T22:53:00Z" w16du:dateUtc="2026-10-20T21:53:00Z"/>
+        </w:rPr>
+      </w:pPr>
+      <w:ins w:id="120" w:author="Rohit Singh" w:date="2026-10-20T22:53:00Z" w16du:dateUtc="2026-10-20T21:53:00Z">
+        <w:r>
+          <w:t>Data Sources</w:t>
+        </w:r>
+      </w:ins>
+    </w:p>
+    <w:p>
+      <w:pPr>
+        <w:rPr>
+          <w:ins w:id="121" w:author="Rohit Singh" w:date="2026-10-20T22:53:00Z" w16du:dateUtc="2026-10-20T21:53:00Z"/>
+          <w:b/>
+          <w:bCs/>
+        </w:rPr>
+      </w:pPr>
+      <w:ins w:id="122" w:author="Rohit Singh" w:date="2026-10-20T22:53:00Z" w16du:dateUtc="2026-10-20T21:53:00Z">
+        <w:r>
+          <w:rPr>
+            <w:b/>
+            <w:bCs/>
+          </w:rPr>
+          <w:t>Dataset Description</w:t>
+        </w:r>
+      </w:ins>
+    </w:p>
+    <w:p>
+      <w:pPr>
+        <w:rPr>
+          <w:ins w:id="123" w:author="Rohit Singh" w:date="2026-10-20T22:53:00Z" w16du:dateUtc="2026-10-20T21:53:00Z"/>
+        </w:rPr>
+      </w:pPr>
+      <w:ins w:id="124" w:author="Rohit Singh" w:date="2026-10-20T22:53:00Z" w16du:dateUtc="2026-10-20T21:53:00Z">
+        <w:r>
+          <w:t xml:space="preserve">The project relies on verified public open datasets published on </w:t>
+        </w:r>
+        <w:r>
+          <w:rPr>
+            <w:b/>
+            <w:bCs/>
+          </w:rPr>
+          <w:t>data.gov.ie</w:t>
+        </w:r>
+        <w:r>
+          <w:t>:</w:t>
+        </w:r>
+      </w:ins>
+    </w:p>
+    <w:p>
+      <w:pPr>
+        <w:numPr>
+          <w:ilvl w:val="0"/>
+          <w:numId w:val="6"/>
+        </w:numPr>
+        <w:rPr>
+          <w:ins w:id="125" w:author="Rohit Singh" w:date="2026-10-20T22:53:00Z" w16du:dateUtc="2026-10-20T21:53:00Z"/>
+        </w:rPr>
+      </w:pPr>
+      <w:ins w:id="126" w:author="Rohit Singh" w:date="2026-10-20T22:53:00Z" w16du:dateUtc="2026-10-20T21:53:00Z">
+        <w:r>
+          <w:rPr>
+            <w:b/>
+            <w:bCs/>
+          </w:rPr>
+          <w:t>CSO TEA30 - Vehicle Registrations and Licensing:</w:t>
+        </w:r>
+        <w:r>
+          <w:t xml:space="preserve"> Contains monthly and annual breakdown of electric, hybrid, and fossil-fuel vehicle registrations aggregated by Irish county.</w:t>
+        </w:r>
+      </w:ins>
+    </w:p>
+    <w:p>
+      <w:pPr>
+        <w:numPr>
+          <w:ilvl w:val="0"/>
+          <w:numId w:val="6"/>
+        </w:numPr>
+        <w:rPr>
+          <w:ins w:id="127" w:author="Rohit Singh" w:date="2026-10-20T22:53:00Z" w16du:dateUtc="2026-10-20T21:53:00Z"/>
+        </w:rPr>
+      </w:pPr>
+      <w:ins w:id="128" w:author="Rohit Singh" w:date="2026-10-20T22:53:00Z" w16du:dateUtc="2026-10-20T21:53:00Z">
+        <w:r>
+          <w:rPr>
+            <w:b/>
+            <w:bCs/>
+          </w:rPr>
+          <w:t>CSO PCIEV01 - Public EV Charging Infrastructure:</w:t>
+        </w:r>
+        <w:r>
+          <w:t xml:space="preserve"> Contains national and regional counts of public charging points (standard AC vs. fast DC chargers).</w:t>
+        </w:r>
+      </w:ins>
+    </w:p>
+    <w:p>
+      <w:pPr>
+        <w:numPr>
+          <w:ilvl w:val="0"/>
+          <w:numId w:val="6"/>
+        </w:numPr>
+        <w:rPr>
+          <w:ins w:id="129" w:author="Rohit Singh" w:date="2026-10-20T22:53:00Z" w16du:dateUtc="2026-10-20T21:53:00Z"/>
+        </w:rPr>
+      </w:pPr>
+      <w:ins w:id="130" w:author="Rohit Singh" w:date="2026-10-20T22:53:00Z" w16du:dateUtc="2026-10-20T21:53:00Z">
+        <w:r>
+          <w:rPr>
+            <w:b/>
+            <w:bCs/>
+          </w:rPr>
+          <w:t>Local Authority Open GIS Datasets (Smart Dublin, Cork City Council, FCC):</w:t>
+        </w:r>
+        <w:r>
+          <w:t xml:space="preserve"> Geolocation records (latitude/longitude), connector types, and charger power capacity.</w:t>
+        </w:r>
+      </w:ins>
+    </w:p>
+    <w:p>
+      <w:pPr>
+        <w:rPr>
+          <w:ins w:id="131" w:author="Rohit Singh" w:date="2026-10-20T22:53:00Z" w16du:dateUtc="2026-10-20T21:53:00Z"/>
+          <w:b/>
+          <w:bCs/>
+        </w:rPr>
+      </w:pPr>
+      <w:ins w:id="132" w:author="Rohit Singh" w:date="2026-10-20T22:53:00Z" w16du:dateUtc="2026-10-20T21:53:00Z">
+        <w:r>
+          <w:rPr>
+            <w:b/>
+            <w:bCs/>
+          </w:rPr>
+          <w:t>Data Access and Rights</w:t>
+        </w:r>
+      </w:ins>
+    </w:p>
+    <w:p>
+      <w:pPr>
+        <w:rPr>
+          <w:ins w:id="133" w:author="Rohit Singh" w:date="2026-10-20T22:53:00Z" w16du:dateUtc="2026-10-20T21:53:00Z"/>
+        </w:rPr>
+      </w:pPr>
+      <w:ins w:id="134" w:author="Rohit Singh" w:date="2026-10-20T22:53:00Z" w16du:dateUtc="2026-10-20T21:53:00Z">
+        <w:r>
+          <w:t xml:space="preserve">All selected datasets are published under the </w:t>
+        </w:r>
+        <w:r>
+          <w:rPr>
+            <w:b/>
+            <w:bCs/>
+          </w:rPr>
+          <w:t>Creative Commons Attribution 4.0 International (CC BY 4.0)</w:t>
+        </w:r>
+        <w:r>
+          <w:t xml:space="preserve"> license or Open Government License. These rights grant full </w:t>
+        </w:r>
+        <w:r>
+          <w:lastRenderedPageBreak/>
+          <w:t>permission to access, combine, adapt, and use the data for academic research and commercial analytical modelling, provided appropriate attribution is maintained.</w:t>
+        </w:r>
+      </w:ins>
+    </w:p>
+    <w:p>
+      <w:pPr>
+        <w:pStyle w:val="Heading1"/>
+        <w:rPr>
+          <w:ins w:id="135" w:author="Rohit Singh" w:date="2026-10-20T22:53:00Z" w16du:dateUtc="2026-10-20T21:53:00Z"/>
+        </w:rPr>
+      </w:pPr>
+      <w:ins w:id="136" w:author="Rohit Singh" w:date="2026-10-20T22:53:00Z" w16du:dateUtc="2026-10-20T21:53:00Z">
+        <w:r>
+          <w:t>Expected Deliverables (Semester 1 &amp; 2)</w:t>
+        </w:r>
+      </w:ins>
+    </w:p>
+    <w:p>
+      <w:pPr>
+        <w:rPr>
+          <w:ins w:id="137" w:author="Rohit Singh" w:date="2026-10-20T22:53:00Z" w16du:dateUtc="2026-10-20T21:53:00Z"/>
+          <w:b/>
+          <w:bCs/>
+        </w:rPr>
+      </w:pPr>
+      <w:ins w:id="138" w:author="Rohit Singh" w:date="2026-10-20T22:53:00Z" w16du:dateUtc="2026-10-20T21:53:00Z">
+        <w:r>
+          <w:rPr>
+            <w:b/>
+            <w:bCs/>
+          </w:rPr>
+          <w:t>Semester 1 Deliverables</w:t>
+        </w:r>
+      </w:ins>
+    </w:p>
+    <w:p>
+      <w:pPr>
+        <w:numPr>
+          <w:ilvl w:val="0"/>
+          <w:numId w:val="7"/>
+        </w:numPr>
+        <w:rPr>
+          <w:ins w:id="139" w:author="Rohit Singh" w:date="2026-10-20T22:53:00Z" w16du:dateUtc="2026-10-20T21:53:00Z"/>
+        </w:rPr>
+      </w:pPr>
+      <w:ins w:id="140" w:author="Rohit Singh" w:date="2026-10-20T22:53:00Z" w16du:dateUtc="2026-10-20T21:53:00Z">
+        <w:r>
+          <w:rPr>
+            <w:b/>
+            <w:bCs/>
+          </w:rPr>
+          <w:t>Capstone Project Proposal (CA1):</w:t>
+        </w:r>
+        <w:r>
+          <w:t xml:space="preserve"> Word document report detailing strategic alignment, problem definition, scope, and architecture.</w:t>
+        </w:r>
+      </w:ins>
+    </w:p>
+    <w:p>
+      <w:pPr>
+        <w:numPr>
+          <w:ilvl w:val="0"/>
+          <w:numId w:val="7"/>
+        </w:numPr>
+        <w:rPr>
+          <w:ins w:id="141" w:author="Rohit Singh" w:date="2026-10-20T22:53:00Z" w16du:dateUtc="2026-10-20T21:53:00Z"/>
+        </w:rPr>
+      </w:pPr>
+      <w:ins w:id="142" w:author="Rohit Singh" w:date="2026-10-20T22:53:00Z" w16du:dateUtc="2026-10-20T21:53:00Z">
+        <w:r>
+          <w:rPr>
+            <w:b/>
+            <w:bCs/>
+          </w:rPr>
+          <w:t>Signed Ethics Form:</w:t>
+        </w:r>
+        <w:r>
+          <w:t xml:space="preserve"> Submitted in PDF format.</w:t>
+        </w:r>
+      </w:ins>
+    </w:p>
+    <w:p>
+      <w:pPr>
+        <w:numPr>
+          <w:ilvl w:val="0"/>
+          <w:numId w:val="7"/>
+        </w:numPr>
+        <w:rPr>
+          <w:ins w:id="143" w:author="Rohit Singh" w:date="2026-10-20T22:53:00Z" w16du:dateUtc="2026-10-20T21:53:00Z"/>
+        </w:rPr>
+      </w:pPr>
+      <w:ins w:id="144" w:author="Rohit Singh" w:date="2026-10-20T22:53:00Z" w16du:dateUtc="2026-10-20T21:53:00Z">
+        <w:r>
+          <w:rPr>
+            <w:b/>
+            <w:bCs/>
+          </w:rPr>
+          <w:t>AI Use Declaration:</w:t>
+        </w:r>
+        <w:r>
+          <w:t xml:space="preserve"> Comprehensive reflection adhering to the AI Fluency Framework.</w:t>
+        </w:r>
+      </w:ins>
+    </w:p>
+    <w:p>
+      <w:pPr>
+        <w:numPr>
+          <w:ilvl w:val="0"/>
+          <w:numId w:val="7"/>
+        </w:numPr>
+        <w:rPr>
+          <w:ins w:id="145" w:author="Rohit Singh" w:date="2026-10-20T22:53:00Z" w16du:dateUtc="2026-10-20T21:53:00Z"/>
+        </w:rPr>
+      </w:pPr>
+      <w:ins w:id="146" w:author="Rohit Singh" w:date="2026-10-20T22:53:00Z" w16du:dateUtc="2026-10-20T21:53:00Z">
+        <w:r>
+          <w:rPr>
+            <w:b/>
+            <w:bCs/>
+          </w:rPr>
+          <w:t>GitHub Repository:</w:t>
+        </w:r>
+        <w:r>
+          <w:t xml:space="preserve"> Established repository initialized with access granted to tahmed1986.</w:t>
+        </w:r>
+      </w:ins>
+    </w:p>
+    <w:p>
+      <w:pPr>
+        <w:rPr>
+          <w:ins w:id="147" w:author="Rohit Singh" w:date="2026-10-20T22:53:00Z" w16du:dateUtc="2026-10-20T21:53:00Z"/>
+          <w:b/>
+          <w:bCs/>
+        </w:rPr>
+      </w:pPr>
+      <w:ins w:id="148" w:author="Rohit Singh" w:date="2026-10-20T22:53:00Z" w16du:dateUtc="2026-10-20T21:53:00Z">
+        <w:r>
+          <w:rPr>
+            <w:b/>
+            <w:bCs/>
+          </w:rPr>
+          <w:t>Semester 2 Final Deliverables</w:t>
+        </w:r>
+      </w:ins>
+    </w:p>
+    <w:p>
+      <w:pPr>
+        <w:numPr>
+          <w:ilvl w:val="0"/>
+          <w:numId w:val="8"/>
+        </w:numPr>
+        <w:rPr>
+          <w:ins w:id="149" w:author="Rohit Singh" w:date="2026-10-20T22:53:00Z" w16du:dateUtc="2026-10-20T21:53:00Z"/>
+        </w:rPr>
+      </w:pPr>
+      <w:ins w:id="150" w:author="Rohit Singh" w:date="2026-10-20T22:53:00Z" w16du:dateUtc="2026-10-20T21:53:00Z">
+        <w:r>
+          <w:rPr>
+            <w:b/>
+            <w:bCs/>
+          </w:rPr>
+          <w:t>Automated ETL &amp; Data Pipeline:</w:t>
+        </w:r>
+        <w:r>
+          <w:t xml:space="preserve"> Reproducible Python scripts/Jupyter Notebooks for data ingestion and preparation.</w:t>
+        </w:r>
+      </w:ins>
+    </w:p>
+    <w:p>
+      <w:pPr>
+        <w:numPr>
+          <w:ilvl w:val="0"/>
+          <w:numId w:val="8"/>
+        </w:numPr>
+        <w:rPr>
+          <w:ins w:id="151" w:author="Rohit Singh" w:date="2026-10-20T22:53:00Z" w16du:dateUtc="2026-10-20T21:53:00Z"/>
+        </w:rPr>
+      </w:pPr>
+      <w:ins w:id="152" w:author="Rohit Singh" w:date="2026-10-20T22:53:00Z" w16du:dateUtc="2026-10-20T21:53:00Z">
+        <w:r>
+          <w:rPr>
+            <w:b/>
+            <w:bCs/>
+          </w:rPr>
+          <w:t>Validated Predictive Model:</w:t>
+        </w:r>
+        <w:r>
+          <w:t xml:space="preserve"> Trained machine learning pipeline evaluated against standard statistical metrics ($R^2$, RMSE).</w:t>
+        </w:r>
+      </w:ins>
+    </w:p>
+    <w:p>
+      <w:pPr>
+        <w:numPr>
+          <w:ilvl w:val="0"/>
+          <w:numId w:val="8"/>
+        </w:numPr>
+        <w:rPr>
+          <w:ins w:id="153" w:author="Rohit Singh" w:date="2026-10-20T22:53:00Z" w16du:dateUtc="2026-10-20T21:53:00Z"/>
+        </w:rPr>
+      </w:pPr>
+      <w:ins w:id="154" w:author="Rohit Singh" w:date="2026-10-20T22:53:00Z" w16du:dateUtc="2026-10-20T21:53:00Z">
+        <w:r>
+          <w:rPr>
+            <w:b/>
+            <w:bCs/>
+          </w:rPr>
+          <w:t>Interactive Business Intelligence Dashboard:</w:t>
+        </w:r>
+        <w:r>
+          <w:t xml:space="preserve"> A functional Power BI report featuring regional infrastructure heatmaps and forecasting sliders.</w:t>
+        </w:r>
+      </w:ins>
+    </w:p>
+    <w:p>
+      <w:pPr>
+        <w:numPr>
+          <w:ilvl w:val="0"/>
+          <w:numId w:val="8"/>
+        </w:numPr>
+        <w:rPr>
+          <w:ins w:id="155" w:author="Rohit Singh" w:date="2026-10-20T22:53:00Z" w16du:dateUtc="2026-10-20T21:53:00Z"/>
+        </w:rPr>
+      </w:pPr>
+      <w:ins w:id="156" w:author="Rohit Singh" w:date="2026-10-20T22:53:00Z" w16du:dateUtc="2026-10-20T21:53:00Z">
+        <w:r>
+          <w:rPr>
+            <w:b/>
+            <w:bCs/>
+          </w:rPr>
+          <w:t>Final Capstone Project Report &amp; Presentation:</w:t>
+        </w:r>
+        <w:r>
+          <w:t xml:space="preserve"> Comprehensive thesis-style documentation covering strategic insights, business impact, and recommendations.</w:t>
+        </w:r>
+      </w:ins>
+    </w:p>
+    <w:p>
+      <w:pPr>
+        <w:pStyle w:val="Heading1"/>
+        <w:rPr>
+          <w:ins w:id="157" w:author="Rohit Singh" w:date="2026-10-20T22:53:00Z" w16du:dateUtc="2026-10-20T21:53:00Z"/>
+        </w:rPr>
+      </w:pPr>
+      <w:ins w:id="158" w:author="Rohit Singh" w:date="2026-10-20T22:53:00Z" w16du:dateUtc="2026-10-20T21:53:00Z">
+        <w:r>
+          <w:t>Project Timeline</w:t>
+        </w:r>
+      </w:ins>
+    </w:p>
+    <w:p>
+      <w:pPr>
+        <w:rPr>
+          <w:ins w:id="159" w:author="Rohit Singh" w:date="2026-10-20T22:53:00Z" w16du:dateUtc="2026-10-20T21:53:00Z"/>
+        </w:rPr>
+      </w:pPr>
+      <w:ins w:id="160" w:author="Rohit Singh" w:date="2026-10-20T22:53:00Z" w16du:dateUtc="2026-10-20T21:53:00Z">
+        <w:r>
+          <w:rPr>
+            <w:noProof/>
+          </w:rPr>
+          <w:drawing>
+            <wp:inline distT="0" distB="0" distL="0" distR="0" wp14:anchorId="2323C2B1" wp14:editId="2DF0B547">
+              <wp:extent cx="5731510" cy="1626870"/>
+              <wp:effectExtent l="0" t="0" r="2540" b="0"/>
+              <wp:docPr id="1439473116" name="Picture 1"/>
+              <wp:cNvGraphicFramePr>
+                <a:graphicFrameLocks xmlns:a="http://schemas.openxmlformats.org/drawingml/2006/main" noChangeAspect="1"/>
+              </wp:cNvGraphicFramePr>
+              <a:graphic xmlns:a="http://schemas.openxmlformats.org/drawingml/2006/main">
+                <a:graphicData uri="http://schemas.openxmlformats.org/drawingml/2006/picture">
+                  <pic:pic xmlns:pic="http://schemas.openxmlformats.org/drawingml/2006/picture">
+                    <pic:nvPicPr>
+                      <pic:cNvPr id="1439473116" name=""/>
+                      <pic:cNvPicPr/>
+                    </pic:nvPicPr>
+                    <pic:blipFill>
+                      <a:blip r:embed="rId10"/>
+                      <a:stretch>
+                        <a:fillRect/>
+                      </a:stretch>
+                    </pic:blipFill>
+                    <pic:spPr>
+                      <a:xfrm>
+                        <a:off x="0" y="0"/>
+                        <a:ext cx="5731510" cy="1626870"/>
+                      </a:xfrm>
+                      <a:prstGeom prst="rect">
+                        <a:avLst/>
+                      </a:prstGeom>
+                    </pic:spPr>
+                  </pic:pic>
+                </a:graphicData>
+              </a:graphic>
+            </wp:inline>
+          </w:drawing>
+        </w:r>
+      </w:ins>
+    </w:p>
+    <w:p>
+      <w:pPr>
+        <w:numPr>
+          <w:ilvl w:val="0"/>
+          <w:numId w:val="9"/>
+        </w:numPr>
+        <w:rPr>
+          <w:ins w:id="161" w:author="Rohit Singh" w:date="2026-10-20T22:53:00Z" w16du:dateUtc="2026-10-20T21:53:00Z"/>
+        </w:rPr>
+      </w:pPr>
+      <w:ins w:id="162" w:author="Rohit Singh" w:date="2026-10-20T22:53:00Z" w16du:dateUtc="2026-10-20T21:53:00Z">
+        <w:r>
+          <w:rPr>
+            <w:b/>
+            <w:bCs/>
+          </w:rPr>
+          <w:t>Milestone 1 (End Semester 1):</w:t>
+        </w:r>
+        <w:r>
+          <w:t xml:space="preserve"> Project Proposal, Git setup, and Ethical approval completed.</w:t>
+        </w:r>
+      </w:ins>
+    </w:p>
+    <w:p>
+      <w:pPr>
+        <w:numPr>
+          <w:ilvl w:val="0"/>
+          <w:numId w:val="9"/>
+        </w:numPr>
+        <w:rPr>
+          <w:ins w:id="163" w:author="Rohit Singh" w:date="2026-10-20T22:53:00Z" w16du:dateUtc="2026-10-20T21:53:00Z"/>
+        </w:rPr>
+      </w:pPr>
+      <w:ins w:id="164" w:author="Rohit Singh" w:date="2026-10-20T22:53:00Z" w16du:dateUtc="2026-10-20T21:53:00Z">
+        <w:r>
+          <w:rPr>
+            <w:b/>
+            <w:bCs/>
+          </w:rPr>
+          <w:t>Milestone 2 (Mid Semester 2):</w:t>
+        </w:r>
+        <w:r>
+          <w:t xml:space="preserve"> Data cleaning, feature engineering, and baseline model training complete.</w:t>
+        </w:r>
+      </w:ins>
+    </w:p>
+    <w:p>
+      <w:pPr>
+        <w:numPr>
+          <w:ilvl w:val="0"/>
+          <w:numId w:val="9"/>
+        </w:numPr>
+        <w:rPr>
+          <w:ins w:id="165" w:author="Rohit Singh" w:date="2026-10-20T22:53:00Z" w16du:dateUtc="2026-10-20T21:53:00Z"/>
+        </w:rPr>
+      </w:pPr>
+      <w:ins w:id="166" w:author="Rohit Singh" w:date="2026-10-20T22:53:00Z" w16du:dateUtc="2026-10-20T21:53:00Z">
+        <w:r>
+          <w:rPr>
+            <w:b/>
+            <w:bCs/>
+          </w:rPr>
+          <w:t>Milestone 3 (Late Semester 2):</w:t>
+        </w:r>
+        <w:r>
+          <w:t xml:space="preserve"> Model optimization, Power BI dashboard deployment, and final presentation defence.</w:t>
+        </w:r>
+      </w:ins>
+    </w:p>
+    <w:p>
+      <w:pPr>
+        <w:pStyle w:val="Heading1"/>
+        <w:rPr>
+          <w:ins w:id="167" w:author="Rohit Singh" w:date="2026-10-20T22:53:00Z" w16du:dateUtc="2026-10-20T21:53:00Z"/>
+        </w:rPr>
+      </w:pPr>
+      <w:ins w:id="168" w:author="Rohit Singh" w:date="2026-10-20T22:53:00Z" w16du:dateUtc="2026-10-20T21:53:00Z">
+        <w:r>
+          <w:lastRenderedPageBreak/>
+          <w:t>Ethical and Legal Considerations</w:t>
+        </w:r>
+      </w:ins>
+    </w:p>
+    <w:p>
+      <w:pPr>
+        <w:rPr>
+          <w:ins w:id="169" w:author="Rohit Singh" w:date="2026-10-20T22:53:00Z" w16du:dateUtc="2026-10-20T21:53:00Z"/>
+          <w:b/>
+          <w:bCs/>
+        </w:rPr>
+      </w:pPr>
+      <w:ins w:id="170" w:author="Rohit Singh" w:date="2026-10-20T22:53:00Z" w16du:dateUtc="2026-10-20T21:53:00Z">
+        <w:r>
+          <w:rPr>
+            <w:b/>
+            <w:bCs/>
+          </w:rPr>
+          <w:t>Data Protection &amp; GDPR</w:t>
+        </w:r>
+      </w:ins>
+    </w:p>
+    <w:p>
+      <w:pPr>
+        <w:rPr>
+          <w:ins w:id="171" w:author="Rohit Singh" w:date="2026-10-20T22:53:00Z" w16du:dateUtc="2026-10-20T21:53:00Z"/>
+        </w:rPr>
+      </w:pPr>
+      <w:ins w:id="172" w:author="Rohit Singh" w:date="2026-10-20T22:53:00Z" w16du:dateUtc="2026-10-20T21:53:00Z">
+        <w:r>
+          <w:t>The datasets utilized consist strictly of aggregated regional statistics and public infrastructure coordinates published by official government bodies. No personally identifiable information (PII), individual vehicle license plates, driver movement logs, or private home addresses are collected or processed. Consequently, the project presents negligible GDPR or personal privacy risks.</w:t>
+        </w:r>
+      </w:ins>
+    </w:p>
+    <w:p>
+      <w:pPr>
+        <w:rPr>
+          <w:ins w:id="173" w:author="Rohit Singh" w:date="2026-10-20T22:53:00Z" w16du:dateUtc="2026-10-20T21:53:00Z"/>
+          <w:b/>
+          <w:bCs/>
+        </w:rPr>
+      </w:pPr>
+      <w:ins w:id="174" w:author="Rohit Singh" w:date="2026-10-20T22:53:00Z" w16du:dateUtc="2026-10-20T21:53:00Z">
+        <w:r>
+          <w:rPr>
+            <w:b/>
+            <w:bCs/>
+          </w:rPr>
+          <w:t>Intellectual Property &amp; Data Use</w:t>
+        </w:r>
+      </w:ins>
+    </w:p>
+    <w:p>
+      <w:pPr>
+        <w:rPr>
+          <w:ins w:id="175" w:author="Rohit Singh" w:date="2026-10-20T22:53:00Z" w16du:dateUtc="2026-10-20T21:53:00Z"/>
+        </w:rPr>
+      </w:pPr>
+      <w:ins w:id="176" w:author="Rohit Singh" w:date="2026-10-20T22:53:00Z" w16du:dateUtc="2026-10-20T21:53:00Z">
+        <w:r>
+          <w:t>All sources are properly referenced in accordance with Harvard Referencing guidelines. Open data licensing conditions under CC BY 4.0 are fully respected by maintaining clear metadata lineage within the code repository.</w:t>
+        </w:r>
+      </w:ins>
+    </w:p>
+    <w:p>
+      <w:pPr>
+        <w:rPr>
+          <w:ins w:id="177" w:author="Rohit Singh" w:date="2026-10-20T22:53:00Z" w16du:dateUtc="2026-10-20T21:53:00Z"/>
+          <w:b/>
+          <w:bCs/>
+        </w:rPr>
+      </w:pPr>
+      <w:ins w:id="178" w:author="Rohit Singh" w:date="2026-10-20T22:53:00Z" w16du:dateUtc="2026-10-20T21:53:00Z">
+        <w:r>
+          <w:rPr>
+            <w:b/>
+            <w:bCs/>
+          </w:rPr>
+          <w:t>Model Transparency &amp; Algorithmic Bias</w:t>
+        </w:r>
+      </w:ins>
+    </w:p>
+    <w:p>
+      <w:pPr>
+        <w:rPr>
+          <w:ins w:id="179" w:author="Rohit Singh" w:date="2026-10-20T22:53:00Z" w16du:dateUtc="2026-10-20T21:53:00Z"/>
+        </w:rPr>
+      </w:pPr>
+      <w:ins w:id="180" w:author="Rohit Singh" w:date="2026-10-20T22:53:00Z" w16du:dateUtc="2026-10-20T21:53:00Z">
+        <w:r>
+          <w:t>Predictive models used in public infrastructure planning must maintain transparency. The project will evaluate feature importance to ensure models do not unintentionally penalize economically disadvantaged or rural communities, supporting equitable access to public infrastructure.</w:t>
+        </w:r>
+      </w:ins>
+    </w:p>
+    <w:p>
+      <w:pPr>
+        <w:rPr>
+          <w:ins w:id="181" w:author="Rohit Singh" w:date="2026-10-20T22:53:00Z" w16du:dateUtc="2026-10-20T21:53:00Z"/>
+          <w:b/>
+          <w:bCs/>
+        </w:rPr>
+      </w:pPr>
+      <w:ins w:id="182" w:author="Rohit Singh" w:date="2026-10-20T22:53:00Z" w16du:dateUtc="2026-10-20T21:53:00Z">
+        <w:r>
+          <w:rPr>
+            <w:b/>
+            <w:bCs/>
+          </w:rPr>
+          <w:t>References</w:t>
+        </w:r>
+      </w:ins>
+    </w:p>
+    <w:p>
+      <w:pPr>
+        <w:numPr>
+          <w:ilvl w:val="0"/>
+          <w:numId w:val="10"/>
+        </w:numPr>
+        <w:rPr>
+          <w:ins w:id="183" w:author="Rohit Singh" w:date="2026-10-20T22:53:00Z" w16du:dateUtc="2026-10-20T21:53:00Z"/>
+        </w:rPr>
+      </w:pPr>
+      <w:ins w:id="184" w:author="Rohit Singh" w:date="2026-10-20T22:53:00Z" w16du:dateUtc="2026-10-20T21:53:00Z">
+        <w:r>
+          <w:t xml:space="preserve">Central Statistics Office (2026) </w:t>
+        </w:r>
+        <w:r>
+          <w:rPr>
+            <w:i/>
+            <w:iCs/>
+          </w:rPr>
+          <w:t>TEA30: Licensing of New and Used Vehicles</w:t>
+        </w:r>
+        <w:r>
+          <w:t>. Available at: https://data.gov.ie (Accessed: 7 October 2026).</w:t>
+        </w:r>
+      </w:ins>
+    </w:p>
+    <w:p>
+      <w:pPr>
+        <w:numPr>
+          <w:ilvl w:val="0"/>
+          <w:numId w:val="10"/>
+        </w:numPr>
+        <w:rPr>
+          <w:ins w:id="185" w:author="Rohit Singh" w:date="2026-10-20T22:53:00Z" w16du:dateUtc="2026-10-20T21:53:00Z"/>
+        </w:rPr>
+      </w:pPr>
+      <w:ins w:id="186" w:author="Rohit Singh" w:date="2026-10-20T22:53:00Z" w16du:dateUtc="2026-10-20T21:53:00Z">
+        <w:r>
+          <w:t xml:space="preserve">Department of Transport (2022) </w:t>
+        </w:r>
+        <w:r>
+          <w:rPr>
+            <w:i/>
+            <w:iCs/>
+          </w:rPr>
+          <w:t>Electric Vehicle Charging Infrastructure Strategy 2022–2025</w:t>
+        </w:r>
+        <w:r>
+          <w:t>. Dublin: Government of Ireland.</w:t>
+        </w:r>
+      </w:ins>
+    </w:p>
+    <w:p>
+      <w:pPr>
+        <w:rPr>
+          <w:b/>
+          <w:bCs/>
+          <w:rPrChange w:id="187" w:author="Rohit Singh" w:date="2026-10-20T22:38:00Z" w16du:dateUtc="2026-10-20T21:38:00Z">
+            <w:rPr/>
+          </w:rPrChange>
+        </w:rPr>
+        <w:pPrChange w:id="188" w:author="Rohit Singh" w:date="2026-10-20T22:38:00Z" w16du:dateUtc="2026-10-20T21:38:00Z">
+          <w:pPr>
+            <w:pStyle w:val="Heading1"/>
+          </w:pPr>
+        </w:pPrChange>
+      </w:pPr>
+      <w:ins w:id="189" w:author="Rohit Singh" w:date="2026-10-20T22:53:00Z" w16du:dateUtc="2026-10-20T21:53:00Z">
+        <w:r>
+          <w:t xml:space="preserve">Sustainable Energy Authority of Ireland (2025) </w:t>
+        </w:r>
+        <w:r>
+          <w:rPr>
+            <w:i/>
+            <w:iCs/>
+          </w:rPr>
+          <w:t>EV Infrastructure and Registration Trends in Ireland</w:t>
+        </w:r>
+        <w:r>
+          <w:t>. Dublin: SEAI.</w:t>
+        </w:r>
+      </w:ins>
     </w:p>
     <w:sectPr>
       <w:pgSz w:w="11906" w:h="16838"/>

</xml_diff>

<commit_message>
Made few updates to section 7 & 8 in the Proposal word document
Made few updates to section 7 & 8 in the Proposal word document
</commit_message>
<xml_diff>
--- a/docs/sba26094_CA1_Strategic_Thinking_v1.docx
+++ b/docs/sba26094_CA1_Strategic_Thinking_v1.docx
@@ -2630,7 +2630,17 @@
           <w:t>Visualization &amp; Reporting:</w:t>
         </w:r>
         <w:r>
-          <w:t xml:space="preserve"> Power BI / Streamlit for dynamic user dashboarding; Matplotlib &amp; Seaborn for EDA.</w:t>
+          <w:t xml:space="preserve"> Power BI / Stream</w:t>
+        </w:r>
+      </w:ins>
+      <w:ins w:id="112" w:author="Rohit Singh" w:date="2026-10-20T23:00:00Z" w16du:dateUtc="2026-10-20T22:00:00Z">
+        <w:r>
+          <w:t>lit</w:t>
+        </w:r>
+      </w:ins>
+      <w:ins w:id="113" w:author="Rohit Singh" w:date="2026-10-20T22:38:00Z" w16du:dateUtc="2026-10-20T21:38:00Z">
+        <w:r>
+          <w:t xml:space="preserve"> for dynamic user dashboarding; Matplotlib &amp; Seaborn for EDA.</w:t>
         </w:r>
       </w:ins>
     </w:p>
@@ -2641,10 +2651,10 @@
           <w:numId w:val="5"/>
         </w:numPr>
         <w:rPr>
-          <w:ins w:id="112" w:author="Rohit Singh" w:date="2026-10-20T22:38:00Z" w16du:dateUtc="2026-10-20T21:38:00Z"/>
-        </w:rPr>
-      </w:pPr>
-      <w:ins w:id="113" w:author="Rohit Singh" w:date="2026-10-20T22:38:00Z" w16du:dateUtc="2026-10-20T21:38:00Z">
+          <w:ins w:id="114" w:author="Rohit Singh" w:date="2026-10-20T22:38:00Z" w16du:dateUtc="2026-10-20T21:38:00Z"/>
+        </w:rPr>
+      </w:pPr>
+      <w:ins w:id="115" w:author="Rohit Singh" w:date="2026-10-20T22:38:00Z" w16du:dateUtc="2026-10-20T21:38:00Z">
         <w:r>
           <w:rPr>
             <w:b/>
@@ -2661,12 +2671,12 @@
     <w:p>
       <w:pPr>
         <w:rPr>
-          <w:ins w:id="114" w:author="Rohit Singh" w:date="2026-10-20T22:38:00Z" w16du:dateUtc="2026-10-20T21:38:00Z"/>
+          <w:ins w:id="116" w:author="Rohit Singh" w:date="2026-10-20T22:38:00Z" w16du:dateUtc="2026-10-20T21:38:00Z"/>
           <w:b/>
           <w:bCs/>
         </w:rPr>
       </w:pPr>
-      <w:ins w:id="115" w:author="Rohit Singh" w:date="2026-10-20T22:38:00Z" w16du:dateUtc="2026-10-20T21:38:00Z">
+      <w:ins w:id="117" w:author="Rohit Singh" w:date="2026-10-20T22:38:00Z" w16du:dateUtc="2026-10-20T21:38:00Z">
         <w:r>
           <w:rPr>
             <w:b/>
@@ -2679,12 +2689,12 @@
     <w:p>
       <w:pPr>
         <w:rPr>
-          <w:ins w:id="116" w:author="Rohit Singh" w:date="2026-10-20T22:53:00Z" w16du:dateUtc="2026-10-20T21:53:00Z"/>
+          <w:ins w:id="118" w:author="Rohit Singh" w:date="2026-10-20T22:53:00Z" w16du:dateUtc="2026-10-20T21:53:00Z"/>
           <w:b/>
           <w:bCs/>
         </w:rPr>
       </w:pPr>
-      <w:ins w:id="117" w:author="Rohit Singh" w:date="2026-10-20T22:55:00Z" w16du:dateUtc="2026-10-20T21:55:00Z">
+      <w:ins w:id="119" w:author="Rohit Singh" w:date="2026-10-20T22:55:00Z" w16du:dateUtc="2026-10-20T21:55:00Z">
         <w:r>
           <w:rPr>
             <w:b/>
@@ -2732,7 +2742,7 @@
     <w:p>
       <w:pPr>
         <w:rPr>
-          <w:ins w:id="118" w:author="Rohit Singh" w:date="2026-10-20T22:53:00Z" w16du:dateUtc="2026-10-20T21:53:00Z"/>
+          <w:ins w:id="120" w:author="Rohit Singh" w:date="2026-10-20T22:53:00Z" w16du:dateUtc="2026-10-20T21:53:00Z"/>
           <w:b/>
           <w:bCs/>
         </w:rPr>
@@ -2742,10 +2752,10 @@
       <w:pPr>
         <w:pStyle w:val="Heading1"/>
         <w:rPr>
-          <w:ins w:id="119" w:author="Rohit Singh" w:date="2026-10-20T22:53:00Z" w16du:dateUtc="2026-10-20T21:53:00Z"/>
-        </w:rPr>
-      </w:pPr>
-      <w:ins w:id="120" w:author="Rohit Singh" w:date="2026-10-20T22:53:00Z" w16du:dateUtc="2026-10-20T21:53:00Z">
+          <w:ins w:id="121" w:author="Rohit Singh" w:date="2026-10-20T22:53:00Z" w16du:dateUtc="2026-10-20T21:53:00Z"/>
+        </w:rPr>
+      </w:pPr>
+      <w:ins w:id="122" w:author="Rohit Singh" w:date="2026-10-20T22:53:00Z" w16du:dateUtc="2026-10-20T21:53:00Z">
         <w:r>
           <w:t>Data Sources</w:t>
         </w:r>
@@ -2754,12 +2764,12 @@
     <w:p>
       <w:pPr>
         <w:rPr>
-          <w:ins w:id="121" w:author="Rohit Singh" w:date="2026-10-20T22:53:00Z" w16du:dateUtc="2026-10-20T21:53:00Z"/>
+          <w:ins w:id="123" w:author="Rohit Singh" w:date="2026-10-20T22:53:00Z" w16du:dateUtc="2026-10-20T21:53:00Z"/>
           <w:b/>
           <w:bCs/>
         </w:rPr>
       </w:pPr>
-      <w:ins w:id="122" w:author="Rohit Singh" w:date="2026-10-20T22:53:00Z" w16du:dateUtc="2026-10-20T21:53:00Z">
+      <w:ins w:id="124" w:author="Rohit Singh" w:date="2026-10-20T22:53:00Z" w16du:dateUtc="2026-10-20T21:53:00Z">
         <w:r>
           <w:rPr>
             <w:b/>
@@ -2772,10 +2782,10 @@
     <w:p>
       <w:pPr>
         <w:rPr>
-          <w:ins w:id="123" w:author="Rohit Singh" w:date="2026-10-20T22:53:00Z" w16du:dateUtc="2026-10-20T21:53:00Z"/>
-        </w:rPr>
-      </w:pPr>
-      <w:ins w:id="124" w:author="Rohit Singh" w:date="2026-10-20T22:53:00Z" w16du:dateUtc="2026-10-20T21:53:00Z">
+          <w:ins w:id="125" w:author="Rohit Singh" w:date="2026-10-20T22:53:00Z" w16du:dateUtc="2026-10-20T21:53:00Z"/>
+        </w:rPr>
+      </w:pPr>
+      <w:ins w:id="126" w:author="Rohit Singh" w:date="2026-10-20T22:53:00Z" w16du:dateUtc="2026-10-20T21:53:00Z">
         <w:r>
           <w:t xml:space="preserve">The project relies on verified public open datasets published on </w:t>
         </w:r>
@@ -2798,10 +2808,10 @@
           <w:numId w:val="6"/>
         </w:numPr>
         <w:rPr>
-          <w:ins w:id="125" w:author="Rohit Singh" w:date="2026-10-20T22:53:00Z" w16du:dateUtc="2026-10-20T21:53:00Z"/>
-        </w:rPr>
-      </w:pPr>
-      <w:ins w:id="126" w:author="Rohit Singh" w:date="2026-10-20T22:53:00Z" w16du:dateUtc="2026-10-20T21:53:00Z">
+          <w:ins w:id="127" w:author="Rohit Singh" w:date="2026-10-20T22:53:00Z" w16du:dateUtc="2026-10-20T21:53:00Z"/>
+        </w:rPr>
+      </w:pPr>
+      <w:ins w:id="128" w:author="Rohit Singh" w:date="2026-10-20T22:53:00Z" w16du:dateUtc="2026-10-20T21:53:00Z">
         <w:r>
           <w:rPr>
             <w:b/>
@@ -2821,10 +2831,10 @@
           <w:numId w:val="6"/>
         </w:numPr>
         <w:rPr>
-          <w:ins w:id="127" w:author="Rohit Singh" w:date="2026-10-20T22:53:00Z" w16du:dateUtc="2026-10-20T21:53:00Z"/>
-        </w:rPr>
-      </w:pPr>
-      <w:ins w:id="128" w:author="Rohit Singh" w:date="2026-10-20T22:53:00Z" w16du:dateUtc="2026-10-20T21:53:00Z">
+          <w:ins w:id="129" w:author="Rohit Singh" w:date="2026-10-20T22:53:00Z" w16du:dateUtc="2026-10-20T21:53:00Z"/>
+        </w:rPr>
+      </w:pPr>
+      <w:ins w:id="130" w:author="Rohit Singh" w:date="2026-10-20T22:53:00Z" w16du:dateUtc="2026-10-20T21:53:00Z">
         <w:r>
           <w:rPr>
             <w:b/>
@@ -2844,10 +2854,10 @@
           <w:numId w:val="6"/>
         </w:numPr>
         <w:rPr>
-          <w:ins w:id="129" w:author="Rohit Singh" w:date="2026-10-20T22:53:00Z" w16du:dateUtc="2026-10-20T21:53:00Z"/>
-        </w:rPr>
-      </w:pPr>
-      <w:ins w:id="130" w:author="Rohit Singh" w:date="2026-10-20T22:53:00Z" w16du:dateUtc="2026-10-20T21:53:00Z">
+          <w:ins w:id="131" w:author="Rohit Singh" w:date="2026-10-20T22:53:00Z" w16du:dateUtc="2026-10-20T21:53:00Z"/>
+        </w:rPr>
+      </w:pPr>
+      <w:ins w:id="132" w:author="Rohit Singh" w:date="2026-10-20T22:53:00Z" w16du:dateUtc="2026-10-20T21:53:00Z">
         <w:r>
           <w:rPr>
             <w:b/>
@@ -2856,19 +2866,29 @@
           <w:t>Local Authority Open GIS Datasets (Smart Dublin, Cork City Council, FCC):</w:t>
         </w:r>
         <w:r>
-          <w:t xml:space="preserve"> Geolocation records (latitude/longitude), connector types, and charger power capacity.</w:t>
-        </w:r>
-      </w:ins>
-    </w:p>
-    <w:p>
-      <w:pPr>
-        <w:rPr>
-          <w:ins w:id="131" w:author="Rohit Singh" w:date="2026-10-20T22:53:00Z" w16du:dateUtc="2026-10-20T21:53:00Z"/>
+          <w:t xml:space="preserve"> Geolocation records (latitude/longitude), connector types, </w:t>
+        </w:r>
+      </w:ins>
+      <w:ins w:id="133" w:author="Rohit Singh" w:date="2026-10-20T23:00:00Z" w16du:dateUtc="2026-10-20T22:00:00Z">
+        <w:r>
+          <w:t>and</w:t>
+        </w:r>
+      </w:ins>
+      <w:ins w:id="134" w:author="Rohit Singh" w:date="2026-10-20T22:53:00Z" w16du:dateUtc="2026-10-20T21:53:00Z">
+        <w:r>
+          <w:t xml:space="preserve"> charger power capacity.</w:t>
+        </w:r>
+      </w:ins>
+    </w:p>
+    <w:p>
+      <w:pPr>
+        <w:rPr>
+          <w:ins w:id="135" w:author="Rohit Singh" w:date="2026-10-20T22:53:00Z" w16du:dateUtc="2026-10-20T21:53:00Z"/>
           <w:b/>
           <w:bCs/>
         </w:rPr>
       </w:pPr>
-      <w:ins w:id="132" w:author="Rohit Singh" w:date="2026-10-20T22:53:00Z" w16du:dateUtc="2026-10-20T21:53:00Z">
+      <w:ins w:id="136" w:author="Rohit Singh" w:date="2026-10-20T22:53:00Z" w16du:dateUtc="2026-10-20T21:53:00Z">
         <w:r>
           <w:rPr>
             <w:b/>
@@ -2881,10 +2901,10 @@
     <w:p>
       <w:pPr>
         <w:rPr>
-          <w:ins w:id="133" w:author="Rohit Singh" w:date="2026-10-20T22:53:00Z" w16du:dateUtc="2026-10-20T21:53:00Z"/>
-        </w:rPr>
-      </w:pPr>
-      <w:ins w:id="134" w:author="Rohit Singh" w:date="2026-10-20T22:53:00Z" w16du:dateUtc="2026-10-20T21:53:00Z">
+          <w:ins w:id="137" w:author="Rohit Singh" w:date="2026-10-20T22:53:00Z" w16du:dateUtc="2026-10-20T21:53:00Z"/>
+        </w:rPr>
+      </w:pPr>
+      <w:ins w:id="138" w:author="Rohit Singh" w:date="2026-10-20T22:53:00Z" w16du:dateUtc="2026-10-20T21:53:00Z">
         <w:r>
           <w:t xml:space="preserve">All selected datasets are published under the </w:t>
         </w:r>
@@ -2908,10 +2928,10 @@
       <w:pPr>
         <w:pStyle w:val="Heading1"/>
         <w:rPr>
-          <w:ins w:id="135" w:author="Rohit Singh" w:date="2026-10-20T22:53:00Z" w16du:dateUtc="2026-10-20T21:53:00Z"/>
-        </w:rPr>
-      </w:pPr>
-      <w:ins w:id="136" w:author="Rohit Singh" w:date="2026-10-20T22:53:00Z" w16du:dateUtc="2026-10-20T21:53:00Z">
+          <w:ins w:id="139" w:author="Rohit Singh" w:date="2026-10-20T22:53:00Z" w16du:dateUtc="2026-10-20T21:53:00Z"/>
+        </w:rPr>
+      </w:pPr>
+      <w:ins w:id="140" w:author="Rohit Singh" w:date="2026-10-20T22:53:00Z" w16du:dateUtc="2026-10-20T21:53:00Z">
         <w:r>
           <w:t>Expected Deliverables (Semester 1 &amp; 2)</w:t>
         </w:r>
@@ -2920,12 +2940,12 @@
     <w:p>
       <w:pPr>
         <w:rPr>
-          <w:ins w:id="137" w:author="Rohit Singh" w:date="2026-10-20T22:53:00Z" w16du:dateUtc="2026-10-20T21:53:00Z"/>
+          <w:ins w:id="141" w:author="Rohit Singh" w:date="2026-10-20T22:53:00Z" w16du:dateUtc="2026-10-20T21:53:00Z"/>
           <w:b/>
           <w:bCs/>
         </w:rPr>
       </w:pPr>
-      <w:ins w:id="138" w:author="Rohit Singh" w:date="2026-10-20T22:53:00Z" w16du:dateUtc="2026-10-20T21:53:00Z">
+      <w:ins w:id="142" w:author="Rohit Singh" w:date="2026-10-20T22:53:00Z" w16du:dateUtc="2026-10-20T21:53:00Z">
         <w:r>
           <w:rPr>
             <w:b/>
@@ -2942,10 +2962,10 @@
           <w:numId w:val="7"/>
         </w:numPr>
         <w:rPr>
-          <w:ins w:id="139" w:author="Rohit Singh" w:date="2026-10-20T22:53:00Z" w16du:dateUtc="2026-10-20T21:53:00Z"/>
-        </w:rPr>
-      </w:pPr>
-      <w:ins w:id="140" w:author="Rohit Singh" w:date="2026-10-20T22:53:00Z" w16du:dateUtc="2026-10-20T21:53:00Z">
+          <w:ins w:id="143" w:author="Rohit Singh" w:date="2026-10-20T22:53:00Z" w16du:dateUtc="2026-10-20T21:53:00Z"/>
+        </w:rPr>
+      </w:pPr>
+      <w:ins w:id="144" w:author="Rohit Singh" w:date="2026-10-20T22:53:00Z" w16du:dateUtc="2026-10-20T21:53:00Z">
         <w:r>
           <w:rPr>
             <w:b/>
@@ -2965,10 +2985,10 @@
           <w:numId w:val="7"/>
         </w:numPr>
         <w:rPr>
-          <w:ins w:id="141" w:author="Rohit Singh" w:date="2026-10-20T22:53:00Z" w16du:dateUtc="2026-10-20T21:53:00Z"/>
-        </w:rPr>
-      </w:pPr>
-      <w:ins w:id="142" w:author="Rohit Singh" w:date="2026-10-20T22:53:00Z" w16du:dateUtc="2026-10-20T21:53:00Z">
+          <w:ins w:id="145" w:author="Rohit Singh" w:date="2026-10-20T22:53:00Z" w16du:dateUtc="2026-10-20T21:53:00Z"/>
+        </w:rPr>
+      </w:pPr>
+      <w:ins w:id="146" w:author="Rohit Singh" w:date="2026-10-20T22:53:00Z" w16du:dateUtc="2026-10-20T21:53:00Z">
         <w:r>
           <w:rPr>
             <w:b/>
@@ -2988,10 +3008,10 @@
           <w:numId w:val="7"/>
         </w:numPr>
         <w:rPr>
-          <w:ins w:id="143" w:author="Rohit Singh" w:date="2026-10-20T22:53:00Z" w16du:dateUtc="2026-10-20T21:53:00Z"/>
-        </w:rPr>
-      </w:pPr>
-      <w:ins w:id="144" w:author="Rohit Singh" w:date="2026-10-20T22:53:00Z" w16du:dateUtc="2026-10-20T21:53:00Z">
+          <w:ins w:id="147" w:author="Rohit Singh" w:date="2026-10-20T22:53:00Z" w16du:dateUtc="2026-10-20T21:53:00Z"/>
+        </w:rPr>
+      </w:pPr>
+      <w:ins w:id="148" w:author="Rohit Singh" w:date="2026-10-20T22:53:00Z" w16du:dateUtc="2026-10-20T21:53:00Z">
         <w:r>
           <w:rPr>
             <w:b/>
@@ -3011,10 +3031,10 @@
           <w:numId w:val="7"/>
         </w:numPr>
         <w:rPr>
-          <w:ins w:id="145" w:author="Rohit Singh" w:date="2026-10-20T22:53:00Z" w16du:dateUtc="2026-10-20T21:53:00Z"/>
-        </w:rPr>
-      </w:pPr>
-      <w:ins w:id="146" w:author="Rohit Singh" w:date="2026-10-20T22:53:00Z" w16du:dateUtc="2026-10-20T21:53:00Z">
+          <w:ins w:id="149" w:author="Rohit Singh" w:date="2026-10-20T22:53:00Z" w16du:dateUtc="2026-10-20T21:53:00Z"/>
+        </w:rPr>
+      </w:pPr>
+      <w:ins w:id="150" w:author="Rohit Singh" w:date="2026-10-20T22:53:00Z" w16du:dateUtc="2026-10-20T21:53:00Z">
         <w:r>
           <w:rPr>
             <w:b/>
@@ -3030,12 +3050,12 @@
     <w:p>
       <w:pPr>
         <w:rPr>
-          <w:ins w:id="147" w:author="Rohit Singh" w:date="2026-10-20T22:53:00Z" w16du:dateUtc="2026-10-20T21:53:00Z"/>
+          <w:ins w:id="151" w:author="Rohit Singh" w:date="2026-10-20T22:53:00Z" w16du:dateUtc="2026-10-20T21:53:00Z"/>
           <w:b/>
           <w:bCs/>
         </w:rPr>
       </w:pPr>
-      <w:ins w:id="148" w:author="Rohit Singh" w:date="2026-10-20T22:53:00Z" w16du:dateUtc="2026-10-20T21:53:00Z">
+      <w:ins w:id="152" w:author="Rohit Singh" w:date="2026-10-20T22:53:00Z" w16du:dateUtc="2026-10-20T21:53:00Z">
         <w:r>
           <w:rPr>
             <w:b/>
@@ -3052,10 +3072,10 @@
           <w:numId w:val="8"/>
         </w:numPr>
         <w:rPr>
-          <w:ins w:id="149" w:author="Rohit Singh" w:date="2026-10-20T22:53:00Z" w16du:dateUtc="2026-10-20T21:53:00Z"/>
-        </w:rPr>
-      </w:pPr>
-      <w:ins w:id="150" w:author="Rohit Singh" w:date="2026-10-20T22:53:00Z" w16du:dateUtc="2026-10-20T21:53:00Z">
+          <w:ins w:id="153" w:author="Rohit Singh" w:date="2026-10-20T22:53:00Z" w16du:dateUtc="2026-10-20T21:53:00Z"/>
+        </w:rPr>
+      </w:pPr>
+      <w:ins w:id="154" w:author="Rohit Singh" w:date="2026-10-20T22:53:00Z" w16du:dateUtc="2026-10-20T21:53:00Z">
         <w:r>
           <w:rPr>
             <w:b/>
@@ -3075,10 +3095,10 @@
           <w:numId w:val="8"/>
         </w:numPr>
         <w:rPr>
-          <w:ins w:id="151" w:author="Rohit Singh" w:date="2026-10-20T22:53:00Z" w16du:dateUtc="2026-10-20T21:53:00Z"/>
-        </w:rPr>
-      </w:pPr>
-      <w:ins w:id="152" w:author="Rohit Singh" w:date="2026-10-20T22:53:00Z" w16du:dateUtc="2026-10-20T21:53:00Z">
+          <w:ins w:id="155" w:author="Rohit Singh" w:date="2026-10-20T22:53:00Z" w16du:dateUtc="2026-10-20T21:53:00Z"/>
+        </w:rPr>
+      </w:pPr>
+      <w:ins w:id="156" w:author="Rohit Singh" w:date="2026-10-20T22:53:00Z" w16du:dateUtc="2026-10-20T21:53:00Z">
         <w:r>
           <w:rPr>
             <w:b/>
@@ -3098,10 +3118,10 @@
           <w:numId w:val="8"/>
         </w:numPr>
         <w:rPr>
-          <w:ins w:id="153" w:author="Rohit Singh" w:date="2026-10-20T22:53:00Z" w16du:dateUtc="2026-10-20T21:53:00Z"/>
-        </w:rPr>
-      </w:pPr>
-      <w:ins w:id="154" w:author="Rohit Singh" w:date="2026-10-20T22:53:00Z" w16du:dateUtc="2026-10-20T21:53:00Z">
+          <w:ins w:id="157" w:author="Rohit Singh" w:date="2026-10-20T22:53:00Z" w16du:dateUtc="2026-10-20T21:53:00Z"/>
+        </w:rPr>
+      </w:pPr>
+      <w:ins w:id="158" w:author="Rohit Singh" w:date="2026-10-20T22:53:00Z" w16du:dateUtc="2026-10-20T21:53:00Z">
         <w:r>
           <w:rPr>
             <w:b/>
@@ -3121,10 +3141,10 @@
           <w:numId w:val="8"/>
         </w:numPr>
         <w:rPr>
-          <w:ins w:id="155" w:author="Rohit Singh" w:date="2026-10-20T22:53:00Z" w16du:dateUtc="2026-10-20T21:53:00Z"/>
-        </w:rPr>
-      </w:pPr>
-      <w:ins w:id="156" w:author="Rohit Singh" w:date="2026-10-20T22:53:00Z" w16du:dateUtc="2026-10-20T21:53:00Z">
+          <w:ins w:id="159" w:author="Rohit Singh" w:date="2026-10-20T22:53:00Z" w16du:dateUtc="2026-10-20T21:53:00Z"/>
+        </w:rPr>
+      </w:pPr>
+      <w:ins w:id="160" w:author="Rohit Singh" w:date="2026-10-20T22:53:00Z" w16du:dateUtc="2026-10-20T21:53:00Z">
         <w:r>
           <w:rPr>
             <w:b/>
@@ -3141,10 +3161,10 @@
       <w:pPr>
         <w:pStyle w:val="Heading1"/>
         <w:rPr>
-          <w:ins w:id="157" w:author="Rohit Singh" w:date="2026-10-20T22:53:00Z" w16du:dateUtc="2026-10-20T21:53:00Z"/>
-        </w:rPr>
-      </w:pPr>
-      <w:ins w:id="158" w:author="Rohit Singh" w:date="2026-10-20T22:53:00Z" w16du:dateUtc="2026-10-20T21:53:00Z">
+          <w:ins w:id="161" w:author="Rohit Singh" w:date="2026-10-20T22:53:00Z" w16du:dateUtc="2026-10-20T21:53:00Z"/>
+        </w:rPr>
+      </w:pPr>
+      <w:ins w:id="162" w:author="Rohit Singh" w:date="2026-10-20T22:53:00Z" w16du:dateUtc="2026-10-20T21:53:00Z">
         <w:r>
           <w:t>Project Timeline</w:t>
         </w:r>
@@ -3153,10 +3173,10 @@
     <w:p>
       <w:pPr>
         <w:rPr>
-          <w:ins w:id="159" w:author="Rohit Singh" w:date="2026-10-20T22:53:00Z" w16du:dateUtc="2026-10-20T21:53:00Z"/>
-        </w:rPr>
-      </w:pPr>
-      <w:ins w:id="160" w:author="Rohit Singh" w:date="2026-10-20T22:53:00Z" w16du:dateUtc="2026-10-20T21:53:00Z">
+          <w:ins w:id="163" w:author="Rohit Singh" w:date="2026-10-20T22:53:00Z" w16du:dateUtc="2026-10-20T21:53:00Z"/>
+        </w:rPr>
+      </w:pPr>
+      <w:ins w:id="164" w:author="Rohit Singh" w:date="2026-10-20T22:53:00Z" w16du:dateUtc="2026-10-20T21:53:00Z">
         <w:r>
           <w:rPr>
             <w:noProof/>
@@ -3206,10 +3226,10 @@
           <w:numId w:val="9"/>
         </w:numPr>
         <w:rPr>
-          <w:ins w:id="161" w:author="Rohit Singh" w:date="2026-10-20T22:53:00Z" w16du:dateUtc="2026-10-20T21:53:00Z"/>
-        </w:rPr>
-      </w:pPr>
-      <w:ins w:id="162" w:author="Rohit Singh" w:date="2026-10-20T22:53:00Z" w16du:dateUtc="2026-10-20T21:53:00Z">
+          <w:ins w:id="165" w:author="Rohit Singh" w:date="2026-10-20T22:53:00Z" w16du:dateUtc="2026-10-20T21:53:00Z"/>
+        </w:rPr>
+      </w:pPr>
+      <w:ins w:id="166" w:author="Rohit Singh" w:date="2026-10-20T22:53:00Z" w16du:dateUtc="2026-10-20T21:53:00Z">
         <w:r>
           <w:rPr>
             <w:b/>
@@ -3229,10 +3249,10 @@
           <w:numId w:val="9"/>
         </w:numPr>
         <w:rPr>
-          <w:ins w:id="163" w:author="Rohit Singh" w:date="2026-10-20T22:53:00Z" w16du:dateUtc="2026-10-20T21:53:00Z"/>
-        </w:rPr>
-      </w:pPr>
-      <w:ins w:id="164" w:author="Rohit Singh" w:date="2026-10-20T22:53:00Z" w16du:dateUtc="2026-10-20T21:53:00Z">
+          <w:ins w:id="167" w:author="Rohit Singh" w:date="2026-10-20T22:53:00Z" w16du:dateUtc="2026-10-20T21:53:00Z"/>
+        </w:rPr>
+      </w:pPr>
+      <w:ins w:id="168" w:author="Rohit Singh" w:date="2026-10-20T22:53:00Z" w16du:dateUtc="2026-10-20T21:53:00Z">
         <w:r>
           <w:rPr>
             <w:b/>
@@ -3252,10 +3272,10 @@
           <w:numId w:val="9"/>
         </w:numPr>
         <w:rPr>
-          <w:ins w:id="165" w:author="Rohit Singh" w:date="2026-10-20T22:53:00Z" w16du:dateUtc="2026-10-20T21:53:00Z"/>
-        </w:rPr>
-      </w:pPr>
-      <w:ins w:id="166" w:author="Rohit Singh" w:date="2026-10-20T22:53:00Z" w16du:dateUtc="2026-10-20T21:53:00Z">
+          <w:ins w:id="169" w:author="Rohit Singh" w:date="2026-10-20T22:53:00Z" w16du:dateUtc="2026-10-20T21:53:00Z"/>
+        </w:rPr>
+      </w:pPr>
+      <w:ins w:id="170" w:author="Rohit Singh" w:date="2026-10-20T22:53:00Z" w16du:dateUtc="2026-10-20T21:53:00Z">
         <w:r>
           <w:rPr>
             <w:b/>
@@ -3272,43 +3292,13 @@
       <w:pPr>
         <w:pStyle w:val="Heading1"/>
         <w:rPr>
-          <w:ins w:id="167" w:author="Rohit Singh" w:date="2026-10-20T22:53:00Z" w16du:dateUtc="2026-10-20T21:53:00Z"/>
-        </w:rPr>
-      </w:pPr>
-      <w:ins w:id="168" w:author="Rohit Singh" w:date="2026-10-20T22:53:00Z" w16du:dateUtc="2026-10-20T21:53:00Z">
+          <w:ins w:id="171" w:author="Rohit Singh" w:date="2026-10-20T22:53:00Z" w16du:dateUtc="2026-10-20T21:53:00Z"/>
+        </w:rPr>
+      </w:pPr>
+      <w:ins w:id="172" w:author="Rohit Singh" w:date="2026-10-20T22:53:00Z" w16du:dateUtc="2026-10-20T21:53:00Z">
         <w:r>
           <w:lastRenderedPageBreak/>
           <w:t>Ethical and Legal Considerations</w:t>
-        </w:r>
-      </w:ins>
-    </w:p>
-    <w:p>
-      <w:pPr>
-        <w:rPr>
-          <w:ins w:id="169" w:author="Rohit Singh" w:date="2026-10-20T22:53:00Z" w16du:dateUtc="2026-10-20T21:53:00Z"/>
-          <w:b/>
-          <w:bCs/>
-        </w:rPr>
-      </w:pPr>
-      <w:ins w:id="170" w:author="Rohit Singh" w:date="2026-10-20T22:53:00Z" w16du:dateUtc="2026-10-20T21:53:00Z">
-        <w:r>
-          <w:rPr>
-            <w:b/>
-            <w:bCs/>
-          </w:rPr>
-          <w:t>Data Protection &amp; GDPR</w:t>
-        </w:r>
-      </w:ins>
-    </w:p>
-    <w:p>
-      <w:pPr>
-        <w:rPr>
-          <w:ins w:id="171" w:author="Rohit Singh" w:date="2026-10-20T22:53:00Z" w16du:dateUtc="2026-10-20T21:53:00Z"/>
-        </w:rPr>
-      </w:pPr>
-      <w:ins w:id="172" w:author="Rohit Singh" w:date="2026-10-20T22:53:00Z" w16du:dateUtc="2026-10-20T21:53:00Z">
-        <w:r>
-          <w:t>The datasets utilized consist strictly of aggregated regional statistics and public infrastructure coordinates published by official government bodies. No personally identifiable information (PII), individual vehicle license plates, driver movement logs, or private home addresses are collected or processed. Consequently, the project presents negligible GDPR or personal privacy risks.</w:t>
         </w:r>
       </w:ins>
     </w:p>
@@ -3326,7 +3316,7 @@
             <w:b/>
             <w:bCs/>
           </w:rPr>
-          <w:t>Intellectual Property &amp; Data Use</w:t>
+          <w:t>Data Protection &amp; GDPR</w:t>
         </w:r>
       </w:ins>
     </w:p>
@@ -3338,7 +3328,7 @@
       </w:pPr>
       <w:ins w:id="176" w:author="Rohit Singh" w:date="2026-10-20T22:53:00Z" w16du:dateUtc="2026-10-20T21:53:00Z">
         <w:r>
-          <w:t>All sources are properly referenced in accordance with Harvard Referencing guidelines. Open data licensing conditions under CC BY 4.0 are fully respected by maintaining clear metadata lineage within the code repository.</w:t>
+          <w:t>The datasets utilized consist strictly of aggregated regional statistics and public infrastructure coordinates published by official government bodies. No personally identifiable information (PII), individual vehicle license plates, driver movement logs, or private home addresses are collected or processed. Consequently, the project presents negligible GDPR or personal privacy risks.</w:t>
         </w:r>
       </w:ins>
     </w:p>
@@ -3356,7 +3346,7 @@
             <w:b/>
             <w:bCs/>
           </w:rPr>
-          <w:t>Model Transparency &amp; Algorithmic Bias</w:t>
+          <w:t>Intellectual Property &amp; Data Use</w:t>
         </w:r>
       </w:ins>
     </w:p>
@@ -3368,7 +3358,7 @@
       </w:pPr>
       <w:ins w:id="180" w:author="Rohit Singh" w:date="2026-10-20T22:53:00Z" w16du:dateUtc="2026-10-20T21:53:00Z">
         <w:r>
-          <w:t>Predictive models used in public infrastructure planning must maintain transparency. The project will evaluate feature importance to ensure models do not unintentionally penalize economically disadvantaged or rural communities, supporting equitable access to public infrastructure.</w:t>
+          <w:t>All sources are properly referenced in accordance with Harvard Referencing guidelines. Open data licensing conditions under CC BY 4.0 are fully respected by maintaining clear metadata lineage within the code repository.</w:t>
         </w:r>
       </w:ins>
     </w:p>
@@ -3381,6 +3371,36 @@
         </w:rPr>
       </w:pPr>
       <w:ins w:id="182" w:author="Rohit Singh" w:date="2026-10-20T22:53:00Z" w16du:dateUtc="2026-10-20T21:53:00Z">
+        <w:r>
+          <w:rPr>
+            <w:b/>
+            <w:bCs/>
+          </w:rPr>
+          <w:t>Model Transparency &amp; Algorithmic Bias</w:t>
+        </w:r>
+      </w:ins>
+    </w:p>
+    <w:p>
+      <w:pPr>
+        <w:rPr>
+          <w:ins w:id="183" w:author="Rohit Singh" w:date="2026-10-20T22:53:00Z" w16du:dateUtc="2026-10-20T21:53:00Z"/>
+        </w:rPr>
+      </w:pPr>
+      <w:ins w:id="184" w:author="Rohit Singh" w:date="2026-10-20T22:53:00Z" w16du:dateUtc="2026-10-20T21:53:00Z">
+        <w:r>
+          <w:t>Predictive models used in public infrastructure planning must maintain transparency. The project will evaluate feature importance to ensure models do not unintentionally penalize economically disadvantaged or rural communities, supporting equitable access to public infrastructure.</w:t>
+        </w:r>
+      </w:ins>
+    </w:p>
+    <w:p>
+      <w:pPr>
+        <w:rPr>
+          <w:ins w:id="185" w:author="Rohit Singh" w:date="2026-10-20T22:53:00Z" w16du:dateUtc="2026-10-20T21:53:00Z"/>
+          <w:b/>
+          <w:bCs/>
+        </w:rPr>
+      </w:pPr>
+      <w:ins w:id="186" w:author="Rohit Singh" w:date="2026-10-20T22:53:00Z" w16du:dateUtc="2026-10-20T21:53:00Z">
         <w:r>
           <w:rPr>
             <w:b/>
@@ -3397,10 +3417,10 @@
           <w:numId w:val="10"/>
         </w:numPr>
         <w:rPr>
-          <w:ins w:id="183" w:author="Rohit Singh" w:date="2026-10-20T22:53:00Z" w16du:dateUtc="2026-10-20T21:53:00Z"/>
-        </w:rPr>
-      </w:pPr>
-      <w:ins w:id="184" w:author="Rohit Singh" w:date="2026-10-20T22:53:00Z" w16du:dateUtc="2026-10-20T21:53:00Z">
+          <w:ins w:id="187" w:author="Rohit Singh" w:date="2026-10-20T22:53:00Z" w16du:dateUtc="2026-10-20T21:53:00Z"/>
+        </w:rPr>
+      </w:pPr>
+      <w:ins w:id="188" w:author="Rohit Singh" w:date="2026-10-20T22:53:00Z" w16du:dateUtc="2026-10-20T21:53:00Z">
         <w:r>
           <w:t xml:space="preserve">Central Statistics Office (2026) </w:t>
         </w:r>
@@ -3423,10 +3443,10 @@
           <w:numId w:val="10"/>
         </w:numPr>
         <w:rPr>
-          <w:ins w:id="185" w:author="Rohit Singh" w:date="2026-10-20T22:53:00Z" w16du:dateUtc="2026-10-20T21:53:00Z"/>
-        </w:rPr>
-      </w:pPr>
-      <w:ins w:id="186" w:author="Rohit Singh" w:date="2026-10-20T22:53:00Z" w16du:dateUtc="2026-10-20T21:53:00Z">
+          <w:ins w:id="189" w:author="Rohit Singh" w:date="2026-10-20T22:53:00Z" w16du:dateUtc="2026-10-20T21:53:00Z"/>
+        </w:rPr>
+      </w:pPr>
+      <w:ins w:id="190" w:author="Rohit Singh" w:date="2026-10-20T22:53:00Z" w16du:dateUtc="2026-10-20T21:53:00Z">
         <w:r>
           <w:t xml:space="preserve">Department of Transport (2022) </w:t>
         </w:r>
@@ -3447,17 +3467,17 @@
         <w:rPr>
           <w:b/>
           <w:bCs/>
-          <w:rPrChange w:id="187" w:author="Rohit Singh" w:date="2026-10-20T22:38:00Z" w16du:dateUtc="2026-10-20T21:38:00Z">
+          <w:rPrChange w:id="191" w:author="Rohit Singh" w:date="2026-10-20T22:38:00Z" w16du:dateUtc="2026-10-20T21:38:00Z">
             <w:rPr/>
           </w:rPrChange>
         </w:rPr>
-        <w:pPrChange w:id="188" w:author="Rohit Singh" w:date="2026-10-20T22:38:00Z" w16du:dateUtc="2026-10-20T21:38:00Z">
+        <w:pPrChange w:id="192" w:author="Rohit Singh" w:date="2026-10-20T22:38:00Z" w16du:dateUtc="2026-10-20T21:38:00Z">
           <w:pPr>
             <w:pStyle w:val="Heading1"/>
           </w:pPr>
         </w:pPrChange>
       </w:pPr>
-      <w:ins w:id="189" w:author="Rohit Singh" w:date="2026-10-20T22:53:00Z" w16du:dateUtc="2026-10-20T21:53:00Z">
+      <w:ins w:id="193" w:author="Rohit Singh" w:date="2026-10-20T22:53:00Z" w16du:dateUtc="2026-10-20T21:53:00Z">
         <w:r>
           <w:t xml:space="preserve">Sustainable Energy Authority of Ireland (2025) </w:t>
         </w:r>

</xml_diff>

<commit_message>
Made few updates to section 6 & 8
</commit_message>
<xml_diff>
--- a/docs/sba26094_CA1_Strategic_Thinking_v1.docx
+++ b/docs/sba26094_CA1_Strategic_Thinking_v1.docx
@@ -650,6 +650,7 @@
                 <w:szCs w:val="32"/>
               </w:rPr>
             </w:pPr>
+            <w:proofErr w:type="spellStart"/>
             <w:r>
               <w:rPr>
                 <w:i/>
@@ -657,7 +658,17 @@
                 <w:sz w:val="32"/>
                 <w:szCs w:val="32"/>
               </w:rPr>
-              <w:t>Taufique Ahmed</w:t>
+              <w:t>Taufique</w:t>
+            </w:r>
+            <w:proofErr w:type="spellEnd"/>
+            <w:r>
+              <w:rPr>
+                <w:i/>
+                <w:color w:val="156082"/>
+                <w:sz w:val="32"/>
+                <w:szCs w:val="32"/>
+              </w:rPr>
+              <w:t xml:space="preserve"> Ahmed</w:t>
             </w:r>
           </w:p>
         </w:tc>
@@ -2151,7 +2162,15 @@
           <w:t>Predictive Model Development:</w:t>
         </w:r>
         <w:r>
-          <w:t xml:space="preserve"> Train, evaluate, and compare machine learning regression models (e.g., Multiple Linear Regression, Random Forest Regressor, XGBoost) to forecast county-level charging demand scores.</w:t>
+          <w:t xml:space="preserve"> Train, evaluate, and compare machine learning regression models (e.g., Multiple Linear Regression, Random Forest Regressor, </w:t>
+        </w:r>
+        <w:proofErr w:type="spellStart"/>
+        <w:r>
+          <w:t>XGBoost</w:t>
+        </w:r>
+        <w:proofErr w:type="spellEnd"/>
+        <w:r>
+          <w:t>) to forecast county-level charging demand scores.</w:t>
         </w:r>
       </w:ins>
     </w:p>
@@ -2174,7 +2193,15 @@
           <w:t>Interactive Dashboard &amp; Delivery:</w:t>
         </w:r>
         <w:r>
-          <w:t xml:space="preserve"> Build an interactive business intelligence dashboard (Power BI/Streamlit) that visualizes predicted demand, identifies underserved regions, and provides scenario-based planning tools for stakeholders.</w:t>
+          <w:t xml:space="preserve"> Build an interactive business intelligence dashboard (Power BI/</w:t>
+        </w:r>
+        <w:proofErr w:type="spellStart"/>
+        <w:r>
+          <w:t>Streamlit</w:t>
+        </w:r>
+        <w:proofErr w:type="spellEnd"/>
+        <w:r>
+          <w:t>) that visualizes predicted demand, identifies underserved regions, and provides scenario-based planning tools for stakeholders.</w:t>
         </w:r>
       </w:ins>
     </w:p>
@@ -2607,7 +2634,15 @@
           <w:t>Machine Learning:</w:t>
         </w:r>
         <w:r>
-          <w:t xml:space="preserve"> Scikit-Learn, XGBoost for feature scaling, regression modelling, and cross-validation.</w:t>
+          <w:t xml:space="preserve"> Scikit-Learn, </w:t>
+        </w:r>
+        <w:proofErr w:type="spellStart"/>
+        <w:r>
+          <w:t>XGBoost</w:t>
+        </w:r>
+        <w:proofErr w:type="spellEnd"/>
+        <w:r>
+          <w:t xml:space="preserve"> for feature scaling, regression modelling, and cross-validation.</w:t>
         </w:r>
       </w:ins>
     </w:p>
@@ -2630,7 +2665,11 @@
           <w:t>Visualization &amp; Reporting:</w:t>
         </w:r>
         <w:r>
-          <w:t xml:space="preserve"> Power BI / Stream</w:t>
+          <w:t xml:space="preserve"> Power BI / </w:t>
+        </w:r>
+        <w:proofErr w:type="spellStart"/>
+        <w:r>
+          <w:t>Stream</w:t>
         </w:r>
       </w:ins>
       <w:ins w:id="112" w:author="Rohit Singh" w:date="2026-10-20T23:00:00Z" w16du:dateUtc="2026-10-20T22:00:00Z">
@@ -2638,6 +2677,7 @@
           <w:t>lit</w:t>
         </w:r>
       </w:ins>
+      <w:proofErr w:type="spellEnd"/>
       <w:ins w:id="113" w:author="Rohit Singh" w:date="2026-10-20T22:38:00Z" w16du:dateUtc="2026-10-20T21:38:00Z">
         <w:r>
           <w:t xml:space="preserve"> for dynamic user dashboarding; Matplotlib &amp; Seaborn for EDA.</w:t>
@@ -2664,7 +2704,7 @@
           <w:t>Environment &amp; Version Control:</w:t>
         </w:r>
         <w:r>
-          <w:t xml:space="preserve"> Jupyter Notebooks, Git, GitHub repository (tahmed1986 access).</w:t>
+          <w:t xml:space="preserve"> Jupyter Notebooks, Git, GitHub repository.</w:t>
         </w:r>
       </w:ins>
     </w:p>
@@ -3043,19 +3083,32 @@
           <w:t>GitHub Repository:</w:t>
         </w:r>
         <w:r>
-          <w:t xml:space="preserve"> Established repository initialized with access granted to tahmed1986.</w:t>
-        </w:r>
-      </w:ins>
-    </w:p>
-    <w:p>
-      <w:pPr>
-        <w:rPr>
-          <w:ins w:id="151" w:author="Rohit Singh" w:date="2026-10-20T22:53:00Z" w16du:dateUtc="2026-10-20T21:53:00Z"/>
+          <w:t xml:space="preserve"> Established repository initialized with access granted to </w:t>
+        </w:r>
+      </w:ins>
+      <w:ins w:id="151" w:author="Rohit Singh" w:date="2026-10-20T23:10:00Z" w16du:dateUtc="2026-10-20T22:10:00Z">
+        <w:r>
+          <w:t>GitHub</w:t>
+        </w:r>
+        <w:r>
+          <w:t xml:space="preserve"> user </w:t>
+        </w:r>
+      </w:ins>
+      <w:ins w:id="152" w:author="Rohit Singh" w:date="2026-10-20T22:53:00Z" w16du:dateUtc="2026-10-20T21:53:00Z">
+        <w:r>
+          <w:t>tahmed1986.</w:t>
+        </w:r>
+      </w:ins>
+    </w:p>
+    <w:p>
+      <w:pPr>
+        <w:rPr>
+          <w:ins w:id="153" w:author="Rohit Singh" w:date="2026-10-20T22:53:00Z" w16du:dateUtc="2026-10-20T21:53:00Z"/>
           <w:b/>
           <w:bCs/>
         </w:rPr>
       </w:pPr>
-      <w:ins w:id="152" w:author="Rohit Singh" w:date="2026-10-20T22:53:00Z" w16du:dateUtc="2026-10-20T21:53:00Z">
+      <w:ins w:id="154" w:author="Rohit Singh" w:date="2026-10-20T22:53:00Z" w16du:dateUtc="2026-10-20T21:53:00Z">
         <w:r>
           <w:rPr>
             <w:b/>
@@ -3072,10 +3125,10 @@
           <w:numId w:val="8"/>
         </w:numPr>
         <w:rPr>
-          <w:ins w:id="153" w:author="Rohit Singh" w:date="2026-10-20T22:53:00Z" w16du:dateUtc="2026-10-20T21:53:00Z"/>
-        </w:rPr>
-      </w:pPr>
-      <w:ins w:id="154" w:author="Rohit Singh" w:date="2026-10-20T22:53:00Z" w16du:dateUtc="2026-10-20T21:53:00Z">
+          <w:ins w:id="155" w:author="Rohit Singh" w:date="2026-10-20T22:53:00Z" w16du:dateUtc="2026-10-20T21:53:00Z"/>
+        </w:rPr>
+      </w:pPr>
+      <w:ins w:id="156" w:author="Rohit Singh" w:date="2026-10-20T22:53:00Z" w16du:dateUtc="2026-10-20T21:53:00Z">
         <w:r>
           <w:rPr>
             <w:b/>
@@ -3095,10 +3148,10 @@
           <w:numId w:val="8"/>
         </w:numPr>
         <w:rPr>
-          <w:ins w:id="155" w:author="Rohit Singh" w:date="2026-10-20T22:53:00Z" w16du:dateUtc="2026-10-20T21:53:00Z"/>
-        </w:rPr>
-      </w:pPr>
-      <w:ins w:id="156" w:author="Rohit Singh" w:date="2026-10-20T22:53:00Z" w16du:dateUtc="2026-10-20T21:53:00Z">
+          <w:ins w:id="157" w:author="Rohit Singh" w:date="2026-10-20T22:53:00Z" w16du:dateUtc="2026-10-20T21:53:00Z"/>
+        </w:rPr>
+      </w:pPr>
+      <w:ins w:id="158" w:author="Rohit Singh" w:date="2026-10-20T22:53:00Z" w16du:dateUtc="2026-10-20T21:53:00Z">
         <w:r>
           <w:rPr>
             <w:b/>
@@ -3118,10 +3171,10 @@
           <w:numId w:val="8"/>
         </w:numPr>
         <w:rPr>
-          <w:ins w:id="157" w:author="Rohit Singh" w:date="2026-10-20T22:53:00Z" w16du:dateUtc="2026-10-20T21:53:00Z"/>
-        </w:rPr>
-      </w:pPr>
-      <w:ins w:id="158" w:author="Rohit Singh" w:date="2026-10-20T22:53:00Z" w16du:dateUtc="2026-10-20T21:53:00Z">
+          <w:ins w:id="159" w:author="Rohit Singh" w:date="2026-10-20T22:53:00Z" w16du:dateUtc="2026-10-20T21:53:00Z"/>
+        </w:rPr>
+      </w:pPr>
+      <w:ins w:id="160" w:author="Rohit Singh" w:date="2026-10-20T22:53:00Z" w16du:dateUtc="2026-10-20T21:53:00Z">
         <w:r>
           <w:rPr>
             <w:b/>
@@ -3141,10 +3194,10 @@
           <w:numId w:val="8"/>
         </w:numPr>
         <w:rPr>
-          <w:ins w:id="159" w:author="Rohit Singh" w:date="2026-10-20T22:53:00Z" w16du:dateUtc="2026-10-20T21:53:00Z"/>
-        </w:rPr>
-      </w:pPr>
-      <w:ins w:id="160" w:author="Rohit Singh" w:date="2026-10-20T22:53:00Z" w16du:dateUtc="2026-10-20T21:53:00Z">
+          <w:ins w:id="161" w:author="Rohit Singh" w:date="2026-10-20T22:53:00Z" w16du:dateUtc="2026-10-20T21:53:00Z"/>
+        </w:rPr>
+      </w:pPr>
+      <w:ins w:id="162" w:author="Rohit Singh" w:date="2026-10-20T22:53:00Z" w16du:dateUtc="2026-10-20T21:53:00Z">
         <w:r>
           <w:rPr>
             <w:b/>
@@ -3161,10 +3214,10 @@
       <w:pPr>
         <w:pStyle w:val="Heading1"/>
         <w:rPr>
-          <w:ins w:id="161" w:author="Rohit Singh" w:date="2026-10-20T22:53:00Z" w16du:dateUtc="2026-10-20T21:53:00Z"/>
-        </w:rPr>
-      </w:pPr>
-      <w:ins w:id="162" w:author="Rohit Singh" w:date="2026-10-20T22:53:00Z" w16du:dateUtc="2026-10-20T21:53:00Z">
+          <w:ins w:id="163" w:author="Rohit Singh" w:date="2026-10-20T22:53:00Z" w16du:dateUtc="2026-10-20T21:53:00Z"/>
+        </w:rPr>
+      </w:pPr>
+      <w:ins w:id="164" w:author="Rohit Singh" w:date="2026-10-20T22:53:00Z" w16du:dateUtc="2026-10-20T21:53:00Z">
         <w:r>
           <w:t>Project Timeline</w:t>
         </w:r>
@@ -3173,10 +3226,10 @@
     <w:p>
       <w:pPr>
         <w:rPr>
-          <w:ins w:id="163" w:author="Rohit Singh" w:date="2026-10-20T22:53:00Z" w16du:dateUtc="2026-10-20T21:53:00Z"/>
-        </w:rPr>
-      </w:pPr>
-      <w:ins w:id="164" w:author="Rohit Singh" w:date="2026-10-20T22:53:00Z" w16du:dateUtc="2026-10-20T21:53:00Z">
+          <w:ins w:id="165" w:author="Rohit Singh" w:date="2026-10-20T22:53:00Z" w16du:dateUtc="2026-10-20T21:53:00Z"/>
+        </w:rPr>
+      </w:pPr>
+      <w:ins w:id="166" w:author="Rohit Singh" w:date="2026-10-20T22:53:00Z" w16du:dateUtc="2026-10-20T21:53:00Z">
         <w:r>
           <w:rPr>
             <w:noProof/>
@@ -3226,10 +3279,10 @@
           <w:numId w:val="9"/>
         </w:numPr>
         <w:rPr>
-          <w:ins w:id="165" w:author="Rohit Singh" w:date="2026-10-20T22:53:00Z" w16du:dateUtc="2026-10-20T21:53:00Z"/>
-        </w:rPr>
-      </w:pPr>
-      <w:ins w:id="166" w:author="Rohit Singh" w:date="2026-10-20T22:53:00Z" w16du:dateUtc="2026-10-20T21:53:00Z">
+          <w:ins w:id="167" w:author="Rohit Singh" w:date="2026-10-20T22:53:00Z" w16du:dateUtc="2026-10-20T21:53:00Z"/>
+        </w:rPr>
+      </w:pPr>
+      <w:ins w:id="168" w:author="Rohit Singh" w:date="2026-10-20T22:53:00Z" w16du:dateUtc="2026-10-20T21:53:00Z">
         <w:r>
           <w:rPr>
             <w:b/>
@@ -3249,10 +3302,10 @@
           <w:numId w:val="9"/>
         </w:numPr>
         <w:rPr>
-          <w:ins w:id="167" w:author="Rohit Singh" w:date="2026-10-20T22:53:00Z" w16du:dateUtc="2026-10-20T21:53:00Z"/>
-        </w:rPr>
-      </w:pPr>
-      <w:ins w:id="168" w:author="Rohit Singh" w:date="2026-10-20T22:53:00Z" w16du:dateUtc="2026-10-20T21:53:00Z">
+          <w:ins w:id="169" w:author="Rohit Singh" w:date="2026-10-20T22:53:00Z" w16du:dateUtc="2026-10-20T21:53:00Z"/>
+        </w:rPr>
+      </w:pPr>
+      <w:ins w:id="170" w:author="Rohit Singh" w:date="2026-10-20T22:53:00Z" w16du:dateUtc="2026-10-20T21:53:00Z">
         <w:r>
           <w:rPr>
             <w:b/>
@@ -3272,10 +3325,10 @@
           <w:numId w:val="9"/>
         </w:numPr>
         <w:rPr>
-          <w:ins w:id="169" w:author="Rohit Singh" w:date="2026-10-20T22:53:00Z" w16du:dateUtc="2026-10-20T21:53:00Z"/>
-        </w:rPr>
-      </w:pPr>
-      <w:ins w:id="170" w:author="Rohit Singh" w:date="2026-10-20T22:53:00Z" w16du:dateUtc="2026-10-20T21:53:00Z">
+          <w:ins w:id="171" w:author="Rohit Singh" w:date="2026-10-20T22:53:00Z" w16du:dateUtc="2026-10-20T21:53:00Z"/>
+        </w:rPr>
+      </w:pPr>
+      <w:ins w:id="172" w:author="Rohit Singh" w:date="2026-10-20T22:53:00Z" w16du:dateUtc="2026-10-20T21:53:00Z">
         <w:r>
           <w:rPr>
             <w:b/>
@@ -3292,10 +3345,10 @@
       <w:pPr>
         <w:pStyle w:val="Heading1"/>
         <w:rPr>
-          <w:ins w:id="171" w:author="Rohit Singh" w:date="2026-10-20T22:53:00Z" w16du:dateUtc="2026-10-20T21:53:00Z"/>
-        </w:rPr>
-      </w:pPr>
-      <w:ins w:id="172" w:author="Rohit Singh" w:date="2026-10-20T22:53:00Z" w16du:dateUtc="2026-10-20T21:53:00Z">
+          <w:ins w:id="173" w:author="Rohit Singh" w:date="2026-10-20T22:53:00Z" w16du:dateUtc="2026-10-20T21:53:00Z"/>
+        </w:rPr>
+      </w:pPr>
+      <w:ins w:id="174" w:author="Rohit Singh" w:date="2026-10-20T22:53:00Z" w16du:dateUtc="2026-10-20T21:53:00Z">
         <w:r>
           <w:lastRenderedPageBreak/>
           <w:t>Ethical and Legal Considerations</w:t>
@@ -3305,12 +3358,12 @@
     <w:p>
       <w:pPr>
         <w:rPr>
-          <w:ins w:id="173" w:author="Rohit Singh" w:date="2026-10-20T22:53:00Z" w16du:dateUtc="2026-10-20T21:53:00Z"/>
+          <w:ins w:id="175" w:author="Rohit Singh" w:date="2026-10-20T22:53:00Z" w16du:dateUtc="2026-10-20T21:53:00Z"/>
           <w:b/>
           <w:bCs/>
         </w:rPr>
       </w:pPr>
-      <w:ins w:id="174" w:author="Rohit Singh" w:date="2026-10-20T22:53:00Z" w16du:dateUtc="2026-10-20T21:53:00Z">
+      <w:ins w:id="176" w:author="Rohit Singh" w:date="2026-10-20T22:53:00Z" w16du:dateUtc="2026-10-20T21:53:00Z">
         <w:r>
           <w:rPr>
             <w:b/>
@@ -3323,10 +3376,10 @@
     <w:p>
       <w:pPr>
         <w:rPr>
-          <w:ins w:id="175" w:author="Rohit Singh" w:date="2026-10-20T22:53:00Z" w16du:dateUtc="2026-10-20T21:53:00Z"/>
-        </w:rPr>
-      </w:pPr>
-      <w:ins w:id="176" w:author="Rohit Singh" w:date="2026-10-20T22:53:00Z" w16du:dateUtc="2026-10-20T21:53:00Z">
+          <w:ins w:id="177" w:author="Rohit Singh" w:date="2026-10-20T22:53:00Z" w16du:dateUtc="2026-10-20T21:53:00Z"/>
+        </w:rPr>
+      </w:pPr>
+      <w:ins w:id="178" w:author="Rohit Singh" w:date="2026-10-20T22:53:00Z" w16du:dateUtc="2026-10-20T21:53:00Z">
         <w:r>
           <w:t>The datasets utilized consist strictly of aggregated regional statistics and public infrastructure coordinates published by official government bodies. No personally identifiable information (PII), individual vehicle license plates, driver movement logs, or private home addresses are collected or processed. Consequently, the project presents negligible GDPR or personal privacy risks.</w:t>
         </w:r>
@@ -3335,12 +3388,12 @@
     <w:p>
       <w:pPr>
         <w:rPr>
-          <w:ins w:id="177" w:author="Rohit Singh" w:date="2026-10-20T22:53:00Z" w16du:dateUtc="2026-10-20T21:53:00Z"/>
+          <w:ins w:id="179" w:author="Rohit Singh" w:date="2026-10-20T22:53:00Z" w16du:dateUtc="2026-10-20T21:53:00Z"/>
           <w:b/>
           <w:bCs/>
         </w:rPr>
       </w:pPr>
-      <w:ins w:id="178" w:author="Rohit Singh" w:date="2026-10-20T22:53:00Z" w16du:dateUtc="2026-10-20T21:53:00Z">
+      <w:ins w:id="180" w:author="Rohit Singh" w:date="2026-10-20T22:53:00Z" w16du:dateUtc="2026-10-20T21:53:00Z">
         <w:r>
           <w:rPr>
             <w:b/>
@@ -3353,10 +3406,10 @@
     <w:p>
       <w:pPr>
         <w:rPr>
-          <w:ins w:id="179" w:author="Rohit Singh" w:date="2026-10-20T22:53:00Z" w16du:dateUtc="2026-10-20T21:53:00Z"/>
-        </w:rPr>
-      </w:pPr>
-      <w:ins w:id="180" w:author="Rohit Singh" w:date="2026-10-20T22:53:00Z" w16du:dateUtc="2026-10-20T21:53:00Z">
+          <w:ins w:id="181" w:author="Rohit Singh" w:date="2026-10-20T22:53:00Z" w16du:dateUtc="2026-10-20T21:53:00Z"/>
+        </w:rPr>
+      </w:pPr>
+      <w:ins w:id="182" w:author="Rohit Singh" w:date="2026-10-20T22:53:00Z" w16du:dateUtc="2026-10-20T21:53:00Z">
         <w:r>
           <w:t>All sources are properly referenced in accordance with Harvard Referencing guidelines. Open data licensing conditions under CC BY 4.0 are fully respected by maintaining clear metadata lineage within the code repository.</w:t>
         </w:r>
@@ -3365,12 +3418,12 @@
     <w:p>
       <w:pPr>
         <w:rPr>
-          <w:ins w:id="181" w:author="Rohit Singh" w:date="2026-10-20T22:53:00Z" w16du:dateUtc="2026-10-20T21:53:00Z"/>
+          <w:ins w:id="183" w:author="Rohit Singh" w:date="2026-10-20T22:53:00Z" w16du:dateUtc="2026-10-20T21:53:00Z"/>
           <w:b/>
           <w:bCs/>
         </w:rPr>
       </w:pPr>
-      <w:ins w:id="182" w:author="Rohit Singh" w:date="2026-10-20T22:53:00Z" w16du:dateUtc="2026-10-20T21:53:00Z">
+      <w:ins w:id="184" w:author="Rohit Singh" w:date="2026-10-20T22:53:00Z" w16du:dateUtc="2026-10-20T21:53:00Z">
         <w:r>
           <w:rPr>
             <w:b/>
@@ -3383,10 +3436,10 @@
     <w:p>
       <w:pPr>
         <w:rPr>
-          <w:ins w:id="183" w:author="Rohit Singh" w:date="2026-10-20T22:53:00Z" w16du:dateUtc="2026-10-20T21:53:00Z"/>
-        </w:rPr>
-      </w:pPr>
-      <w:ins w:id="184" w:author="Rohit Singh" w:date="2026-10-20T22:53:00Z" w16du:dateUtc="2026-10-20T21:53:00Z">
+          <w:ins w:id="185" w:author="Rohit Singh" w:date="2026-10-20T22:53:00Z" w16du:dateUtc="2026-10-20T21:53:00Z"/>
+        </w:rPr>
+      </w:pPr>
+      <w:ins w:id="186" w:author="Rohit Singh" w:date="2026-10-20T22:53:00Z" w16du:dateUtc="2026-10-20T21:53:00Z">
         <w:r>
           <w:t>Predictive models used in public infrastructure planning must maintain transparency. The project will evaluate feature importance to ensure models do not unintentionally penalize economically disadvantaged or rural communities, supporting equitable access to public infrastructure.</w:t>
         </w:r>
@@ -3395,12 +3448,12 @@
     <w:p>
       <w:pPr>
         <w:rPr>
-          <w:ins w:id="185" w:author="Rohit Singh" w:date="2026-10-20T22:53:00Z" w16du:dateUtc="2026-10-20T21:53:00Z"/>
+          <w:ins w:id="187" w:author="Rohit Singh" w:date="2026-10-20T22:53:00Z" w16du:dateUtc="2026-10-20T21:53:00Z"/>
           <w:b/>
           <w:bCs/>
         </w:rPr>
       </w:pPr>
-      <w:ins w:id="186" w:author="Rohit Singh" w:date="2026-10-20T22:53:00Z" w16du:dateUtc="2026-10-20T21:53:00Z">
+      <w:ins w:id="188" w:author="Rohit Singh" w:date="2026-10-20T22:53:00Z" w16du:dateUtc="2026-10-20T21:53:00Z">
         <w:r>
           <w:rPr>
             <w:b/>
@@ -3417,10 +3470,10 @@
           <w:numId w:val="10"/>
         </w:numPr>
         <w:rPr>
-          <w:ins w:id="187" w:author="Rohit Singh" w:date="2026-10-20T22:53:00Z" w16du:dateUtc="2026-10-20T21:53:00Z"/>
-        </w:rPr>
-      </w:pPr>
-      <w:ins w:id="188" w:author="Rohit Singh" w:date="2026-10-20T22:53:00Z" w16du:dateUtc="2026-10-20T21:53:00Z">
+          <w:ins w:id="189" w:author="Rohit Singh" w:date="2026-10-20T22:53:00Z" w16du:dateUtc="2026-10-20T21:53:00Z"/>
+        </w:rPr>
+      </w:pPr>
+      <w:ins w:id="190" w:author="Rohit Singh" w:date="2026-10-20T22:53:00Z" w16du:dateUtc="2026-10-20T21:53:00Z">
         <w:r>
           <w:t xml:space="preserve">Central Statistics Office (2026) </w:t>
         </w:r>
@@ -3443,10 +3496,10 @@
           <w:numId w:val="10"/>
         </w:numPr>
         <w:rPr>
-          <w:ins w:id="189" w:author="Rohit Singh" w:date="2026-10-20T22:53:00Z" w16du:dateUtc="2026-10-20T21:53:00Z"/>
-        </w:rPr>
-      </w:pPr>
-      <w:ins w:id="190" w:author="Rohit Singh" w:date="2026-10-20T22:53:00Z" w16du:dateUtc="2026-10-20T21:53:00Z">
+          <w:ins w:id="191" w:author="Rohit Singh" w:date="2026-10-20T22:53:00Z" w16du:dateUtc="2026-10-20T21:53:00Z"/>
+        </w:rPr>
+      </w:pPr>
+      <w:ins w:id="192" w:author="Rohit Singh" w:date="2026-10-20T22:53:00Z" w16du:dateUtc="2026-10-20T21:53:00Z">
         <w:r>
           <w:t xml:space="preserve">Department of Transport (2022) </w:t>
         </w:r>
@@ -3467,17 +3520,17 @@
         <w:rPr>
           <w:b/>
           <w:bCs/>
-          <w:rPrChange w:id="191" w:author="Rohit Singh" w:date="2026-10-20T22:38:00Z" w16du:dateUtc="2026-10-20T21:38:00Z">
+          <w:rPrChange w:id="193" w:author="Rohit Singh" w:date="2026-10-20T22:38:00Z" w16du:dateUtc="2026-10-20T21:38:00Z">
             <w:rPr/>
           </w:rPrChange>
         </w:rPr>
-        <w:pPrChange w:id="192" w:author="Rohit Singh" w:date="2026-10-20T22:38:00Z" w16du:dateUtc="2026-10-20T21:38:00Z">
+        <w:pPrChange w:id="194" w:author="Rohit Singh" w:date="2026-10-20T22:38:00Z" w16du:dateUtc="2026-10-20T21:38:00Z">
           <w:pPr>
             <w:pStyle w:val="Heading1"/>
           </w:pPr>
         </w:pPrChange>
       </w:pPr>
-      <w:ins w:id="193" w:author="Rohit Singh" w:date="2026-10-20T22:53:00Z" w16du:dateUtc="2026-10-20T21:53:00Z">
+      <w:ins w:id="195" w:author="Rohit Singh" w:date="2026-10-20T22:53:00Z" w16du:dateUtc="2026-10-20T21:53:00Z">
         <w:r>
           <w:t xml:space="preserve">Sustainable Energy Authority of Ireland (2025) </w:t>
         </w:r>

</xml_diff>

<commit_message>
Updated diagram in section 6 of the proposal word document
Updated diagram in section 6 of the proposal word document
</commit_message>
<xml_diff>
--- a/docs/sba26094_CA1_Strategic_Thinking_v1.docx
+++ b/docs/sba26094_CA1_Strategic_Thinking_v1.docx
@@ -1192,6 +1192,7 @@
               <w:tab w:val="right" w:leader="dot" w:pos="9016"/>
             </w:tabs>
             <w:rPr>
+              <w:ins w:id="11" w:author="Rohit Singh" w:date="2026-10-23T17:39:00Z" w16du:dateUtc="2026-10-23T16:39:00Z"/>
               <w:rFonts w:eastAsiaTheme="minorEastAsia"/>
               <w:noProof/>
               <w:sz w:val="24"/>
@@ -1199,7 +1200,7 @@
               <w:lang w:eastAsia="en-IE"/>
             </w:rPr>
           </w:pPr>
-          <w:ins w:id="11" w:author="Rohit Singh" w:date="2026-10-15T10:54:00Z" w16du:dateUtc="2026-10-15T09:54:00Z">
+          <w:ins w:id="12" w:author="Rohit Singh" w:date="2026-10-15T10:54:00Z" w16du:dateUtc="2026-10-15T09:54:00Z">
             <w:r>
               <w:fldChar w:fldCharType="begin"/>
             </w:r>
@@ -1210,7 +1211,47 @@
               <w:fldChar w:fldCharType="separate"/>
             </w:r>
           </w:ins>
-          <w:hyperlink w:anchor="_Toc242954056" w:history="1">
+          <w:ins w:id="13" w:author="Rohit Singh" w:date="2026-10-23T17:39:00Z" w16du:dateUtc="2026-10-23T16:39:00Z">
+            <w:r>
+              <w:rPr>
+                <w:rStyle w:val="Hyperlink"/>
+                <w:noProof/>
+              </w:rPr>
+              <w:fldChar w:fldCharType="begin"/>
+            </w:r>
+            <w:r>
+              <w:rPr>
+                <w:rStyle w:val="Hyperlink"/>
+                <w:noProof/>
+              </w:rPr>
+              <w:instrText xml:space="preserve"> </w:instrText>
+            </w:r>
+            <w:r>
+              <w:rPr>
+                <w:noProof/>
+              </w:rPr>
+              <w:instrText>HYPERLINK \l "_Toc243669603"</w:instrText>
+            </w:r>
+            <w:r>
+              <w:rPr>
+                <w:rStyle w:val="Hyperlink"/>
+                <w:noProof/>
+              </w:rPr>
+              <w:instrText xml:space="preserve"> </w:instrText>
+            </w:r>
+            <w:r>
+              <w:rPr>
+                <w:rStyle w:val="Hyperlink"/>
+                <w:noProof/>
+              </w:rPr>
+            </w:r>
+            <w:r>
+              <w:rPr>
+                <w:rStyle w:val="Hyperlink"/>
+                <w:noProof/>
+              </w:rPr>
+              <w:fldChar w:fldCharType="separate"/>
+            </w:r>
             <w:r>
               <w:rPr>
                 <w:rStyle w:val="Hyperlink"/>
@@ -1254,7 +1295,7 @@
                 <w:noProof/>
                 <w:webHidden/>
               </w:rPr>
-              <w:instrText xml:space="preserve"> PAGEREF _Toc242954056 \h </w:instrText>
+              <w:instrText xml:space="preserve"> PAGEREF _Toc243669603 \h </w:instrText>
             </w:r>
             <w:r>
               <w:rPr>
@@ -1283,7 +1324,14 @@
               </w:rPr>
               <w:fldChar w:fldCharType="end"/>
             </w:r>
-          </w:hyperlink>
+            <w:r>
+              <w:rPr>
+                <w:rStyle w:val="Hyperlink"/>
+                <w:noProof/>
+              </w:rPr>
+              <w:fldChar w:fldCharType="end"/>
+            </w:r>
+          </w:ins>
         </w:p>
         <w:p>
           <w:pPr>
@@ -1293,6 +1341,7 @@
               <w:tab w:val="right" w:leader="dot" w:pos="9016"/>
             </w:tabs>
             <w:rPr>
+              <w:ins w:id="14" w:author="Rohit Singh" w:date="2026-10-23T17:39:00Z" w16du:dateUtc="2026-10-23T16:39:00Z"/>
               <w:rFonts w:eastAsiaTheme="minorEastAsia"/>
               <w:noProof/>
               <w:sz w:val="24"/>
@@ -1300,7 +1349,47 @@
               <w:lang w:eastAsia="en-IE"/>
             </w:rPr>
           </w:pPr>
-          <w:hyperlink w:anchor="_Toc242954057" w:history="1">
+          <w:ins w:id="15" w:author="Rohit Singh" w:date="2026-10-23T17:39:00Z" w16du:dateUtc="2026-10-23T16:39:00Z">
+            <w:r>
+              <w:rPr>
+                <w:rStyle w:val="Hyperlink"/>
+                <w:noProof/>
+              </w:rPr>
+              <w:fldChar w:fldCharType="begin"/>
+            </w:r>
+            <w:r>
+              <w:rPr>
+                <w:rStyle w:val="Hyperlink"/>
+                <w:noProof/>
+              </w:rPr>
+              <w:instrText xml:space="preserve"> </w:instrText>
+            </w:r>
+            <w:r>
+              <w:rPr>
+                <w:noProof/>
+              </w:rPr>
+              <w:instrText>HYPERLINK \l "_Toc243669604"</w:instrText>
+            </w:r>
+            <w:r>
+              <w:rPr>
+                <w:rStyle w:val="Hyperlink"/>
+                <w:noProof/>
+              </w:rPr>
+              <w:instrText xml:space="preserve"> </w:instrText>
+            </w:r>
+            <w:r>
+              <w:rPr>
+                <w:rStyle w:val="Hyperlink"/>
+                <w:noProof/>
+              </w:rPr>
+            </w:r>
+            <w:r>
+              <w:rPr>
+                <w:rStyle w:val="Hyperlink"/>
+                <w:noProof/>
+              </w:rPr>
+              <w:fldChar w:fldCharType="separate"/>
+            </w:r>
             <w:r>
               <w:rPr>
                 <w:rStyle w:val="Hyperlink"/>
@@ -1344,7 +1433,7 @@
                 <w:noProof/>
                 <w:webHidden/>
               </w:rPr>
-              <w:instrText xml:space="preserve"> PAGEREF _Toc242954057 \h </w:instrText>
+              <w:instrText xml:space="preserve"> PAGEREF _Toc243669604 \h </w:instrText>
             </w:r>
             <w:r>
               <w:rPr>
@@ -1373,7 +1462,14 @@
               </w:rPr>
               <w:fldChar w:fldCharType="end"/>
             </w:r>
-          </w:hyperlink>
+            <w:r>
+              <w:rPr>
+                <w:rStyle w:val="Hyperlink"/>
+                <w:noProof/>
+              </w:rPr>
+              <w:fldChar w:fldCharType="end"/>
+            </w:r>
+          </w:ins>
         </w:p>
         <w:p>
           <w:pPr>
@@ -1383,6 +1479,7 @@
               <w:tab w:val="right" w:leader="dot" w:pos="9016"/>
             </w:tabs>
             <w:rPr>
+              <w:ins w:id="16" w:author="Rohit Singh" w:date="2026-10-23T17:39:00Z" w16du:dateUtc="2026-10-23T16:39:00Z"/>
               <w:rFonts w:eastAsiaTheme="minorEastAsia"/>
               <w:noProof/>
               <w:sz w:val="24"/>
@@ -1390,7 +1487,47 @@
               <w:lang w:eastAsia="en-IE"/>
             </w:rPr>
           </w:pPr>
-          <w:hyperlink w:anchor="_Toc242954059" w:history="1">
+          <w:ins w:id="17" w:author="Rohit Singh" w:date="2026-10-23T17:39:00Z" w16du:dateUtc="2026-10-23T16:39:00Z">
+            <w:r>
+              <w:rPr>
+                <w:rStyle w:val="Hyperlink"/>
+                <w:noProof/>
+              </w:rPr>
+              <w:fldChar w:fldCharType="begin"/>
+            </w:r>
+            <w:r>
+              <w:rPr>
+                <w:rStyle w:val="Hyperlink"/>
+                <w:noProof/>
+              </w:rPr>
+              <w:instrText xml:space="preserve"> </w:instrText>
+            </w:r>
+            <w:r>
+              <w:rPr>
+                <w:noProof/>
+              </w:rPr>
+              <w:instrText>HYPERLINK \l "_Toc243669606"</w:instrText>
+            </w:r>
+            <w:r>
+              <w:rPr>
+                <w:rStyle w:val="Hyperlink"/>
+                <w:noProof/>
+              </w:rPr>
+              <w:instrText xml:space="preserve"> </w:instrText>
+            </w:r>
+            <w:r>
+              <w:rPr>
+                <w:rStyle w:val="Hyperlink"/>
+                <w:noProof/>
+              </w:rPr>
+            </w:r>
+            <w:r>
+              <w:rPr>
+                <w:rStyle w:val="Hyperlink"/>
+                <w:noProof/>
+              </w:rPr>
+              <w:fldChar w:fldCharType="separate"/>
+            </w:r>
             <w:r>
               <w:rPr>
                 <w:rStyle w:val="Hyperlink"/>
@@ -1434,7 +1571,7 @@
                 <w:noProof/>
                 <w:webHidden/>
               </w:rPr>
-              <w:instrText xml:space="preserve"> PAGEREF _Toc242954059 \h </w:instrText>
+              <w:instrText xml:space="preserve"> PAGEREF _Toc243669606 \h </w:instrText>
             </w:r>
             <w:r>
               <w:rPr>
@@ -1463,7 +1600,14 @@
               </w:rPr>
               <w:fldChar w:fldCharType="end"/>
             </w:r>
-          </w:hyperlink>
+            <w:r>
+              <w:rPr>
+                <w:rStyle w:val="Hyperlink"/>
+                <w:noProof/>
+              </w:rPr>
+              <w:fldChar w:fldCharType="end"/>
+            </w:r>
+          </w:ins>
         </w:p>
         <w:p>
           <w:pPr>
@@ -1473,6 +1617,7 @@
               <w:tab w:val="right" w:leader="dot" w:pos="9016"/>
             </w:tabs>
             <w:rPr>
+              <w:ins w:id="18" w:author="Rohit Singh" w:date="2026-10-23T17:39:00Z" w16du:dateUtc="2026-10-23T16:39:00Z"/>
               <w:rFonts w:eastAsiaTheme="minorEastAsia"/>
               <w:noProof/>
               <w:sz w:val="24"/>
@@ -1480,7 +1625,47 @@
               <w:lang w:eastAsia="en-IE"/>
             </w:rPr>
           </w:pPr>
-          <w:hyperlink w:anchor="_Toc242954060" w:history="1">
+          <w:ins w:id="19" w:author="Rohit Singh" w:date="2026-10-23T17:39:00Z" w16du:dateUtc="2026-10-23T16:39:00Z">
+            <w:r>
+              <w:rPr>
+                <w:rStyle w:val="Hyperlink"/>
+                <w:noProof/>
+              </w:rPr>
+              <w:fldChar w:fldCharType="begin"/>
+            </w:r>
+            <w:r>
+              <w:rPr>
+                <w:rStyle w:val="Hyperlink"/>
+                <w:noProof/>
+              </w:rPr>
+              <w:instrText xml:space="preserve"> </w:instrText>
+            </w:r>
+            <w:r>
+              <w:rPr>
+                <w:noProof/>
+              </w:rPr>
+              <w:instrText>HYPERLINK \l "_Toc243669607"</w:instrText>
+            </w:r>
+            <w:r>
+              <w:rPr>
+                <w:rStyle w:val="Hyperlink"/>
+                <w:noProof/>
+              </w:rPr>
+              <w:instrText xml:space="preserve"> </w:instrText>
+            </w:r>
+            <w:r>
+              <w:rPr>
+                <w:rStyle w:val="Hyperlink"/>
+                <w:noProof/>
+              </w:rPr>
+            </w:r>
+            <w:r>
+              <w:rPr>
+                <w:rStyle w:val="Hyperlink"/>
+                <w:noProof/>
+              </w:rPr>
+              <w:fldChar w:fldCharType="separate"/>
+            </w:r>
             <w:r>
               <w:rPr>
                 <w:rStyle w:val="Hyperlink"/>
@@ -1524,7 +1709,7 @@
                 <w:noProof/>
                 <w:webHidden/>
               </w:rPr>
-              <w:instrText xml:space="preserve"> PAGEREF _Toc242954060 \h </w:instrText>
+              <w:instrText xml:space="preserve"> PAGEREF _Toc243669607 \h </w:instrText>
             </w:r>
             <w:r>
               <w:rPr>
@@ -1553,7 +1738,14 @@
               </w:rPr>
               <w:fldChar w:fldCharType="end"/>
             </w:r>
-          </w:hyperlink>
+            <w:r>
+              <w:rPr>
+                <w:rStyle w:val="Hyperlink"/>
+                <w:noProof/>
+              </w:rPr>
+              <w:fldChar w:fldCharType="end"/>
+            </w:r>
+          </w:ins>
         </w:p>
         <w:p>
           <w:pPr>
@@ -1563,6 +1755,7 @@
               <w:tab w:val="right" w:leader="dot" w:pos="9016"/>
             </w:tabs>
             <w:rPr>
+              <w:ins w:id="20" w:author="Rohit Singh" w:date="2026-10-23T17:39:00Z" w16du:dateUtc="2026-10-23T16:39:00Z"/>
               <w:rFonts w:eastAsiaTheme="minorEastAsia"/>
               <w:noProof/>
               <w:sz w:val="24"/>
@@ -1570,7 +1763,47 @@
               <w:lang w:eastAsia="en-IE"/>
             </w:rPr>
           </w:pPr>
-          <w:hyperlink w:anchor="_Toc242954061" w:history="1">
+          <w:ins w:id="21" w:author="Rohit Singh" w:date="2026-10-23T17:39:00Z" w16du:dateUtc="2026-10-23T16:39:00Z">
+            <w:r>
+              <w:rPr>
+                <w:rStyle w:val="Hyperlink"/>
+                <w:noProof/>
+              </w:rPr>
+              <w:fldChar w:fldCharType="begin"/>
+            </w:r>
+            <w:r>
+              <w:rPr>
+                <w:rStyle w:val="Hyperlink"/>
+                <w:noProof/>
+              </w:rPr>
+              <w:instrText xml:space="preserve"> </w:instrText>
+            </w:r>
+            <w:r>
+              <w:rPr>
+                <w:noProof/>
+              </w:rPr>
+              <w:instrText>HYPERLINK \l "_Toc243669608"</w:instrText>
+            </w:r>
+            <w:r>
+              <w:rPr>
+                <w:rStyle w:val="Hyperlink"/>
+                <w:noProof/>
+              </w:rPr>
+              <w:instrText xml:space="preserve"> </w:instrText>
+            </w:r>
+            <w:r>
+              <w:rPr>
+                <w:rStyle w:val="Hyperlink"/>
+                <w:noProof/>
+              </w:rPr>
+            </w:r>
+            <w:r>
+              <w:rPr>
+                <w:rStyle w:val="Hyperlink"/>
+                <w:noProof/>
+              </w:rPr>
+              <w:fldChar w:fldCharType="separate"/>
+            </w:r>
             <w:r>
               <w:rPr>
                 <w:rStyle w:val="Hyperlink"/>
@@ -1614,7 +1847,7 @@
                 <w:noProof/>
                 <w:webHidden/>
               </w:rPr>
-              <w:instrText xml:space="preserve"> PAGEREF _Toc242954061 \h </w:instrText>
+              <w:instrText xml:space="preserve"> PAGEREF _Toc243669608 \h </w:instrText>
             </w:r>
             <w:r>
               <w:rPr>
@@ -1643,15 +1876,1017 @@
               </w:rPr>
               <w:fldChar w:fldCharType="end"/>
             </w:r>
-          </w:hyperlink>
+            <w:r>
+              <w:rPr>
+                <w:rStyle w:val="Hyperlink"/>
+                <w:noProof/>
+              </w:rPr>
+              <w:fldChar w:fldCharType="end"/>
+            </w:r>
+          </w:ins>
+        </w:p>
+        <w:p>
+          <w:pPr>
+            <w:pStyle w:val="TOC1"/>
+            <w:tabs>
+              <w:tab w:val="left" w:pos="480"/>
+              <w:tab w:val="right" w:leader="dot" w:pos="9016"/>
+            </w:tabs>
+            <w:rPr>
+              <w:ins w:id="22" w:author="Rohit Singh" w:date="2026-10-23T17:39:00Z" w16du:dateUtc="2026-10-23T16:39:00Z"/>
+              <w:rFonts w:eastAsiaTheme="minorEastAsia"/>
+              <w:noProof/>
+              <w:sz w:val="24"/>
+              <w:szCs w:val="24"/>
+              <w:lang w:eastAsia="en-IE"/>
+            </w:rPr>
+          </w:pPr>
+          <w:ins w:id="23" w:author="Rohit Singh" w:date="2026-10-23T17:39:00Z" w16du:dateUtc="2026-10-23T16:39:00Z">
+            <w:r>
+              <w:rPr>
+                <w:rStyle w:val="Hyperlink"/>
+                <w:noProof/>
+              </w:rPr>
+              <w:fldChar w:fldCharType="begin"/>
+            </w:r>
+            <w:r>
+              <w:rPr>
+                <w:rStyle w:val="Hyperlink"/>
+                <w:noProof/>
+              </w:rPr>
+              <w:instrText xml:space="preserve"> </w:instrText>
+            </w:r>
+            <w:r>
+              <w:rPr>
+                <w:noProof/>
+              </w:rPr>
+              <w:instrText>HYPERLINK \l "_Toc243669609"</w:instrText>
+            </w:r>
+            <w:r>
+              <w:rPr>
+                <w:rStyle w:val="Hyperlink"/>
+                <w:noProof/>
+              </w:rPr>
+              <w:instrText xml:space="preserve"> </w:instrText>
+            </w:r>
+            <w:r>
+              <w:rPr>
+                <w:rStyle w:val="Hyperlink"/>
+                <w:noProof/>
+              </w:rPr>
+            </w:r>
+            <w:r>
+              <w:rPr>
+                <w:rStyle w:val="Hyperlink"/>
+                <w:noProof/>
+              </w:rPr>
+              <w:fldChar w:fldCharType="separate"/>
+            </w:r>
+            <w:r>
+              <w:rPr>
+                <w:rStyle w:val="Hyperlink"/>
+                <w:noProof/>
+              </w:rPr>
+              <w:t>6</w:t>
+            </w:r>
+            <w:r>
+              <w:rPr>
+                <w:rFonts w:eastAsiaTheme="minorEastAsia"/>
+                <w:noProof/>
+                <w:sz w:val="24"/>
+                <w:szCs w:val="24"/>
+                <w:lang w:eastAsia="en-IE"/>
+              </w:rPr>
+              <w:tab/>
+            </w:r>
+            <w:r>
+              <w:rPr>
+                <w:rStyle w:val="Hyperlink"/>
+                <w:noProof/>
+              </w:rPr>
+              <w:t>Methodology &amp; Architecture</w:t>
+            </w:r>
+            <w:r>
+              <w:rPr>
+                <w:noProof/>
+                <w:webHidden/>
+              </w:rPr>
+              <w:tab/>
+            </w:r>
+            <w:r>
+              <w:rPr>
+                <w:noProof/>
+                <w:webHidden/>
+              </w:rPr>
+              <w:fldChar w:fldCharType="begin"/>
+            </w:r>
+            <w:r>
+              <w:rPr>
+                <w:noProof/>
+                <w:webHidden/>
+              </w:rPr>
+              <w:instrText xml:space="preserve"> PAGEREF _Toc243669609 \h </w:instrText>
+            </w:r>
+            <w:r>
+              <w:rPr>
+                <w:noProof/>
+                <w:webHidden/>
+              </w:rPr>
+            </w:r>
+            <w:r>
+              <w:rPr>
+                <w:noProof/>
+                <w:webHidden/>
+              </w:rPr>
+              <w:fldChar w:fldCharType="separate"/>
+            </w:r>
+            <w:r>
+              <w:rPr>
+                <w:noProof/>
+                <w:webHidden/>
+              </w:rPr>
+              <w:t>6</w:t>
+            </w:r>
+            <w:r>
+              <w:rPr>
+                <w:noProof/>
+                <w:webHidden/>
+              </w:rPr>
+              <w:fldChar w:fldCharType="end"/>
+            </w:r>
+            <w:r>
+              <w:rPr>
+                <w:rStyle w:val="Hyperlink"/>
+                <w:noProof/>
+              </w:rPr>
+              <w:fldChar w:fldCharType="end"/>
+            </w:r>
+          </w:ins>
+        </w:p>
+        <w:p>
+          <w:pPr>
+            <w:pStyle w:val="TOC1"/>
+            <w:tabs>
+              <w:tab w:val="left" w:pos="480"/>
+              <w:tab w:val="right" w:leader="dot" w:pos="9016"/>
+            </w:tabs>
+            <w:rPr>
+              <w:ins w:id="24" w:author="Rohit Singh" w:date="2026-10-23T17:39:00Z" w16du:dateUtc="2026-10-23T16:39:00Z"/>
+              <w:rFonts w:eastAsiaTheme="minorEastAsia"/>
+              <w:noProof/>
+              <w:sz w:val="24"/>
+              <w:szCs w:val="24"/>
+              <w:lang w:eastAsia="en-IE"/>
+            </w:rPr>
+          </w:pPr>
+          <w:ins w:id="25" w:author="Rohit Singh" w:date="2026-10-23T17:39:00Z" w16du:dateUtc="2026-10-23T16:39:00Z">
+            <w:r>
+              <w:rPr>
+                <w:rStyle w:val="Hyperlink"/>
+                <w:noProof/>
+              </w:rPr>
+              <w:fldChar w:fldCharType="begin"/>
+            </w:r>
+            <w:r>
+              <w:rPr>
+                <w:rStyle w:val="Hyperlink"/>
+                <w:noProof/>
+              </w:rPr>
+              <w:instrText xml:space="preserve"> </w:instrText>
+            </w:r>
+            <w:r>
+              <w:rPr>
+                <w:noProof/>
+              </w:rPr>
+              <w:instrText>HYPERLINK \l "_Toc243669610"</w:instrText>
+            </w:r>
+            <w:r>
+              <w:rPr>
+                <w:rStyle w:val="Hyperlink"/>
+                <w:noProof/>
+              </w:rPr>
+              <w:instrText xml:space="preserve"> </w:instrText>
+            </w:r>
+            <w:r>
+              <w:rPr>
+                <w:rStyle w:val="Hyperlink"/>
+                <w:noProof/>
+              </w:rPr>
+            </w:r>
+            <w:r>
+              <w:rPr>
+                <w:rStyle w:val="Hyperlink"/>
+                <w:noProof/>
+              </w:rPr>
+              <w:fldChar w:fldCharType="separate"/>
+            </w:r>
+            <w:r>
+              <w:rPr>
+                <w:rStyle w:val="Hyperlink"/>
+                <w:noProof/>
+              </w:rPr>
+              <w:t>7</w:t>
+            </w:r>
+            <w:r>
+              <w:rPr>
+                <w:rFonts w:eastAsiaTheme="minorEastAsia"/>
+                <w:noProof/>
+                <w:sz w:val="24"/>
+                <w:szCs w:val="24"/>
+                <w:lang w:eastAsia="en-IE"/>
+              </w:rPr>
+              <w:tab/>
+            </w:r>
+            <w:r>
+              <w:rPr>
+                <w:rStyle w:val="Hyperlink"/>
+                <w:noProof/>
+              </w:rPr>
+              <w:t>Data Sources</w:t>
+            </w:r>
+            <w:r>
+              <w:rPr>
+                <w:noProof/>
+                <w:webHidden/>
+              </w:rPr>
+              <w:tab/>
+            </w:r>
+            <w:r>
+              <w:rPr>
+                <w:noProof/>
+                <w:webHidden/>
+              </w:rPr>
+              <w:fldChar w:fldCharType="begin"/>
+            </w:r>
+            <w:r>
+              <w:rPr>
+                <w:noProof/>
+                <w:webHidden/>
+              </w:rPr>
+              <w:instrText xml:space="preserve"> PAGEREF _Toc243669610 \h </w:instrText>
+            </w:r>
+            <w:r>
+              <w:rPr>
+                <w:noProof/>
+                <w:webHidden/>
+              </w:rPr>
+            </w:r>
+            <w:r>
+              <w:rPr>
+                <w:noProof/>
+                <w:webHidden/>
+              </w:rPr>
+              <w:fldChar w:fldCharType="separate"/>
+            </w:r>
+            <w:r>
+              <w:rPr>
+                <w:noProof/>
+                <w:webHidden/>
+              </w:rPr>
+              <w:t>7</w:t>
+            </w:r>
+            <w:r>
+              <w:rPr>
+                <w:noProof/>
+                <w:webHidden/>
+              </w:rPr>
+              <w:fldChar w:fldCharType="end"/>
+            </w:r>
+            <w:r>
+              <w:rPr>
+                <w:rStyle w:val="Hyperlink"/>
+                <w:noProof/>
+              </w:rPr>
+              <w:fldChar w:fldCharType="end"/>
+            </w:r>
+          </w:ins>
+        </w:p>
+        <w:p>
+          <w:pPr>
+            <w:pStyle w:val="TOC1"/>
+            <w:tabs>
+              <w:tab w:val="left" w:pos="480"/>
+              <w:tab w:val="right" w:leader="dot" w:pos="9016"/>
+            </w:tabs>
+            <w:rPr>
+              <w:ins w:id="26" w:author="Rohit Singh" w:date="2026-10-23T17:39:00Z" w16du:dateUtc="2026-10-23T16:39:00Z"/>
+              <w:rFonts w:eastAsiaTheme="minorEastAsia"/>
+              <w:noProof/>
+              <w:sz w:val="24"/>
+              <w:szCs w:val="24"/>
+              <w:lang w:eastAsia="en-IE"/>
+            </w:rPr>
+          </w:pPr>
+          <w:ins w:id="27" w:author="Rohit Singh" w:date="2026-10-23T17:39:00Z" w16du:dateUtc="2026-10-23T16:39:00Z">
+            <w:r>
+              <w:rPr>
+                <w:rStyle w:val="Hyperlink"/>
+                <w:noProof/>
+              </w:rPr>
+              <w:fldChar w:fldCharType="begin"/>
+            </w:r>
+            <w:r>
+              <w:rPr>
+                <w:rStyle w:val="Hyperlink"/>
+                <w:noProof/>
+              </w:rPr>
+              <w:instrText xml:space="preserve"> </w:instrText>
+            </w:r>
+            <w:r>
+              <w:rPr>
+                <w:noProof/>
+              </w:rPr>
+              <w:instrText>HYPERLINK \l "_Toc243669611"</w:instrText>
+            </w:r>
+            <w:r>
+              <w:rPr>
+                <w:rStyle w:val="Hyperlink"/>
+                <w:noProof/>
+              </w:rPr>
+              <w:instrText xml:space="preserve"> </w:instrText>
+            </w:r>
+            <w:r>
+              <w:rPr>
+                <w:rStyle w:val="Hyperlink"/>
+                <w:noProof/>
+              </w:rPr>
+            </w:r>
+            <w:r>
+              <w:rPr>
+                <w:rStyle w:val="Hyperlink"/>
+                <w:noProof/>
+              </w:rPr>
+              <w:fldChar w:fldCharType="separate"/>
+            </w:r>
+            <w:r>
+              <w:rPr>
+                <w:rStyle w:val="Hyperlink"/>
+                <w:noProof/>
+              </w:rPr>
+              <w:t>8</w:t>
+            </w:r>
+            <w:r>
+              <w:rPr>
+                <w:rFonts w:eastAsiaTheme="minorEastAsia"/>
+                <w:noProof/>
+                <w:sz w:val="24"/>
+                <w:szCs w:val="24"/>
+                <w:lang w:eastAsia="en-IE"/>
+              </w:rPr>
+              <w:tab/>
+            </w:r>
+            <w:r>
+              <w:rPr>
+                <w:rStyle w:val="Hyperlink"/>
+                <w:noProof/>
+              </w:rPr>
+              <w:t>Expected Deliverables (Semester 1 &amp; 2)</w:t>
+            </w:r>
+            <w:r>
+              <w:rPr>
+                <w:noProof/>
+                <w:webHidden/>
+              </w:rPr>
+              <w:tab/>
+            </w:r>
+            <w:r>
+              <w:rPr>
+                <w:noProof/>
+                <w:webHidden/>
+              </w:rPr>
+              <w:fldChar w:fldCharType="begin"/>
+            </w:r>
+            <w:r>
+              <w:rPr>
+                <w:noProof/>
+                <w:webHidden/>
+              </w:rPr>
+              <w:instrText xml:space="preserve"> PAGEREF _Toc243669611 \h </w:instrText>
+            </w:r>
+            <w:r>
+              <w:rPr>
+                <w:noProof/>
+                <w:webHidden/>
+              </w:rPr>
+            </w:r>
+            <w:r>
+              <w:rPr>
+                <w:noProof/>
+                <w:webHidden/>
+              </w:rPr>
+              <w:fldChar w:fldCharType="separate"/>
+            </w:r>
+            <w:r>
+              <w:rPr>
+                <w:noProof/>
+                <w:webHidden/>
+              </w:rPr>
+              <w:t>8</w:t>
+            </w:r>
+            <w:r>
+              <w:rPr>
+                <w:noProof/>
+                <w:webHidden/>
+              </w:rPr>
+              <w:fldChar w:fldCharType="end"/>
+            </w:r>
+            <w:r>
+              <w:rPr>
+                <w:rStyle w:val="Hyperlink"/>
+                <w:noProof/>
+              </w:rPr>
+              <w:fldChar w:fldCharType="end"/>
+            </w:r>
+          </w:ins>
+        </w:p>
+        <w:p>
+          <w:pPr>
+            <w:pStyle w:val="TOC1"/>
+            <w:tabs>
+              <w:tab w:val="left" w:pos="480"/>
+              <w:tab w:val="right" w:leader="dot" w:pos="9016"/>
+            </w:tabs>
+            <w:rPr>
+              <w:ins w:id="28" w:author="Rohit Singh" w:date="2026-10-23T17:39:00Z" w16du:dateUtc="2026-10-23T16:39:00Z"/>
+              <w:rFonts w:eastAsiaTheme="minorEastAsia"/>
+              <w:noProof/>
+              <w:sz w:val="24"/>
+              <w:szCs w:val="24"/>
+              <w:lang w:eastAsia="en-IE"/>
+            </w:rPr>
+          </w:pPr>
+          <w:ins w:id="29" w:author="Rohit Singh" w:date="2026-10-23T17:39:00Z" w16du:dateUtc="2026-10-23T16:39:00Z">
+            <w:r>
+              <w:rPr>
+                <w:rStyle w:val="Hyperlink"/>
+                <w:noProof/>
+              </w:rPr>
+              <w:fldChar w:fldCharType="begin"/>
+            </w:r>
+            <w:r>
+              <w:rPr>
+                <w:rStyle w:val="Hyperlink"/>
+                <w:noProof/>
+              </w:rPr>
+              <w:instrText xml:space="preserve"> </w:instrText>
+            </w:r>
+            <w:r>
+              <w:rPr>
+                <w:noProof/>
+              </w:rPr>
+              <w:instrText>HYPERLINK \l "_Toc243669612"</w:instrText>
+            </w:r>
+            <w:r>
+              <w:rPr>
+                <w:rStyle w:val="Hyperlink"/>
+                <w:noProof/>
+              </w:rPr>
+              <w:instrText xml:space="preserve"> </w:instrText>
+            </w:r>
+            <w:r>
+              <w:rPr>
+                <w:rStyle w:val="Hyperlink"/>
+                <w:noProof/>
+              </w:rPr>
+            </w:r>
+            <w:r>
+              <w:rPr>
+                <w:rStyle w:val="Hyperlink"/>
+                <w:noProof/>
+              </w:rPr>
+              <w:fldChar w:fldCharType="separate"/>
+            </w:r>
+            <w:r>
+              <w:rPr>
+                <w:rStyle w:val="Hyperlink"/>
+                <w:noProof/>
+              </w:rPr>
+              <w:t>9</w:t>
+            </w:r>
+            <w:r>
+              <w:rPr>
+                <w:rFonts w:eastAsiaTheme="minorEastAsia"/>
+                <w:noProof/>
+                <w:sz w:val="24"/>
+                <w:szCs w:val="24"/>
+                <w:lang w:eastAsia="en-IE"/>
+              </w:rPr>
+              <w:tab/>
+            </w:r>
+            <w:r>
+              <w:rPr>
+                <w:rStyle w:val="Hyperlink"/>
+                <w:noProof/>
+              </w:rPr>
+              <w:t>Project Timeline</w:t>
+            </w:r>
+            <w:r>
+              <w:rPr>
+                <w:noProof/>
+                <w:webHidden/>
+              </w:rPr>
+              <w:tab/>
+            </w:r>
+            <w:r>
+              <w:rPr>
+                <w:noProof/>
+                <w:webHidden/>
+              </w:rPr>
+              <w:fldChar w:fldCharType="begin"/>
+            </w:r>
+            <w:r>
+              <w:rPr>
+                <w:noProof/>
+                <w:webHidden/>
+              </w:rPr>
+              <w:instrText xml:space="preserve"> PAGEREF _Toc243669612 \h </w:instrText>
+            </w:r>
+            <w:r>
+              <w:rPr>
+                <w:noProof/>
+                <w:webHidden/>
+              </w:rPr>
+            </w:r>
+            <w:r>
+              <w:rPr>
+                <w:noProof/>
+                <w:webHidden/>
+              </w:rPr>
+              <w:fldChar w:fldCharType="separate"/>
+            </w:r>
+            <w:r>
+              <w:rPr>
+                <w:noProof/>
+                <w:webHidden/>
+              </w:rPr>
+              <w:t>9</w:t>
+            </w:r>
+            <w:r>
+              <w:rPr>
+                <w:noProof/>
+                <w:webHidden/>
+              </w:rPr>
+              <w:fldChar w:fldCharType="end"/>
+            </w:r>
+            <w:r>
+              <w:rPr>
+                <w:rStyle w:val="Hyperlink"/>
+                <w:noProof/>
+              </w:rPr>
+              <w:fldChar w:fldCharType="end"/>
+            </w:r>
+          </w:ins>
+        </w:p>
+        <w:p>
+          <w:pPr>
+            <w:pStyle w:val="TOC1"/>
+            <w:tabs>
+              <w:tab w:val="left" w:pos="480"/>
+              <w:tab w:val="right" w:leader="dot" w:pos="9016"/>
+            </w:tabs>
+            <w:rPr>
+              <w:ins w:id="30" w:author="Rohit Singh" w:date="2026-10-23T17:39:00Z" w16du:dateUtc="2026-10-23T16:39:00Z"/>
+              <w:rFonts w:eastAsiaTheme="minorEastAsia"/>
+              <w:noProof/>
+              <w:sz w:val="24"/>
+              <w:szCs w:val="24"/>
+              <w:lang w:eastAsia="en-IE"/>
+            </w:rPr>
+          </w:pPr>
+          <w:ins w:id="31" w:author="Rohit Singh" w:date="2026-10-23T17:39:00Z" w16du:dateUtc="2026-10-23T16:39:00Z">
+            <w:r>
+              <w:rPr>
+                <w:rStyle w:val="Hyperlink"/>
+                <w:noProof/>
+              </w:rPr>
+              <w:fldChar w:fldCharType="begin"/>
+            </w:r>
+            <w:r>
+              <w:rPr>
+                <w:rStyle w:val="Hyperlink"/>
+                <w:noProof/>
+              </w:rPr>
+              <w:instrText xml:space="preserve"> </w:instrText>
+            </w:r>
+            <w:r>
+              <w:rPr>
+                <w:noProof/>
+              </w:rPr>
+              <w:instrText>HYPERLINK \l "_Toc243669613"</w:instrText>
+            </w:r>
+            <w:r>
+              <w:rPr>
+                <w:rStyle w:val="Hyperlink"/>
+                <w:noProof/>
+              </w:rPr>
+              <w:instrText xml:space="preserve"> </w:instrText>
+            </w:r>
+            <w:r>
+              <w:rPr>
+                <w:rStyle w:val="Hyperlink"/>
+                <w:noProof/>
+              </w:rPr>
+            </w:r>
+            <w:r>
+              <w:rPr>
+                <w:rStyle w:val="Hyperlink"/>
+                <w:noProof/>
+              </w:rPr>
+              <w:fldChar w:fldCharType="separate"/>
+            </w:r>
+            <w:r>
+              <w:rPr>
+                <w:rStyle w:val="Hyperlink"/>
+                <w:noProof/>
+              </w:rPr>
+              <w:t>10</w:t>
+            </w:r>
+            <w:r>
+              <w:rPr>
+                <w:rFonts w:eastAsiaTheme="minorEastAsia"/>
+                <w:noProof/>
+                <w:sz w:val="24"/>
+                <w:szCs w:val="24"/>
+                <w:lang w:eastAsia="en-IE"/>
+              </w:rPr>
+              <w:tab/>
+            </w:r>
+            <w:r>
+              <w:rPr>
+                <w:rStyle w:val="Hyperlink"/>
+                <w:noProof/>
+              </w:rPr>
+              <w:t>Ethical and Legal Considerations</w:t>
+            </w:r>
+            <w:r>
+              <w:rPr>
+                <w:noProof/>
+                <w:webHidden/>
+              </w:rPr>
+              <w:tab/>
+            </w:r>
+            <w:r>
+              <w:rPr>
+                <w:noProof/>
+                <w:webHidden/>
+              </w:rPr>
+              <w:fldChar w:fldCharType="begin"/>
+            </w:r>
+            <w:r>
+              <w:rPr>
+                <w:noProof/>
+                <w:webHidden/>
+              </w:rPr>
+              <w:instrText xml:space="preserve"> PAGEREF _Toc243669613 \h </w:instrText>
+            </w:r>
+            <w:r>
+              <w:rPr>
+                <w:noProof/>
+                <w:webHidden/>
+              </w:rPr>
+            </w:r>
+            <w:r>
+              <w:rPr>
+                <w:noProof/>
+                <w:webHidden/>
+              </w:rPr>
+              <w:fldChar w:fldCharType="separate"/>
+            </w:r>
+            <w:r>
+              <w:rPr>
+                <w:noProof/>
+                <w:webHidden/>
+              </w:rPr>
+              <w:t>9</w:t>
+            </w:r>
+            <w:r>
+              <w:rPr>
+                <w:noProof/>
+                <w:webHidden/>
+              </w:rPr>
+              <w:fldChar w:fldCharType="end"/>
+            </w:r>
+            <w:r>
+              <w:rPr>
+                <w:rStyle w:val="Hyperlink"/>
+                <w:noProof/>
+              </w:rPr>
+              <w:fldChar w:fldCharType="end"/>
+            </w:r>
+          </w:ins>
+        </w:p>
+        <w:p>
+          <w:pPr>
+            <w:pStyle w:val="TOC1"/>
+            <w:tabs>
+              <w:tab w:val="left" w:pos="480"/>
+              <w:tab w:val="right" w:leader="dot" w:pos="9016"/>
+            </w:tabs>
+            <w:rPr>
+              <w:del w:id="32" w:author="Rohit Singh" w:date="2026-10-23T17:39:00Z" w16du:dateUtc="2026-10-23T16:39:00Z"/>
+              <w:rFonts w:eastAsiaTheme="minorEastAsia"/>
+              <w:noProof/>
+              <w:sz w:val="24"/>
+              <w:szCs w:val="24"/>
+              <w:lang w:eastAsia="en-IE"/>
+            </w:rPr>
+          </w:pPr>
+          <w:del w:id="33" w:author="Rohit Singh" w:date="2026-10-23T17:39:00Z" w16du:dateUtc="2026-10-23T16:39:00Z">
+            <w:r>
+              <w:rPr>
+                <w:noProof/>
+                <w:rPrChange w:id="34" w:author="Rohit Singh" w:date="2026-10-23T17:39:00Z" w16du:dateUtc="2026-10-23T16:39:00Z">
+                  <w:rPr>
+                    <w:rStyle w:val="Hyperlink"/>
+                    <w:noProof/>
+                  </w:rPr>
+                </w:rPrChange>
+              </w:rPr>
+              <w:delText>1</w:delText>
+            </w:r>
+            <w:r>
+              <w:rPr>
+                <w:rFonts w:eastAsiaTheme="minorEastAsia"/>
+                <w:noProof/>
+                <w:sz w:val="24"/>
+                <w:szCs w:val="24"/>
+                <w:lang w:eastAsia="en-IE"/>
+              </w:rPr>
+              <w:tab/>
+            </w:r>
+            <w:r>
+              <w:rPr>
+                <w:noProof/>
+                <w:rPrChange w:id="35" w:author="Rohit Singh" w:date="2026-10-23T17:39:00Z" w16du:dateUtc="2026-10-23T16:39:00Z">
+                  <w:rPr>
+                    <w:rStyle w:val="Hyperlink"/>
+                    <w:noProof/>
+                  </w:rPr>
+                </w:rPrChange>
+              </w:rPr>
+              <w:delText>Project Title</w:delText>
+            </w:r>
+            <w:r>
+              <w:rPr>
+                <w:noProof/>
+                <w:webHidden/>
+              </w:rPr>
+              <w:tab/>
+              <w:delText>4</w:delText>
+            </w:r>
+          </w:del>
+        </w:p>
+        <w:p>
+          <w:pPr>
+            <w:pStyle w:val="TOC1"/>
+            <w:tabs>
+              <w:tab w:val="left" w:pos="480"/>
+              <w:tab w:val="right" w:leader="dot" w:pos="9016"/>
+            </w:tabs>
+            <w:rPr>
+              <w:del w:id="36" w:author="Rohit Singh" w:date="2026-10-23T17:39:00Z" w16du:dateUtc="2026-10-23T16:39:00Z"/>
+              <w:rFonts w:eastAsiaTheme="minorEastAsia"/>
+              <w:noProof/>
+              <w:sz w:val="24"/>
+              <w:szCs w:val="24"/>
+              <w:lang w:eastAsia="en-IE"/>
+            </w:rPr>
+          </w:pPr>
+          <w:del w:id="37" w:author="Rohit Singh" w:date="2026-10-23T17:39:00Z" w16du:dateUtc="2026-10-23T16:39:00Z">
+            <w:r>
+              <w:rPr>
+                <w:noProof/>
+                <w:rPrChange w:id="38" w:author="Rohit Singh" w:date="2026-10-23T17:39:00Z" w16du:dateUtc="2026-10-23T16:39:00Z">
+                  <w:rPr>
+                    <w:rStyle w:val="Hyperlink"/>
+                    <w:noProof/>
+                  </w:rPr>
+                </w:rPrChange>
+              </w:rPr>
+              <w:delText>2</w:delText>
+            </w:r>
+            <w:r>
+              <w:rPr>
+                <w:rFonts w:eastAsiaTheme="minorEastAsia"/>
+                <w:noProof/>
+                <w:sz w:val="24"/>
+                <w:szCs w:val="24"/>
+                <w:lang w:eastAsia="en-IE"/>
+              </w:rPr>
+              <w:tab/>
+            </w:r>
+            <w:r>
+              <w:rPr>
+                <w:noProof/>
+                <w:rPrChange w:id="39" w:author="Rohit Singh" w:date="2026-10-23T17:39:00Z" w16du:dateUtc="2026-10-23T16:39:00Z">
+                  <w:rPr>
+                    <w:rStyle w:val="Hyperlink"/>
+                    <w:noProof/>
+                  </w:rPr>
+                </w:rPrChange>
+              </w:rPr>
+              <w:delText>Introduction</w:delText>
+            </w:r>
+            <w:r>
+              <w:rPr>
+                <w:noProof/>
+                <w:webHidden/>
+              </w:rPr>
+              <w:tab/>
+              <w:delText>4</w:delText>
+            </w:r>
+          </w:del>
+        </w:p>
+        <w:p>
+          <w:pPr>
+            <w:pStyle w:val="TOC1"/>
+            <w:tabs>
+              <w:tab w:val="left" w:pos="480"/>
+              <w:tab w:val="right" w:leader="dot" w:pos="9016"/>
+            </w:tabs>
+            <w:rPr>
+              <w:del w:id="40" w:author="Rohit Singh" w:date="2026-10-23T17:39:00Z" w16du:dateUtc="2026-10-23T16:39:00Z"/>
+              <w:rFonts w:eastAsiaTheme="minorEastAsia"/>
+              <w:noProof/>
+              <w:sz w:val="24"/>
+              <w:szCs w:val="24"/>
+              <w:lang w:eastAsia="en-IE"/>
+            </w:rPr>
+          </w:pPr>
+          <w:del w:id="41" w:author="Rohit Singh" w:date="2026-10-23T17:39:00Z" w16du:dateUtc="2026-10-23T16:39:00Z">
+            <w:r>
+              <w:rPr>
+                <w:noProof/>
+                <w:rPrChange w:id="42" w:author="Rohit Singh" w:date="2026-10-23T17:39:00Z" w16du:dateUtc="2026-10-23T16:39:00Z">
+                  <w:rPr>
+                    <w:rStyle w:val="Hyperlink"/>
+                    <w:noProof/>
+                  </w:rPr>
+                </w:rPrChange>
+              </w:rPr>
+              <w:delText>3</w:delText>
+            </w:r>
+            <w:r>
+              <w:rPr>
+                <w:rFonts w:eastAsiaTheme="minorEastAsia"/>
+                <w:noProof/>
+                <w:sz w:val="24"/>
+                <w:szCs w:val="24"/>
+                <w:lang w:eastAsia="en-IE"/>
+              </w:rPr>
+              <w:tab/>
+            </w:r>
+            <w:r>
+              <w:rPr>
+                <w:noProof/>
+                <w:rPrChange w:id="43" w:author="Rohit Singh" w:date="2026-10-23T17:39:00Z" w16du:dateUtc="2026-10-23T16:39:00Z">
+                  <w:rPr>
+                    <w:rStyle w:val="Hyperlink"/>
+                    <w:noProof/>
+                  </w:rPr>
+                </w:rPrChange>
+              </w:rPr>
+              <w:delText>Problem Definition</w:delText>
+            </w:r>
+            <w:r>
+              <w:rPr>
+                <w:noProof/>
+                <w:webHidden/>
+              </w:rPr>
+              <w:tab/>
+              <w:delText>4</w:delText>
+            </w:r>
+          </w:del>
+        </w:p>
+        <w:p>
+          <w:pPr>
+            <w:pStyle w:val="TOC1"/>
+            <w:tabs>
+              <w:tab w:val="left" w:pos="480"/>
+              <w:tab w:val="right" w:leader="dot" w:pos="9016"/>
+            </w:tabs>
+            <w:rPr>
+              <w:del w:id="44" w:author="Rohit Singh" w:date="2026-10-23T17:39:00Z" w16du:dateUtc="2026-10-23T16:39:00Z"/>
+              <w:rFonts w:eastAsiaTheme="minorEastAsia"/>
+              <w:noProof/>
+              <w:sz w:val="24"/>
+              <w:szCs w:val="24"/>
+              <w:lang w:eastAsia="en-IE"/>
+            </w:rPr>
+          </w:pPr>
+          <w:del w:id="45" w:author="Rohit Singh" w:date="2026-10-23T17:39:00Z" w16du:dateUtc="2026-10-23T16:39:00Z">
+            <w:r>
+              <w:rPr>
+                <w:noProof/>
+                <w:rPrChange w:id="46" w:author="Rohit Singh" w:date="2026-10-23T17:39:00Z" w16du:dateUtc="2026-10-23T16:39:00Z">
+                  <w:rPr>
+                    <w:rStyle w:val="Hyperlink"/>
+                    <w:noProof/>
+                  </w:rPr>
+                </w:rPrChange>
+              </w:rPr>
+              <w:delText>4</w:delText>
+            </w:r>
+            <w:r>
+              <w:rPr>
+                <w:rFonts w:eastAsiaTheme="minorEastAsia"/>
+                <w:noProof/>
+                <w:sz w:val="24"/>
+                <w:szCs w:val="24"/>
+                <w:lang w:eastAsia="en-IE"/>
+              </w:rPr>
+              <w:tab/>
+            </w:r>
+            <w:r>
+              <w:rPr>
+                <w:noProof/>
+                <w:rPrChange w:id="47" w:author="Rohit Singh" w:date="2026-10-23T17:39:00Z" w16du:dateUtc="2026-10-23T16:39:00Z">
+                  <w:rPr>
+                    <w:rStyle w:val="Hyperlink"/>
+                    <w:noProof/>
+                  </w:rPr>
+                </w:rPrChange>
+              </w:rPr>
+              <w:delText>Aim and Objectives</w:delText>
+            </w:r>
+            <w:r>
+              <w:rPr>
+                <w:noProof/>
+                <w:webHidden/>
+              </w:rPr>
+              <w:tab/>
+              <w:delText>5</w:delText>
+            </w:r>
+          </w:del>
+        </w:p>
+        <w:p>
+          <w:pPr>
+            <w:pStyle w:val="TOC1"/>
+            <w:tabs>
+              <w:tab w:val="left" w:pos="480"/>
+              <w:tab w:val="right" w:leader="dot" w:pos="9016"/>
+            </w:tabs>
+            <w:rPr>
+              <w:del w:id="48" w:author="Rohit Singh" w:date="2026-10-23T17:39:00Z" w16du:dateUtc="2026-10-23T16:39:00Z"/>
+              <w:rFonts w:eastAsiaTheme="minorEastAsia"/>
+              <w:noProof/>
+              <w:sz w:val="24"/>
+              <w:szCs w:val="24"/>
+              <w:lang w:eastAsia="en-IE"/>
+            </w:rPr>
+          </w:pPr>
+          <w:del w:id="49" w:author="Rohit Singh" w:date="2026-10-23T17:39:00Z" w16du:dateUtc="2026-10-23T16:39:00Z">
+            <w:r>
+              <w:rPr>
+                <w:noProof/>
+                <w:rPrChange w:id="50" w:author="Rohit Singh" w:date="2026-10-23T17:39:00Z" w16du:dateUtc="2026-10-23T16:39:00Z">
+                  <w:rPr>
+                    <w:rStyle w:val="Hyperlink"/>
+                    <w:noProof/>
+                  </w:rPr>
+                </w:rPrChange>
+              </w:rPr>
+              <w:delText>5</w:delText>
+            </w:r>
+            <w:r>
+              <w:rPr>
+                <w:rFonts w:eastAsiaTheme="minorEastAsia"/>
+                <w:noProof/>
+                <w:sz w:val="24"/>
+                <w:szCs w:val="24"/>
+                <w:lang w:eastAsia="en-IE"/>
+              </w:rPr>
+              <w:tab/>
+            </w:r>
+            <w:r>
+              <w:rPr>
+                <w:noProof/>
+                <w:rPrChange w:id="51" w:author="Rohit Singh" w:date="2026-10-23T17:39:00Z" w16du:dateUtc="2026-10-23T16:39:00Z">
+                  <w:rPr>
+                    <w:rStyle w:val="Hyperlink"/>
+                    <w:noProof/>
+                  </w:rPr>
+                </w:rPrChange>
+              </w:rPr>
+              <w:delText>Scope</w:delText>
+            </w:r>
+            <w:r>
+              <w:rPr>
+                <w:noProof/>
+                <w:webHidden/>
+              </w:rPr>
+              <w:tab/>
+              <w:delText>5</w:delText>
+            </w:r>
+          </w:del>
         </w:p>
         <w:p>
           <w:pPr>
             <w:rPr>
-              <w:ins w:id="12" w:author="Rohit Singh" w:date="2026-10-15T10:54:00Z" w16du:dateUtc="2026-10-15T09:54:00Z"/>
+              <w:ins w:id="52" w:author="Rohit Singh" w:date="2026-10-15T10:54:00Z" w16du:dateUtc="2026-10-15T09:54:00Z"/>
             </w:rPr>
           </w:pPr>
-          <w:ins w:id="13" w:author="Rohit Singh" w:date="2026-10-15T10:54:00Z" w16du:dateUtc="2026-10-15T09:54:00Z">
+          <w:ins w:id="53" w:author="Rohit Singh" w:date="2026-10-15T10:54:00Z" w16du:dateUtc="2026-10-15T09:54:00Z">
             <w:r>
               <w:rPr>
                 <w:b/>
@@ -1662,22 +2897,21 @@
             </w:r>
           </w:ins>
         </w:p>
-        <w:customXmlInsRangeStart w:id="14" w:author="Rohit Singh" w:date="2026-10-15T10:54:00Z"/>
+        <w:customXmlInsRangeStart w:id="54" w:author="Rohit Singh" w:date="2026-10-15T10:54:00Z"/>
       </w:sdtContent>
     </w:sdt>
-    <w:customXmlInsRangeEnd w:id="14"/>
-    <w:p>
-      <w:pPr>
-        <w:rPr>
-          <w:ins w:id="15" w:author="Rohit Singh" w:date="2026-10-15T10:54:00Z" w16du:dateUtc="2026-10-15T09:54:00Z"/>
+    <w:customXmlInsRangeEnd w:id="54"/>
+    <w:p>
+      <w:pPr>
+        <w:rPr>
+          <w:ins w:id="55" w:author="Rohit Singh" w:date="2026-10-15T10:54:00Z" w16du:dateUtc="2026-10-15T09:54:00Z"/>
           <w:rFonts w:asciiTheme="majorHAnsi" w:eastAsiaTheme="majorEastAsia" w:hAnsiTheme="majorHAnsi" w:cstheme="majorBidi"/>
           <w:color w:val="0F4761" w:themeColor="accent1" w:themeShade="BF"/>
           <w:sz w:val="40"/>
           <w:szCs w:val="40"/>
         </w:rPr>
       </w:pPr>
-      <w:bookmarkStart w:id="16" w:name="_Toc242954056"/>
-      <w:ins w:id="17" w:author="Rohit Singh" w:date="2026-10-15T10:54:00Z" w16du:dateUtc="2026-10-15T09:54:00Z">
+      <w:ins w:id="56" w:author="Rohit Singh" w:date="2026-10-15T10:54:00Z" w16du:dateUtc="2026-10-15T09:54:00Z">
         <w:r>
           <w:br w:type="page"/>
         </w:r>
@@ -1687,40 +2921,41 @@
       <w:pPr>
         <w:pStyle w:val="Heading1"/>
       </w:pPr>
+      <w:bookmarkStart w:id="57" w:name="_Toc243669603"/>
       <w:r>
         <w:lastRenderedPageBreak/>
         <w:t>Project Title</w:t>
       </w:r>
-      <w:bookmarkEnd w:id="16"/>
+      <w:bookmarkEnd w:id="57"/>
     </w:p>
     <w:p>
       <w:pPr>
         <w:rPr>
           <w:b/>
           <w:bCs/>
-          <w:rPrChange w:id="18" w:author="Rohit Singh" w:date="2026-10-12T21:32:00Z" w16du:dateUtc="2026-10-12T20:32:00Z">
+          <w:rPrChange w:id="58" w:author="Rohit Singh" w:date="2026-10-12T21:32:00Z" w16du:dateUtc="2026-10-12T20:32:00Z">
             <w:rPr/>
           </w:rPrChange>
         </w:rPr>
       </w:pPr>
-      <w:ins w:id="19" w:author="Rohit Singh" w:date="2026-10-12T21:30:00Z" w16du:dateUtc="2026-10-12T20:30:00Z">
+      <w:ins w:id="59" w:author="Rohit Singh" w:date="2026-10-12T21:30:00Z" w16du:dateUtc="2026-10-12T20:30:00Z">
         <w:r>
           <w:rPr>
             <w:b/>
             <w:bCs/>
-            <w:rPrChange w:id="20" w:author="Rohit Singh" w:date="2026-10-12T21:32:00Z" w16du:dateUtc="2026-10-12T20:32:00Z">
+            <w:rPrChange w:id="60" w:author="Rohit Singh" w:date="2026-10-12T21:32:00Z" w16du:dateUtc="2026-10-12T20:32:00Z">
               <w:rPr/>
             </w:rPrChange>
           </w:rPr>
           <w:t>Predictive Analytics for Electric Vehicle Charging Infrastructur</w:t>
         </w:r>
       </w:ins>
-      <w:ins w:id="21" w:author="Rohit Singh" w:date="2026-10-12T21:31:00Z" w16du:dateUtc="2026-10-12T20:31:00Z">
+      <w:ins w:id="61" w:author="Rohit Singh" w:date="2026-10-12T21:31:00Z" w16du:dateUtc="2026-10-12T20:31:00Z">
         <w:r>
           <w:rPr>
             <w:b/>
             <w:bCs/>
-            <w:rPrChange w:id="22" w:author="Rohit Singh" w:date="2026-10-12T21:32:00Z" w16du:dateUtc="2026-10-12T20:32:00Z">
+            <w:rPrChange w:id="62" w:author="Rohit Singh" w:date="2026-10-12T21:32:00Z" w16du:dateUtc="2026-10-12T20:32:00Z">
               <w:rPr/>
             </w:rPrChange>
           </w:rPr>
@@ -1730,7 +2965,7 @@
           <w:rPr>
             <w:b/>
             <w:bCs/>
-            <w:rPrChange w:id="23" w:author="Rohit Singh" w:date="2026-10-12T21:32:00Z" w16du:dateUtc="2026-10-12T20:32:00Z">
+            <w:rPrChange w:id="63" w:author="Rohit Singh" w:date="2026-10-12T21:32:00Z" w16du:dateUtc="2026-10-12T20:32:00Z">
               <w:rPr/>
             </w:rPrChange>
           </w:rPr>
@@ -1750,19 +2985,19 @@
       <w:pPr>
         <w:pStyle w:val="Heading1"/>
       </w:pPr>
-      <w:bookmarkStart w:id="24" w:name="_Toc242954057"/>
+      <w:bookmarkStart w:id="64" w:name="_Toc243669604"/>
       <w:r>
         <w:t>Introduction</w:t>
       </w:r>
-      <w:bookmarkEnd w:id="24"/>
-    </w:p>
-    <w:p>
-      <w:pPr>
-        <w:rPr>
-          <w:ins w:id="25" w:author="Rohit Singh" w:date="2026-10-12T21:32:00Z" w16du:dateUtc="2026-10-12T20:32:00Z"/>
-        </w:rPr>
-      </w:pPr>
-      <w:ins w:id="26" w:author="Rohit Singh" w:date="2026-10-12T21:32:00Z" w16du:dateUtc="2026-10-12T20:32:00Z">
+      <w:bookmarkEnd w:id="64"/>
+    </w:p>
+    <w:p>
+      <w:pPr>
+        <w:rPr>
+          <w:ins w:id="65" w:author="Rohit Singh" w:date="2026-10-12T21:32:00Z" w16du:dateUtc="2026-10-12T20:32:00Z"/>
+        </w:rPr>
+      </w:pPr>
+      <w:ins w:id="66" w:author="Rohit Singh" w:date="2026-10-12T21:32:00Z" w16du:dateUtc="2026-10-12T20:32:00Z">
         <w:r>
           <w:t>Ireland’s Climate Action Plan sets an ambitious target of transitioning to sustainable transportation, targeting over 950,000 electric vehicles (EVs) on Irish roads by 2030. Achieving this target requires a proportional expansion of robust, accessible, and reliably placed public charging infrastructure across all local electoral areas and municipal regions.</w:t>
         </w:r>
@@ -1771,10 +3006,10 @@
     <w:p>
       <w:pPr>
         <w:rPr>
-          <w:ins w:id="27" w:author="Rohit Singh" w:date="2026-10-12T21:32:00Z" w16du:dateUtc="2026-10-12T20:32:00Z"/>
-        </w:rPr>
-      </w:pPr>
-      <w:ins w:id="28" w:author="Rohit Singh" w:date="2026-10-12T21:32:00Z" w16du:dateUtc="2026-10-12T20:32:00Z">
+          <w:ins w:id="67" w:author="Rohit Singh" w:date="2026-10-12T21:32:00Z" w16du:dateUtc="2026-10-12T20:32:00Z"/>
+        </w:rPr>
+      </w:pPr>
+      <w:ins w:id="68" w:author="Rohit Singh" w:date="2026-10-12T21:32:00Z" w16du:dateUtc="2026-10-12T20:32:00Z">
         <w:r>
           <w:t>Currently, local authorities, energy providers, and private operators face significant challenges in determining optimal geographic and capacity allocation for new EV charging stations. Misalignments between rapid vehicle adoption and infrastructure deployment result in severe localized congestion in high-adoption zones and underutilized capital investments in lower-demand corridors.</w:t>
         </w:r>
@@ -1783,10 +3018,10 @@
     <w:p>
       <w:pPr>
         <w:rPr>
-          <w:ins w:id="29" w:author="Rohit Singh" w:date="2026-10-12T21:32:00Z" w16du:dateUtc="2026-10-12T20:32:00Z"/>
-        </w:rPr>
-      </w:pPr>
-      <w:ins w:id="30" w:author="Rohit Singh" w:date="2026-10-12T21:32:00Z" w16du:dateUtc="2026-10-12T20:32:00Z">
+          <w:ins w:id="69" w:author="Rohit Singh" w:date="2026-10-12T21:32:00Z" w16du:dateUtc="2026-10-12T20:32:00Z"/>
+        </w:rPr>
+      </w:pPr>
+      <w:ins w:id="70" w:author="Rohit Singh" w:date="2026-10-12T21:32:00Z" w16du:dateUtc="2026-10-12T20:32:00Z">
         <w:r>
           <w:t>This project addresses this critical infrastructure gap through data analytics and predictive modelling. By synthesizing public vehicle registration statistics, demographic metrics, and spatial charging station locations published on the Irish open data portal (</w:t>
         </w:r>
@@ -1805,29 +3040,31 @@
     <w:p>
       <w:pPr>
         <w:rPr>
-          <w:del w:id="31" w:author="Rohit Singh" w:date="2026-10-12T21:32:00Z" w16du:dateUtc="2026-10-12T20:32:00Z"/>
-        </w:rPr>
-      </w:pPr>
-      <w:bookmarkStart w:id="32" w:name="_Toc242954058"/>
-      <w:bookmarkEnd w:id="32"/>
+          <w:del w:id="71" w:author="Rohit Singh" w:date="2026-10-12T21:32:00Z" w16du:dateUtc="2026-10-12T20:32:00Z"/>
+        </w:rPr>
+      </w:pPr>
+      <w:bookmarkStart w:id="72" w:name="_Toc242954058"/>
+      <w:bookmarkStart w:id="73" w:name="_Toc243669605"/>
+      <w:bookmarkEnd w:id="72"/>
+      <w:bookmarkEnd w:id="73"/>
     </w:p>
     <w:p>
       <w:pPr>
         <w:pStyle w:val="Heading1"/>
       </w:pPr>
-      <w:bookmarkStart w:id="33" w:name="_Toc242954059"/>
+      <w:bookmarkStart w:id="74" w:name="_Toc243669606"/>
       <w:r>
         <w:t>Problem Definition</w:t>
       </w:r>
-      <w:bookmarkEnd w:id="33"/>
-    </w:p>
-    <w:p>
-      <w:pPr>
-        <w:rPr>
-          <w:ins w:id="34" w:author="Rohit Singh" w:date="2026-10-12T21:32:00Z" w16du:dateUtc="2026-10-12T20:32:00Z"/>
-        </w:rPr>
-      </w:pPr>
-      <w:ins w:id="35" w:author="Rohit Singh" w:date="2026-10-12T21:32:00Z" w16du:dateUtc="2026-10-12T20:32:00Z">
+      <w:bookmarkEnd w:id="74"/>
+    </w:p>
+    <w:p>
+      <w:pPr>
+        <w:rPr>
+          <w:ins w:id="75" w:author="Rohit Singh" w:date="2026-10-12T21:32:00Z" w16du:dateUtc="2026-10-12T20:32:00Z"/>
+        </w:rPr>
+      </w:pPr>
+      <w:ins w:id="76" w:author="Rohit Singh" w:date="2026-10-12T21:32:00Z" w16du:dateUtc="2026-10-12T20:32:00Z">
         <w:r>
           <w:t>The primary business problem investigated in this project is the lack of empirical, data-driven forecasting tools to guide public and private capital expenditure in EV charging infrastructure across Ireland.</w:t>
         </w:r>
@@ -1836,12 +3073,12 @@
     <w:p>
       <w:pPr>
         <w:rPr>
-          <w:ins w:id="36" w:author="Rohit Singh" w:date="2026-10-12T21:32:00Z" w16du:dateUtc="2026-10-12T20:32:00Z"/>
+          <w:ins w:id="77" w:author="Rohit Singh" w:date="2026-10-12T21:32:00Z" w16du:dateUtc="2026-10-12T20:32:00Z"/>
           <w:b/>
           <w:bCs/>
         </w:rPr>
       </w:pPr>
-      <w:ins w:id="37" w:author="Rohit Singh" w:date="2026-10-12T21:32:00Z" w16du:dateUtc="2026-10-12T20:32:00Z">
+      <w:ins w:id="78" w:author="Rohit Singh" w:date="2026-10-12T21:32:00Z" w16du:dateUtc="2026-10-12T20:32:00Z">
         <w:r>
           <w:rPr>
             <w:b/>
@@ -1858,10 +3095,10 @@
           <w:numId w:val="1"/>
         </w:numPr>
         <w:rPr>
-          <w:ins w:id="38" w:author="Rohit Singh" w:date="2026-10-12T21:32:00Z" w16du:dateUtc="2026-10-12T20:32:00Z"/>
-        </w:rPr>
-      </w:pPr>
-      <w:ins w:id="39" w:author="Rohit Singh" w:date="2026-10-12T21:32:00Z" w16du:dateUtc="2026-10-12T20:32:00Z">
+          <w:ins w:id="79" w:author="Rohit Singh" w:date="2026-10-12T21:32:00Z" w16du:dateUtc="2026-10-12T20:32:00Z"/>
+        </w:rPr>
+      </w:pPr>
+      <w:ins w:id="80" w:author="Rohit Singh" w:date="2026-10-12T21:32:00Z" w16du:dateUtc="2026-10-12T20:32:00Z">
         <w:r>
           <w:rPr>
             <w:b/>
@@ -1881,10 +3118,10 @@
           <w:numId w:val="1"/>
         </w:numPr>
         <w:rPr>
-          <w:ins w:id="40" w:author="Rohit Singh" w:date="2026-10-12T21:32:00Z" w16du:dateUtc="2026-10-12T20:32:00Z"/>
-        </w:rPr>
-      </w:pPr>
-      <w:ins w:id="41" w:author="Rohit Singh" w:date="2026-10-12T21:32:00Z" w16du:dateUtc="2026-10-12T20:32:00Z">
+          <w:ins w:id="81" w:author="Rohit Singh" w:date="2026-10-12T21:32:00Z" w16du:dateUtc="2026-10-12T20:32:00Z"/>
+        </w:rPr>
+      </w:pPr>
+      <w:ins w:id="82" w:author="Rohit Singh" w:date="2026-10-12T21:32:00Z" w16du:dateUtc="2026-10-12T20:32:00Z">
         <w:r>
           <w:rPr>
             <w:b/>
@@ -1904,10 +3141,10 @@
           <w:numId w:val="1"/>
         </w:numPr>
         <w:rPr>
-          <w:ins w:id="42" w:author="Rohit Singh" w:date="2026-10-12T21:32:00Z" w16du:dateUtc="2026-10-12T20:32:00Z"/>
-        </w:rPr>
-      </w:pPr>
-      <w:ins w:id="43" w:author="Rohit Singh" w:date="2026-10-12T21:32:00Z" w16du:dateUtc="2026-10-12T20:32:00Z">
+          <w:ins w:id="83" w:author="Rohit Singh" w:date="2026-10-12T21:32:00Z" w16du:dateUtc="2026-10-12T20:32:00Z"/>
+        </w:rPr>
+      </w:pPr>
+      <w:ins w:id="84" w:author="Rohit Singh" w:date="2026-10-12T21:32:00Z" w16du:dateUtc="2026-10-12T20:32:00Z">
         <w:r>
           <w:rPr>
             <w:b/>
@@ -1923,12 +3160,12 @@
     <w:p>
       <w:pPr>
         <w:rPr>
-          <w:ins w:id="44" w:author="Rohit Singh" w:date="2026-10-12T21:32:00Z" w16du:dateUtc="2026-10-12T20:32:00Z"/>
+          <w:ins w:id="85" w:author="Rohit Singh" w:date="2026-10-12T21:32:00Z" w16du:dateUtc="2026-10-12T20:32:00Z"/>
           <w:b/>
           <w:bCs/>
         </w:rPr>
       </w:pPr>
-      <w:ins w:id="45" w:author="Rohit Singh" w:date="2026-10-12T21:32:00Z" w16du:dateUtc="2026-10-12T20:32:00Z">
+      <w:ins w:id="86" w:author="Rohit Singh" w:date="2026-10-12T21:32:00Z" w16du:dateUtc="2026-10-12T20:32:00Z">
         <w:r>
           <w:rPr>
             <w:b/>
@@ -1953,7 +3190,7 @@
       </w:ins>
     </w:p>
     <w:p>
-      <w:ins w:id="46" w:author="Rohit Singh" w:date="2026-10-12T21:32:00Z" w16du:dateUtc="2026-10-12T20:32:00Z">
+      <w:ins w:id="87" w:author="Rohit Singh" w:date="2026-10-12T21:32:00Z" w16du:dateUtc="2026-10-12T20:32:00Z">
         <w:r>
           <w:t xml:space="preserve">Data analytics allows stakeholders to transition from reactive installation policies to proactive, predictive deployment strategies. By analysing historical vehicle registration trends, county-level EV adoption rates, and existing spatial charger distributions, machine learning algorithms (e.g., Regression and Decision Tree models) can model complex non-linear relationships. These </w:t>
         </w:r>
@@ -1977,24 +3214,24 @@
       <w:pPr>
         <w:pStyle w:val="Heading1"/>
         <w:rPr>
-          <w:ins w:id="47" w:author="Rohit Singh" w:date="2026-10-15T10:35:00Z" w16du:dateUtc="2026-10-15T09:35:00Z"/>
-        </w:rPr>
-      </w:pPr>
-      <w:bookmarkStart w:id="48" w:name="_Toc242954060"/>
+          <w:ins w:id="88" w:author="Rohit Singh" w:date="2026-10-15T10:35:00Z" w16du:dateUtc="2026-10-15T09:35:00Z"/>
+        </w:rPr>
+      </w:pPr>
+      <w:bookmarkStart w:id="89" w:name="_Toc243669607"/>
       <w:r>
         <w:t>Aim and Objectives</w:t>
       </w:r>
-      <w:bookmarkEnd w:id="48"/>
-    </w:p>
-    <w:p>
-      <w:pPr>
-        <w:rPr>
-          <w:ins w:id="49" w:author="Rohit Singh" w:date="2026-10-15T10:35:00Z" w16du:dateUtc="2026-10-15T09:35:00Z"/>
+      <w:bookmarkEnd w:id="89"/>
+    </w:p>
+    <w:p>
+      <w:pPr>
+        <w:rPr>
+          <w:ins w:id="90" w:author="Rohit Singh" w:date="2026-10-15T10:35:00Z" w16du:dateUtc="2026-10-15T09:35:00Z"/>
           <w:b/>
           <w:bCs/>
         </w:rPr>
       </w:pPr>
-      <w:ins w:id="50" w:author="Rohit Singh" w:date="2026-10-15T10:35:00Z" w16du:dateUtc="2026-10-15T09:35:00Z">
+      <w:ins w:id="91" w:author="Rohit Singh" w:date="2026-10-15T10:35:00Z" w16du:dateUtc="2026-10-15T09:35:00Z">
         <w:r>
           <w:rPr>
             <w:b/>
@@ -2007,10 +3244,10 @@
     <w:p>
       <w:pPr>
         <w:rPr>
-          <w:ins w:id="51" w:author="Rohit Singh" w:date="2026-10-15T10:35:00Z" w16du:dateUtc="2026-10-15T09:35:00Z"/>
-        </w:rPr>
-      </w:pPr>
-      <w:ins w:id="52" w:author="Rohit Singh" w:date="2026-10-15T10:35:00Z" w16du:dateUtc="2026-10-15T09:35:00Z">
+          <w:ins w:id="92" w:author="Rohit Singh" w:date="2026-10-15T10:35:00Z" w16du:dateUtc="2026-10-15T09:35:00Z"/>
+        </w:rPr>
+      </w:pPr>
+      <w:ins w:id="93" w:author="Rohit Singh" w:date="2026-10-15T10:35:00Z" w16du:dateUtc="2026-10-15T09:35:00Z">
         <w:r>
           <w:t>The overall aim of this project is to develop a predictive analytics model and interactive business intelligence solution that forecasts regional EV charging demand in Ireland, empowering public planners and commercial operators to optimize future infrastructure allocation.</w:t>
         </w:r>
@@ -2019,12 +3256,12 @@
     <w:p>
       <w:pPr>
         <w:rPr>
-          <w:ins w:id="53" w:author="Rohit Singh" w:date="2026-10-15T10:35:00Z" w16du:dateUtc="2026-10-15T09:35:00Z"/>
+          <w:ins w:id="94" w:author="Rohit Singh" w:date="2026-10-15T10:35:00Z" w16du:dateUtc="2026-10-15T09:35:00Z"/>
           <w:b/>
           <w:bCs/>
         </w:rPr>
       </w:pPr>
-      <w:ins w:id="54" w:author="Rohit Singh" w:date="2026-10-15T10:35:00Z" w16du:dateUtc="2026-10-15T09:35:00Z">
+      <w:ins w:id="95" w:author="Rohit Singh" w:date="2026-10-15T10:35:00Z" w16du:dateUtc="2026-10-15T09:35:00Z">
         <w:r>
           <w:rPr>
             <w:b/>
@@ -2041,10 +3278,10 @@
           <w:numId w:val="2"/>
         </w:numPr>
         <w:rPr>
-          <w:ins w:id="55" w:author="Rohit Singh" w:date="2026-10-15T10:35:00Z" w16du:dateUtc="2026-10-15T09:35:00Z"/>
-        </w:rPr>
-      </w:pPr>
-      <w:ins w:id="56" w:author="Rohit Singh" w:date="2026-10-15T10:35:00Z" w16du:dateUtc="2026-10-15T09:35:00Z">
+          <w:ins w:id="96" w:author="Rohit Singh" w:date="2026-10-15T10:35:00Z" w16du:dateUtc="2026-10-15T09:35:00Z"/>
+        </w:rPr>
+      </w:pPr>
+      <w:ins w:id="97" w:author="Rohit Singh" w:date="2026-10-15T10:35:00Z" w16du:dateUtc="2026-10-15T09:35:00Z">
         <w:r>
           <w:rPr>
             <w:b/>
@@ -2074,10 +3311,10 @@
           <w:numId w:val="2"/>
         </w:numPr>
         <w:rPr>
-          <w:ins w:id="57" w:author="Rohit Singh" w:date="2026-10-15T10:35:00Z" w16du:dateUtc="2026-10-15T09:35:00Z"/>
-        </w:rPr>
-      </w:pPr>
-      <w:ins w:id="58" w:author="Rohit Singh" w:date="2026-10-15T10:35:00Z" w16du:dateUtc="2026-10-15T09:35:00Z">
+          <w:ins w:id="98" w:author="Rohit Singh" w:date="2026-10-15T10:35:00Z" w16du:dateUtc="2026-10-15T09:35:00Z"/>
+        </w:rPr>
+      </w:pPr>
+      <w:ins w:id="99" w:author="Rohit Singh" w:date="2026-10-15T10:35:00Z" w16du:dateUtc="2026-10-15T09:35:00Z">
         <w:r>
           <w:rPr>
             <w:b/>
@@ -2097,10 +3334,10 @@
           <w:numId w:val="2"/>
         </w:numPr>
         <w:rPr>
-          <w:ins w:id="59" w:author="Rohit Singh" w:date="2026-10-15T10:35:00Z" w16du:dateUtc="2026-10-15T09:35:00Z"/>
-        </w:rPr>
-      </w:pPr>
-      <w:ins w:id="60" w:author="Rohit Singh" w:date="2026-10-15T10:35:00Z" w16du:dateUtc="2026-10-15T09:35:00Z">
+          <w:ins w:id="100" w:author="Rohit Singh" w:date="2026-10-15T10:35:00Z" w16du:dateUtc="2026-10-15T09:35:00Z"/>
+        </w:rPr>
+      </w:pPr>
+      <w:ins w:id="101" w:author="Rohit Singh" w:date="2026-10-15T10:35:00Z" w16du:dateUtc="2026-10-15T09:35:00Z">
         <w:r>
           <w:rPr>
             <w:b/>
@@ -2150,10 +3387,10 @@
           <w:numId w:val="2"/>
         </w:numPr>
         <w:rPr>
-          <w:ins w:id="61" w:author="Rohit Singh" w:date="2026-10-15T10:35:00Z" w16du:dateUtc="2026-10-15T09:35:00Z"/>
-        </w:rPr>
-      </w:pPr>
-      <w:ins w:id="62" w:author="Rohit Singh" w:date="2026-10-15T10:35:00Z" w16du:dateUtc="2026-10-15T09:35:00Z">
+          <w:ins w:id="102" w:author="Rohit Singh" w:date="2026-10-15T10:35:00Z" w16du:dateUtc="2026-10-15T09:35:00Z"/>
+        </w:rPr>
+      </w:pPr>
+      <w:ins w:id="103" w:author="Rohit Singh" w:date="2026-10-15T10:35:00Z" w16du:dateUtc="2026-10-15T09:35:00Z">
         <w:r>
           <w:rPr>
             <w:b/>
@@ -2181,10 +3418,10 @@
           <w:numId w:val="2"/>
         </w:numPr>
         <w:rPr>
-          <w:ins w:id="63" w:author="Rohit Singh" w:date="2026-10-15T10:35:00Z" w16du:dateUtc="2026-10-15T09:35:00Z"/>
-        </w:rPr>
-      </w:pPr>
-      <w:ins w:id="64" w:author="Rohit Singh" w:date="2026-10-15T10:35:00Z" w16du:dateUtc="2026-10-15T09:35:00Z">
+          <w:ins w:id="104" w:author="Rohit Singh" w:date="2026-10-15T10:35:00Z" w16du:dateUtc="2026-10-15T09:35:00Z"/>
+        </w:rPr>
+      </w:pPr>
+      <w:ins w:id="105" w:author="Rohit Singh" w:date="2026-10-15T10:35:00Z" w16du:dateUtc="2026-10-15T09:35:00Z">
         <w:r>
           <w:rPr>
             <w:b/>
@@ -2208,12 +3445,12 @@
     <w:p>
       <w:pPr>
         <w:rPr>
-          <w:ins w:id="65" w:author="Rohit Singh" w:date="2026-10-15T10:35:00Z" w16du:dateUtc="2026-10-15T09:35:00Z"/>
+          <w:ins w:id="106" w:author="Rohit Singh" w:date="2026-10-15T10:35:00Z" w16du:dateUtc="2026-10-15T09:35:00Z"/>
           <w:b/>
           <w:bCs/>
         </w:rPr>
       </w:pPr>
-      <w:ins w:id="66" w:author="Rohit Singh" w:date="2026-10-15T10:35:00Z" w16du:dateUtc="2026-10-15T09:35:00Z">
+      <w:ins w:id="107" w:author="Rohit Singh" w:date="2026-10-15T10:35:00Z" w16du:dateUtc="2026-10-15T09:35:00Z">
         <w:r>
           <w:rPr>
             <w:b/>
@@ -2226,10 +3463,10 @@
     <w:p>
       <w:pPr>
         <w:rPr>
-          <w:ins w:id="67" w:author="Rohit Singh" w:date="2026-10-15T10:52:00Z" w16du:dateUtc="2026-10-15T09:52:00Z"/>
-        </w:rPr>
-      </w:pPr>
-      <w:ins w:id="68" w:author="Rohit Singh" w:date="2026-10-15T10:35:00Z" w16du:dateUtc="2026-10-15T09:35:00Z">
+          <w:ins w:id="108" w:author="Rohit Singh" w:date="2026-10-15T10:52:00Z" w16du:dateUtc="2026-10-15T09:52:00Z"/>
+        </w:rPr>
+      </w:pPr>
+      <w:ins w:id="109" w:author="Rohit Singh" w:date="2026-10-15T10:35:00Z" w16du:dateUtc="2026-10-15T09:35:00Z">
         <w:r>
           <w:rPr>
             <w:i/>
@@ -2255,7 +3492,7 @@
     <w:p>
       <w:pPr>
         <w:rPr>
-          <w:ins w:id="69" w:author="Rohit Singh" w:date="2026-10-15T10:52:00Z" w16du:dateUtc="2026-10-15T09:52:00Z"/>
+          <w:ins w:id="110" w:author="Rohit Singh" w:date="2026-10-15T10:52:00Z" w16du:dateUtc="2026-10-15T09:52:00Z"/>
         </w:rPr>
       </w:pPr>
     </w:p>
@@ -2263,26 +3500,26 @@
       <w:pPr>
         <w:pStyle w:val="Heading1"/>
         <w:rPr>
-          <w:ins w:id="70" w:author="Rohit Singh" w:date="2026-10-20T22:38:00Z" w16du:dateUtc="2026-10-20T21:38:00Z"/>
-        </w:rPr>
-      </w:pPr>
-      <w:bookmarkStart w:id="71" w:name="_Toc242954061"/>
-      <w:ins w:id="72" w:author="Rohit Singh" w:date="2026-10-15T10:52:00Z" w16du:dateUtc="2026-10-15T09:52:00Z">
+          <w:ins w:id="111" w:author="Rohit Singh" w:date="2026-10-20T22:38:00Z" w16du:dateUtc="2026-10-20T21:38:00Z"/>
+        </w:rPr>
+      </w:pPr>
+      <w:bookmarkStart w:id="112" w:name="_Toc243669608"/>
+      <w:ins w:id="113" w:author="Rohit Singh" w:date="2026-10-15T10:52:00Z" w16du:dateUtc="2026-10-15T09:52:00Z">
         <w:r>
           <w:t>Scope</w:t>
         </w:r>
       </w:ins>
-      <w:bookmarkEnd w:id="71"/>
-    </w:p>
-    <w:p>
-      <w:pPr>
-        <w:rPr>
-          <w:ins w:id="73" w:author="Rohit Singh" w:date="2026-10-20T22:38:00Z" w16du:dateUtc="2026-10-20T21:38:00Z"/>
+      <w:bookmarkEnd w:id="112"/>
+    </w:p>
+    <w:p>
+      <w:pPr>
+        <w:rPr>
+          <w:ins w:id="114" w:author="Rohit Singh" w:date="2026-10-20T22:38:00Z" w16du:dateUtc="2026-10-20T21:38:00Z"/>
           <w:b/>
           <w:bCs/>
         </w:rPr>
       </w:pPr>
-      <w:ins w:id="74" w:author="Rohit Singh" w:date="2026-10-20T22:38:00Z" w16du:dateUtc="2026-10-20T21:38:00Z">
+      <w:ins w:id="115" w:author="Rohit Singh" w:date="2026-10-20T22:38:00Z" w16du:dateUtc="2026-10-20T21:38:00Z">
         <w:r>
           <w:rPr>
             <w:b/>
@@ -2299,10 +3536,10 @@
           <w:numId w:val="3"/>
         </w:numPr>
         <w:rPr>
-          <w:ins w:id="75" w:author="Rohit Singh" w:date="2026-10-20T22:38:00Z" w16du:dateUtc="2026-10-20T21:38:00Z"/>
-        </w:rPr>
-      </w:pPr>
-      <w:ins w:id="76" w:author="Rohit Singh" w:date="2026-10-20T22:38:00Z" w16du:dateUtc="2026-10-20T21:38:00Z">
+          <w:ins w:id="116" w:author="Rohit Singh" w:date="2026-10-20T22:38:00Z" w16du:dateUtc="2026-10-20T21:38:00Z"/>
+        </w:rPr>
+      </w:pPr>
+      <w:ins w:id="117" w:author="Rohit Singh" w:date="2026-10-20T22:38:00Z" w16du:dateUtc="2026-10-20T21:38:00Z">
         <w:r>
           <w:t xml:space="preserve">Analysis of open public datasets from </w:t>
         </w:r>
@@ -2325,10 +3562,10 @@
           <w:numId w:val="3"/>
         </w:numPr>
         <w:rPr>
-          <w:ins w:id="77" w:author="Rohit Singh" w:date="2026-10-20T22:38:00Z" w16du:dateUtc="2026-10-20T21:38:00Z"/>
-        </w:rPr>
-      </w:pPr>
-      <w:ins w:id="78" w:author="Rohit Singh" w:date="2026-10-20T22:38:00Z" w16du:dateUtc="2026-10-20T21:38:00Z">
+          <w:ins w:id="118" w:author="Rohit Singh" w:date="2026-10-20T22:38:00Z" w16du:dateUtc="2026-10-20T21:38:00Z"/>
+        </w:rPr>
+      </w:pPr>
+      <w:ins w:id="119" w:author="Rohit Singh" w:date="2026-10-20T22:38:00Z" w16du:dateUtc="2026-10-20T21:38:00Z">
         <w:r>
           <w:t>Historical vehicle registration trends and EV adoption metrics from 2019 to 2026.</w:t>
         </w:r>
@@ -2341,10 +3578,10 @@
           <w:numId w:val="3"/>
         </w:numPr>
         <w:rPr>
-          <w:ins w:id="79" w:author="Rohit Singh" w:date="2026-10-20T22:38:00Z" w16du:dateUtc="2026-10-20T21:38:00Z"/>
-        </w:rPr>
-      </w:pPr>
-      <w:ins w:id="80" w:author="Rohit Singh" w:date="2026-10-20T22:38:00Z" w16du:dateUtc="2026-10-20T21:38:00Z">
+          <w:ins w:id="120" w:author="Rohit Singh" w:date="2026-10-20T22:38:00Z" w16du:dateUtc="2026-10-20T21:38:00Z"/>
+        </w:rPr>
+      </w:pPr>
+      <w:ins w:id="121" w:author="Rohit Singh" w:date="2026-10-20T22:38:00Z" w16du:dateUtc="2026-10-20T21:38:00Z">
         <w:r>
           <w:t>Spatial analysis of existing public charging points managed by local authorities and public bodies.</w:t>
         </w:r>
@@ -2357,10 +3594,10 @@
           <w:numId w:val="3"/>
         </w:numPr>
         <w:rPr>
-          <w:ins w:id="81" w:author="Rohit Singh" w:date="2026-10-20T22:38:00Z" w16du:dateUtc="2026-10-20T21:38:00Z"/>
-        </w:rPr>
-      </w:pPr>
-      <w:ins w:id="82" w:author="Rohit Singh" w:date="2026-10-20T22:38:00Z" w16du:dateUtc="2026-10-20T21:38:00Z">
+          <w:ins w:id="122" w:author="Rohit Singh" w:date="2026-10-20T22:38:00Z" w16du:dateUtc="2026-10-20T21:38:00Z"/>
+        </w:rPr>
+      </w:pPr>
+      <w:ins w:id="123" w:author="Rohit Singh" w:date="2026-10-20T22:38:00Z" w16du:dateUtc="2026-10-20T21:38:00Z">
         <w:r>
           <w:lastRenderedPageBreak/>
           <w:t>Machine learning modelling in Python using supervised regression algorithms.</w:t>
@@ -2374,10 +3611,10 @@
           <w:numId w:val="3"/>
         </w:numPr>
         <w:rPr>
-          <w:ins w:id="83" w:author="Rohit Singh" w:date="2026-10-20T22:38:00Z" w16du:dateUtc="2026-10-20T21:38:00Z"/>
-        </w:rPr>
-      </w:pPr>
-      <w:ins w:id="84" w:author="Rohit Singh" w:date="2026-10-20T22:38:00Z" w16du:dateUtc="2026-10-20T21:38:00Z">
+          <w:ins w:id="124" w:author="Rohit Singh" w:date="2026-10-20T22:38:00Z" w16du:dateUtc="2026-10-20T21:38:00Z"/>
+        </w:rPr>
+      </w:pPr>
+      <w:ins w:id="125" w:author="Rohit Singh" w:date="2026-10-20T22:38:00Z" w16du:dateUtc="2026-10-20T21:38:00Z">
         <w:r>
           <w:t>Development of an interactive executive dashboard for visual scenario planning.</w:t>
         </w:r>
@@ -2386,12 +3623,12 @@
     <w:p>
       <w:pPr>
         <w:rPr>
-          <w:ins w:id="85" w:author="Rohit Singh" w:date="2026-10-20T22:38:00Z" w16du:dateUtc="2026-10-20T21:38:00Z"/>
+          <w:ins w:id="126" w:author="Rohit Singh" w:date="2026-10-20T22:38:00Z" w16du:dateUtc="2026-10-20T21:38:00Z"/>
           <w:b/>
           <w:bCs/>
         </w:rPr>
       </w:pPr>
-      <w:ins w:id="86" w:author="Rohit Singh" w:date="2026-10-20T22:38:00Z" w16du:dateUtc="2026-10-20T21:38:00Z">
+      <w:ins w:id="127" w:author="Rohit Singh" w:date="2026-10-20T22:38:00Z" w16du:dateUtc="2026-10-20T21:38:00Z">
         <w:r>
           <w:rPr>
             <w:b/>
@@ -2408,10 +3645,10 @@
           <w:numId w:val="4"/>
         </w:numPr>
         <w:rPr>
-          <w:ins w:id="87" w:author="Rohit Singh" w:date="2026-10-20T22:38:00Z" w16du:dateUtc="2026-10-20T21:38:00Z"/>
-        </w:rPr>
-      </w:pPr>
-      <w:ins w:id="88" w:author="Rohit Singh" w:date="2026-10-20T22:38:00Z" w16du:dateUtc="2026-10-20T21:38:00Z">
+          <w:ins w:id="128" w:author="Rohit Singh" w:date="2026-10-20T22:38:00Z" w16du:dateUtc="2026-10-20T21:38:00Z"/>
+        </w:rPr>
+      </w:pPr>
+      <w:ins w:id="129" w:author="Rohit Singh" w:date="2026-10-20T22:38:00Z" w16du:dateUtc="2026-10-20T21:38:00Z">
         <w:r>
           <w:t>Real-time IoT sensor telemetry or live live-streamed charger occupancy tracking.</w:t>
         </w:r>
@@ -2424,10 +3661,10 @@
           <w:numId w:val="4"/>
         </w:numPr>
         <w:rPr>
-          <w:ins w:id="89" w:author="Rohit Singh" w:date="2026-10-20T22:38:00Z" w16du:dateUtc="2026-10-20T21:38:00Z"/>
-        </w:rPr>
-      </w:pPr>
-      <w:ins w:id="90" w:author="Rohit Singh" w:date="2026-10-20T22:38:00Z" w16du:dateUtc="2026-10-20T21:38:00Z">
+          <w:ins w:id="130" w:author="Rohit Singh" w:date="2026-10-20T22:38:00Z" w16du:dateUtc="2026-10-20T21:38:00Z"/>
+        </w:rPr>
+      </w:pPr>
+      <w:ins w:id="131" w:author="Rohit Singh" w:date="2026-10-20T22:38:00Z" w16du:dateUtc="2026-10-20T21:38:00Z">
         <w:r>
           <w:t>Proprietary commercial pricing strategies, electricity tariff modelling, or financial ROI calculations for private operators.</w:t>
         </w:r>
@@ -2440,10 +3677,10 @@
           <w:numId w:val="4"/>
         </w:numPr>
         <w:rPr>
-          <w:ins w:id="91" w:author="Rohit Singh" w:date="2026-10-20T22:38:00Z" w16du:dateUtc="2026-10-20T21:38:00Z"/>
-        </w:rPr>
-      </w:pPr>
-      <w:ins w:id="92" w:author="Rohit Singh" w:date="2026-10-20T22:38:00Z" w16du:dateUtc="2026-10-20T21:38:00Z">
+          <w:ins w:id="132" w:author="Rohit Singh" w:date="2026-10-20T22:38:00Z" w16du:dateUtc="2026-10-20T21:38:00Z"/>
+        </w:rPr>
+      </w:pPr>
+      <w:ins w:id="133" w:author="Rohit Singh" w:date="2026-10-20T22:38:00Z" w16du:dateUtc="2026-10-20T21:38:00Z">
         <w:r>
           <w:t>Electrical engineering smart-grid load balancing and circuit design.</w:t>
         </w:r>
@@ -2452,10 +3689,10 @@
     <w:p>
       <w:pPr>
         <w:rPr>
-          <w:ins w:id="93" w:author="Rohit Singh" w:date="2026-10-20T22:38:00Z" w16du:dateUtc="2026-10-20T21:38:00Z"/>
-        </w:rPr>
-      </w:pPr>
-      <w:ins w:id="94" w:author="Rohit Singh" w:date="2026-10-20T22:38:00Z" w16du:dateUtc="2026-10-20T21:38:00Z">
+          <w:ins w:id="134" w:author="Rohit Singh" w:date="2026-10-20T22:38:00Z" w16du:dateUtc="2026-10-20T21:38:00Z"/>
+        </w:rPr>
+      </w:pPr>
+      <w:ins w:id="135" w:author="Rohit Singh" w:date="2026-10-20T22:38:00Z" w16du:dateUtc="2026-10-20T21:38:00Z">
         <w:r>
           <w:t>Individual driver behavioural tracking or private home charger installation analysis.</w:t>
         </w:r>
@@ -2464,7 +3701,7 @@
     <w:p>
       <w:pPr>
         <w:rPr>
-          <w:ins w:id="95" w:author="Rohit Singh" w:date="2026-10-20T22:38:00Z" w16du:dateUtc="2026-10-20T21:38:00Z"/>
+          <w:ins w:id="136" w:author="Rohit Singh" w:date="2026-10-20T22:38:00Z" w16du:dateUtc="2026-10-20T21:38:00Z"/>
         </w:rPr>
       </w:pPr>
     </w:p>
@@ -2472,24 +3709,26 @@
       <w:pPr>
         <w:pStyle w:val="Heading1"/>
         <w:rPr>
-          <w:ins w:id="96" w:author="Rohit Singh" w:date="2026-10-20T22:38:00Z" w16du:dateUtc="2026-10-20T21:38:00Z"/>
-        </w:rPr>
-      </w:pPr>
-      <w:ins w:id="97" w:author="Rohit Singh" w:date="2026-10-20T22:38:00Z" w16du:dateUtc="2026-10-20T21:38:00Z">
+          <w:ins w:id="137" w:author="Rohit Singh" w:date="2026-10-20T22:38:00Z" w16du:dateUtc="2026-10-20T21:38:00Z"/>
+        </w:rPr>
+      </w:pPr>
+      <w:bookmarkStart w:id="138" w:name="_Toc243669609"/>
+      <w:ins w:id="139" w:author="Rohit Singh" w:date="2026-10-20T22:38:00Z" w16du:dateUtc="2026-10-20T21:38:00Z">
         <w:r>
           <w:t>Methodology &amp; Architecture</w:t>
         </w:r>
-      </w:ins>
-    </w:p>
-    <w:p>
-      <w:pPr>
-        <w:rPr>
-          <w:ins w:id="98" w:author="Rohit Singh" w:date="2026-10-20T22:38:00Z" w16du:dateUtc="2026-10-20T21:38:00Z"/>
+        <w:bookmarkEnd w:id="138"/>
+      </w:ins>
+    </w:p>
+    <w:p>
+      <w:pPr>
+        <w:rPr>
+          <w:ins w:id="140" w:author="Rohit Singh" w:date="2026-10-20T22:38:00Z" w16du:dateUtc="2026-10-20T21:38:00Z"/>
           <w:b/>
           <w:bCs/>
         </w:rPr>
       </w:pPr>
-      <w:ins w:id="99" w:author="Rohit Singh" w:date="2026-10-20T22:38:00Z" w16du:dateUtc="2026-10-20T21:38:00Z">
+      <w:ins w:id="141" w:author="Rohit Singh" w:date="2026-10-20T22:38:00Z" w16du:dateUtc="2026-10-20T21:38:00Z">
         <w:r>
           <w:rPr>
             <w:b/>
@@ -2502,10 +3741,10 @@
     <w:p>
       <w:pPr>
         <w:rPr>
-          <w:ins w:id="100" w:author="Rohit Singh" w:date="2026-10-20T22:38:00Z" w16du:dateUtc="2026-10-20T21:38:00Z"/>
-        </w:rPr>
-      </w:pPr>
-      <w:ins w:id="101" w:author="Rohit Singh" w:date="2026-10-20T22:38:00Z" w16du:dateUtc="2026-10-20T21:38:00Z">
+          <w:ins w:id="142" w:author="Rohit Singh" w:date="2026-10-20T22:38:00Z" w16du:dateUtc="2026-10-20T21:38:00Z"/>
+        </w:rPr>
+      </w:pPr>
+      <w:ins w:id="143" w:author="Rohit Singh" w:date="2026-10-20T22:38:00Z" w16du:dateUtc="2026-10-20T21:38:00Z">
         <w:r>
           <w:t xml:space="preserve">This project follows the </w:t>
         </w:r>
@@ -2524,23 +3763,21 @@
     <w:p>
       <w:pPr>
         <w:rPr>
-          <w:ins w:id="102" w:author="Rohit Singh" w:date="2026-10-20T22:38:00Z" w16du:dateUtc="2026-10-20T21:38:00Z"/>
+          <w:ins w:id="144" w:author="Rohit Singh" w:date="2026-10-20T22:38:00Z" w16du:dateUtc="2026-10-20T21:38:00Z"/>
           <w:b/>
           <w:bCs/>
         </w:rPr>
       </w:pPr>
-      <w:ins w:id="103" w:author="Rohit Singh" w:date="2026-10-20T22:55:00Z" w16du:dateUtc="2026-10-20T21:55:00Z">
+      <w:ins w:id="145" w:author="Rohit Singh" w:date="2026-10-23T17:38:00Z" w16du:dateUtc="2026-10-23T16:38:00Z">
         <w:r>
           <w:rPr>
-            <w:b/>
-            <w:bCs/>
             <w:noProof/>
           </w:rPr>
           <w:drawing>
-            <wp:inline distT="0" distB="0" distL="0" distR="0" wp14:anchorId="6246AAFD" wp14:editId="4C1AA093">
-              <wp:extent cx="5210902" cy="3038899"/>
-              <wp:effectExtent l="0" t="0" r="8890" b="9525"/>
-              <wp:docPr id="567514605" name="Picture 1"/>
+            <wp:inline distT="0" distB="0" distL="0" distR="0" wp14:anchorId="6A47BD5F" wp14:editId="5D38DA06">
+              <wp:extent cx="5353050" cy="4019550"/>
+              <wp:effectExtent l="0" t="0" r="0" b="0"/>
+              <wp:docPr id="1490892427" name="Picture 5"/>
               <wp:cNvGraphicFramePr>
                 <a:graphicFrameLocks xmlns:a="http://schemas.openxmlformats.org/drawingml/2006/main" noChangeAspect="1"/>
               </wp:cNvGraphicFramePr>
@@ -2548,23 +3785,36 @@
                 <a:graphicData uri="http://schemas.openxmlformats.org/drawingml/2006/picture">
                   <pic:pic xmlns:pic="http://schemas.openxmlformats.org/drawingml/2006/picture">
                     <pic:nvPicPr>
-                      <pic:cNvPr id="567514605" name=""/>
-                      <pic:cNvPicPr/>
+                      <pic:cNvPr id="0" name="Picture 1"/>
+                      <pic:cNvPicPr>
+                        <a:picLocks noChangeAspect="1" noChangeArrowheads="1"/>
+                      </pic:cNvPicPr>
                     </pic:nvPicPr>
                     <pic:blipFill>
-                      <a:blip r:embed="rId8"/>
+                      <a:blip r:embed="rId8">
+                        <a:extLst>
+                          <a:ext uri="{28A0092B-C50C-407E-A947-70E740481C1C}">
+                            <a14:useLocalDpi xmlns:a14="http://schemas.microsoft.com/office/drawing/2010/main" val="0"/>
+                          </a:ext>
+                        </a:extLst>
+                      </a:blip>
+                      <a:srcRect/>
                       <a:stretch>
                         <a:fillRect/>
                       </a:stretch>
                     </pic:blipFill>
-                    <pic:spPr>
+                    <pic:spPr bwMode="auto">
                       <a:xfrm>
                         <a:off x="0" y="0"/>
-                        <a:ext cx="5210902" cy="3038899"/>
+                        <a:ext cx="5353050" cy="4019550"/>
                       </a:xfrm>
                       <a:prstGeom prst="rect">
                         <a:avLst/>
                       </a:prstGeom>
+                      <a:noFill/>
+                      <a:ln>
+                        <a:noFill/>
+                      </a:ln>
                     </pic:spPr>
                   </pic:pic>
                 </a:graphicData>
@@ -2577,12 +3827,12 @@
     <w:p>
       <w:pPr>
         <w:rPr>
-          <w:ins w:id="104" w:author="Rohit Singh" w:date="2026-10-20T22:38:00Z" w16du:dateUtc="2026-10-20T21:38:00Z"/>
+          <w:ins w:id="146" w:author="Rohit Singh" w:date="2026-10-20T22:38:00Z" w16du:dateUtc="2026-10-20T21:38:00Z"/>
           <w:b/>
           <w:bCs/>
         </w:rPr>
       </w:pPr>
-      <w:ins w:id="105" w:author="Rohit Singh" w:date="2026-10-20T22:38:00Z" w16du:dateUtc="2026-10-20T21:38:00Z">
+      <w:ins w:id="147" w:author="Rohit Singh" w:date="2026-10-20T22:38:00Z" w16du:dateUtc="2026-10-20T21:38:00Z">
         <w:r>
           <w:rPr>
             <w:b/>
@@ -2599,10 +3849,10 @@
           <w:numId w:val="5"/>
         </w:numPr>
         <w:rPr>
-          <w:ins w:id="106" w:author="Rohit Singh" w:date="2026-10-20T22:38:00Z" w16du:dateUtc="2026-10-20T21:38:00Z"/>
-        </w:rPr>
-      </w:pPr>
-      <w:ins w:id="107" w:author="Rohit Singh" w:date="2026-10-20T22:38:00Z" w16du:dateUtc="2026-10-20T21:38:00Z">
+          <w:ins w:id="148" w:author="Rohit Singh" w:date="2026-10-20T22:38:00Z" w16du:dateUtc="2026-10-20T21:38:00Z"/>
+        </w:rPr>
+      </w:pPr>
+      <w:ins w:id="149" w:author="Rohit Singh" w:date="2026-10-20T22:38:00Z" w16du:dateUtc="2026-10-20T21:38:00Z">
         <w:r>
           <w:rPr>
             <w:b/>
@@ -2622,15 +3872,16 @@
           <w:numId w:val="5"/>
         </w:numPr>
         <w:rPr>
-          <w:ins w:id="108" w:author="Rohit Singh" w:date="2026-10-20T22:38:00Z" w16du:dateUtc="2026-10-20T21:38:00Z"/>
-        </w:rPr>
-      </w:pPr>
-      <w:ins w:id="109" w:author="Rohit Singh" w:date="2026-10-20T22:38:00Z" w16du:dateUtc="2026-10-20T21:38:00Z">
+          <w:ins w:id="150" w:author="Rohit Singh" w:date="2026-10-20T22:38:00Z" w16du:dateUtc="2026-10-20T21:38:00Z"/>
+        </w:rPr>
+      </w:pPr>
+      <w:ins w:id="151" w:author="Rohit Singh" w:date="2026-10-20T22:38:00Z" w16du:dateUtc="2026-10-20T21:38:00Z">
         <w:r>
           <w:rPr>
             <w:b/>
             <w:bCs/>
           </w:rPr>
+          <w:lastRenderedPageBreak/>
           <w:t>Machine Learning:</w:t>
         </w:r>
         <w:r>
@@ -2653,10 +3904,10 @@
           <w:numId w:val="5"/>
         </w:numPr>
         <w:rPr>
-          <w:ins w:id="110" w:author="Rohit Singh" w:date="2026-10-20T22:38:00Z" w16du:dateUtc="2026-10-20T21:38:00Z"/>
-        </w:rPr>
-      </w:pPr>
-      <w:ins w:id="111" w:author="Rohit Singh" w:date="2026-10-20T22:38:00Z" w16du:dateUtc="2026-10-20T21:38:00Z">
+          <w:ins w:id="152" w:author="Rohit Singh" w:date="2026-10-20T22:38:00Z" w16du:dateUtc="2026-10-20T21:38:00Z"/>
+        </w:rPr>
+      </w:pPr>
+      <w:ins w:id="153" w:author="Rohit Singh" w:date="2026-10-20T22:38:00Z" w16du:dateUtc="2026-10-20T21:38:00Z">
         <w:r>
           <w:rPr>
             <w:b/>
@@ -2672,13 +3923,13 @@
           <w:t>Stream</w:t>
         </w:r>
       </w:ins>
-      <w:ins w:id="112" w:author="Rohit Singh" w:date="2026-10-20T23:00:00Z" w16du:dateUtc="2026-10-20T22:00:00Z">
+      <w:ins w:id="154" w:author="Rohit Singh" w:date="2026-10-20T23:00:00Z" w16du:dateUtc="2026-10-20T22:00:00Z">
         <w:r>
           <w:t>lit</w:t>
         </w:r>
       </w:ins>
       <w:proofErr w:type="spellEnd"/>
-      <w:ins w:id="113" w:author="Rohit Singh" w:date="2026-10-20T22:38:00Z" w16du:dateUtc="2026-10-20T21:38:00Z">
+      <w:ins w:id="155" w:author="Rohit Singh" w:date="2026-10-20T22:38:00Z" w16du:dateUtc="2026-10-20T21:38:00Z">
         <w:r>
           <w:t xml:space="preserve"> for dynamic user dashboarding; Matplotlib &amp; Seaborn for EDA.</w:t>
         </w:r>
@@ -2691,16 +3942,15 @@
           <w:numId w:val="5"/>
         </w:numPr>
         <w:rPr>
-          <w:ins w:id="114" w:author="Rohit Singh" w:date="2026-10-20T22:38:00Z" w16du:dateUtc="2026-10-20T21:38:00Z"/>
-        </w:rPr>
-      </w:pPr>
-      <w:ins w:id="115" w:author="Rohit Singh" w:date="2026-10-20T22:38:00Z" w16du:dateUtc="2026-10-20T21:38:00Z">
+          <w:ins w:id="156" w:author="Rohit Singh" w:date="2026-10-20T22:38:00Z" w16du:dateUtc="2026-10-20T21:38:00Z"/>
+        </w:rPr>
+      </w:pPr>
+      <w:ins w:id="157" w:author="Rohit Singh" w:date="2026-10-20T22:38:00Z" w16du:dateUtc="2026-10-20T21:38:00Z">
         <w:r>
           <w:rPr>
             <w:b/>
             <w:bCs/>
           </w:rPr>
-          <w:lastRenderedPageBreak/>
           <w:t>Environment &amp; Version Control:</w:t>
         </w:r>
         <w:r>
@@ -2711,12 +3961,12 @@
     <w:p>
       <w:pPr>
         <w:rPr>
-          <w:ins w:id="116" w:author="Rohit Singh" w:date="2026-10-20T22:38:00Z" w16du:dateUtc="2026-10-20T21:38:00Z"/>
+          <w:ins w:id="158" w:author="Rohit Singh" w:date="2026-10-20T22:38:00Z" w16du:dateUtc="2026-10-20T21:38:00Z"/>
           <w:b/>
           <w:bCs/>
         </w:rPr>
       </w:pPr>
-      <w:ins w:id="117" w:author="Rohit Singh" w:date="2026-10-20T22:38:00Z" w16du:dateUtc="2026-10-20T21:38:00Z">
+      <w:ins w:id="159" w:author="Rohit Singh" w:date="2026-10-20T22:38:00Z" w16du:dateUtc="2026-10-20T21:38:00Z">
         <w:r>
           <w:rPr>
             <w:b/>
@@ -2729,23 +3979,21 @@
     <w:p>
       <w:pPr>
         <w:rPr>
-          <w:ins w:id="118" w:author="Rohit Singh" w:date="2026-10-20T22:53:00Z" w16du:dateUtc="2026-10-20T21:53:00Z"/>
+          <w:ins w:id="160" w:author="Rohit Singh" w:date="2026-10-20T22:53:00Z" w16du:dateUtc="2026-10-20T21:53:00Z"/>
           <w:b/>
           <w:bCs/>
         </w:rPr>
       </w:pPr>
-      <w:ins w:id="119" w:author="Rohit Singh" w:date="2026-10-20T22:55:00Z" w16du:dateUtc="2026-10-20T21:55:00Z">
+      <w:ins w:id="161" w:author="Rohit Singh" w:date="2026-10-23T17:39:00Z" w16du:dateUtc="2026-10-23T16:39:00Z">
         <w:r>
           <w:rPr>
-            <w:b/>
-            <w:bCs/>
             <w:noProof/>
           </w:rPr>
           <w:drawing>
-            <wp:inline distT="0" distB="0" distL="0" distR="0" wp14:anchorId="3D02058B" wp14:editId="14097368">
-              <wp:extent cx="5731510" cy="4234815"/>
-              <wp:effectExtent l="0" t="0" r="2540" b="0"/>
-              <wp:docPr id="883228301" name="Picture 1"/>
+            <wp:inline distT="0" distB="0" distL="0" distR="0" wp14:anchorId="4076A48A" wp14:editId="22932A6F">
+              <wp:extent cx="5448300" cy="5267325"/>
+              <wp:effectExtent l="0" t="0" r="0" b="9525"/>
+              <wp:docPr id="1104084704" name="Picture 6"/>
               <wp:cNvGraphicFramePr>
                 <a:graphicFrameLocks xmlns:a="http://schemas.openxmlformats.org/drawingml/2006/main" noChangeAspect="1"/>
               </wp:cNvGraphicFramePr>
@@ -2753,23 +4001,36 @@
                 <a:graphicData uri="http://schemas.openxmlformats.org/drawingml/2006/picture">
                   <pic:pic xmlns:pic="http://schemas.openxmlformats.org/drawingml/2006/picture">
                     <pic:nvPicPr>
-                      <pic:cNvPr id="883228301" name=""/>
-                      <pic:cNvPicPr/>
+                      <pic:cNvPr id="0" name="Picture 3"/>
+                      <pic:cNvPicPr>
+                        <a:picLocks noChangeAspect="1" noChangeArrowheads="1"/>
+                      </pic:cNvPicPr>
                     </pic:nvPicPr>
                     <pic:blipFill>
-                      <a:blip r:embed="rId9"/>
+                      <a:blip r:embed="rId9">
+                        <a:extLst>
+                          <a:ext uri="{28A0092B-C50C-407E-A947-70E740481C1C}">
+                            <a14:useLocalDpi xmlns:a14="http://schemas.microsoft.com/office/drawing/2010/main" val="0"/>
+                          </a:ext>
+                        </a:extLst>
+                      </a:blip>
+                      <a:srcRect/>
                       <a:stretch>
                         <a:fillRect/>
                       </a:stretch>
                     </pic:blipFill>
-                    <pic:spPr>
+                    <pic:spPr bwMode="auto">
                       <a:xfrm>
                         <a:off x="0" y="0"/>
-                        <a:ext cx="5731510" cy="4234815"/>
+                        <a:ext cx="5448300" cy="5267325"/>
                       </a:xfrm>
                       <a:prstGeom prst="rect">
                         <a:avLst/>
                       </a:prstGeom>
+                      <a:noFill/>
+                      <a:ln>
+                        <a:noFill/>
+                      </a:ln>
                     </pic:spPr>
                   </pic:pic>
                 </a:graphicData>
@@ -2782,7 +4043,7 @@
     <w:p>
       <w:pPr>
         <w:rPr>
-          <w:ins w:id="120" w:author="Rohit Singh" w:date="2026-10-20T22:53:00Z" w16du:dateUtc="2026-10-20T21:53:00Z"/>
+          <w:ins w:id="162" w:author="Rohit Singh" w:date="2026-10-20T22:53:00Z" w16du:dateUtc="2026-10-20T21:53:00Z"/>
           <w:b/>
           <w:bCs/>
         </w:rPr>
@@ -2792,24 +4053,26 @@
       <w:pPr>
         <w:pStyle w:val="Heading1"/>
         <w:rPr>
-          <w:ins w:id="121" w:author="Rohit Singh" w:date="2026-10-20T22:53:00Z" w16du:dateUtc="2026-10-20T21:53:00Z"/>
-        </w:rPr>
-      </w:pPr>
-      <w:ins w:id="122" w:author="Rohit Singh" w:date="2026-10-20T22:53:00Z" w16du:dateUtc="2026-10-20T21:53:00Z">
+          <w:ins w:id="163" w:author="Rohit Singh" w:date="2026-10-20T22:53:00Z" w16du:dateUtc="2026-10-20T21:53:00Z"/>
+        </w:rPr>
+      </w:pPr>
+      <w:bookmarkStart w:id="164" w:name="_Toc243669610"/>
+      <w:ins w:id="165" w:author="Rohit Singh" w:date="2026-10-20T22:53:00Z" w16du:dateUtc="2026-10-20T21:53:00Z">
         <w:r>
           <w:t>Data Sources</w:t>
         </w:r>
-      </w:ins>
-    </w:p>
-    <w:p>
-      <w:pPr>
-        <w:rPr>
-          <w:ins w:id="123" w:author="Rohit Singh" w:date="2026-10-20T22:53:00Z" w16du:dateUtc="2026-10-20T21:53:00Z"/>
+        <w:bookmarkEnd w:id="164"/>
+      </w:ins>
+    </w:p>
+    <w:p>
+      <w:pPr>
+        <w:rPr>
+          <w:ins w:id="166" w:author="Rohit Singh" w:date="2026-10-20T22:53:00Z" w16du:dateUtc="2026-10-20T21:53:00Z"/>
           <w:b/>
           <w:bCs/>
         </w:rPr>
       </w:pPr>
-      <w:ins w:id="124" w:author="Rohit Singh" w:date="2026-10-20T22:53:00Z" w16du:dateUtc="2026-10-20T21:53:00Z">
+      <w:ins w:id="167" w:author="Rohit Singh" w:date="2026-10-20T22:53:00Z" w16du:dateUtc="2026-10-20T21:53:00Z">
         <w:r>
           <w:rPr>
             <w:b/>
@@ -2822,10 +4085,10 @@
     <w:p>
       <w:pPr>
         <w:rPr>
-          <w:ins w:id="125" w:author="Rohit Singh" w:date="2026-10-20T22:53:00Z" w16du:dateUtc="2026-10-20T21:53:00Z"/>
-        </w:rPr>
-      </w:pPr>
-      <w:ins w:id="126" w:author="Rohit Singh" w:date="2026-10-20T22:53:00Z" w16du:dateUtc="2026-10-20T21:53:00Z">
+          <w:ins w:id="168" w:author="Rohit Singh" w:date="2026-10-20T22:53:00Z" w16du:dateUtc="2026-10-20T21:53:00Z"/>
+        </w:rPr>
+      </w:pPr>
+      <w:ins w:id="169" w:author="Rohit Singh" w:date="2026-10-20T22:53:00Z" w16du:dateUtc="2026-10-20T21:53:00Z">
         <w:r>
           <w:t xml:space="preserve">The project relies on verified public open datasets published on </w:t>
         </w:r>
@@ -2848,10 +4111,10 @@
           <w:numId w:val="6"/>
         </w:numPr>
         <w:rPr>
-          <w:ins w:id="127" w:author="Rohit Singh" w:date="2026-10-20T22:53:00Z" w16du:dateUtc="2026-10-20T21:53:00Z"/>
-        </w:rPr>
-      </w:pPr>
-      <w:ins w:id="128" w:author="Rohit Singh" w:date="2026-10-20T22:53:00Z" w16du:dateUtc="2026-10-20T21:53:00Z">
+          <w:ins w:id="170" w:author="Rohit Singh" w:date="2026-10-20T22:53:00Z" w16du:dateUtc="2026-10-20T21:53:00Z"/>
+        </w:rPr>
+      </w:pPr>
+      <w:ins w:id="171" w:author="Rohit Singh" w:date="2026-10-20T22:53:00Z" w16du:dateUtc="2026-10-20T21:53:00Z">
         <w:r>
           <w:rPr>
             <w:b/>
@@ -2871,15 +4134,16 @@
           <w:numId w:val="6"/>
         </w:numPr>
         <w:rPr>
-          <w:ins w:id="129" w:author="Rohit Singh" w:date="2026-10-20T22:53:00Z" w16du:dateUtc="2026-10-20T21:53:00Z"/>
-        </w:rPr>
-      </w:pPr>
-      <w:ins w:id="130" w:author="Rohit Singh" w:date="2026-10-20T22:53:00Z" w16du:dateUtc="2026-10-20T21:53:00Z">
+          <w:ins w:id="172" w:author="Rohit Singh" w:date="2026-10-20T22:53:00Z" w16du:dateUtc="2026-10-20T21:53:00Z"/>
+        </w:rPr>
+      </w:pPr>
+      <w:ins w:id="173" w:author="Rohit Singh" w:date="2026-10-20T22:53:00Z" w16du:dateUtc="2026-10-20T21:53:00Z">
         <w:r>
           <w:rPr>
             <w:b/>
             <w:bCs/>
           </w:rPr>
+          <w:lastRenderedPageBreak/>
           <w:t>CSO PCIEV01 - Public EV Charging Infrastructure:</w:t>
         </w:r>
         <w:r>
@@ -2894,10 +4158,10 @@
           <w:numId w:val="6"/>
         </w:numPr>
         <w:rPr>
-          <w:ins w:id="131" w:author="Rohit Singh" w:date="2026-10-20T22:53:00Z" w16du:dateUtc="2026-10-20T21:53:00Z"/>
-        </w:rPr>
-      </w:pPr>
-      <w:ins w:id="132" w:author="Rohit Singh" w:date="2026-10-20T22:53:00Z" w16du:dateUtc="2026-10-20T21:53:00Z">
+          <w:ins w:id="174" w:author="Rohit Singh" w:date="2026-10-20T22:53:00Z" w16du:dateUtc="2026-10-20T21:53:00Z"/>
+        </w:rPr>
+      </w:pPr>
+      <w:ins w:id="175" w:author="Rohit Singh" w:date="2026-10-20T22:53:00Z" w16du:dateUtc="2026-10-20T21:53:00Z">
         <w:r>
           <w:rPr>
             <w:b/>
@@ -2909,12 +4173,12 @@
           <w:t xml:space="preserve"> Geolocation records (latitude/longitude), connector types, </w:t>
         </w:r>
       </w:ins>
-      <w:ins w:id="133" w:author="Rohit Singh" w:date="2026-10-20T23:00:00Z" w16du:dateUtc="2026-10-20T22:00:00Z">
+      <w:ins w:id="176" w:author="Rohit Singh" w:date="2026-10-20T23:00:00Z" w16du:dateUtc="2026-10-20T22:00:00Z">
         <w:r>
           <w:t>and</w:t>
         </w:r>
       </w:ins>
-      <w:ins w:id="134" w:author="Rohit Singh" w:date="2026-10-20T22:53:00Z" w16du:dateUtc="2026-10-20T21:53:00Z">
+      <w:ins w:id="177" w:author="Rohit Singh" w:date="2026-10-20T22:53:00Z" w16du:dateUtc="2026-10-20T21:53:00Z">
         <w:r>
           <w:t xml:space="preserve"> charger power capacity.</w:t>
         </w:r>
@@ -2923,12 +4187,12 @@
     <w:p>
       <w:pPr>
         <w:rPr>
-          <w:ins w:id="135" w:author="Rohit Singh" w:date="2026-10-20T22:53:00Z" w16du:dateUtc="2026-10-20T21:53:00Z"/>
+          <w:ins w:id="178" w:author="Rohit Singh" w:date="2026-10-20T22:53:00Z" w16du:dateUtc="2026-10-20T21:53:00Z"/>
           <w:b/>
           <w:bCs/>
         </w:rPr>
       </w:pPr>
-      <w:ins w:id="136" w:author="Rohit Singh" w:date="2026-10-20T22:53:00Z" w16du:dateUtc="2026-10-20T21:53:00Z">
+      <w:ins w:id="179" w:author="Rohit Singh" w:date="2026-10-20T22:53:00Z" w16du:dateUtc="2026-10-20T21:53:00Z">
         <w:r>
           <w:rPr>
             <w:b/>
@@ -2941,10 +4205,10 @@
     <w:p>
       <w:pPr>
         <w:rPr>
-          <w:ins w:id="137" w:author="Rohit Singh" w:date="2026-10-20T22:53:00Z" w16du:dateUtc="2026-10-20T21:53:00Z"/>
-        </w:rPr>
-      </w:pPr>
-      <w:ins w:id="138" w:author="Rohit Singh" w:date="2026-10-20T22:53:00Z" w16du:dateUtc="2026-10-20T21:53:00Z">
+          <w:ins w:id="180" w:author="Rohit Singh" w:date="2026-10-20T22:53:00Z" w16du:dateUtc="2026-10-20T21:53:00Z"/>
+        </w:rPr>
+      </w:pPr>
+      <w:ins w:id="181" w:author="Rohit Singh" w:date="2026-10-20T22:53:00Z" w16du:dateUtc="2026-10-20T21:53:00Z">
         <w:r>
           <w:t xml:space="preserve">All selected datasets are published under the </w:t>
         </w:r>
@@ -2956,11 +4220,7 @@
           <w:t>Creative Commons Attribution 4.0 International (CC BY 4.0)</w:t>
         </w:r>
         <w:r>
-          <w:t xml:space="preserve"> license or Open Government License. These rights grant full </w:t>
-        </w:r>
-        <w:r>
-          <w:lastRenderedPageBreak/>
-          <w:t>permission to access, combine, adapt, and use the data for academic research and commercial analytical modelling, provided appropriate attribution is maintained.</w:t>
+          <w:t xml:space="preserve"> license or Open Government License. These rights grant full permission to access, combine, adapt, and use the data for academic research and commercial analytical modelling, provided appropriate attribution is maintained.</w:t>
         </w:r>
       </w:ins>
     </w:p>
@@ -2968,24 +4228,26 @@
       <w:pPr>
         <w:pStyle w:val="Heading1"/>
         <w:rPr>
-          <w:ins w:id="139" w:author="Rohit Singh" w:date="2026-10-20T22:53:00Z" w16du:dateUtc="2026-10-20T21:53:00Z"/>
-        </w:rPr>
-      </w:pPr>
-      <w:ins w:id="140" w:author="Rohit Singh" w:date="2026-10-20T22:53:00Z" w16du:dateUtc="2026-10-20T21:53:00Z">
+          <w:ins w:id="182" w:author="Rohit Singh" w:date="2026-10-20T22:53:00Z" w16du:dateUtc="2026-10-20T21:53:00Z"/>
+        </w:rPr>
+      </w:pPr>
+      <w:bookmarkStart w:id="183" w:name="_Toc243669611"/>
+      <w:ins w:id="184" w:author="Rohit Singh" w:date="2026-10-20T22:53:00Z" w16du:dateUtc="2026-10-20T21:53:00Z">
         <w:r>
           <w:t>Expected Deliverables (Semester 1 &amp; 2)</w:t>
         </w:r>
-      </w:ins>
-    </w:p>
-    <w:p>
-      <w:pPr>
-        <w:rPr>
-          <w:ins w:id="141" w:author="Rohit Singh" w:date="2026-10-20T22:53:00Z" w16du:dateUtc="2026-10-20T21:53:00Z"/>
+        <w:bookmarkEnd w:id="183"/>
+      </w:ins>
+    </w:p>
+    <w:p>
+      <w:pPr>
+        <w:rPr>
+          <w:ins w:id="185" w:author="Rohit Singh" w:date="2026-10-20T22:53:00Z" w16du:dateUtc="2026-10-20T21:53:00Z"/>
           <w:b/>
           <w:bCs/>
         </w:rPr>
       </w:pPr>
-      <w:ins w:id="142" w:author="Rohit Singh" w:date="2026-10-20T22:53:00Z" w16du:dateUtc="2026-10-20T21:53:00Z">
+      <w:ins w:id="186" w:author="Rohit Singh" w:date="2026-10-20T22:53:00Z" w16du:dateUtc="2026-10-20T21:53:00Z">
         <w:r>
           <w:rPr>
             <w:b/>
@@ -3002,10 +4264,10 @@
           <w:numId w:val="7"/>
         </w:numPr>
         <w:rPr>
-          <w:ins w:id="143" w:author="Rohit Singh" w:date="2026-10-20T22:53:00Z" w16du:dateUtc="2026-10-20T21:53:00Z"/>
-        </w:rPr>
-      </w:pPr>
-      <w:ins w:id="144" w:author="Rohit Singh" w:date="2026-10-20T22:53:00Z" w16du:dateUtc="2026-10-20T21:53:00Z">
+          <w:ins w:id="187" w:author="Rohit Singh" w:date="2026-10-20T22:53:00Z" w16du:dateUtc="2026-10-20T21:53:00Z"/>
+        </w:rPr>
+      </w:pPr>
+      <w:ins w:id="188" w:author="Rohit Singh" w:date="2026-10-20T22:53:00Z" w16du:dateUtc="2026-10-20T21:53:00Z">
         <w:r>
           <w:rPr>
             <w:b/>
@@ -3025,10 +4287,10 @@
           <w:numId w:val="7"/>
         </w:numPr>
         <w:rPr>
-          <w:ins w:id="145" w:author="Rohit Singh" w:date="2026-10-20T22:53:00Z" w16du:dateUtc="2026-10-20T21:53:00Z"/>
-        </w:rPr>
-      </w:pPr>
-      <w:ins w:id="146" w:author="Rohit Singh" w:date="2026-10-20T22:53:00Z" w16du:dateUtc="2026-10-20T21:53:00Z">
+          <w:ins w:id="189" w:author="Rohit Singh" w:date="2026-10-20T22:53:00Z" w16du:dateUtc="2026-10-20T21:53:00Z"/>
+        </w:rPr>
+      </w:pPr>
+      <w:ins w:id="190" w:author="Rohit Singh" w:date="2026-10-20T22:53:00Z" w16du:dateUtc="2026-10-20T21:53:00Z">
         <w:r>
           <w:rPr>
             <w:b/>
@@ -3048,10 +4310,10 @@
           <w:numId w:val="7"/>
         </w:numPr>
         <w:rPr>
-          <w:ins w:id="147" w:author="Rohit Singh" w:date="2026-10-20T22:53:00Z" w16du:dateUtc="2026-10-20T21:53:00Z"/>
-        </w:rPr>
-      </w:pPr>
-      <w:ins w:id="148" w:author="Rohit Singh" w:date="2026-10-20T22:53:00Z" w16du:dateUtc="2026-10-20T21:53:00Z">
+          <w:ins w:id="191" w:author="Rohit Singh" w:date="2026-10-20T22:53:00Z" w16du:dateUtc="2026-10-20T21:53:00Z"/>
+        </w:rPr>
+      </w:pPr>
+      <w:ins w:id="192" w:author="Rohit Singh" w:date="2026-10-20T22:53:00Z" w16du:dateUtc="2026-10-20T21:53:00Z">
         <w:r>
           <w:rPr>
             <w:b/>
@@ -3071,10 +4333,10 @@
           <w:numId w:val="7"/>
         </w:numPr>
         <w:rPr>
-          <w:ins w:id="149" w:author="Rohit Singh" w:date="2026-10-20T22:53:00Z" w16du:dateUtc="2026-10-20T21:53:00Z"/>
-        </w:rPr>
-      </w:pPr>
-      <w:ins w:id="150" w:author="Rohit Singh" w:date="2026-10-20T22:53:00Z" w16du:dateUtc="2026-10-20T21:53:00Z">
+          <w:ins w:id="193" w:author="Rohit Singh" w:date="2026-10-20T22:53:00Z" w16du:dateUtc="2026-10-20T21:53:00Z"/>
+        </w:rPr>
+      </w:pPr>
+      <w:ins w:id="194" w:author="Rohit Singh" w:date="2026-10-20T22:53:00Z" w16du:dateUtc="2026-10-20T21:53:00Z">
         <w:r>
           <w:rPr>
             <w:b/>
@@ -3086,7 +4348,7 @@
           <w:t xml:space="preserve"> Established repository initialized with access granted to </w:t>
         </w:r>
       </w:ins>
-      <w:ins w:id="151" w:author="Rohit Singh" w:date="2026-10-20T23:10:00Z" w16du:dateUtc="2026-10-20T22:10:00Z">
+      <w:ins w:id="195" w:author="Rohit Singh" w:date="2026-10-20T23:10:00Z" w16du:dateUtc="2026-10-20T22:10:00Z">
         <w:r>
           <w:t>GitHub</w:t>
         </w:r>
@@ -3094,7 +4356,7 @@
           <w:t xml:space="preserve"> user </w:t>
         </w:r>
       </w:ins>
-      <w:ins w:id="152" w:author="Rohit Singh" w:date="2026-10-20T22:53:00Z" w16du:dateUtc="2026-10-20T21:53:00Z">
+      <w:ins w:id="196" w:author="Rohit Singh" w:date="2026-10-20T22:53:00Z" w16du:dateUtc="2026-10-20T21:53:00Z">
         <w:r>
           <w:t>tahmed1986.</w:t>
         </w:r>
@@ -3103,12 +4365,12 @@
     <w:p>
       <w:pPr>
         <w:rPr>
-          <w:ins w:id="153" w:author="Rohit Singh" w:date="2026-10-20T22:53:00Z" w16du:dateUtc="2026-10-20T21:53:00Z"/>
+          <w:ins w:id="197" w:author="Rohit Singh" w:date="2026-10-20T22:53:00Z" w16du:dateUtc="2026-10-20T21:53:00Z"/>
           <w:b/>
           <w:bCs/>
         </w:rPr>
       </w:pPr>
-      <w:ins w:id="154" w:author="Rohit Singh" w:date="2026-10-20T22:53:00Z" w16du:dateUtc="2026-10-20T21:53:00Z">
+      <w:ins w:id="198" w:author="Rohit Singh" w:date="2026-10-20T22:53:00Z" w16du:dateUtc="2026-10-20T21:53:00Z">
         <w:r>
           <w:rPr>
             <w:b/>
@@ -3125,10 +4387,10 @@
           <w:numId w:val="8"/>
         </w:numPr>
         <w:rPr>
-          <w:ins w:id="155" w:author="Rohit Singh" w:date="2026-10-20T22:53:00Z" w16du:dateUtc="2026-10-20T21:53:00Z"/>
-        </w:rPr>
-      </w:pPr>
-      <w:ins w:id="156" w:author="Rohit Singh" w:date="2026-10-20T22:53:00Z" w16du:dateUtc="2026-10-20T21:53:00Z">
+          <w:ins w:id="199" w:author="Rohit Singh" w:date="2026-10-20T22:53:00Z" w16du:dateUtc="2026-10-20T21:53:00Z"/>
+        </w:rPr>
+      </w:pPr>
+      <w:ins w:id="200" w:author="Rohit Singh" w:date="2026-10-20T22:53:00Z" w16du:dateUtc="2026-10-20T21:53:00Z">
         <w:r>
           <w:rPr>
             <w:b/>
@@ -3148,10 +4410,10 @@
           <w:numId w:val="8"/>
         </w:numPr>
         <w:rPr>
-          <w:ins w:id="157" w:author="Rohit Singh" w:date="2026-10-20T22:53:00Z" w16du:dateUtc="2026-10-20T21:53:00Z"/>
-        </w:rPr>
-      </w:pPr>
-      <w:ins w:id="158" w:author="Rohit Singh" w:date="2026-10-20T22:53:00Z" w16du:dateUtc="2026-10-20T21:53:00Z">
+          <w:ins w:id="201" w:author="Rohit Singh" w:date="2026-10-20T22:53:00Z" w16du:dateUtc="2026-10-20T21:53:00Z"/>
+        </w:rPr>
+      </w:pPr>
+      <w:ins w:id="202" w:author="Rohit Singh" w:date="2026-10-20T22:53:00Z" w16du:dateUtc="2026-10-20T21:53:00Z">
         <w:r>
           <w:rPr>
             <w:b/>
@@ -3171,10 +4433,10 @@
           <w:numId w:val="8"/>
         </w:numPr>
         <w:rPr>
-          <w:ins w:id="159" w:author="Rohit Singh" w:date="2026-10-20T22:53:00Z" w16du:dateUtc="2026-10-20T21:53:00Z"/>
-        </w:rPr>
-      </w:pPr>
-      <w:ins w:id="160" w:author="Rohit Singh" w:date="2026-10-20T22:53:00Z" w16du:dateUtc="2026-10-20T21:53:00Z">
+          <w:ins w:id="203" w:author="Rohit Singh" w:date="2026-10-20T22:53:00Z" w16du:dateUtc="2026-10-20T21:53:00Z"/>
+        </w:rPr>
+      </w:pPr>
+      <w:ins w:id="204" w:author="Rohit Singh" w:date="2026-10-20T22:53:00Z" w16du:dateUtc="2026-10-20T21:53:00Z">
         <w:r>
           <w:rPr>
             <w:b/>
@@ -3194,10 +4456,10 @@
           <w:numId w:val="8"/>
         </w:numPr>
         <w:rPr>
-          <w:ins w:id="161" w:author="Rohit Singh" w:date="2026-10-20T22:53:00Z" w16du:dateUtc="2026-10-20T21:53:00Z"/>
-        </w:rPr>
-      </w:pPr>
-      <w:ins w:id="162" w:author="Rohit Singh" w:date="2026-10-20T22:53:00Z" w16du:dateUtc="2026-10-20T21:53:00Z">
+          <w:ins w:id="205" w:author="Rohit Singh" w:date="2026-10-20T22:53:00Z" w16du:dateUtc="2026-10-20T21:53:00Z"/>
+        </w:rPr>
+      </w:pPr>
+      <w:ins w:id="206" w:author="Rohit Singh" w:date="2026-10-20T22:53:00Z" w16du:dateUtc="2026-10-20T21:53:00Z">
         <w:r>
           <w:rPr>
             <w:b/>
@@ -3214,31 +4476,34 @@
       <w:pPr>
         <w:pStyle w:val="Heading1"/>
         <w:rPr>
-          <w:ins w:id="163" w:author="Rohit Singh" w:date="2026-10-20T22:53:00Z" w16du:dateUtc="2026-10-20T21:53:00Z"/>
-        </w:rPr>
-      </w:pPr>
-      <w:ins w:id="164" w:author="Rohit Singh" w:date="2026-10-20T22:53:00Z" w16du:dateUtc="2026-10-20T21:53:00Z">
-        <w:r>
+          <w:ins w:id="207" w:author="Rohit Singh" w:date="2026-10-20T22:53:00Z" w16du:dateUtc="2026-10-20T21:53:00Z"/>
+        </w:rPr>
+      </w:pPr>
+      <w:bookmarkStart w:id="208" w:name="_Toc243669612"/>
+      <w:ins w:id="209" w:author="Rohit Singh" w:date="2026-10-20T22:53:00Z" w16du:dateUtc="2026-10-20T21:53:00Z">
+        <w:r>
+          <w:lastRenderedPageBreak/>
           <w:t>Project Timeline</w:t>
         </w:r>
-      </w:ins>
-    </w:p>
-    <w:p>
-      <w:pPr>
-        <w:rPr>
-          <w:ins w:id="165" w:author="Rohit Singh" w:date="2026-10-20T22:53:00Z" w16du:dateUtc="2026-10-20T21:53:00Z"/>
-        </w:rPr>
-      </w:pPr>
-      <w:ins w:id="166" w:author="Rohit Singh" w:date="2026-10-20T22:53:00Z" w16du:dateUtc="2026-10-20T21:53:00Z">
+        <w:bookmarkEnd w:id="208"/>
+      </w:ins>
+    </w:p>
+    <w:p>
+      <w:pPr>
+        <w:rPr>
+          <w:ins w:id="210" w:author="Rohit Singh" w:date="2026-10-20T22:53:00Z" w16du:dateUtc="2026-10-20T21:53:00Z"/>
+        </w:rPr>
+      </w:pPr>
+      <w:ins w:id="211" w:author="Rohit Singh" w:date="2026-10-23T17:39:00Z" w16du:dateUtc="2026-10-23T16:39:00Z">
         <w:r>
           <w:rPr>
             <w:noProof/>
           </w:rPr>
           <w:drawing>
-            <wp:inline distT="0" distB="0" distL="0" distR="0" wp14:anchorId="2323C2B1" wp14:editId="2DF0B547">
-              <wp:extent cx="5731510" cy="1626870"/>
+            <wp:inline distT="0" distB="0" distL="0" distR="0" wp14:anchorId="4A1D0A40" wp14:editId="132189CE">
+              <wp:extent cx="5731510" cy="3395980"/>
               <wp:effectExtent l="0" t="0" r="2540" b="0"/>
-              <wp:docPr id="1439473116" name="Picture 1"/>
+              <wp:docPr id="366713490" name="Picture 7"/>
               <wp:cNvGraphicFramePr>
                 <a:graphicFrameLocks xmlns:a="http://schemas.openxmlformats.org/drawingml/2006/main" noChangeAspect="1"/>
               </wp:cNvGraphicFramePr>
@@ -3246,23 +4511,36 @@
                 <a:graphicData uri="http://schemas.openxmlformats.org/drawingml/2006/picture">
                   <pic:pic xmlns:pic="http://schemas.openxmlformats.org/drawingml/2006/picture">
                     <pic:nvPicPr>
-                      <pic:cNvPr id="1439473116" name=""/>
-                      <pic:cNvPicPr/>
+                      <pic:cNvPr id="0" name="Picture 5"/>
+                      <pic:cNvPicPr>
+                        <a:picLocks noChangeAspect="1" noChangeArrowheads="1"/>
+                      </pic:cNvPicPr>
                     </pic:nvPicPr>
                     <pic:blipFill>
-                      <a:blip r:embed="rId10"/>
+                      <a:blip r:embed="rId10">
+                        <a:extLst>
+                          <a:ext uri="{28A0092B-C50C-407E-A947-70E740481C1C}">
+                            <a14:useLocalDpi xmlns:a14="http://schemas.microsoft.com/office/drawing/2010/main" val="0"/>
+                          </a:ext>
+                        </a:extLst>
+                      </a:blip>
+                      <a:srcRect/>
                       <a:stretch>
                         <a:fillRect/>
                       </a:stretch>
                     </pic:blipFill>
-                    <pic:spPr>
+                    <pic:spPr bwMode="auto">
                       <a:xfrm>
                         <a:off x="0" y="0"/>
-                        <a:ext cx="5731510" cy="1626870"/>
+                        <a:ext cx="5731510" cy="3395980"/>
                       </a:xfrm>
                       <a:prstGeom prst="rect">
                         <a:avLst/>
                       </a:prstGeom>
+                      <a:noFill/>
+                      <a:ln>
+                        <a:noFill/>
+                      </a:ln>
                     </pic:spPr>
                   </pic:pic>
                 </a:graphicData>
@@ -3279,10 +4557,10 @@
           <w:numId w:val="9"/>
         </w:numPr>
         <w:rPr>
-          <w:ins w:id="167" w:author="Rohit Singh" w:date="2026-10-20T22:53:00Z" w16du:dateUtc="2026-10-20T21:53:00Z"/>
-        </w:rPr>
-      </w:pPr>
-      <w:ins w:id="168" w:author="Rohit Singh" w:date="2026-10-20T22:53:00Z" w16du:dateUtc="2026-10-20T21:53:00Z">
+          <w:ins w:id="212" w:author="Rohit Singh" w:date="2026-10-20T22:53:00Z" w16du:dateUtc="2026-10-20T21:53:00Z"/>
+        </w:rPr>
+      </w:pPr>
+      <w:ins w:id="213" w:author="Rohit Singh" w:date="2026-10-20T22:53:00Z" w16du:dateUtc="2026-10-20T21:53:00Z">
         <w:r>
           <w:rPr>
             <w:b/>
@@ -3302,10 +4580,10 @@
           <w:numId w:val="9"/>
         </w:numPr>
         <w:rPr>
-          <w:ins w:id="169" w:author="Rohit Singh" w:date="2026-10-20T22:53:00Z" w16du:dateUtc="2026-10-20T21:53:00Z"/>
-        </w:rPr>
-      </w:pPr>
-      <w:ins w:id="170" w:author="Rohit Singh" w:date="2026-10-20T22:53:00Z" w16du:dateUtc="2026-10-20T21:53:00Z">
+          <w:ins w:id="214" w:author="Rohit Singh" w:date="2026-10-20T22:53:00Z" w16du:dateUtc="2026-10-20T21:53:00Z"/>
+        </w:rPr>
+      </w:pPr>
+      <w:ins w:id="215" w:author="Rohit Singh" w:date="2026-10-20T22:53:00Z" w16du:dateUtc="2026-10-20T21:53:00Z">
         <w:r>
           <w:rPr>
             <w:b/>
@@ -3325,10 +4603,10 @@
           <w:numId w:val="9"/>
         </w:numPr>
         <w:rPr>
-          <w:ins w:id="171" w:author="Rohit Singh" w:date="2026-10-20T22:53:00Z" w16du:dateUtc="2026-10-20T21:53:00Z"/>
-        </w:rPr>
-      </w:pPr>
-      <w:ins w:id="172" w:author="Rohit Singh" w:date="2026-10-20T22:53:00Z" w16du:dateUtc="2026-10-20T21:53:00Z">
+          <w:ins w:id="216" w:author="Rohit Singh" w:date="2026-10-20T22:53:00Z" w16du:dateUtc="2026-10-20T21:53:00Z"/>
+        </w:rPr>
+      </w:pPr>
+      <w:ins w:id="217" w:author="Rohit Singh" w:date="2026-10-20T22:53:00Z" w16du:dateUtc="2026-10-20T21:53:00Z">
         <w:r>
           <w:rPr>
             <w:b/>
@@ -3345,25 +4623,26 @@
       <w:pPr>
         <w:pStyle w:val="Heading1"/>
         <w:rPr>
-          <w:ins w:id="173" w:author="Rohit Singh" w:date="2026-10-20T22:53:00Z" w16du:dateUtc="2026-10-20T21:53:00Z"/>
-        </w:rPr>
-      </w:pPr>
-      <w:ins w:id="174" w:author="Rohit Singh" w:date="2026-10-20T22:53:00Z" w16du:dateUtc="2026-10-20T21:53:00Z">
-        <w:r>
-          <w:lastRenderedPageBreak/>
+          <w:ins w:id="218" w:author="Rohit Singh" w:date="2026-10-20T22:53:00Z" w16du:dateUtc="2026-10-20T21:53:00Z"/>
+        </w:rPr>
+      </w:pPr>
+      <w:bookmarkStart w:id="219" w:name="_Toc243669613"/>
+      <w:ins w:id="220" w:author="Rohit Singh" w:date="2026-10-20T22:53:00Z" w16du:dateUtc="2026-10-20T21:53:00Z">
+        <w:r>
           <w:t>Ethical and Legal Considerations</w:t>
         </w:r>
-      </w:ins>
-    </w:p>
-    <w:p>
-      <w:pPr>
-        <w:rPr>
-          <w:ins w:id="175" w:author="Rohit Singh" w:date="2026-10-20T22:53:00Z" w16du:dateUtc="2026-10-20T21:53:00Z"/>
+        <w:bookmarkEnd w:id="219"/>
+      </w:ins>
+    </w:p>
+    <w:p>
+      <w:pPr>
+        <w:rPr>
+          <w:ins w:id="221" w:author="Rohit Singh" w:date="2026-10-20T22:53:00Z" w16du:dateUtc="2026-10-20T21:53:00Z"/>
           <w:b/>
           <w:bCs/>
         </w:rPr>
       </w:pPr>
-      <w:ins w:id="176" w:author="Rohit Singh" w:date="2026-10-20T22:53:00Z" w16du:dateUtc="2026-10-20T21:53:00Z">
+      <w:ins w:id="222" w:author="Rohit Singh" w:date="2026-10-20T22:53:00Z" w16du:dateUtc="2026-10-20T21:53:00Z">
         <w:r>
           <w:rPr>
             <w:b/>
@@ -3376,10 +4655,10 @@
     <w:p>
       <w:pPr>
         <w:rPr>
-          <w:ins w:id="177" w:author="Rohit Singh" w:date="2026-10-20T22:53:00Z" w16du:dateUtc="2026-10-20T21:53:00Z"/>
-        </w:rPr>
-      </w:pPr>
-      <w:ins w:id="178" w:author="Rohit Singh" w:date="2026-10-20T22:53:00Z" w16du:dateUtc="2026-10-20T21:53:00Z">
+          <w:ins w:id="223" w:author="Rohit Singh" w:date="2026-10-20T22:53:00Z" w16du:dateUtc="2026-10-20T21:53:00Z"/>
+        </w:rPr>
+      </w:pPr>
+      <w:ins w:id="224" w:author="Rohit Singh" w:date="2026-10-20T22:53:00Z" w16du:dateUtc="2026-10-20T21:53:00Z">
         <w:r>
           <w:t>The datasets utilized consist strictly of aggregated regional statistics and public infrastructure coordinates published by official government bodies. No personally identifiable information (PII), individual vehicle license plates, driver movement logs, or private home addresses are collected or processed. Consequently, the project presents negligible GDPR or personal privacy risks.</w:t>
         </w:r>
@@ -3388,12 +4667,12 @@
     <w:p>
       <w:pPr>
         <w:rPr>
-          <w:ins w:id="179" w:author="Rohit Singh" w:date="2026-10-20T22:53:00Z" w16du:dateUtc="2026-10-20T21:53:00Z"/>
+          <w:ins w:id="225" w:author="Rohit Singh" w:date="2026-10-20T22:53:00Z" w16du:dateUtc="2026-10-20T21:53:00Z"/>
           <w:b/>
           <w:bCs/>
         </w:rPr>
       </w:pPr>
-      <w:ins w:id="180" w:author="Rohit Singh" w:date="2026-10-20T22:53:00Z" w16du:dateUtc="2026-10-20T21:53:00Z">
+      <w:ins w:id="226" w:author="Rohit Singh" w:date="2026-10-20T22:53:00Z" w16du:dateUtc="2026-10-20T21:53:00Z">
         <w:r>
           <w:rPr>
             <w:b/>
@@ -3406,10 +4685,10 @@
     <w:p>
       <w:pPr>
         <w:rPr>
-          <w:ins w:id="181" w:author="Rohit Singh" w:date="2026-10-20T22:53:00Z" w16du:dateUtc="2026-10-20T21:53:00Z"/>
-        </w:rPr>
-      </w:pPr>
-      <w:ins w:id="182" w:author="Rohit Singh" w:date="2026-10-20T22:53:00Z" w16du:dateUtc="2026-10-20T21:53:00Z">
+          <w:ins w:id="227" w:author="Rohit Singh" w:date="2026-10-20T22:53:00Z" w16du:dateUtc="2026-10-20T21:53:00Z"/>
+        </w:rPr>
+      </w:pPr>
+      <w:ins w:id="228" w:author="Rohit Singh" w:date="2026-10-20T22:53:00Z" w16du:dateUtc="2026-10-20T21:53:00Z">
         <w:r>
           <w:t>All sources are properly referenced in accordance with Harvard Referencing guidelines. Open data licensing conditions under CC BY 4.0 are fully respected by maintaining clear metadata lineage within the code repository.</w:t>
         </w:r>
@@ -3418,12 +4697,12 @@
     <w:p>
       <w:pPr>
         <w:rPr>
-          <w:ins w:id="183" w:author="Rohit Singh" w:date="2026-10-20T22:53:00Z" w16du:dateUtc="2026-10-20T21:53:00Z"/>
+          <w:ins w:id="229" w:author="Rohit Singh" w:date="2026-10-20T22:53:00Z" w16du:dateUtc="2026-10-20T21:53:00Z"/>
           <w:b/>
           <w:bCs/>
         </w:rPr>
       </w:pPr>
-      <w:ins w:id="184" w:author="Rohit Singh" w:date="2026-10-20T22:53:00Z" w16du:dateUtc="2026-10-20T21:53:00Z">
+      <w:ins w:id="230" w:author="Rohit Singh" w:date="2026-10-20T22:53:00Z" w16du:dateUtc="2026-10-20T21:53:00Z">
         <w:r>
           <w:rPr>
             <w:b/>
@@ -3436,24 +4715,28 @@
     <w:p>
       <w:pPr>
         <w:rPr>
-          <w:ins w:id="185" w:author="Rohit Singh" w:date="2026-10-20T22:53:00Z" w16du:dateUtc="2026-10-20T21:53:00Z"/>
-        </w:rPr>
-      </w:pPr>
-      <w:ins w:id="186" w:author="Rohit Singh" w:date="2026-10-20T22:53:00Z" w16du:dateUtc="2026-10-20T21:53:00Z">
-        <w:r>
-          <w:t>Predictive models used in public infrastructure planning must maintain transparency. The project will evaluate feature importance to ensure models do not unintentionally penalize economically disadvantaged or rural communities, supporting equitable access to public infrastructure.</w:t>
-        </w:r>
-      </w:ins>
-    </w:p>
-    <w:p>
-      <w:pPr>
-        <w:rPr>
-          <w:ins w:id="187" w:author="Rohit Singh" w:date="2026-10-20T22:53:00Z" w16du:dateUtc="2026-10-20T21:53:00Z"/>
+          <w:ins w:id="231" w:author="Rohit Singh" w:date="2026-10-20T22:53:00Z" w16du:dateUtc="2026-10-20T21:53:00Z"/>
+        </w:rPr>
+      </w:pPr>
+      <w:ins w:id="232" w:author="Rohit Singh" w:date="2026-10-20T22:53:00Z" w16du:dateUtc="2026-10-20T21:53:00Z">
+        <w:r>
+          <w:t xml:space="preserve">Predictive models used in public infrastructure planning must maintain transparency. The project will evaluate feature importance to ensure models do not unintentionally penalize </w:t>
+        </w:r>
+        <w:r>
+          <w:lastRenderedPageBreak/>
+          <w:t>economically disadvantaged or rural communities, supporting equitable access to public infrastructure.</w:t>
+        </w:r>
+      </w:ins>
+    </w:p>
+    <w:p>
+      <w:pPr>
+        <w:rPr>
+          <w:ins w:id="233" w:author="Rohit Singh" w:date="2026-10-20T22:53:00Z" w16du:dateUtc="2026-10-20T21:53:00Z"/>
           <w:b/>
           <w:bCs/>
         </w:rPr>
       </w:pPr>
-      <w:ins w:id="188" w:author="Rohit Singh" w:date="2026-10-20T22:53:00Z" w16du:dateUtc="2026-10-20T21:53:00Z">
+      <w:ins w:id="234" w:author="Rohit Singh" w:date="2026-10-20T22:53:00Z" w16du:dateUtc="2026-10-20T21:53:00Z">
         <w:r>
           <w:rPr>
             <w:b/>
@@ -3470,10 +4753,10 @@
           <w:numId w:val="10"/>
         </w:numPr>
         <w:rPr>
-          <w:ins w:id="189" w:author="Rohit Singh" w:date="2026-10-20T22:53:00Z" w16du:dateUtc="2026-10-20T21:53:00Z"/>
-        </w:rPr>
-      </w:pPr>
-      <w:ins w:id="190" w:author="Rohit Singh" w:date="2026-10-20T22:53:00Z" w16du:dateUtc="2026-10-20T21:53:00Z">
+          <w:ins w:id="235" w:author="Rohit Singh" w:date="2026-10-20T22:53:00Z" w16du:dateUtc="2026-10-20T21:53:00Z"/>
+        </w:rPr>
+      </w:pPr>
+      <w:ins w:id="236" w:author="Rohit Singh" w:date="2026-10-20T22:53:00Z" w16du:dateUtc="2026-10-20T21:53:00Z">
         <w:r>
           <w:t xml:space="preserve">Central Statistics Office (2026) </w:t>
         </w:r>
@@ -3496,10 +4779,10 @@
           <w:numId w:val="10"/>
         </w:numPr>
         <w:rPr>
-          <w:ins w:id="191" w:author="Rohit Singh" w:date="2026-10-20T22:53:00Z" w16du:dateUtc="2026-10-20T21:53:00Z"/>
-        </w:rPr>
-      </w:pPr>
-      <w:ins w:id="192" w:author="Rohit Singh" w:date="2026-10-20T22:53:00Z" w16du:dateUtc="2026-10-20T21:53:00Z">
+          <w:ins w:id="237" w:author="Rohit Singh" w:date="2026-10-20T22:53:00Z" w16du:dateUtc="2026-10-20T21:53:00Z"/>
+        </w:rPr>
+      </w:pPr>
+      <w:ins w:id="238" w:author="Rohit Singh" w:date="2026-10-20T22:53:00Z" w16du:dateUtc="2026-10-20T21:53:00Z">
         <w:r>
           <w:t xml:space="preserve">Department of Transport (2022) </w:t>
         </w:r>
@@ -3520,17 +4803,17 @@
         <w:rPr>
           <w:b/>
           <w:bCs/>
-          <w:rPrChange w:id="193" w:author="Rohit Singh" w:date="2026-10-20T22:38:00Z" w16du:dateUtc="2026-10-20T21:38:00Z">
+          <w:rPrChange w:id="239" w:author="Rohit Singh" w:date="2026-10-20T22:38:00Z" w16du:dateUtc="2026-10-20T21:38:00Z">
             <w:rPr/>
           </w:rPrChange>
         </w:rPr>
-        <w:pPrChange w:id="194" w:author="Rohit Singh" w:date="2026-10-20T22:38:00Z" w16du:dateUtc="2026-10-20T21:38:00Z">
+        <w:pPrChange w:id="240" w:author="Rohit Singh" w:date="2026-10-20T22:38:00Z" w16du:dateUtc="2026-10-20T21:38:00Z">
           <w:pPr>
             <w:pStyle w:val="Heading1"/>
           </w:pPr>
         </w:pPrChange>
       </w:pPr>
-      <w:ins w:id="195" w:author="Rohit Singh" w:date="2026-10-20T22:53:00Z" w16du:dateUtc="2026-10-20T21:53:00Z">
+      <w:ins w:id="241" w:author="Rohit Singh" w:date="2026-10-20T22:53:00Z" w16du:dateUtc="2026-10-20T21:53:00Z">
         <w:r>
           <w:t xml:space="preserve">Sustainable Energy Authority of Ireland (2025) </w:t>
         </w:r>

</xml_diff>

<commit_message>
Updated section 6 to include a view on project timelines
Updated section 6 to include a view on project timelines
</commit_message>
<xml_diff>
--- a/docs/sba26094_CA1_Strategic_Thinking_v1.docx
+++ b/docs/sba26094_CA1_Strategic_Thinking_v1.docx
@@ -650,7 +650,6 @@
                 <w:szCs w:val="32"/>
               </w:rPr>
             </w:pPr>
-            <w:proofErr w:type="spellStart"/>
             <w:r>
               <w:rPr>
                 <w:i/>
@@ -658,17 +657,7 @@
                 <w:sz w:val="32"/>
                 <w:szCs w:val="32"/>
               </w:rPr>
-              <w:t>Taufique</w:t>
-            </w:r>
-            <w:proofErr w:type="spellEnd"/>
-            <w:r>
-              <w:rPr>
-                <w:i/>
-                <w:color w:val="156082"/>
-                <w:sz w:val="32"/>
-                <w:szCs w:val="32"/>
-              </w:rPr>
-              <w:t xml:space="preserve"> Ahmed</w:t>
+              <w:t>Taufique Ahmed</w:t>
             </w:r>
           </w:p>
         </w:tc>
@@ -3399,15 +3388,7 @@
           <w:t>Predictive Model Development:</w:t>
         </w:r>
         <w:r>
-          <w:t xml:space="preserve"> Train, evaluate, and compare machine learning regression models (e.g., Multiple Linear Regression, Random Forest Regressor, </w:t>
-        </w:r>
-        <w:proofErr w:type="spellStart"/>
-        <w:r>
-          <w:t>XGBoost</w:t>
-        </w:r>
-        <w:proofErr w:type="spellEnd"/>
-        <w:r>
-          <w:t>) to forecast county-level charging demand scores.</w:t>
+          <w:t xml:space="preserve"> Train, evaluate, and compare machine learning regression models (e.g., Multiple Linear Regression, Random Forest Regressor, XGBoost) to forecast county-level charging demand scores.</w:t>
         </w:r>
       </w:ins>
     </w:p>
@@ -3430,15 +3411,7 @@
           <w:t>Interactive Dashboard &amp; Delivery:</w:t>
         </w:r>
         <w:r>
-          <w:t xml:space="preserve"> Build an interactive business intelligence dashboard (Power BI/</w:t>
-        </w:r>
-        <w:proofErr w:type="spellStart"/>
-        <w:r>
-          <w:t>Streamlit</w:t>
-        </w:r>
-        <w:proofErr w:type="spellEnd"/>
-        <w:r>
-          <w:t>) that visualizes predicted demand, identifies underserved regions, and provides scenario-based planning tools for stakeholders.</w:t>
+          <w:t xml:space="preserve"> Build an interactive business intelligence dashboard (Power BI/Streamlit) that visualizes predicted demand, identifies underserved regions, and provides scenario-based planning tools for stakeholders.</w:t>
         </w:r>
       </w:ins>
     </w:p>
@@ -3885,15 +3858,7 @@
           <w:t>Machine Learning:</w:t>
         </w:r>
         <w:r>
-          <w:t xml:space="preserve"> Scikit-Learn, </w:t>
-        </w:r>
-        <w:proofErr w:type="spellStart"/>
-        <w:r>
-          <w:t>XGBoost</w:t>
-        </w:r>
-        <w:proofErr w:type="spellEnd"/>
-        <w:r>
-          <w:t xml:space="preserve"> for feature scaling, regression modelling, and cross-validation.</w:t>
+          <w:t xml:space="preserve"> Scikit-Learn, XGBoost for feature scaling, regression modelling, and cross-validation.</w:t>
         </w:r>
       </w:ins>
     </w:p>
@@ -3916,11 +3881,7 @@
           <w:t>Visualization &amp; Reporting:</w:t>
         </w:r>
         <w:r>
-          <w:t xml:space="preserve"> Power BI / </w:t>
-        </w:r>
-        <w:proofErr w:type="spellStart"/>
-        <w:r>
-          <w:t>Stream</w:t>
+          <w:t xml:space="preserve"> Power BI / Stream</w:t>
         </w:r>
       </w:ins>
       <w:ins w:id="154" w:author="Rohit Singh" w:date="2026-10-20T23:00:00Z" w16du:dateUtc="2026-10-20T22:00:00Z">
@@ -3928,7 +3889,6 @@
           <w:t>lit</w:t>
         </w:r>
       </w:ins>
-      <w:proofErr w:type="spellEnd"/>
       <w:ins w:id="155" w:author="Rohit Singh" w:date="2026-10-20T22:38:00Z" w16du:dateUtc="2026-10-20T21:38:00Z">
         <w:r>
           <w:t xml:space="preserve"> for dynamic user dashboarding; Matplotlib &amp; Seaborn for EDA.</w:t>

</xml_diff>

<commit_message>
Arranged different sections and updated table of contents in the proposal word document
Arranged different sections and updated table of contents in the proposal word document
</commit_message>
<xml_diff>
--- a/docs/sba26094_CA1_Strategic_Thinking_v1.docx
+++ b/docs/sba26094_CA1_Strategic_Thinking_v1.docx
@@ -650,6 +650,7 @@
                 <w:szCs w:val="32"/>
               </w:rPr>
             </w:pPr>
+            <w:proofErr w:type="spellStart"/>
             <w:r>
               <w:rPr>
                 <w:i/>
@@ -657,7 +658,17 @@
                 <w:sz w:val="32"/>
                 <w:szCs w:val="32"/>
               </w:rPr>
-              <w:t>Taufique Ahmed</w:t>
+              <w:t>Taufique</w:t>
+            </w:r>
+            <w:proofErr w:type="spellEnd"/>
+            <w:r>
+              <w:rPr>
+                <w:i/>
+                <w:color w:val="156082"/>
+                <w:sz w:val="32"/>
+                <w:szCs w:val="32"/>
+              </w:rPr>
+              <w:t xml:space="preserve"> Ahmed</w:t>
             </w:r>
           </w:p>
         </w:tc>
@@ -3388,7 +3399,15 @@
           <w:t>Predictive Model Development:</w:t>
         </w:r>
         <w:r>
-          <w:t xml:space="preserve"> Train, evaluate, and compare machine learning regression models (e.g., Multiple Linear Regression, Random Forest Regressor, XGBoost) to forecast county-level charging demand scores.</w:t>
+          <w:t xml:space="preserve"> Train, evaluate, and compare machine learning regression models (e.g., Multiple Linear Regression, Random Forest Regressor, </w:t>
+        </w:r>
+        <w:proofErr w:type="spellStart"/>
+        <w:r>
+          <w:t>XGBoost</w:t>
+        </w:r>
+        <w:proofErr w:type="spellEnd"/>
+        <w:r>
+          <w:t>) to forecast county-level charging demand scores.</w:t>
         </w:r>
       </w:ins>
     </w:p>
@@ -3411,7 +3430,15 @@
           <w:t>Interactive Dashboard &amp; Delivery:</w:t>
         </w:r>
         <w:r>
-          <w:t xml:space="preserve"> Build an interactive business intelligence dashboard (Power BI/Streamlit) that visualizes predicted demand, identifies underserved regions, and provides scenario-based planning tools for stakeholders.</w:t>
+          <w:t xml:space="preserve"> Build an interactive business intelligence dashboard (Power BI/</w:t>
+        </w:r>
+        <w:proofErr w:type="spellStart"/>
+        <w:r>
+          <w:t>Streamlit</w:t>
+        </w:r>
+        <w:proofErr w:type="spellEnd"/>
+        <w:r>
+          <w:t>) that visualizes predicted demand, identifies underserved regions, and provides scenario-based planning tools for stakeholders.</w:t>
         </w:r>
       </w:ins>
     </w:p>
@@ -3858,7 +3885,15 @@
           <w:t>Machine Learning:</w:t>
         </w:r>
         <w:r>
-          <w:t xml:space="preserve"> Scikit-Learn, XGBoost for feature scaling, regression modelling, and cross-validation.</w:t>
+          <w:t xml:space="preserve"> Scikit-Learn, </w:t>
+        </w:r>
+        <w:proofErr w:type="spellStart"/>
+        <w:r>
+          <w:t>XGBoost</w:t>
+        </w:r>
+        <w:proofErr w:type="spellEnd"/>
+        <w:r>
+          <w:t xml:space="preserve"> for feature scaling, regression modelling, and cross-validation.</w:t>
         </w:r>
       </w:ins>
     </w:p>
@@ -3881,7 +3916,11 @@
           <w:t>Visualization &amp; Reporting:</w:t>
         </w:r>
         <w:r>
-          <w:t xml:space="preserve"> Power BI / Stream</w:t>
+          <w:t xml:space="preserve"> Power BI / </w:t>
+        </w:r>
+        <w:proofErr w:type="spellStart"/>
+        <w:r>
+          <w:t>Stream</w:t>
         </w:r>
       </w:ins>
       <w:ins w:id="154" w:author="Rohit Singh" w:date="2026-10-20T23:00:00Z" w16du:dateUtc="2026-10-20T22:00:00Z">
@@ -3889,6 +3928,7 @@
           <w:t>lit</w:t>
         </w:r>
       </w:ins>
+      <w:proofErr w:type="spellEnd"/>
       <w:ins w:id="155" w:author="Rohit Singh" w:date="2026-10-20T22:38:00Z" w16du:dateUtc="2026-10-20T21:38:00Z">
         <w:r>
           <w:t xml:space="preserve"> for dynamic user dashboarding; Matplotlib &amp; Seaborn for EDA.</w:t>
@@ -3950,9 +3990,9 @@
             <w:noProof/>
           </w:rPr>
           <w:drawing>
-            <wp:inline distT="0" distB="0" distL="0" distR="0" wp14:anchorId="4076A48A" wp14:editId="22932A6F">
-              <wp:extent cx="5448300" cy="5267325"/>
-              <wp:effectExtent l="0" t="0" r="0" b="9525"/>
+            <wp:inline distT="0" distB="0" distL="0" distR="0" wp14:anchorId="4076A48A" wp14:editId="3ECDF73F">
+              <wp:extent cx="4965700" cy="4800755"/>
+              <wp:effectExtent l="0" t="0" r="6350" b="0"/>
               <wp:docPr id="1104084704" name="Picture 6"/>
               <wp:cNvGraphicFramePr>
                 <a:graphicFrameLocks xmlns:a="http://schemas.openxmlformats.org/drawingml/2006/main" noChangeAspect="1"/>
@@ -3982,7 +4022,7 @@
                     <pic:spPr bwMode="auto">
                       <a:xfrm>
                         <a:off x="0" y="0"/>
-                        <a:ext cx="5448300" cy="5267325"/>
+                        <a:ext cx="4965700" cy="4800755"/>
                       </a:xfrm>
                       <a:prstGeom prst="rect">
                         <a:avLst/>
@@ -4103,7 +4143,6 @@
             <w:b/>
             <w:bCs/>
           </w:rPr>
-          <w:lastRenderedPageBreak/>
           <w:t>CSO PCIEV01 - Public EV Charging Infrastructure:</w:t>
         </w:r>
         <w:r>
@@ -4127,6 +4166,7 @@
             <w:b/>
             <w:bCs/>
           </w:rPr>
+          <w:lastRenderedPageBreak/>
           <w:t>Local Authority Open GIS Datasets (Smart Dublin, Cork City Council, FCC):</w:t>
         </w:r>
         <w:r>

</xml_diff>